<commit_message>
Remove build-to-suit sentence from the offer summary
Co-Authored-By: Claude Fable 5.1 <noreply@anthropic.com>
Claude-Session: https://claude.ai/code/session_01Y2BwyWrz2zGDUPQB2oEzRk
</commit_message>
<xml_diff>
--- a/business-plan/ponuka-merkury-market/Oferta_inwestycyjna_Stara_Lubovna_Merkury_Market_PL.docx
+++ b/business-plan/ponuka-merkury-market/Oferta_inwestycyjna_Stara_Lubovna_Merkury_Market_PL.docx
@@ -355,20 +355,6 @@
           <w:szCs w:val="21"/>
         </w:rPr>
         <w:t xml:space="preserve">zarządzanie projektem, wybór architekta, postępowanie lokalizacyjne i pozwolenie na budowę oraz kontakty z miastem, z którym od lat utrzymujemy dobre relacje, również z kierownictwem miasta.</w:t>
-      </w:r>
-    </w:p>
-    <w:p>
-      <w:pPr>
-        <w:spacing w:after="120" w:line="276"/>
-        <w:jc w:val="both"/>
-      </w:pPr>
-      <w:r>
-        <w:rPr>
-          <w:rFonts w:ascii="Arial" w:cs="Arial" w:eastAsia="Arial" w:hAnsi="Arial"/>
-          <w:sz w:val="21"/>
-          <w:szCs w:val="21"/>
-        </w:rPr>
-        <w:t xml:space="preserve">Alternatywnie możemy zabudować teren według wymagań Merkury Market i wynająć obiekt długoterminowo (build-to-suit). Wszystkie warianty opisano w części 4.</w:t>
       </w:r>
     </w:p>
     <w:p>

</xml_diff>

<commit_message>
Offer: construction as general contractor paid by Merkury Market
Variant build-to-suit nahradený službou povolení a prípravy; výstavba
na kľúč výslovne na náklady investora Merkury Market podľa zmluvy o dielo.

Co-Authored-By: Claude Fable 5.1 <noreply@anthropic.com>
Claude-Session: https://claude.ai/code/session_01Y2BwyWrz2zGDUPQB2oEzRk
</commit_message>
<xml_diff>
--- a/business-plan/ponuka-merkury-market/Oferta_inwestycyjna_Stara_Lubovna_Merkury_Market_PL.docx
+++ b/business-plan/ponuka-merkury-market/Oferta_inwestycyjna_Stara_Lubovna_Merkury_Market_PL.docx
@@ -267,7 +267,7 @@
           <w:sz w:val="21"/>
           <w:szCs w:val="21"/>
         </w:rPr>
-        <w:t xml:space="preserve">Oferta składa się z trzech części, które można łączyć:</w:t>
+        <w:t xml:space="preserve">Oferta składa się z trzech części: sprzedaż terenu jest podstawą, a budowa i przygotowanie są usługami opcjonalnymi, które Merkury Market zamawia i finansuje jako inwestor:</w:t>
       </w:r>
     </w:p>
     <w:p>
@@ -325,7 +325,7 @@
           <w:sz w:val="21"/>
           <w:szCs w:val="21"/>
         </w:rPr>
-        <w:t xml:space="preserve">BauHausEurope jako generalny wykonawca zapewni rozbiórkę własnym sprzętem (w tym kruszarką betonu), roboty ziemne, budowę sklepu, parkingu i sieci.</w:t>
+        <w:t xml:space="preserve">po sprzedaży terenu BauHausEurope jako generalny wykonawca, na koszt inwestora Merkury Market, zapewni rozbiórkę własnym sprzętem (w tym kruszarką betonu), roboty ziemne, budowę sklepu, parkingu i sieci – na podstawie umowy o roboty budowlane ze stałą ceną i terminem.</w:t>
       </w:r>
     </w:p>
     <w:p>
@@ -2353,7 +2353,7 @@
                 <w:sz w:val="17"/>
                 <w:szCs w:val="17"/>
               </w:rPr>
-              <w:t xml:space="preserve">wariant A + BauHausEurope jako generalny wykonawca</w:t>
+              <w:t xml:space="preserve">wariant A + BauHausEurope jako generalny wykonawca; inwestorem i zamawiającym jest Merkury Market, cena robót płatna według umowy o roboty budowlane (fakturowanie etapowe)</w:t>
             </w:r>
           </w:p>
         </w:tc>
@@ -2464,7 +2464,7 @@
                 <w:sz w:val="17"/>
                 <w:szCs w:val="17"/>
               </w:rPr>
-              <w:t xml:space="preserve">C – Build-to-suit</w:t>
+              <w:t xml:space="preserve">C – Pozwolenia i przygotowanie</w:t>
             </w:r>
           </w:p>
         </w:tc>
@@ -2499,7 +2499,7 @@
                 <w:sz w:val="17"/>
                 <w:szCs w:val="17"/>
               </w:rPr>
-              <w:t xml:space="preserve">BauHausEurope buduje obiekt w standardzie Merkury Market i wynajmuje go na 15 – 20 lat</w:t>
+              <w:t xml:space="preserve">usługa dla Merkury Market przed budową i w jej trakcie</w:t>
             </w:r>
           </w:p>
         </w:tc>
@@ -2534,7 +2534,7 @@
                 <w:sz w:val="17"/>
                 <w:szCs w:val="17"/>
               </w:rPr>
-              <w:t xml:space="preserve">finansowanie budowy, projekt, pozwolenia, budowa, zarządzanie obiektem</w:t>
+              <w:t xml:space="preserve">przygotowanie zamierzenia dla miasta, wybór architekta, projekt, postępowanie lokalizacyjne i pozwolenie na budowę, zarządzanie projektem</w:t>
             </w:r>
           </w:p>
         </w:tc>
@@ -2569,7 +2569,7 @@
                 <w:sz w:val="17"/>
                 <w:szCs w:val="17"/>
               </w:rPr>
-              <w:t xml:space="preserve">centrum handlowe bez własnej inwestycji w grunt i budynek, czynsz od otwarcia</w:t>
+              <w:t xml:space="preserve">szybsze pozwolenia i lokalny partner znający miasto, urzędy i dostawców</w:t>
             </w:r>
           </w:p>
         </w:tc>

</xml_diff>

<commit_message>
Offer: satellite imagery, valuation data and zoning information
Satelitné snímky areálu a mesta, sekcia s údajmi zo znaleckého posudku
č. 87/2024 a sekcia s územnoplánovacou informáciou podľa ÚPN mesta;
odstránené zmienky o polyfunkčnom bytovom projekte.

Co-Authored-By: Claude Fable 5.1 <noreply@anthropic.com>
Claude-Session: https://claude.ai/code/session_01Y2BwyWrz2zGDUPQB2oEzRk
</commit_message>
<xml_diff>
--- a/business-plan/ponuka-merkury-market/Oferta_inwestycyjna_Stara_Lubovna_Merkury_Market_PL.docx
+++ b/business-plan/ponuka-merkury-market/Oferta_inwestycyjna_Stara_Lubovna_Merkury_Market_PL.docx
@@ -166,7 +166,7 @@
       <w:r>
         <w:drawing>
           <wp:inline distT="0" distB="0" distL="0" distR="0">
-            <wp:extent cx="5334000" cy="3429000"/>
+            <wp:extent cx="5334000" cy="3619500"/>
             <wp:effectExtent t="0" r="0" b="0" l="0"/>
             <wp:docPr id="1" name="" descr="" title=""/>
             <wp:cNvGraphicFramePr>
@@ -191,7 +191,7 @@
                   <pic:spPr bwMode="auto">
                     <a:xfrm>
                       <a:off x="0" y="0"/>
-                      <a:ext cx="5334000" cy="3429000"/>
+                      <a:ext cx="5334000" cy="3619500"/>
                     </a:xfrm>
                     <a:prstGeom prst="rect">
                       <a:avLst/>
@@ -253,7 +253,7 @@
           <w:sz w:val="21"/>
           <w:szCs w:val="21"/>
         </w:rPr>
-        <w:t xml:space="preserve">BauHausEurope s. r. o. jest wyłącznym właścicielem zamkniętego terenu dawnej piekarni przy ulicy Levočskiej w Starej Ľubovni o łącznej powierzchni 10 789 m². Teren leży przy głównym wjeździe do miasta od strony Preszowa i Popradu, nad rzeką Jakubianka, naprzeciwko szpitala powiatowego, i posiada pełne uzbrojenie wraz z własną stacją transformatorową. Oferujemy firmie Merkury Market ten teren jako lokalizację nowego centrum handlowego w mieście powiatowym, w którym tego formatu sklepu dotychczas brakuje.</w:t>
+        <w:t xml:space="preserve">BauHausEurope s. r. o. jest wyłącznym właścicielem zamkniętego terenu dawnej piekarni przy ulicy Levočskiej w Starej Ľubovni o łącznej powierzchni 10 789 m². Teren leży przy głównym wjeździe do miasta od strony Preszowa i Popradu, nad rzeką Jakubianka, naprzeciwko szpitala powiatowego, i posiada pełne uzbrojenie wraz z własną stacją transformatorową. Oferujemy firmie Merkury Market ten teren jako lokalizację nowego centrum handlowego w mieście powiatowym, w którym tego formatu sklepu dotychczas brakuje. Teren został w 2024 r. wyceniony operatem szacunkowym na 1 850 000 EUR.</w:t>
       </w:r>
     </w:p>
     <w:p>
@@ -995,7 +995,7 @@
                 <w:sz w:val="19"/>
                 <w:szCs w:val="19"/>
               </w:rPr>
-              <w:t xml:space="preserve">teren zabudowany miasta; ważna decyzja lokalizacyjna dla zabudowy wielofunkcyjnej z parterem handlowym</w:t>
+              <w:t xml:space="preserve">obszar zabudowany miasta, istniejący teren produkcyjno-magazynowy; przeznaczenie według planu miasta i ważna decyzja lokalizacyjna – zob. część 4</w:t>
             </w:r>
           </w:p>
         </w:tc>
@@ -1223,7 +1223,7 @@
                 <w:sz w:val="19"/>
                 <w:szCs w:val="19"/>
               </w:rPr>
-              <w:t xml:space="preserve">operat szacunkowy (2024), pomiar geodezyjny, studium architektoniczne (2025), badania geologiczno-inżynierskie i hydrogeologiczne (w toku), dokumentacja projektowa istniejących obiektów</w:t>
+              <w:t xml:space="preserve">operat szacunkowy nr 87/2024, wypis z księgi wieczystej i mapa katastralna, pomiar geodezyjny, informacja planistyczna miasta, badania geologiczno-inżynierskie i hydrogeologiczne (w toku), dokumentacja projektowa istniejących obiektów, pozwolenie na budowę i decyzja o odbiorze</w:t>
             </w:r>
           </w:p>
         </w:tc>
@@ -1233,70 +1233,6 @@
       <w:pPr>
         <w:spacing w:after="120"/>
       </w:pPr>
-    </w:p>
-    <w:p>
-      <w:pPr>
-        <w:keepNext/>
-        <w:spacing w:after="60" w:before="120"/>
-        <w:jc w:val="center"/>
-      </w:pPr>
-      <w:r>
-        <w:drawing>
-          <wp:inline distT="0" distB="0" distL="0" distR="0">
-            <wp:extent cx="5715000" cy="3676650"/>
-            <wp:effectExtent t="0" r="0" b="0" l="0"/>
-            <wp:docPr id="1" name="" descr="" title=""/>
-            <wp:cNvGraphicFramePr>
-              <a:graphicFrameLocks xmlns:a="http://schemas.openxmlformats.org/drawingml/2006/main" noChangeAspect="1"/>
-            </wp:cNvGraphicFramePr>
-            <a:graphic xmlns:a="http://schemas.openxmlformats.org/drawingml/2006/main">
-              <a:graphicData uri="http://schemas.openxmlformats.org/drawingml/2006/picture">
-                <pic:pic xmlns:pic="http://schemas.openxmlformats.org/drawingml/2006/picture">
-                  <pic:nvPicPr>
-                    <pic:cNvPr id="0" name="" descr=""/>
-                    <pic:cNvPicPr>
-                      <a:picLocks noChangeAspect="1" noChangeArrowheads="1"/>
-                    </pic:cNvPicPr>
-                  </pic:nvPicPr>
-                  <pic:blipFill>
-                    <a:blip r:embed="rId9" cstate="none"/>
-                    <a:srcRect/>
-                    <a:stretch>
-                      <a:fillRect/>
-                    </a:stretch>
-                  </pic:blipFill>
-                  <pic:spPr bwMode="auto">
-                    <a:xfrm>
-                      <a:off x="0" y="0"/>
-                      <a:ext cx="5715000" cy="3676650"/>
-                    </a:xfrm>
-                    <a:prstGeom prst="rect">
-                      <a:avLst/>
-                    </a:prstGeom>
-                  </pic:spPr>
-                </pic:pic>
-              </a:graphicData>
-            </a:graphic>
-          </wp:inline>
-        </w:drawing>
-      </w:r>
-    </w:p>
-    <w:p>
-      <w:pPr>
-        <w:spacing w:after="200" w:before="60"/>
-        <w:jc w:val="center"/>
-      </w:pPr>
-      <w:r>
-        <w:rPr>
-          <w:rFonts w:ascii="Arial" w:cs="Arial" w:eastAsia="Arial" w:hAnsi="Arial"/>
-          <w:i/>
-          <w:iCs/>
-          <w:color w:val="52514E"/>
-          <w:sz w:val="17"/>
-          <w:szCs w:val="17"/>
-        </w:rPr>
-        <w:t xml:space="preserve">Rys. 1 – Położenie terenu w Starej Ľubovni (OpenStreetMap)</w:t>
-      </w:r>
     </w:p>
     <w:p>
       <w:pPr>
@@ -1359,7 +1295,7 @@
           <w:sz w:val="17"/>
           <w:szCs w:val="17"/>
         </w:rPr>
-        <w:t xml:space="preserve">Rys. 2 – Szersze otoczenie: Stará Ľubovňa przy drodze I/68 między Preszowem a granicą polską (OpenStreetMap)</w:t>
+        <w:t xml:space="preserve">Rys. 1 – Zdjęcie satelitarne: położenie terenu (czerwony punkt) w południowej części Starej Ľubovni przy ul. Levočskiej (ortofoto GKÚ/NLC, Esri World Imagery)</w:t>
       </w:r>
     </w:p>
     <w:p>
@@ -1371,7 +1307,7 @@
       <w:r>
         <w:drawing>
           <wp:inline distT="0" distB="0" distL="0" distR="0">
-            <wp:extent cx="4953000" cy="3181350"/>
+            <wp:extent cx="5715000" cy="3876675"/>
             <wp:effectExtent t="0" r="0" b="0" l="0"/>
             <wp:docPr id="1" name="" descr="" title=""/>
             <wp:cNvGraphicFramePr>
@@ -1396,7 +1332,7 @@
                   <pic:spPr bwMode="auto">
                     <a:xfrm>
                       <a:off x="0" y="0"/>
-                      <a:ext cx="4953000" cy="3181350"/>
+                      <a:ext cx="5715000" cy="3876675"/>
                     </a:xfrm>
                     <a:prstGeom prst="rect">
                       <a:avLst/>
@@ -1423,7 +1359,135 @@
           <w:sz w:val="17"/>
           <w:szCs w:val="17"/>
         </w:rPr>
-        <w:t xml:space="preserve">Rys. 3 – Kształt i granice terenu między ulicą Levočską a rzeką Jakubianka (ze studium Harajčík Architekti, 2025)</w:t>
+        <w:t xml:space="preserve">Rys. 2 – Zdjęcie satelitarne terenu: hala produkcyjna, budynek administracyjny, obiekty magazynowe i place utwardzone między ul. Levočską a rzeką Jakubianka</w:t>
+      </w:r>
+    </w:p>
+    <w:p>
+      <w:pPr>
+        <w:keepNext/>
+        <w:spacing w:after="60" w:before="120"/>
+        <w:jc w:val="center"/>
+      </w:pPr>
+      <w:r>
+        <w:drawing>
+          <wp:inline distT="0" distB="0" distL="0" distR="0">
+            <wp:extent cx="5334000" cy="3429000"/>
+            <wp:effectExtent t="0" r="0" b="0" l="0"/>
+            <wp:docPr id="1" name="" descr="" title=""/>
+            <wp:cNvGraphicFramePr>
+              <a:graphicFrameLocks xmlns:a="http://schemas.openxmlformats.org/drawingml/2006/main" noChangeAspect="1"/>
+            </wp:cNvGraphicFramePr>
+            <a:graphic xmlns:a="http://schemas.openxmlformats.org/drawingml/2006/main">
+              <a:graphicData uri="http://schemas.openxmlformats.org/drawingml/2006/picture">
+                <pic:pic xmlns:pic="http://schemas.openxmlformats.org/drawingml/2006/picture">
+                  <pic:nvPicPr>
+                    <pic:cNvPr id="0" name="" descr=""/>
+                    <pic:cNvPicPr>
+                      <a:picLocks noChangeAspect="1" noChangeArrowheads="1"/>
+                    </pic:cNvPicPr>
+                  </pic:nvPicPr>
+                  <pic:blipFill>
+                    <a:blip r:embed="rId12" cstate="none"/>
+                    <a:srcRect/>
+                    <a:stretch>
+                      <a:fillRect/>
+                    </a:stretch>
+                  </pic:blipFill>
+                  <pic:spPr bwMode="auto">
+                    <a:xfrm>
+                      <a:off x="0" y="0"/>
+                      <a:ext cx="5334000" cy="3429000"/>
+                    </a:xfrm>
+                    <a:prstGeom prst="rect">
+                      <a:avLst/>
+                    </a:prstGeom>
+                  </pic:spPr>
+                </pic:pic>
+              </a:graphicData>
+            </a:graphic>
+          </wp:inline>
+        </w:drawing>
+      </w:r>
+    </w:p>
+    <w:p>
+      <w:pPr>
+        <w:spacing w:after="200" w:before="60"/>
+        <w:jc w:val="center"/>
+      </w:pPr>
+      <w:r>
+        <w:rPr>
+          <w:rFonts w:ascii="Arial" w:cs="Arial" w:eastAsia="Arial" w:hAnsi="Arial"/>
+          <w:i/>
+          <w:iCs/>
+          <w:color w:val="52514E"/>
+          <w:sz w:val="17"/>
+          <w:szCs w:val="17"/>
+        </w:rPr>
+        <w:t xml:space="preserve">Rys. 3 – Położenie terenu na mapie miasta (OpenStreetMap)</w:t>
+      </w:r>
+    </w:p>
+    <w:p>
+      <w:pPr>
+        <w:keepNext/>
+        <w:spacing w:after="60" w:before="120"/>
+        <w:jc w:val="center"/>
+      </w:pPr>
+      <w:r>
+        <w:drawing>
+          <wp:inline distT="0" distB="0" distL="0" distR="0">
+            <wp:extent cx="5334000" cy="3429000"/>
+            <wp:effectExtent t="0" r="0" b="0" l="0"/>
+            <wp:docPr id="1" name="" descr="" title=""/>
+            <wp:cNvGraphicFramePr>
+              <a:graphicFrameLocks xmlns:a="http://schemas.openxmlformats.org/drawingml/2006/main" noChangeAspect="1"/>
+            </wp:cNvGraphicFramePr>
+            <a:graphic xmlns:a="http://schemas.openxmlformats.org/drawingml/2006/main">
+              <a:graphicData uri="http://schemas.openxmlformats.org/drawingml/2006/picture">
+                <pic:pic xmlns:pic="http://schemas.openxmlformats.org/drawingml/2006/picture">
+                  <pic:nvPicPr>
+                    <pic:cNvPr id="0" name="" descr=""/>
+                    <pic:cNvPicPr>
+                      <a:picLocks noChangeAspect="1" noChangeArrowheads="1"/>
+                    </pic:cNvPicPr>
+                  </pic:nvPicPr>
+                  <pic:blipFill>
+                    <a:blip r:embed="rId13" cstate="none"/>
+                    <a:srcRect/>
+                    <a:stretch>
+                      <a:fillRect/>
+                    </a:stretch>
+                  </pic:blipFill>
+                  <pic:spPr bwMode="auto">
+                    <a:xfrm>
+                      <a:off x="0" y="0"/>
+                      <a:ext cx="5334000" cy="3429000"/>
+                    </a:xfrm>
+                    <a:prstGeom prst="rect">
+                      <a:avLst/>
+                    </a:prstGeom>
+                  </pic:spPr>
+                </pic:pic>
+              </a:graphicData>
+            </a:graphic>
+          </wp:inline>
+        </w:drawing>
+      </w:r>
+    </w:p>
+    <w:p>
+      <w:pPr>
+        <w:spacing w:after="200" w:before="60"/>
+        <w:jc w:val="center"/>
+      </w:pPr>
+      <w:r>
+        <w:rPr>
+          <w:rFonts w:ascii="Arial" w:cs="Arial" w:eastAsia="Arial" w:hAnsi="Arial"/>
+          <w:i/>
+          <w:iCs/>
+          <w:color w:val="52514E"/>
+          <w:sz w:val="17"/>
+          <w:szCs w:val="17"/>
+        </w:rPr>
+        <w:t xml:space="preserve">Rys. 4 – Szersze otoczenie: Stará Ľubovňa przy drodze I/68 między Preszowem a granicą polską (OpenStreetMap)</w:t>
       </w:r>
     </w:p>
     <w:p>
@@ -1440,7 +1504,3376 @@
           <w:sz w:val="30"/>
           <w:szCs w:val="30"/>
         </w:rPr>
-        <w:t xml:space="preserve">3. Lokalizacja i rynek</w:t>
+        <w:t xml:space="preserve">3. Dane z operatu szacunkowego</w:t>
+      </w:r>
+    </w:p>
+    <w:p>
+      <w:pPr>
+        <w:spacing w:after="120" w:line="276"/>
+        <w:jc w:val="both"/>
+      </w:pPr>
+      <w:r>
+        <w:rPr>
+          <w:rFonts w:ascii="Arial" w:cs="Arial" w:eastAsia="Arial" w:hAnsi="Arial"/>
+          <w:sz w:val="21"/>
+          <w:szCs w:val="21"/>
+        </w:rPr>
+        <w:t xml:space="preserve">Nieruchomość została wyceniona operatem szacunkowym nr 87/2024 (inż. Peter Repčák, biegły sądowy w dziedzinie budownictwa, specjalność wycena nieruchomości, 22.07.2024). Operat opiera się na oględzinach i pomiarze z 4.07.2024, wypisie z księgi wieczystej LV nr 1382 i kopii mapy katastralnej. Pierwotna piekarnia powstała w 1953 r., teren został kompleksowo przebudowany na podstawie pozwolenia na budowę z 1984 r. (projekt Potravinoprojekt Bratysława) i odebrany w 1992 r.; obiekty są użytkowane od 1989 r.</w:t>
+      </w:r>
+    </w:p>
+    <w:tbl>
+      <w:tblPr>
+        <w:tblW w:type="dxa" w:w="9638"/>
+        <w:tblBorders>
+          <w:top w:val="single" w:color="auto" w:sz="4"/>
+          <w:left w:val="single" w:color="auto" w:sz="4"/>
+          <w:bottom w:val="single" w:color="auto" w:sz="4"/>
+          <w:right w:val="single" w:color="auto" w:sz="4"/>
+          <w:insideH w:val="single" w:color="auto" w:sz="4"/>
+          <w:insideV w:val="single" w:color="auto" w:sz="4"/>
+        </w:tblBorders>
+      </w:tblPr>
+      <w:tblGrid>
+        <w:gridCol w:w="3276"/>
+        <w:gridCol w:w="1349"/>
+        <w:gridCol w:w="1349"/>
+        <w:gridCol w:w="963"/>
+        <w:gridCol w:w="1542"/>
+        <w:gridCol w:w="1159"/>
+      </w:tblGrid>
+      <w:tr>
+        <w:trPr>
+          <w:cantSplit/>
+          <w:tblHeader/>
+        </w:trPr>
+        <w:tc>
+          <w:tcPr>
+            <w:tcW w:type="dxa" w:w="3276"/>
+            <w:tcBorders>
+              <w:top w:val="single" w:color="C9D3E3" w:sz="4"/>
+              <w:left w:val="single" w:color="C9D3E3" w:sz="4"/>
+              <w:bottom w:val="single" w:color="C9D3E3" w:sz="4"/>
+              <w:right w:val="single" w:color="C9D3E3" w:sz="4"/>
+            </w:tcBorders>
+            <w:shd w:fill="1F3B73" w:color="auto" w:val="clear"/>
+            <w:tcMar>
+              <w:top w:type="dxa" w:w="60"/>
+              <w:left w:type="dxa" w:w="90"/>
+              <w:bottom w:type="dxa" w:w="60"/>
+              <w:right w:type="dxa" w:w="90"/>
+            </w:tcMar>
+            <w:vAlign w:val="center"/>
+          </w:tcPr>
+          <w:p>
+            <w:pPr>
+              <w:spacing w:after="0"/>
+              <w:jc w:val="left"/>
+            </w:pPr>
+            <w:r>
+              <w:rPr>
+                <w:rFonts w:ascii="Arial" w:cs="Arial" w:eastAsia="Arial" w:hAnsi="Arial"/>
+                <w:b/>
+                <w:bCs/>
+                <w:color w:val="FFFFFF"/>
+                <w:sz w:val="17"/>
+                <w:szCs w:val="17"/>
+              </w:rPr>
+              <w:t xml:space="preserve">Obiekt</w:t>
+            </w:r>
+          </w:p>
+        </w:tc>
+        <w:tc>
+          <w:tcPr>
+            <w:tcW w:type="dxa" w:w="1349"/>
+            <w:tcBorders>
+              <w:top w:val="single" w:color="C9D3E3" w:sz="4"/>
+              <w:left w:val="single" w:color="C9D3E3" w:sz="4"/>
+              <w:bottom w:val="single" w:color="C9D3E3" w:sz="4"/>
+              <w:right w:val="single" w:color="C9D3E3" w:sz="4"/>
+            </w:tcBorders>
+            <w:shd w:fill="1F3B73" w:color="auto" w:val="clear"/>
+            <w:tcMar>
+              <w:top w:type="dxa" w:w="60"/>
+              <w:left w:type="dxa" w:w="90"/>
+              <w:bottom w:type="dxa" w:w="60"/>
+              <w:right w:type="dxa" w:w="90"/>
+            </w:tcMar>
+            <w:vAlign w:val="center"/>
+          </w:tcPr>
+          <w:p>
+            <w:pPr>
+              <w:spacing w:after="0"/>
+              <w:jc w:val="right"/>
+            </w:pPr>
+            <w:r>
+              <w:rPr>
+                <w:rFonts w:ascii="Arial" w:cs="Arial" w:eastAsia="Arial" w:hAnsi="Arial"/>
+                <w:b/>
+                <w:bCs/>
+                <w:color w:val="FFFFFF"/>
+                <w:sz w:val="17"/>
+                <w:szCs w:val="17"/>
+              </w:rPr>
+              <w:t xml:space="preserve">Kubatura (m³)</w:t>
+            </w:r>
+          </w:p>
+        </w:tc>
+        <w:tc>
+          <w:tcPr>
+            <w:tcW w:type="dxa" w:w="1349"/>
+            <w:tcBorders>
+              <w:top w:val="single" w:color="C9D3E3" w:sz="4"/>
+              <w:left w:val="single" w:color="C9D3E3" w:sz="4"/>
+              <w:bottom w:val="single" w:color="C9D3E3" w:sz="4"/>
+              <w:right w:val="single" w:color="C9D3E3" w:sz="4"/>
+            </w:tcBorders>
+            <w:shd w:fill="1F3B73" w:color="auto" w:val="clear"/>
+            <w:tcMar>
+              <w:top w:type="dxa" w:w="60"/>
+              <w:left w:type="dxa" w:w="90"/>
+              <w:bottom w:type="dxa" w:w="60"/>
+              <w:right w:type="dxa" w:w="90"/>
+            </w:tcMar>
+            <w:vAlign w:val="center"/>
+          </w:tcPr>
+          <w:p>
+            <w:pPr>
+              <w:spacing w:after="0"/>
+              <w:jc w:val="right"/>
+            </w:pPr>
+            <w:r>
+              <w:rPr>
+                <w:rFonts w:ascii="Arial" w:cs="Arial" w:eastAsia="Arial" w:hAnsi="Arial"/>
+                <w:b/>
+                <w:bCs/>
+                <w:color w:val="FFFFFF"/>
+                <w:sz w:val="17"/>
+                <w:szCs w:val="17"/>
+              </w:rPr>
+              <w:t xml:space="preserve">Pow. zabudowy (m²)</w:t>
+            </w:r>
+          </w:p>
+        </w:tc>
+        <w:tc>
+          <w:tcPr>
+            <w:tcW w:type="dxa" w:w="963"/>
+            <w:tcBorders>
+              <w:top w:val="single" w:color="C9D3E3" w:sz="4"/>
+              <w:left w:val="single" w:color="C9D3E3" w:sz="4"/>
+              <w:bottom w:val="single" w:color="C9D3E3" w:sz="4"/>
+              <w:right w:val="single" w:color="C9D3E3" w:sz="4"/>
+            </w:tcBorders>
+            <w:shd w:fill="1F3B73" w:color="auto" w:val="clear"/>
+            <w:tcMar>
+              <w:top w:type="dxa" w:w="60"/>
+              <w:left w:type="dxa" w:w="90"/>
+              <w:bottom w:type="dxa" w:w="60"/>
+              <w:right w:type="dxa" w:w="90"/>
+            </w:tcMar>
+            <w:vAlign w:val="center"/>
+          </w:tcPr>
+          <w:p>
+            <w:pPr>
+              <w:spacing w:after="0"/>
+              <w:jc w:val="center"/>
+            </w:pPr>
+            <w:r>
+              <w:rPr>
+                <w:rFonts w:ascii="Arial" w:cs="Arial" w:eastAsia="Arial" w:hAnsi="Arial"/>
+                <w:b/>
+                <w:bCs/>
+                <w:color w:val="FFFFFF"/>
+                <w:sz w:val="17"/>
+                <w:szCs w:val="17"/>
+              </w:rPr>
+              <w:t xml:space="preserve">Kondygn.</w:t>
+            </w:r>
+          </w:p>
+        </w:tc>
+        <w:tc>
+          <w:tcPr>
+            <w:tcW w:type="dxa" w:w="1542"/>
+            <w:tcBorders>
+              <w:top w:val="single" w:color="C9D3E3" w:sz="4"/>
+              <w:left w:val="single" w:color="C9D3E3" w:sz="4"/>
+              <w:bottom w:val="single" w:color="C9D3E3" w:sz="4"/>
+              <w:right w:val="single" w:color="C9D3E3" w:sz="4"/>
+            </w:tcBorders>
+            <w:shd w:fill="1F3B73" w:color="auto" w:val="clear"/>
+            <w:tcMar>
+              <w:top w:type="dxa" w:w="60"/>
+              <w:left w:type="dxa" w:w="90"/>
+              <w:bottom w:type="dxa" w:w="60"/>
+              <w:right w:type="dxa" w:w="90"/>
+            </w:tcMar>
+            <w:vAlign w:val="center"/>
+          </w:tcPr>
+          <w:p>
+            <w:pPr>
+              <w:spacing w:after="0"/>
+              <w:jc w:val="right"/>
+            </w:pPr>
+            <w:r>
+              <w:rPr>
+                <w:rFonts w:ascii="Arial" w:cs="Arial" w:eastAsia="Arial" w:hAnsi="Arial"/>
+                <w:b/>
+                <w:bCs/>
+                <w:color w:val="FFFFFF"/>
+                <w:sz w:val="17"/>
+                <w:szCs w:val="17"/>
+              </w:rPr>
+              <w:t xml:space="preserve">Konstrukcja</w:t>
+            </w:r>
+          </w:p>
+        </w:tc>
+        <w:tc>
+          <w:tcPr>
+            <w:tcW w:type="dxa" w:w="1159"/>
+            <w:tcBorders>
+              <w:top w:val="single" w:color="C9D3E3" w:sz="4"/>
+              <w:left w:val="single" w:color="C9D3E3" w:sz="4"/>
+              <w:bottom w:val="single" w:color="C9D3E3" w:sz="4"/>
+              <w:right w:val="single" w:color="C9D3E3" w:sz="4"/>
+            </w:tcBorders>
+            <w:shd w:fill="1F3B73" w:color="auto" w:val="clear"/>
+            <w:tcMar>
+              <w:top w:type="dxa" w:w="60"/>
+              <w:left w:type="dxa" w:w="90"/>
+              <w:bottom w:type="dxa" w:w="60"/>
+              <w:right w:type="dxa" w:w="90"/>
+            </w:tcMar>
+            <w:vAlign w:val="center"/>
+          </w:tcPr>
+          <w:p>
+            <w:pPr>
+              <w:spacing w:after="0"/>
+              <w:jc w:val="right"/>
+            </w:pPr>
+            <w:r>
+              <w:rPr>
+                <w:rFonts w:ascii="Arial" w:cs="Arial" w:eastAsia="Arial" w:hAnsi="Arial"/>
+                <w:b/>
+                <w:bCs/>
+                <w:color w:val="FFFFFF"/>
+                <w:sz w:val="17"/>
+                <w:szCs w:val="17"/>
+              </w:rPr>
+              <w:t xml:space="preserve">Wartość rynkowa (EUR)</w:t>
+            </w:r>
+          </w:p>
+        </w:tc>
+      </w:tr>
+      <w:tr>
+        <w:trPr>
+          <w:cantSplit/>
+          <w:tblHeader w:val="false"/>
+        </w:trPr>
+        <w:tc>
+          <w:tcPr>
+            <w:tcW w:type="dxa" w:w="3276"/>
+            <w:tcBorders>
+              <w:top w:val="single" w:color="C9D3E3" w:sz="4"/>
+              <w:left w:val="single" w:color="C9D3E3" w:sz="4"/>
+              <w:bottom w:val="single" w:color="C9D3E3" w:sz="4"/>
+              <w:right w:val="single" w:color="C9D3E3" w:sz="4"/>
+            </w:tcBorders>
+            <w:tcMar>
+              <w:top w:type="dxa" w:w="60"/>
+              <w:left w:type="dxa" w:w="90"/>
+              <w:bottom w:type="dxa" w:w="60"/>
+              <w:right w:type="dxa" w:w="90"/>
+            </w:tcMar>
+            <w:vAlign w:val="center"/>
+          </w:tcPr>
+          <w:p>
+            <w:pPr>
+              <w:spacing w:after="0"/>
+              <w:jc w:val="left"/>
+            </w:pPr>
+            <w:r>
+              <w:rPr>
+                <w:rFonts w:ascii="Arial" w:cs="Arial" w:eastAsia="Arial" w:hAnsi="Arial"/>
+                <w:b w:val="false"/>
+                <w:bCs w:val="false"/>
+                <w:color w:val="000000"/>
+                <w:sz w:val="17"/>
+                <w:szCs w:val="17"/>
+              </w:rPr>
+              <w:t xml:space="preserve">Budynek administracyjny (część trzykondygnacyjna, nr 345)</w:t>
+            </w:r>
+          </w:p>
+        </w:tc>
+        <w:tc>
+          <w:tcPr>
+            <w:tcW w:type="dxa" w:w="1349"/>
+            <w:tcBorders>
+              <w:top w:val="single" w:color="C9D3E3" w:sz="4"/>
+              <w:left w:val="single" w:color="C9D3E3" w:sz="4"/>
+              <w:bottom w:val="single" w:color="C9D3E3" w:sz="4"/>
+              <w:right w:val="single" w:color="C9D3E3" w:sz="4"/>
+            </w:tcBorders>
+            <w:tcMar>
+              <w:top w:type="dxa" w:w="60"/>
+              <w:left w:type="dxa" w:w="90"/>
+              <w:bottom w:type="dxa" w:w="60"/>
+              <w:right w:type="dxa" w:w="90"/>
+            </w:tcMar>
+            <w:vAlign w:val="center"/>
+          </w:tcPr>
+          <w:p>
+            <w:pPr>
+              <w:spacing w:after="0"/>
+              <w:jc w:val="right"/>
+            </w:pPr>
+            <w:r>
+              <w:rPr>
+                <w:rFonts w:ascii="Arial" w:cs="Arial" w:eastAsia="Arial" w:hAnsi="Arial"/>
+                <w:b w:val="false"/>
+                <w:bCs w:val="false"/>
+                <w:color w:val="000000"/>
+                <w:sz w:val="17"/>
+                <w:szCs w:val="17"/>
+              </w:rPr>
+              <w:t xml:space="preserve">3 893,62</w:t>
+            </w:r>
+          </w:p>
+        </w:tc>
+        <w:tc>
+          <w:tcPr>
+            <w:tcW w:type="dxa" w:w="1349"/>
+            <w:tcBorders>
+              <w:top w:val="single" w:color="C9D3E3" w:sz="4"/>
+              <w:left w:val="single" w:color="C9D3E3" w:sz="4"/>
+              <w:bottom w:val="single" w:color="C9D3E3" w:sz="4"/>
+              <w:right w:val="single" w:color="C9D3E3" w:sz="4"/>
+            </w:tcBorders>
+            <w:tcMar>
+              <w:top w:type="dxa" w:w="60"/>
+              <w:left w:type="dxa" w:w="90"/>
+              <w:bottom w:type="dxa" w:w="60"/>
+              <w:right w:type="dxa" w:w="90"/>
+            </w:tcMar>
+            <w:vAlign w:val="center"/>
+          </w:tcPr>
+          <w:p>
+            <w:pPr>
+              <w:spacing w:after="0"/>
+              <w:jc w:val="right"/>
+            </w:pPr>
+            <w:r>
+              <w:rPr>
+                <w:rFonts w:ascii="Arial" w:cs="Arial" w:eastAsia="Arial" w:hAnsi="Arial"/>
+                <w:b w:val="false"/>
+                <w:bCs w:val="false"/>
+                <w:color w:val="000000"/>
+                <w:sz w:val="17"/>
+                <w:szCs w:val="17"/>
+              </w:rPr>
+              <w:t xml:space="preserve">404,21</w:t>
+            </w:r>
+          </w:p>
+        </w:tc>
+        <w:tc>
+          <w:tcPr>
+            <w:tcW w:type="dxa" w:w="963"/>
+            <w:tcBorders>
+              <w:top w:val="single" w:color="C9D3E3" w:sz="4"/>
+              <w:left w:val="single" w:color="C9D3E3" w:sz="4"/>
+              <w:bottom w:val="single" w:color="C9D3E3" w:sz="4"/>
+              <w:right w:val="single" w:color="C9D3E3" w:sz="4"/>
+            </w:tcBorders>
+            <w:tcMar>
+              <w:top w:type="dxa" w:w="60"/>
+              <w:left w:type="dxa" w:w="90"/>
+              <w:bottom w:type="dxa" w:w="60"/>
+              <w:right w:type="dxa" w:w="90"/>
+            </w:tcMar>
+            <w:vAlign w:val="center"/>
+          </w:tcPr>
+          <w:p>
+            <w:pPr>
+              <w:spacing w:after="0"/>
+              <w:jc w:val="center"/>
+            </w:pPr>
+            <w:r>
+              <w:rPr>
+                <w:rFonts w:ascii="Arial" w:cs="Arial" w:eastAsia="Arial" w:hAnsi="Arial"/>
+                <w:b w:val="false"/>
+                <w:bCs w:val="false"/>
+                <w:color w:val="000000"/>
+                <w:sz w:val="17"/>
+                <w:szCs w:val="17"/>
+              </w:rPr>
+              <w:t xml:space="preserve">3</w:t>
+            </w:r>
+          </w:p>
+        </w:tc>
+        <w:tc>
+          <w:tcPr>
+            <w:tcW w:type="dxa" w:w="1542"/>
+            <w:tcBorders>
+              <w:top w:val="single" w:color="C9D3E3" w:sz="4"/>
+              <w:left w:val="single" w:color="C9D3E3" w:sz="4"/>
+              <w:bottom w:val="single" w:color="C9D3E3" w:sz="4"/>
+              <w:right w:val="single" w:color="C9D3E3" w:sz="4"/>
+            </w:tcBorders>
+            <w:tcMar>
+              <w:top w:type="dxa" w:w="60"/>
+              <w:left w:type="dxa" w:w="90"/>
+              <w:bottom w:type="dxa" w:w="60"/>
+              <w:right w:type="dxa" w:w="90"/>
+            </w:tcMar>
+            <w:vAlign w:val="center"/>
+          </w:tcPr>
+          <w:p>
+            <w:pPr>
+              <w:spacing w:after="0"/>
+              <w:jc w:val="right"/>
+            </w:pPr>
+            <w:r>
+              <w:rPr>
+                <w:rFonts w:ascii="Arial" w:cs="Arial" w:eastAsia="Arial" w:hAnsi="Arial"/>
+                <w:b w:val="false"/>
+                <w:bCs w:val="false"/>
+                <w:color w:val="000000"/>
+                <w:sz w:val="17"/>
+                <w:szCs w:val="17"/>
+              </w:rPr>
+              <w:t xml:space="preserve">prefabrykowany szkielet żelbetowy, płyty z betonu komórkowego, dach płaski; parter wyremontowany, nowe okna PCV</w:t>
+            </w:r>
+          </w:p>
+        </w:tc>
+        <w:tc>
+          <w:tcPr>
+            <w:tcW w:type="dxa" w:w="1159"/>
+            <w:tcBorders>
+              <w:top w:val="single" w:color="C9D3E3" w:sz="4"/>
+              <w:left w:val="single" w:color="C9D3E3" w:sz="4"/>
+              <w:bottom w:val="single" w:color="C9D3E3" w:sz="4"/>
+              <w:right w:val="single" w:color="C9D3E3" w:sz="4"/>
+            </w:tcBorders>
+            <w:tcMar>
+              <w:top w:type="dxa" w:w="60"/>
+              <w:left w:type="dxa" w:w="90"/>
+              <w:bottom w:type="dxa" w:w="60"/>
+              <w:right w:type="dxa" w:w="90"/>
+            </w:tcMar>
+            <w:vAlign w:val="center"/>
+          </w:tcPr>
+          <w:p>
+            <w:pPr>
+              <w:spacing w:after="0"/>
+              <w:jc w:val="right"/>
+            </w:pPr>
+            <w:r>
+              <w:rPr>
+                <w:rFonts w:ascii="Arial" w:cs="Arial" w:eastAsia="Arial" w:hAnsi="Arial"/>
+                <w:b w:val="false"/>
+                <w:bCs w:val="false"/>
+                <w:color w:val="000000"/>
+                <w:sz w:val="17"/>
+                <w:szCs w:val="17"/>
+              </w:rPr>
+              <w:t xml:space="preserve">326 171,99</w:t>
+            </w:r>
+          </w:p>
+        </w:tc>
+      </w:tr>
+      <w:tr>
+        <w:trPr>
+          <w:cantSplit/>
+          <w:tblHeader w:val="false"/>
+        </w:trPr>
+        <w:tc>
+          <w:tcPr>
+            <w:tcW w:type="dxa" w:w="3276"/>
+            <w:tcBorders>
+              <w:top w:val="single" w:color="C9D3E3" w:sz="4"/>
+              <w:left w:val="single" w:color="C9D3E3" w:sz="4"/>
+              <w:bottom w:val="single" w:color="C9D3E3" w:sz="4"/>
+              <w:right w:val="single" w:color="C9D3E3" w:sz="4"/>
+            </w:tcBorders>
+            <w:tcMar>
+              <w:top w:type="dxa" w:w="60"/>
+              <w:left w:type="dxa" w:w="90"/>
+              <w:bottom w:type="dxa" w:w="60"/>
+              <w:right w:type="dxa" w:w="90"/>
+            </w:tcMar>
+            <w:vAlign w:val="center"/>
+          </w:tcPr>
+          <w:p>
+            <w:pPr>
+              <w:spacing w:after="0"/>
+              <w:jc w:val="left"/>
+            </w:pPr>
+            <w:r>
+              <w:rPr>
+                <w:rFonts w:ascii="Arial" w:cs="Arial" w:eastAsia="Arial" w:hAnsi="Arial"/>
+                <w:b w:val="false"/>
+                <w:bCs w:val="false"/>
+                <w:color w:val="000000"/>
+                <w:sz w:val="17"/>
+                <w:szCs w:val="17"/>
+              </w:rPr>
+              <w:t xml:space="preserve">Hala produkcyjna (część parterowa)</w:t>
+            </w:r>
+          </w:p>
+        </w:tc>
+        <w:tc>
+          <w:tcPr>
+            <w:tcW w:type="dxa" w:w="1349"/>
+            <w:tcBorders>
+              <w:top w:val="single" w:color="C9D3E3" w:sz="4"/>
+              <w:left w:val="single" w:color="C9D3E3" w:sz="4"/>
+              <w:bottom w:val="single" w:color="C9D3E3" w:sz="4"/>
+              <w:right w:val="single" w:color="C9D3E3" w:sz="4"/>
+            </w:tcBorders>
+            <w:tcMar>
+              <w:top w:type="dxa" w:w="60"/>
+              <w:left w:type="dxa" w:w="90"/>
+              <w:bottom w:type="dxa" w:w="60"/>
+              <w:right w:type="dxa" w:w="90"/>
+            </w:tcMar>
+            <w:vAlign w:val="center"/>
+          </w:tcPr>
+          <w:p>
+            <w:pPr>
+              <w:spacing w:after="0"/>
+              <w:jc w:val="right"/>
+            </w:pPr>
+            <w:r>
+              <w:rPr>
+                <w:rFonts w:ascii="Arial" w:cs="Arial" w:eastAsia="Arial" w:hAnsi="Arial"/>
+                <w:b w:val="false"/>
+                <w:bCs w:val="false"/>
+                <w:color w:val="000000"/>
+                <w:sz w:val="17"/>
+                <w:szCs w:val="17"/>
+              </w:rPr>
+              <w:t xml:space="preserve">13 050,14</w:t>
+            </w:r>
+          </w:p>
+        </w:tc>
+        <w:tc>
+          <w:tcPr>
+            <w:tcW w:type="dxa" w:w="1349"/>
+            <w:tcBorders>
+              <w:top w:val="single" w:color="C9D3E3" w:sz="4"/>
+              <w:left w:val="single" w:color="C9D3E3" w:sz="4"/>
+              <w:bottom w:val="single" w:color="C9D3E3" w:sz="4"/>
+              <w:right w:val="single" w:color="C9D3E3" w:sz="4"/>
+            </w:tcBorders>
+            <w:tcMar>
+              <w:top w:type="dxa" w:w="60"/>
+              <w:left w:type="dxa" w:w="90"/>
+              <w:bottom w:type="dxa" w:w="60"/>
+              <w:right w:type="dxa" w:w="90"/>
+            </w:tcMar>
+            <w:vAlign w:val="center"/>
+          </w:tcPr>
+          <w:p>
+            <w:pPr>
+              <w:spacing w:after="0"/>
+              <w:jc w:val="right"/>
+            </w:pPr>
+            <w:r>
+              <w:rPr>
+                <w:rFonts w:ascii="Arial" w:cs="Arial" w:eastAsia="Arial" w:hAnsi="Arial"/>
+                <w:b w:val="false"/>
+                <w:bCs w:val="false"/>
+                <w:color w:val="000000"/>
+                <w:sz w:val="17"/>
+                <w:szCs w:val="17"/>
+              </w:rPr>
+              <w:t xml:space="preserve">1 696,14</w:t>
+            </w:r>
+          </w:p>
+        </w:tc>
+        <w:tc>
+          <w:tcPr>
+            <w:tcW w:type="dxa" w:w="963"/>
+            <w:tcBorders>
+              <w:top w:val="single" w:color="C9D3E3" w:sz="4"/>
+              <w:left w:val="single" w:color="C9D3E3" w:sz="4"/>
+              <w:bottom w:val="single" w:color="C9D3E3" w:sz="4"/>
+              <w:right w:val="single" w:color="C9D3E3" w:sz="4"/>
+            </w:tcBorders>
+            <w:tcMar>
+              <w:top w:type="dxa" w:w="60"/>
+              <w:left w:type="dxa" w:w="90"/>
+              <w:bottom w:type="dxa" w:w="60"/>
+              <w:right w:type="dxa" w:w="90"/>
+            </w:tcMar>
+            <w:vAlign w:val="center"/>
+          </w:tcPr>
+          <w:p>
+            <w:pPr>
+              <w:spacing w:after="0"/>
+              <w:jc w:val="center"/>
+            </w:pPr>
+            <w:r>
+              <w:rPr>
+                <w:rFonts w:ascii="Arial" w:cs="Arial" w:eastAsia="Arial" w:hAnsi="Arial"/>
+                <w:b w:val="false"/>
+                <w:bCs w:val="false"/>
+                <w:color w:val="000000"/>
+                <w:sz w:val="17"/>
+                <w:szCs w:val="17"/>
+              </w:rPr>
+              <w:t xml:space="preserve">1</w:t>
+            </w:r>
+          </w:p>
+        </w:tc>
+        <w:tc>
+          <w:tcPr>
+            <w:tcW w:type="dxa" w:w="1542"/>
+            <w:tcBorders>
+              <w:top w:val="single" w:color="C9D3E3" w:sz="4"/>
+              <w:left w:val="single" w:color="C9D3E3" w:sz="4"/>
+              <w:bottom w:val="single" w:color="C9D3E3" w:sz="4"/>
+              <w:right w:val="single" w:color="C9D3E3" w:sz="4"/>
+            </w:tcBorders>
+            <w:tcMar>
+              <w:top w:type="dxa" w:w="60"/>
+              <w:left w:type="dxa" w:w="90"/>
+              <w:bottom w:type="dxa" w:w="60"/>
+              <w:right w:type="dxa" w:w="90"/>
+            </w:tcMar>
+            <w:vAlign w:val="center"/>
+          </w:tcPr>
+          <w:p>
+            <w:pPr>
+              <w:spacing w:after="0"/>
+              <w:jc w:val="right"/>
+            </w:pPr>
+            <w:r>
+              <w:rPr>
+                <w:rFonts w:ascii="Arial" w:cs="Arial" w:eastAsia="Arial" w:hAnsi="Arial"/>
+                <w:b w:val="false"/>
+                <w:bCs w:val="false"/>
+                <w:color w:val="000000"/>
+                <w:sz w:val="17"/>
+                <w:szCs w:val="17"/>
+              </w:rPr>
+              <w:t xml:space="preserve">prefabrykowany szkielet żelbetowy, dach płaski, sieci wewnętrzne</w:t>
+            </w:r>
+          </w:p>
+        </w:tc>
+        <w:tc>
+          <w:tcPr>
+            <w:tcW w:type="dxa" w:w="1159"/>
+            <w:tcBorders>
+              <w:top w:val="single" w:color="C9D3E3" w:sz="4"/>
+              <w:left w:val="single" w:color="C9D3E3" w:sz="4"/>
+              <w:bottom w:val="single" w:color="C9D3E3" w:sz="4"/>
+              <w:right w:val="single" w:color="C9D3E3" w:sz="4"/>
+            </w:tcBorders>
+            <w:tcMar>
+              <w:top w:type="dxa" w:w="60"/>
+              <w:left w:type="dxa" w:w="90"/>
+              <w:bottom w:type="dxa" w:w="60"/>
+              <w:right w:type="dxa" w:w="90"/>
+            </w:tcMar>
+            <w:vAlign w:val="center"/>
+          </w:tcPr>
+          <w:p>
+            <w:pPr>
+              <w:spacing w:after="0"/>
+              <w:jc w:val="right"/>
+            </w:pPr>
+            <w:r>
+              <w:rPr>
+                <w:rFonts w:ascii="Arial" w:cs="Arial" w:eastAsia="Arial" w:hAnsi="Arial"/>
+                <w:b w:val="false"/>
+                <w:bCs w:val="false"/>
+                <w:color w:val="000000"/>
+                <w:sz w:val="17"/>
+                <w:szCs w:val="17"/>
+              </w:rPr>
+              <w:t xml:space="preserve">428 170,32</w:t>
+            </w:r>
+          </w:p>
+        </w:tc>
+      </w:tr>
+      <w:tr>
+        <w:trPr>
+          <w:cantSplit/>
+          <w:tblHeader w:val="false"/>
+        </w:trPr>
+        <w:tc>
+          <w:tcPr>
+            <w:tcW w:type="dxa" w:w="3276"/>
+            <w:tcBorders>
+              <w:top w:val="single" w:color="C9D3E3" w:sz="4"/>
+              <w:left w:val="single" w:color="C9D3E3" w:sz="4"/>
+              <w:bottom w:val="single" w:color="C9D3E3" w:sz="4"/>
+              <w:right w:val="single" w:color="C9D3E3" w:sz="4"/>
+            </w:tcBorders>
+            <w:tcMar>
+              <w:top w:type="dxa" w:w="60"/>
+              <w:left w:type="dxa" w:w="90"/>
+              <w:bottom w:type="dxa" w:w="60"/>
+              <w:right w:type="dxa" w:w="90"/>
+            </w:tcMar>
+            <w:vAlign w:val="center"/>
+          </w:tcPr>
+          <w:p>
+            <w:pPr>
+              <w:spacing w:after="0"/>
+              <w:jc w:val="left"/>
+            </w:pPr>
+            <w:r>
+              <w:rPr>
+                <w:rFonts w:ascii="Arial" w:cs="Arial" w:eastAsia="Arial" w:hAnsi="Arial"/>
+                <w:b w:val="false"/>
+                <w:bCs w:val="false"/>
+                <w:color w:val="000000"/>
+                <w:sz w:val="17"/>
+                <w:szCs w:val="17"/>
+              </w:rPr>
+              <w:t xml:space="preserve">Budynek produkcyjno-magazynowy (część czterokondygnacyjna)</w:t>
+            </w:r>
+          </w:p>
+        </w:tc>
+        <w:tc>
+          <w:tcPr>
+            <w:tcW w:type="dxa" w:w="1349"/>
+            <w:tcBorders>
+              <w:top w:val="single" w:color="C9D3E3" w:sz="4"/>
+              <w:left w:val="single" w:color="C9D3E3" w:sz="4"/>
+              <w:bottom w:val="single" w:color="C9D3E3" w:sz="4"/>
+              <w:right w:val="single" w:color="C9D3E3" w:sz="4"/>
+            </w:tcBorders>
+            <w:tcMar>
+              <w:top w:type="dxa" w:w="60"/>
+              <w:left w:type="dxa" w:w="90"/>
+              <w:bottom w:type="dxa" w:w="60"/>
+              <w:right w:type="dxa" w:w="90"/>
+            </w:tcMar>
+            <w:vAlign w:val="center"/>
+          </w:tcPr>
+          <w:p>
+            <w:pPr>
+              <w:spacing w:after="0"/>
+              <w:jc w:val="right"/>
+            </w:pPr>
+            <w:r>
+              <w:rPr>
+                <w:rFonts w:ascii="Arial" w:cs="Arial" w:eastAsia="Arial" w:hAnsi="Arial"/>
+                <w:b w:val="false"/>
+                <w:bCs w:val="false"/>
+                <w:color w:val="000000"/>
+                <w:sz w:val="17"/>
+                <w:szCs w:val="17"/>
+              </w:rPr>
+              <w:t xml:space="preserve">5 655,36</w:t>
+            </w:r>
+          </w:p>
+        </w:tc>
+        <w:tc>
+          <w:tcPr>
+            <w:tcW w:type="dxa" w:w="1349"/>
+            <w:tcBorders>
+              <w:top w:val="single" w:color="C9D3E3" w:sz="4"/>
+              <w:left w:val="single" w:color="C9D3E3" w:sz="4"/>
+              <w:bottom w:val="single" w:color="C9D3E3" w:sz="4"/>
+              <w:right w:val="single" w:color="C9D3E3" w:sz="4"/>
+            </w:tcBorders>
+            <w:tcMar>
+              <w:top w:type="dxa" w:w="60"/>
+              <w:left w:type="dxa" w:w="90"/>
+              <w:bottom w:type="dxa" w:w="60"/>
+              <w:right w:type="dxa" w:w="90"/>
+            </w:tcMar>
+            <w:vAlign w:val="center"/>
+          </w:tcPr>
+          <w:p>
+            <w:pPr>
+              <w:spacing w:after="0"/>
+              <w:jc w:val="right"/>
+            </w:pPr>
+            <w:r>
+              <w:rPr>
+                <w:rFonts w:ascii="Arial" w:cs="Arial" w:eastAsia="Arial" w:hAnsi="Arial"/>
+                <w:b w:val="false"/>
+                <w:bCs w:val="false"/>
+                <w:color w:val="000000"/>
+                <w:sz w:val="17"/>
+                <w:szCs w:val="17"/>
+              </w:rPr>
+              <w:t xml:space="preserve">327,50</w:t>
+            </w:r>
+          </w:p>
+        </w:tc>
+        <w:tc>
+          <w:tcPr>
+            <w:tcW w:type="dxa" w:w="963"/>
+            <w:tcBorders>
+              <w:top w:val="single" w:color="C9D3E3" w:sz="4"/>
+              <w:left w:val="single" w:color="C9D3E3" w:sz="4"/>
+              <w:bottom w:val="single" w:color="C9D3E3" w:sz="4"/>
+              <w:right w:val="single" w:color="C9D3E3" w:sz="4"/>
+            </w:tcBorders>
+            <w:tcMar>
+              <w:top w:type="dxa" w:w="60"/>
+              <w:left w:type="dxa" w:w="90"/>
+              <w:bottom w:type="dxa" w:w="60"/>
+              <w:right w:type="dxa" w:w="90"/>
+            </w:tcMar>
+            <w:vAlign w:val="center"/>
+          </w:tcPr>
+          <w:p>
+            <w:pPr>
+              <w:spacing w:after="0"/>
+              <w:jc w:val="center"/>
+            </w:pPr>
+            <w:r>
+              <w:rPr>
+                <w:rFonts w:ascii="Arial" w:cs="Arial" w:eastAsia="Arial" w:hAnsi="Arial"/>
+                <w:b w:val="false"/>
+                <w:bCs w:val="false"/>
+                <w:color w:val="000000"/>
+                <w:sz w:val="17"/>
+                <w:szCs w:val="17"/>
+              </w:rPr>
+              <w:t xml:space="preserve">4</w:t>
+            </w:r>
+          </w:p>
+        </w:tc>
+        <w:tc>
+          <w:tcPr>
+            <w:tcW w:type="dxa" w:w="1542"/>
+            <w:tcBorders>
+              <w:top w:val="single" w:color="C9D3E3" w:sz="4"/>
+              <w:left w:val="single" w:color="C9D3E3" w:sz="4"/>
+              <w:bottom w:val="single" w:color="C9D3E3" w:sz="4"/>
+              <w:right w:val="single" w:color="C9D3E3" w:sz="4"/>
+            </w:tcBorders>
+            <w:tcMar>
+              <w:top w:type="dxa" w:w="60"/>
+              <w:left w:type="dxa" w:w="90"/>
+              <w:bottom w:type="dxa" w:w="60"/>
+              <w:right w:type="dxa" w:w="90"/>
+            </w:tcMar>
+            <w:vAlign w:val="center"/>
+          </w:tcPr>
+          <w:p>
+            <w:pPr>
+              <w:spacing w:after="0"/>
+              <w:jc w:val="right"/>
+            </w:pPr>
+            <w:r>
+              <w:rPr>
+                <w:rFonts w:ascii="Arial" w:cs="Arial" w:eastAsia="Arial" w:hAnsi="Arial"/>
+                <w:b w:val="false"/>
+                <w:bCs w:val="false"/>
+                <w:color w:val="000000"/>
+                <w:sz w:val="17"/>
+                <w:szCs w:val="17"/>
+              </w:rPr>
+              <w:t xml:space="preserve">prefabrykowany szkielet żelbetowy, dach płaski</w:t>
+            </w:r>
+          </w:p>
+        </w:tc>
+        <w:tc>
+          <w:tcPr>
+            <w:tcW w:type="dxa" w:w="1159"/>
+            <w:tcBorders>
+              <w:top w:val="single" w:color="C9D3E3" w:sz="4"/>
+              <w:left w:val="single" w:color="C9D3E3" w:sz="4"/>
+              <w:bottom w:val="single" w:color="C9D3E3" w:sz="4"/>
+              <w:right w:val="single" w:color="C9D3E3" w:sz="4"/>
+            </w:tcBorders>
+            <w:tcMar>
+              <w:top w:type="dxa" w:w="60"/>
+              <w:left w:type="dxa" w:w="90"/>
+              <w:bottom w:type="dxa" w:w="60"/>
+              <w:right w:type="dxa" w:w="90"/>
+            </w:tcMar>
+            <w:vAlign w:val="center"/>
+          </w:tcPr>
+          <w:p>
+            <w:pPr>
+              <w:spacing w:after="0"/>
+              <w:jc w:val="right"/>
+            </w:pPr>
+            <w:r>
+              <w:rPr>
+                <w:rFonts w:ascii="Arial" w:cs="Arial" w:eastAsia="Arial" w:hAnsi="Arial"/>
+                <w:b w:val="false"/>
+                <w:bCs w:val="false"/>
+                <w:color w:val="000000"/>
+                <w:sz w:val="17"/>
+                <w:szCs w:val="17"/>
+              </w:rPr>
+              <w:t xml:space="preserve">320 165,36</w:t>
+            </w:r>
+          </w:p>
+        </w:tc>
+      </w:tr>
+      <w:tr>
+        <w:trPr>
+          <w:cantSplit/>
+          <w:tblHeader w:val="false"/>
+        </w:trPr>
+        <w:tc>
+          <w:tcPr>
+            <w:tcW w:type="dxa" w:w="3276"/>
+            <w:tcBorders>
+              <w:top w:val="single" w:color="C9D3E3" w:sz="4"/>
+              <w:left w:val="single" w:color="C9D3E3" w:sz="4"/>
+              <w:bottom w:val="single" w:color="C9D3E3" w:sz="4"/>
+              <w:right w:val="single" w:color="C9D3E3" w:sz="4"/>
+            </w:tcBorders>
+            <w:tcMar>
+              <w:top w:type="dxa" w:w="60"/>
+              <w:left w:type="dxa" w:w="90"/>
+              <w:bottom w:type="dxa" w:w="60"/>
+              <w:right w:type="dxa" w:w="90"/>
+            </w:tcMar>
+            <w:vAlign w:val="center"/>
+          </w:tcPr>
+          <w:p>
+            <w:pPr>
+              <w:spacing w:after="0"/>
+              <w:jc w:val="left"/>
+            </w:pPr>
+            <w:r>
+              <w:rPr>
+                <w:rFonts w:ascii="Arial" w:cs="Arial" w:eastAsia="Arial" w:hAnsi="Arial"/>
+                <w:b w:val="false"/>
+                <w:bCs w:val="false"/>
+                <w:color w:val="000000"/>
+                <w:sz w:val="17"/>
+                <w:szCs w:val="17"/>
+              </w:rPr>
+              <w:t xml:space="preserve">Garaże</w:t>
+            </w:r>
+          </w:p>
+        </w:tc>
+        <w:tc>
+          <w:tcPr>
+            <w:tcW w:type="dxa" w:w="1349"/>
+            <w:tcBorders>
+              <w:top w:val="single" w:color="C9D3E3" w:sz="4"/>
+              <w:left w:val="single" w:color="C9D3E3" w:sz="4"/>
+              <w:bottom w:val="single" w:color="C9D3E3" w:sz="4"/>
+              <w:right w:val="single" w:color="C9D3E3" w:sz="4"/>
+            </w:tcBorders>
+            <w:tcMar>
+              <w:top w:type="dxa" w:w="60"/>
+              <w:left w:type="dxa" w:w="90"/>
+              <w:bottom w:type="dxa" w:w="60"/>
+              <w:right w:type="dxa" w:w="90"/>
+            </w:tcMar>
+            <w:vAlign w:val="center"/>
+          </w:tcPr>
+          <w:p>
+            <w:pPr>
+              <w:spacing w:after="0"/>
+              <w:jc w:val="right"/>
+            </w:pPr>
+            <w:r>
+              <w:rPr>
+                <w:rFonts w:ascii="Arial" w:cs="Arial" w:eastAsia="Arial" w:hAnsi="Arial"/>
+                <w:b w:val="false"/>
+                <w:bCs w:val="false"/>
+                <w:color w:val="000000"/>
+                <w:sz w:val="17"/>
+                <w:szCs w:val="17"/>
+              </w:rPr>
+              <w:t xml:space="preserve">3 511,66</w:t>
+            </w:r>
+          </w:p>
+        </w:tc>
+        <w:tc>
+          <w:tcPr>
+            <w:tcW w:type="dxa" w:w="1349"/>
+            <w:tcBorders>
+              <w:top w:val="single" w:color="C9D3E3" w:sz="4"/>
+              <w:left w:val="single" w:color="C9D3E3" w:sz="4"/>
+              <w:bottom w:val="single" w:color="C9D3E3" w:sz="4"/>
+              <w:right w:val="single" w:color="C9D3E3" w:sz="4"/>
+            </w:tcBorders>
+            <w:tcMar>
+              <w:top w:type="dxa" w:w="60"/>
+              <w:left w:type="dxa" w:w="90"/>
+              <w:bottom w:type="dxa" w:w="60"/>
+              <w:right w:type="dxa" w:w="90"/>
+            </w:tcMar>
+            <w:vAlign w:val="center"/>
+          </w:tcPr>
+          <w:p>
+            <w:pPr>
+              <w:spacing w:after="0"/>
+              <w:jc w:val="right"/>
+            </w:pPr>
+            <w:r>
+              <w:rPr>
+                <w:rFonts w:ascii="Arial" w:cs="Arial" w:eastAsia="Arial" w:hAnsi="Arial"/>
+                <w:b w:val="false"/>
+                <w:bCs w:val="false"/>
+                <w:color w:val="000000"/>
+                <w:sz w:val="17"/>
+                <w:szCs w:val="17"/>
+              </w:rPr>
+              <w:t xml:space="preserve">445,31</w:t>
+            </w:r>
+          </w:p>
+        </w:tc>
+        <w:tc>
+          <w:tcPr>
+            <w:tcW w:type="dxa" w:w="963"/>
+            <w:tcBorders>
+              <w:top w:val="single" w:color="C9D3E3" w:sz="4"/>
+              <w:left w:val="single" w:color="C9D3E3" w:sz="4"/>
+              <w:bottom w:val="single" w:color="C9D3E3" w:sz="4"/>
+              <w:right w:val="single" w:color="C9D3E3" w:sz="4"/>
+            </w:tcBorders>
+            <w:tcMar>
+              <w:top w:type="dxa" w:w="60"/>
+              <w:left w:type="dxa" w:w="90"/>
+              <w:bottom w:type="dxa" w:w="60"/>
+              <w:right w:type="dxa" w:w="90"/>
+            </w:tcMar>
+            <w:vAlign w:val="center"/>
+          </w:tcPr>
+          <w:p>
+            <w:pPr>
+              <w:spacing w:after="0"/>
+              <w:jc w:val="center"/>
+            </w:pPr>
+            <w:r>
+              <w:rPr>
+                <w:rFonts w:ascii="Arial" w:cs="Arial" w:eastAsia="Arial" w:hAnsi="Arial"/>
+                <w:b w:val="false"/>
+                <w:bCs w:val="false"/>
+                <w:color w:val="000000"/>
+                <w:sz w:val="17"/>
+                <w:szCs w:val="17"/>
+              </w:rPr>
+              <w:t xml:space="preserve">2</w:t>
+            </w:r>
+          </w:p>
+        </w:tc>
+        <w:tc>
+          <w:tcPr>
+            <w:tcW w:type="dxa" w:w="1542"/>
+            <w:tcBorders>
+              <w:top w:val="single" w:color="C9D3E3" w:sz="4"/>
+              <w:left w:val="single" w:color="C9D3E3" w:sz="4"/>
+              <w:bottom w:val="single" w:color="C9D3E3" w:sz="4"/>
+              <w:right w:val="single" w:color="C9D3E3" w:sz="4"/>
+            </w:tcBorders>
+            <w:tcMar>
+              <w:top w:type="dxa" w:w="60"/>
+              <w:left w:type="dxa" w:w="90"/>
+              <w:bottom w:type="dxa" w:w="60"/>
+              <w:right w:type="dxa" w:w="90"/>
+            </w:tcMar>
+            <w:vAlign w:val="center"/>
+          </w:tcPr>
+          <w:p>
+            <w:pPr>
+              <w:spacing w:after="0"/>
+              <w:jc w:val="right"/>
+            </w:pPr>
+            <w:r>
+              <w:rPr>
+                <w:rFonts w:ascii="Arial" w:cs="Arial" w:eastAsia="Arial" w:hAnsi="Arial"/>
+                <w:b w:val="false"/>
+                <w:bCs w:val="false"/>
+                <w:color w:val="000000"/>
+                <w:sz w:val="17"/>
+                <w:szCs w:val="17"/>
+              </w:rPr>
+              <w:t xml:space="preserve">murowane / montowane</w:t>
+            </w:r>
+          </w:p>
+        </w:tc>
+        <w:tc>
+          <w:tcPr>
+            <w:tcW w:type="dxa" w:w="1159"/>
+            <w:tcBorders>
+              <w:top w:val="single" w:color="C9D3E3" w:sz="4"/>
+              <w:left w:val="single" w:color="C9D3E3" w:sz="4"/>
+              <w:bottom w:val="single" w:color="C9D3E3" w:sz="4"/>
+              <w:right w:val="single" w:color="C9D3E3" w:sz="4"/>
+            </w:tcBorders>
+            <w:tcMar>
+              <w:top w:type="dxa" w:w="60"/>
+              <w:left w:type="dxa" w:w="90"/>
+              <w:bottom w:type="dxa" w:w="60"/>
+              <w:right w:type="dxa" w:w="90"/>
+            </w:tcMar>
+            <w:vAlign w:val="center"/>
+          </w:tcPr>
+          <w:p>
+            <w:pPr>
+              <w:spacing w:after="0"/>
+              <w:jc w:val="right"/>
+            </w:pPr>
+            <w:r>
+              <w:rPr>
+                <w:rFonts w:ascii="Arial" w:cs="Arial" w:eastAsia="Arial" w:hAnsi="Arial"/>
+                <w:b w:val="false"/>
+                <w:bCs w:val="false"/>
+                <w:color w:val="000000"/>
+                <w:sz w:val="17"/>
+                <w:szCs w:val="17"/>
+              </w:rPr>
+              <w:t xml:space="preserve">28 860,05</w:t>
+            </w:r>
+          </w:p>
+        </w:tc>
+      </w:tr>
+      <w:tr>
+        <w:trPr>
+          <w:cantSplit/>
+          <w:tblHeader w:val="false"/>
+        </w:trPr>
+        <w:tc>
+          <w:tcPr>
+            <w:tcW w:type="dxa" w:w="3276"/>
+            <w:tcBorders>
+              <w:top w:val="single" w:color="C9D3E3" w:sz="4"/>
+              <w:left w:val="single" w:color="C9D3E3" w:sz="4"/>
+              <w:bottom w:val="single" w:color="C9D3E3" w:sz="4"/>
+              <w:right w:val="single" w:color="C9D3E3" w:sz="4"/>
+            </w:tcBorders>
+            <w:tcMar>
+              <w:top w:type="dxa" w:w="60"/>
+              <w:left w:type="dxa" w:w="90"/>
+              <w:bottom w:type="dxa" w:w="60"/>
+              <w:right w:type="dxa" w:w="90"/>
+            </w:tcMar>
+            <w:vAlign w:val="center"/>
+          </w:tcPr>
+          <w:p>
+            <w:pPr>
+              <w:spacing w:after="0"/>
+              <w:jc w:val="left"/>
+            </w:pPr>
+            <w:r>
+              <w:rPr>
+                <w:rFonts w:ascii="Arial" w:cs="Arial" w:eastAsia="Arial" w:hAnsi="Arial"/>
+                <w:b w:val="false"/>
+                <w:bCs w:val="false"/>
+                <w:color w:val="000000"/>
+                <w:sz w:val="17"/>
+                <w:szCs w:val="17"/>
+              </w:rPr>
+              <w:t xml:space="preserve">Kotłownia</w:t>
+            </w:r>
+          </w:p>
+        </w:tc>
+        <w:tc>
+          <w:tcPr>
+            <w:tcW w:type="dxa" w:w="1349"/>
+            <w:tcBorders>
+              <w:top w:val="single" w:color="C9D3E3" w:sz="4"/>
+              <w:left w:val="single" w:color="C9D3E3" w:sz="4"/>
+              <w:bottom w:val="single" w:color="C9D3E3" w:sz="4"/>
+              <w:right w:val="single" w:color="C9D3E3" w:sz="4"/>
+            </w:tcBorders>
+            <w:tcMar>
+              <w:top w:type="dxa" w:w="60"/>
+              <w:left w:type="dxa" w:w="90"/>
+              <w:bottom w:type="dxa" w:w="60"/>
+              <w:right w:type="dxa" w:w="90"/>
+            </w:tcMar>
+            <w:vAlign w:val="center"/>
+          </w:tcPr>
+          <w:p>
+            <w:pPr>
+              <w:spacing w:after="0"/>
+              <w:jc w:val="right"/>
+            </w:pPr>
+            <w:r>
+              <w:rPr>
+                <w:rFonts w:ascii="Arial" w:cs="Arial" w:eastAsia="Arial" w:hAnsi="Arial"/>
+                <w:b w:val="false"/>
+                <w:bCs w:val="false"/>
+                <w:color w:val="000000"/>
+                <w:sz w:val="17"/>
+                <w:szCs w:val="17"/>
+              </w:rPr>
+              <w:t xml:space="preserve">1 106,17</w:t>
+            </w:r>
+          </w:p>
+        </w:tc>
+        <w:tc>
+          <w:tcPr>
+            <w:tcW w:type="dxa" w:w="1349"/>
+            <w:tcBorders>
+              <w:top w:val="single" w:color="C9D3E3" w:sz="4"/>
+              <w:left w:val="single" w:color="C9D3E3" w:sz="4"/>
+              <w:bottom w:val="single" w:color="C9D3E3" w:sz="4"/>
+              <w:right w:val="single" w:color="C9D3E3" w:sz="4"/>
+            </w:tcBorders>
+            <w:tcMar>
+              <w:top w:type="dxa" w:w="60"/>
+              <w:left w:type="dxa" w:w="90"/>
+              <w:bottom w:type="dxa" w:w="60"/>
+              <w:right w:type="dxa" w:w="90"/>
+            </w:tcMar>
+            <w:vAlign w:val="center"/>
+          </w:tcPr>
+          <w:p>
+            <w:pPr>
+              <w:spacing w:after="0"/>
+              <w:jc w:val="right"/>
+            </w:pPr>
+            <w:r>
+              <w:rPr>
+                <w:rFonts w:ascii="Arial" w:cs="Arial" w:eastAsia="Arial" w:hAnsi="Arial"/>
+                <w:b w:val="false"/>
+                <w:bCs w:val="false"/>
+                <w:color w:val="000000"/>
+                <w:sz w:val="17"/>
+                <w:szCs w:val="17"/>
+              </w:rPr>
+              <w:t xml:space="preserve">152,90</w:t>
+            </w:r>
+          </w:p>
+        </w:tc>
+        <w:tc>
+          <w:tcPr>
+            <w:tcW w:type="dxa" w:w="963"/>
+            <w:tcBorders>
+              <w:top w:val="single" w:color="C9D3E3" w:sz="4"/>
+              <w:left w:val="single" w:color="C9D3E3" w:sz="4"/>
+              <w:bottom w:val="single" w:color="C9D3E3" w:sz="4"/>
+              <w:right w:val="single" w:color="C9D3E3" w:sz="4"/>
+            </w:tcBorders>
+            <w:tcMar>
+              <w:top w:type="dxa" w:w="60"/>
+              <w:left w:type="dxa" w:w="90"/>
+              <w:bottom w:type="dxa" w:w="60"/>
+              <w:right w:type="dxa" w:w="90"/>
+            </w:tcMar>
+            <w:vAlign w:val="center"/>
+          </w:tcPr>
+          <w:p>
+            <w:pPr>
+              <w:spacing w:after="0"/>
+              <w:jc w:val="center"/>
+            </w:pPr>
+            <w:r>
+              <w:rPr>
+                <w:rFonts w:ascii="Arial" w:cs="Arial" w:eastAsia="Arial" w:hAnsi="Arial"/>
+                <w:b w:val="false"/>
+                <w:bCs w:val="false"/>
+                <w:color w:val="000000"/>
+                <w:sz w:val="17"/>
+                <w:szCs w:val="17"/>
+              </w:rPr>
+              <w:t xml:space="preserve">1</w:t>
+            </w:r>
+          </w:p>
+        </w:tc>
+        <w:tc>
+          <w:tcPr>
+            <w:tcW w:type="dxa" w:w="1542"/>
+            <w:tcBorders>
+              <w:top w:val="single" w:color="C9D3E3" w:sz="4"/>
+              <w:left w:val="single" w:color="C9D3E3" w:sz="4"/>
+              <w:bottom w:val="single" w:color="C9D3E3" w:sz="4"/>
+              <w:right w:val="single" w:color="C9D3E3" w:sz="4"/>
+            </w:tcBorders>
+            <w:tcMar>
+              <w:top w:type="dxa" w:w="60"/>
+              <w:left w:type="dxa" w:w="90"/>
+              <w:bottom w:type="dxa" w:w="60"/>
+              <w:right w:type="dxa" w:w="90"/>
+            </w:tcMar>
+            <w:vAlign w:val="center"/>
+          </w:tcPr>
+          <w:p>
+            <w:pPr>
+              <w:spacing w:after="0"/>
+              <w:jc w:val="right"/>
+            </w:pPr>
+            <w:r>
+              <w:rPr>
+                <w:rFonts w:ascii="Arial" w:cs="Arial" w:eastAsia="Arial" w:hAnsi="Arial"/>
+                <w:b w:val="false"/>
+                <w:bCs w:val="false"/>
+                <w:color w:val="000000"/>
+                <w:sz w:val="17"/>
+                <w:szCs w:val="17"/>
+              </w:rPr>
+              <w:t xml:space="preserve">murowana</w:t>
+            </w:r>
+          </w:p>
+        </w:tc>
+        <w:tc>
+          <w:tcPr>
+            <w:tcW w:type="dxa" w:w="1159"/>
+            <w:tcBorders>
+              <w:top w:val="single" w:color="C9D3E3" w:sz="4"/>
+              <w:left w:val="single" w:color="C9D3E3" w:sz="4"/>
+              <w:bottom w:val="single" w:color="C9D3E3" w:sz="4"/>
+              <w:right w:val="single" w:color="C9D3E3" w:sz="4"/>
+            </w:tcBorders>
+            <w:tcMar>
+              <w:top w:type="dxa" w:w="60"/>
+              <w:left w:type="dxa" w:w="90"/>
+              <w:bottom w:type="dxa" w:w="60"/>
+              <w:right w:type="dxa" w:w="90"/>
+            </w:tcMar>
+            <w:vAlign w:val="center"/>
+          </w:tcPr>
+          <w:p>
+            <w:pPr>
+              <w:spacing w:after="0"/>
+              <w:jc w:val="right"/>
+            </w:pPr>
+            <w:r>
+              <w:rPr>
+                <w:rFonts w:ascii="Arial" w:cs="Arial" w:eastAsia="Arial" w:hAnsi="Arial"/>
+                <w:b w:val="false"/>
+                <w:bCs w:val="false"/>
+                <w:color w:val="000000"/>
+                <w:sz w:val="17"/>
+                <w:szCs w:val="17"/>
+              </w:rPr>
+              <w:t xml:space="preserve">35 164,98</w:t>
+            </w:r>
+          </w:p>
+        </w:tc>
+      </w:tr>
+      <w:tr>
+        <w:trPr>
+          <w:cantSplit/>
+          <w:tblHeader w:val="false"/>
+        </w:trPr>
+        <w:tc>
+          <w:tcPr>
+            <w:tcW w:type="dxa" w:w="3276"/>
+            <w:tcBorders>
+              <w:top w:val="single" w:color="C9D3E3" w:sz="4"/>
+              <w:left w:val="single" w:color="C9D3E3" w:sz="4"/>
+              <w:bottom w:val="single" w:color="C9D3E3" w:sz="4"/>
+              <w:right w:val="single" w:color="C9D3E3" w:sz="4"/>
+            </w:tcBorders>
+            <w:tcMar>
+              <w:top w:type="dxa" w:w="60"/>
+              <w:left w:type="dxa" w:w="90"/>
+              <w:bottom w:type="dxa" w:w="60"/>
+              <w:right w:type="dxa" w:w="90"/>
+            </w:tcMar>
+            <w:vAlign w:val="center"/>
+          </w:tcPr>
+          <w:p>
+            <w:pPr>
+              <w:spacing w:after="0"/>
+              <w:jc w:val="left"/>
+            </w:pPr>
+            <w:r>
+              <w:rPr>
+                <w:rFonts w:ascii="Arial" w:cs="Arial" w:eastAsia="Arial" w:hAnsi="Arial"/>
+                <w:b w:val="false"/>
+                <w:bCs w:val="false"/>
+                <w:color w:val="000000"/>
+                <w:sz w:val="17"/>
+                <w:szCs w:val="17"/>
+              </w:rPr>
+              <w:t xml:space="preserve">Gospodarka olejowa</w:t>
+            </w:r>
+          </w:p>
+        </w:tc>
+        <w:tc>
+          <w:tcPr>
+            <w:tcW w:type="dxa" w:w="1349"/>
+            <w:tcBorders>
+              <w:top w:val="single" w:color="C9D3E3" w:sz="4"/>
+              <w:left w:val="single" w:color="C9D3E3" w:sz="4"/>
+              <w:bottom w:val="single" w:color="C9D3E3" w:sz="4"/>
+              <w:right w:val="single" w:color="C9D3E3" w:sz="4"/>
+            </w:tcBorders>
+            <w:tcMar>
+              <w:top w:type="dxa" w:w="60"/>
+              <w:left w:type="dxa" w:w="90"/>
+              <w:bottom w:type="dxa" w:w="60"/>
+              <w:right w:type="dxa" w:w="90"/>
+            </w:tcMar>
+            <w:vAlign w:val="center"/>
+          </w:tcPr>
+          <w:p>
+            <w:pPr>
+              <w:spacing w:after="0"/>
+              <w:jc w:val="right"/>
+            </w:pPr>
+            <w:r>
+              <w:rPr>
+                <w:rFonts w:ascii="Arial" w:cs="Arial" w:eastAsia="Arial" w:hAnsi="Arial"/>
+                <w:b w:val="false"/>
+                <w:bCs w:val="false"/>
+                <w:color w:val="000000"/>
+                <w:sz w:val="17"/>
+                <w:szCs w:val="17"/>
+              </w:rPr>
+              <w:t xml:space="preserve">529,86</w:t>
+            </w:r>
+          </w:p>
+        </w:tc>
+        <w:tc>
+          <w:tcPr>
+            <w:tcW w:type="dxa" w:w="1349"/>
+            <w:tcBorders>
+              <w:top w:val="single" w:color="C9D3E3" w:sz="4"/>
+              <w:left w:val="single" w:color="C9D3E3" w:sz="4"/>
+              <w:bottom w:val="single" w:color="C9D3E3" w:sz="4"/>
+              <w:right w:val="single" w:color="C9D3E3" w:sz="4"/>
+            </w:tcBorders>
+            <w:tcMar>
+              <w:top w:type="dxa" w:w="60"/>
+              <w:left w:type="dxa" w:w="90"/>
+              <w:bottom w:type="dxa" w:w="60"/>
+              <w:right w:type="dxa" w:w="90"/>
+            </w:tcMar>
+            <w:vAlign w:val="center"/>
+          </w:tcPr>
+          <w:p>
+            <w:pPr>
+              <w:spacing w:after="0"/>
+              <w:jc w:val="right"/>
+            </w:pPr>
+            <w:r>
+              <w:rPr>
+                <w:rFonts w:ascii="Arial" w:cs="Arial" w:eastAsia="Arial" w:hAnsi="Arial"/>
+                <w:b w:val="false"/>
+                <w:bCs w:val="false"/>
+                <w:color w:val="000000"/>
+                <w:sz w:val="17"/>
+                <w:szCs w:val="17"/>
+              </w:rPr>
+              <w:t xml:space="preserve">109,02</w:t>
+            </w:r>
+          </w:p>
+        </w:tc>
+        <w:tc>
+          <w:tcPr>
+            <w:tcW w:type="dxa" w:w="963"/>
+            <w:tcBorders>
+              <w:top w:val="single" w:color="C9D3E3" w:sz="4"/>
+              <w:left w:val="single" w:color="C9D3E3" w:sz="4"/>
+              <w:bottom w:val="single" w:color="C9D3E3" w:sz="4"/>
+              <w:right w:val="single" w:color="C9D3E3" w:sz="4"/>
+            </w:tcBorders>
+            <w:tcMar>
+              <w:top w:type="dxa" w:w="60"/>
+              <w:left w:type="dxa" w:w="90"/>
+              <w:bottom w:type="dxa" w:w="60"/>
+              <w:right w:type="dxa" w:w="90"/>
+            </w:tcMar>
+            <w:vAlign w:val="center"/>
+          </w:tcPr>
+          <w:p>
+            <w:pPr>
+              <w:spacing w:after="0"/>
+              <w:jc w:val="center"/>
+            </w:pPr>
+            <w:r>
+              <w:rPr>
+                <w:rFonts w:ascii="Arial" w:cs="Arial" w:eastAsia="Arial" w:hAnsi="Arial"/>
+                <w:b w:val="false"/>
+                <w:bCs w:val="false"/>
+                <w:color w:val="000000"/>
+                <w:sz w:val="17"/>
+                <w:szCs w:val="17"/>
+              </w:rPr>
+              <w:t xml:space="preserve">1</w:t>
+            </w:r>
+          </w:p>
+        </w:tc>
+        <w:tc>
+          <w:tcPr>
+            <w:tcW w:type="dxa" w:w="1542"/>
+            <w:tcBorders>
+              <w:top w:val="single" w:color="C9D3E3" w:sz="4"/>
+              <w:left w:val="single" w:color="C9D3E3" w:sz="4"/>
+              <w:bottom w:val="single" w:color="C9D3E3" w:sz="4"/>
+              <w:right w:val="single" w:color="C9D3E3" w:sz="4"/>
+            </w:tcBorders>
+            <w:tcMar>
+              <w:top w:type="dxa" w:w="60"/>
+              <w:left w:type="dxa" w:w="90"/>
+              <w:bottom w:type="dxa" w:w="60"/>
+              <w:right w:type="dxa" w:w="90"/>
+            </w:tcMar>
+            <w:vAlign w:val="center"/>
+          </w:tcPr>
+          <w:p>
+            <w:pPr>
+              <w:spacing w:after="0"/>
+              <w:jc w:val="right"/>
+            </w:pPr>
+            <w:r>
+              <w:rPr>
+                <w:rFonts w:ascii="Arial" w:cs="Arial" w:eastAsia="Arial" w:hAnsi="Arial"/>
+                <w:b w:val="false"/>
+                <w:bCs w:val="false"/>
+                <w:color w:val="000000"/>
+                <w:sz w:val="17"/>
+                <w:szCs w:val="17"/>
+              </w:rPr>
+              <w:t xml:space="preserve">murowana</w:t>
+            </w:r>
+          </w:p>
+        </w:tc>
+        <w:tc>
+          <w:tcPr>
+            <w:tcW w:type="dxa" w:w="1159"/>
+            <w:tcBorders>
+              <w:top w:val="single" w:color="C9D3E3" w:sz="4"/>
+              <w:left w:val="single" w:color="C9D3E3" w:sz="4"/>
+              <w:bottom w:val="single" w:color="C9D3E3" w:sz="4"/>
+              <w:right w:val="single" w:color="C9D3E3" w:sz="4"/>
+            </w:tcBorders>
+            <w:tcMar>
+              <w:top w:type="dxa" w:w="60"/>
+              <w:left w:type="dxa" w:w="90"/>
+              <w:bottom w:type="dxa" w:w="60"/>
+              <w:right w:type="dxa" w:w="90"/>
+            </w:tcMar>
+            <w:vAlign w:val="center"/>
+          </w:tcPr>
+          <w:p>
+            <w:pPr>
+              <w:spacing w:after="0"/>
+              <w:jc w:val="right"/>
+            </w:pPr>
+            <w:r>
+              <w:rPr>
+                <w:rFonts w:ascii="Arial" w:cs="Arial" w:eastAsia="Arial" w:hAnsi="Arial"/>
+                <w:b w:val="false"/>
+                <w:bCs w:val="false"/>
+                <w:color w:val="000000"/>
+                <w:sz w:val="17"/>
+                <w:szCs w:val="17"/>
+              </w:rPr>
+              <w:t xml:space="preserve">19 377,16</w:t>
+            </w:r>
+          </w:p>
+        </w:tc>
+      </w:tr>
+      <w:tr>
+        <w:trPr>
+          <w:cantSplit/>
+          <w:tblHeader w:val="false"/>
+        </w:trPr>
+        <w:tc>
+          <w:tcPr>
+            <w:tcW w:type="dxa" w:w="3276"/>
+            <w:tcBorders>
+              <w:top w:val="single" w:color="C9D3E3" w:sz="4"/>
+              <w:left w:val="single" w:color="C9D3E3" w:sz="4"/>
+              <w:bottom w:val="single" w:color="C9D3E3" w:sz="4"/>
+              <w:right w:val="single" w:color="C9D3E3" w:sz="4"/>
+            </w:tcBorders>
+            <w:tcMar>
+              <w:top w:type="dxa" w:w="60"/>
+              <w:left w:type="dxa" w:w="90"/>
+              <w:bottom w:type="dxa" w:w="60"/>
+              <w:right w:type="dxa" w:w="90"/>
+            </w:tcMar>
+            <w:vAlign w:val="center"/>
+          </w:tcPr>
+          <w:p>
+            <w:pPr>
+              <w:spacing w:after="0"/>
+              <w:jc w:val="left"/>
+            </w:pPr>
+            <w:r>
+              <w:rPr>
+                <w:rFonts w:ascii="Arial" w:cs="Arial" w:eastAsia="Arial" w:hAnsi="Arial"/>
+                <w:b w:val="false"/>
+                <w:bCs w:val="false"/>
+                <w:color w:val="000000"/>
+                <w:sz w:val="17"/>
+                <w:szCs w:val="17"/>
+              </w:rPr>
+              <w:t xml:space="preserve">Stacja transformatorowa</w:t>
+            </w:r>
+          </w:p>
+        </w:tc>
+        <w:tc>
+          <w:tcPr>
+            <w:tcW w:type="dxa" w:w="1349"/>
+            <w:tcBorders>
+              <w:top w:val="single" w:color="C9D3E3" w:sz="4"/>
+              <w:left w:val="single" w:color="C9D3E3" w:sz="4"/>
+              <w:bottom w:val="single" w:color="C9D3E3" w:sz="4"/>
+              <w:right w:val="single" w:color="C9D3E3" w:sz="4"/>
+            </w:tcBorders>
+            <w:tcMar>
+              <w:top w:type="dxa" w:w="60"/>
+              <w:left w:type="dxa" w:w="90"/>
+              <w:bottom w:type="dxa" w:w="60"/>
+              <w:right w:type="dxa" w:w="90"/>
+            </w:tcMar>
+            <w:vAlign w:val="center"/>
+          </w:tcPr>
+          <w:p>
+            <w:pPr>
+              <w:spacing w:after="0"/>
+              <w:jc w:val="right"/>
+            </w:pPr>
+            <w:r>
+              <w:rPr>
+                <w:rFonts w:ascii="Arial" w:cs="Arial" w:eastAsia="Arial" w:hAnsi="Arial"/>
+                <w:b w:val="false"/>
+                <w:bCs w:val="false"/>
+                <w:color w:val="000000"/>
+                <w:sz w:val="17"/>
+                <w:szCs w:val="17"/>
+              </w:rPr>
+              <w:t xml:space="preserve">255,12</w:t>
+            </w:r>
+          </w:p>
+        </w:tc>
+        <w:tc>
+          <w:tcPr>
+            <w:tcW w:type="dxa" w:w="1349"/>
+            <w:tcBorders>
+              <w:top w:val="single" w:color="C9D3E3" w:sz="4"/>
+              <w:left w:val="single" w:color="C9D3E3" w:sz="4"/>
+              <w:bottom w:val="single" w:color="C9D3E3" w:sz="4"/>
+              <w:right w:val="single" w:color="C9D3E3" w:sz="4"/>
+            </w:tcBorders>
+            <w:tcMar>
+              <w:top w:type="dxa" w:w="60"/>
+              <w:left w:type="dxa" w:w="90"/>
+              <w:bottom w:type="dxa" w:w="60"/>
+              <w:right w:type="dxa" w:w="90"/>
+            </w:tcMar>
+            <w:vAlign w:val="center"/>
+          </w:tcPr>
+          <w:p>
+            <w:pPr>
+              <w:spacing w:after="0"/>
+              <w:jc w:val="right"/>
+            </w:pPr>
+            <w:r>
+              <w:rPr>
+                <w:rFonts w:ascii="Arial" w:cs="Arial" w:eastAsia="Arial" w:hAnsi="Arial"/>
+                <w:b w:val="false"/>
+                <w:bCs w:val="false"/>
+                <w:color w:val="000000"/>
+                <w:sz w:val="17"/>
+                <w:szCs w:val="17"/>
+              </w:rPr>
+              <w:t xml:space="preserve">56,07</w:t>
+            </w:r>
+          </w:p>
+        </w:tc>
+        <w:tc>
+          <w:tcPr>
+            <w:tcW w:type="dxa" w:w="963"/>
+            <w:tcBorders>
+              <w:top w:val="single" w:color="C9D3E3" w:sz="4"/>
+              <w:left w:val="single" w:color="C9D3E3" w:sz="4"/>
+              <w:bottom w:val="single" w:color="C9D3E3" w:sz="4"/>
+              <w:right w:val="single" w:color="C9D3E3" w:sz="4"/>
+            </w:tcBorders>
+            <w:tcMar>
+              <w:top w:type="dxa" w:w="60"/>
+              <w:left w:type="dxa" w:w="90"/>
+              <w:bottom w:type="dxa" w:w="60"/>
+              <w:right w:type="dxa" w:w="90"/>
+            </w:tcMar>
+            <w:vAlign w:val="center"/>
+          </w:tcPr>
+          <w:p>
+            <w:pPr>
+              <w:spacing w:after="0"/>
+              <w:jc w:val="center"/>
+            </w:pPr>
+            <w:r>
+              <w:rPr>
+                <w:rFonts w:ascii="Arial" w:cs="Arial" w:eastAsia="Arial" w:hAnsi="Arial"/>
+                <w:b w:val="false"/>
+                <w:bCs w:val="false"/>
+                <w:color w:val="000000"/>
+                <w:sz w:val="17"/>
+                <w:szCs w:val="17"/>
+              </w:rPr>
+              <w:t xml:space="preserve">1</w:t>
+            </w:r>
+          </w:p>
+        </w:tc>
+        <w:tc>
+          <w:tcPr>
+            <w:tcW w:type="dxa" w:w="1542"/>
+            <w:tcBorders>
+              <w:top w:val="single" w:color="C9D3E3" w:sz="4"/>
+              <w:left w:val="single" w:color="C9D3E3" w:sz="4"/>
+              <w:bottom w:val="single" w:color="C9D3E3" w:sz="4"/>
+              <w:right w:val="single" w:color="C9D3E3" w:sz="4"/>
+            </w:tcBorders>
+            <w:tcMar>
+              <w:top w:type="dxa" w:w="60"/>
+              <w:left w:type="dxa" w:w="90"/>
+              <w:bottom w:type="dxa" w:w="60"/>
+              <w:right w:type="dxa" w:w="90"/>
+            </w:tcMar>
+            <w:vAlign w:val="center"/>
+          </w:tcPr>
+          <w:p>
+            <w:pPr>
+              <w:spacing w:after="0"/>
+              <w:jc w:val="right"/>
+            </w:pPr>
+            <w:r>
+              <w:rPr>
+                <w:rFonts w:ascii="Arial" w:cs="Arial" w:eastAsia="Arial" w:hAnsi="Arial"/>
+                <w:b w:val="false"/>
+                <w:bCs w:val="false"/>
+                <w:color w:val="000000"/>
+                <w:sz w:val="17"/>
+                <w:szCs w:val="17"/>
+              </w:rPr>
+              <w:t xml:space="preserve">murowana</w:t>
+            </w:r>
+          </w:p>
+        </w:tc>
+        <w:tc>
+          <w:tcPr>
+            <w:tcW w:type="dxa" w:w="1159"/>
+            <w:tcBorders>
+              <w:top w:val="single" w:color="C9D3E3" w:sz="4"/>
+              <w:left w:val="single" w:color="C9D3E3" w:sz="4"/>
+              <w:bottom w:val="single" w:color="C9D3E3" w:sz="4"/>
+              <w:right w:val="single" w:color="C9D3E3" w:sz="4"/>
+            </w:tcBorders>
+            <w:tcMar>
+              <w:top w:type="dxa" w:w="60"/>
+              <w:left w:type="dxa" w:w="90"/>
+              <w:bottom w:type="dxa" w:w="60"/>
+              <w:right w:type="dxa" w:w="90"/>
+            </w:tcMar>
+            <w:vAlign w:val="center"/>
+          </w:tcPr>
+          <w:p>
+            <w:pPr>
+              <w:spacing w:after="0"/>
+              <w:jc w:val="right"/>
+            </w:pPr>
+            <w:r>
+              <w:rPr>
+                <w:rFonts w:ascii="Arial" w:cs="Arial" w:eastAsia="Arial" w:hAnsi="Arial"/>
+                <w:b w:val="false"/>
+                <w:bCs w:val="false"/>
+                <w:color w:val="000000"/>
+                <w:sz w:val="17"/>
+                <w:szCs w:val="17"/>
+              </w:rPr>
+              <w:t xml:space="preserve">14 647,85</w:t>
+            </w:r>
+          </w:p>
+        </w:tc>
+      </w:tr>
+      <w:tr>
+        <w:trPr>
+          <w:cantSplit/>
+          <w:tblHeader w:val="false"/>
+        </w:trPr>
+        <w:tc>
+          <w:tcPr>
+            <w:tcW w:type="dxa" w:w="3276"/>
+            <w:tcBorders>
+              <w:top w:val="single" w:color="C9D3E3" w:sz="4"/>
+              <w:left w:val="single" w:color="C9D3E3" w:sz="4"/>
+              <w:bottom w:val="single" w:color="C9D3E3" w:sz="4"/>
+              <w:right w:val="single" w:color="C9D3E3" w:sz="4"/>
+            </w:tcBorders>
+            <w:tcMar>
+              <w:top w:type="dxa" w:w="60"/>
+              <w:left w:type="dxa" w:w="90"/>
+              <w:bottom w:type="dxa" w:w="60"/>
+              <w:right w:type="dxa" w:w="90"/>
+            </w:tcMar>
+            <w:vAlign w:val="center"/>
+          </w:tcPr>
+          <w:p>
+            <w:pPr>
+              <w:spacing w:after="0"/>
+              <w:jc w:val="left"/>
+            </w:pPr>
+            <w:r>
+              <w:rPr>
+                <w:rFonts w:ascii="Arial" w:cs="Arial" w:eastAsia="Arial" w:hAnsi="Arial"/>
+                <w:b w:val="false"/>
+                <w:bCs w:val="false"/>
+                <w:color w:val="000000"/>
+                <w:sz w:val="17"/>
+                <w:szCs w:val="17"/>
+              </w:rPr>
+              <w:t xml:space="preserve">Ogrodzenie, przyłącza (woda, kanalizacja sanitarna i deszczowa, gaz, energia), studnie, szambo, place betonowe</w:t>
+            </w:r>
+          </w:p>
+        </w:tc>
+        <w:tc>
+          <w:tcPr>
+            <w:tcW w:type="dxa" w:w="1349"/>
+            <w:tcBorders>
+              <w:top w:val="single" w:color="C9D3E3" w:sz="4"/>
+              <w:left w:val="single" w:color="C9D3E3" w:sz="4"/>
+              <w:bottom w:val="single" w:color="C9D3E3" w:sz="4"/>
+              <w:right w:val="single" w:color="C9D3E3" w:sz="4"/>
+            </w:tcBorders>
+            <w:tcMar>
+              <w:top w:type="dxa" w:w="60"/>
+              <w:left w:type="dxa" w:w="90"/>
+              <w:bottom w:type="dxa" w:w="60"/>
+              <w:right w:type="dxa" w:w="90"/>
+            </w:tcMar>
+            <w:vAlign w:val="center"/>
+          </w:tcPr>
+          <w:p>
+            <w:pPr>
+              <w:spacing w:after="0"/>
+              <w:jc w:val="right"/>
+            </w:pPr>
+            <w:r>
+              <w:rPr>
+                <w:rFonts w:ascii="Arial" w:cs="Arial" w:eastAsia="Arial" w:hAnsi="Arial"/>
+                <w:b w:val="false"/>
+                <w:bCs w:val="false"/>
+                <w:color w:val="000000"/>
+                <w:sz w:val="17"/>
+                <w:szCs w:val="17"/>
+              </w:rPr>
+              <w:t xml:space="preserve">–</w:t>
+            </w:r>
+          </w:p>
+        </w:tc>
+        <w:tc>
+          <w:tcPr>
+            <w:tcW w:type="dxa" w:w="1349"/>
+            <w:tcBorders>
+              <w:top w:val="single" w:color="C9D3E3" w:sz="4"/>
+              <w:left w:val="single" w:color="C9D3E3" w:sz="4"/>
+              <w:bottom w:val="single" w:color="C9D3E3" w:sz="4"/>
+              <w:right w:val="single" w:color="C9D3E3" w:sz="4"/>
+            </w:tcBorders>
+            <w:tcMar>
+              <w:top w:type="dxa" w:w="60"/>
+              <w:left w:type="dxa" w:w="90"/>
+              <w:bottom w:type="dxa" w:w="60"/>
+              <w:right w:type="dxa" w:w="90"/>
+            </w:tcMar>
+            <w:vAlign w:val="center"/>
+          </w:tcPr>
+          <w:p>
+            <w:pPr>
+              <w:spacing w:after="0"/>
+              <w:jc w:val="right"/>
+            </w:pPr>
+            <w:r>
+              <w:rPr>
+                <w:rFonts w:ascii="Arial" w:cs="Arial" w:eastAsia="Arial" w:hAnsi="Arial"/>
+                <w:b w:val="false"/>
+                <w:bCs w:val="false"/>
+                <w:color w:val="000000"/>
+                <w:sz w:val="17"/>
+                <w:szCs w:val="17"/>
+              </w:rPr>
+              <w:t xml:space="preserve">–</w:t>
+            </w:r>
+          </w:p>
+        </w:tc>
+        <w:tc>
+          <w:tcPr>
+            <w:tcW w:type="dxa" w:w="963"/>
+            <w:tcBorders>
+              <w:top w:val="single" w:color="C9D3E3" w:sz="4"/>
+              <w:left w:val="single" w:color="C9D3E3" w:sz="4"/>
+              <w:bottom w:val="single" w:color="C9D3E3" w:sz="4"/>
+              <w:right w:val="single" w:color="C9D3E3" w:sz="4"/>
+            </w:tcBorders>
+            <w:tcMar>
+              <w:top w:type="dxa" w:w="60"/>
+              <w:left w:type="dxa" w:w="90"/>
+              <w:bottom w:type="dxa" w:w="60"/>
+              <w:right w:type="dxa" w:w="90"/>
+            </w:tcMar>
+            <w:vAlign w:val="center"/>
+          </w:tcPr>
+          <w:p>
+            <w:pPr>
+              <w:spacing w:after="0"/>
+              <w:jc w:val="center"/>
+            </w:pPr>
+            <w:r>
+              <w:rPr>
+                <w:rFonts w:ascii="Arial" w:cs="Arial" w:eastAsia="Arial" w:hAnsi="Arial"/>
+                <w:b w:val="false"/>
+                <w:bCs w:val="false"/>
+                <w:color w:val="000000"/>
+                <w:sz w:val="17"/>
+                <w:szCs w:val="17"/>
+              </w:rPr>
+              <w:t xml:space="preserve">–</w:t>
+            </w:r>
+          </w:p>
+        </w:tc>
+        <w:tc>
+          <w:tcPr>
+            <w:tcW w:type="dxa" w:w="1542"/>
+            <w:tcBorders>
+              <w:top w:val="single" w:color="C9D3E3" w:sz="4"/>
+              <w:left w:val="single" w:color="C9D3E3" w:sz="4"/>
+              <w:bottom w:val="single" w:color="C9D3E3" w:sz="4"/>
+              <w:right w:val="single" w:color="C9D3E3" w:sz="4"/>
+            </w:tcBorders>
+            <w:tcMar>
+              <w:top w:type="dxa" w:w="60"/>
+              <w:left w:type="dxa" w:w="90"/>
+              <w:bottom w:type="dxa" w:w="60"/>
+              <w:right w:type="dxa" w:w="90"/>
+            </w:tcMar>
+            <w:vAlign w:val="center"/>
+          </w:tcPr>
+          <w:p>
+            <w:pPr>
+              <w:spacing w:after="0"/>
+              <w:jc w:val="right"/>
+            </w:pPr>
+            <w:r>
+              <w:rPr>
+                <w:rFonts w:ascii="Arial" w:cs="Arial" w:eastAsia="Arial" w:hAnsi="Arial"/>
+                <w:b w:val="false"/>
+                <w:bCs w:val="false"/>
+                <w:color w:val="000000"/>
+                <w:sz w:val="17"/>
+                <w:szCs w:val="17"/>
+              </w:rPr>
+              <w:t xml:space="preserve">zagospodarowanie zewnętrzne</w:t>
+            </w:r>
+          </w:p>
+        </w:tc>
+        <w:tc>
+          <w:tcPr>
+            <w:tcW w:type="dxa" w:w="1159"/>
+            <w:tcBorders>
+              <w:top w:val="single" w:color="C9D3E3" w:sz="4"/>
+              <w:left w:val="single" w:color="C9D3E3" w:sz="4"/>
+              <w:bottom w:val="single" w:color="C9D3E3" w:sz="4"/>
+              <w:right w:val="single" w:color="C9D3E3" w:sz="4"/>
+            </w:tcBorders>
+            <w:tcMar>
+              <w:top w:type="dxa" w:w="60"/>
+              <w:left w:type="dxa" w:w="90"/>
+              <w:bottom w:type="dxa" w:w="60"/>
+              <w:right w:type="dxa" w:w="90"/>
+            </w:tcMar>
+            <w:vAlign w:val="center"/>
+          </w:tcPr>
+          <w:p>
+            <w:pPr>
+              <w:spacing w:after="0"/>
+              <w:jc w:val="right"/>
+            </w:pPr>
+            <w:r>
+              <w:rPr>
+                <w:rFonts w:ascii="Arial" w:cs="Arial" w:eastAsia="Arial" w:hAnsi="Arial"/>
+                <w:b w:val="false"/>
+                <w:bCs w:val="false"/>
+                <w:color w:val="000000"/>
+                <w:sz w:val="17"/>
+                <w:szCs w:val="17"/>
+              </w:rPr>
+              <w:t xml:space="preserve">52 832,89</w:t>
+            </w:r>
+          </w:p>
+        </w:tc>
+      </w:tr>
+      <w:tr>
+        <w:trPr>
+          <w:cantSplit/>
+          <w:tblHeader w:val="false"/>
+        </w:trPr>
+        <w:tc>
+          <w:tcPr>
+            <w:tcW w:type="dxa" w:w="3276"/>
+            <w:tcBorders>
+              <w:top w:val="single" w:color="C9D3E3" w:sz="4"/>
+              <w:left w:val="single" w:color="C9D3E3" w:sz="4"/>
+              <w:bottom w:val="single" w:color="C9D3E3" w:sz="4"/>
+              <w:right w:val="single" w:color="C9D3E3" w:sz="4"/>
+            </w:tcBorders>
+            <w:shd w:fill="EEF3FA" w:color="auto" w:val="clear"/>
+            <w:tcMar>
+              <w:top w:type="dxa" w:w="60"/>
+              <w:left w:type="dxa" w:w="90"/>
+              <w:bottom w:type="dxa" w:w="60"/>
+              <w:right w:type="dxa" w:w="90"/>
+            </w:tcMar>
+            <w:vAlign w:val="center"/>
+          </w:tcPr>
+          <w:p>
+            <w:pPr>
+              <w:spacing w:after="0"/>
+              <w:jc w:val="left"/>
+            </w:pPr>
+            <w:r>
+              <w:rPr>
+                <w:rFonts w:ascii="Arial" w:cs="Arial" w:eastAsia="Arial" w:hAnsi="Arial"/>
+                <w:b/>
+                <w:bCs/>
+                <w:color w:val="000000"/>
+                <w:sz w:val="17"/>
+                <w:szCs w:val="17"/>
+              </w:rPr>
+              <w:t xml:space="preserve">Budynki i budowle razem</w:t>
+            </w:r>
+          </w:p>
+        </w:tc>
+        <w:tc>
+          <w:tcPr>
+            <w:tcW w:type="dxa" w:w="1349"/>
+            <w:tcBorders>
+              <w:top w:val="single" w:color="C9D3E3" w:sz="4"/>
+              <w:left w:val="single" w:color="C9D3E3" w:sz="4"/>
+              <w:bottom w:val="single" w:color="C9D3E3" w:sz="4"/>
+              <w:right w:val="single" w:color="C9D3E3" w:sz="4"/>
+            </w:tcBorders>
+            <w:shd w:fill="EEF3FA" w:color="auto" w:val="clear"/>
+            <w:tcMar>
+              <w:top w:type="dxa" w:w="60"/>
+              <w:left w:type="dxa" w:w="90"/>
+              <w:bottom w:type="dxa" w:w="60"/>
+              <w:right w:type="dxa" w:w="90"/>
+            </w:tcMar>
+            <w:vAlign w:val="center"/>
+          </w:tcPr>
+          <w:p>
+            <w:pPr>
+              <w:spacing w:after="0"/>
+              <w:jc w:val="right"/>
+            </w:pPr>
+            <w:r>
+              <w:rPr>
+                <w:rFonts w:ascii="Arial" w:cs="Arial" w:eastAsia="Arial" w:hAnsi="Arial"/>
+                <w:b/>
+                <w:bCs/>
+                <w:color w:val="000000"/>
+                <w:sz w:val="17"/>
+                <w:szCs w:val="17"/>
+              </w:rPr>
+              <w:t xml:space="preserve">28 001,93</w:t>
+            </w:r>
+          </w:p>
+        </w:tc>
+        <w:tc>
+          <w:tcPr>
+            <w:tcW w:type="dxa" w:w="1349"/>
+            <w:tcBorders>
+              <w:top w:val="single" w:color="C9D3E3" w:sz="4"/>
+              <w:left w:val="single" w:color="C9D3E3" w:sz="4"/>
+              <w:bottom w:val="single" w:color="C9D3E3" w:sz="4"/>
+              <w:right w:val="single" w:color="C9D3E3" w:sz="4"/>
+            </w:tcBorders>
+            <w:shd w:fill="EEF3FA" w:color="auto" w:val="clear"/>
+            <w:tcMar>
+              <w:top w:type="dxa" w:w="60"/>
+              <w:left w:type="dxa" w:w="90"/>
+              <w:bottom w:type="dxa" w:w="60"/>
+              <w:right w:type="dxa" w:w="90"/>
+            </w:tcMar>
+            <w:vAlign w:val="center"/>
+          </w:tcPr>
+          <w:p>
+            <w:pPr>
+              <w:spacing w:after="0"/>
+              <w:jc w:val="right"/>
+            </w:pPr>
+            <w:r>
+              <w:rPr>
+                <w:rFonts w:ascii="Arial" w:cs="Arial" w:eastAsia="Arial" w:hAnsi="Arial"/>
+                <w:b/>
+                <w:bCs/>
+                <w:color w:val="000000"/>
+                <w:sz w:val="17"/>
+                <w:szCs w:val="17"/>
+              </w:rPr>
+              <w:t xml:space="preserve">3 191,15</w:t>
+            </w:r>
+          </w:p>
+        </w:tc>
+        <w:tc>
+          <w:tcPr>
+            <w:tcW w:type="dxa" w:w="963"/>
+            <w:tcBorders>
+              <w:top w:val="single" w:color="C9D3E3" w:sz="4"/>
+              <w:left w:val="single" w:color="C9D3E3" w:sz="4"/>
+              <w:bottom w:val="single" w:color="C9D3E3" w:sz="4"/>
+              <w:right w:val="single" w:color="C9D3E3" w:sz="4"/>
+            </w:tcBorders>
+            <w:shd w:fill="EEF3FA" w:color="auto" w:val="clear"/>
+            <w:tcMar>
+              <w:top w:type="dxa" w:w="60"/>
+              <w:left w:type="dxa" w:w="90"/>
+              <w:bottom w:type="dxa" w:w="60"/>
+              <w:right w:type="dxa" w:w="90"/>
+            </w:tcMar>
+            <w:vAlign w:val="center"/>
+          </w:tcPr>
+          <w:p>
+            <w:pPr>
+              <w:spacing w:after="0"/>
+              <w:jc w:val="center"/>
+            </w:pPr>
+            <w:r>
+              <w:rPr>
+                <w:rFonts w:ascii="Arial" w:cs="Arial" w:eastAsia="Arial" w:hAnsi="Arial"/>
+                <w:b/>
+                <w:bCs/>
+                <w:color w:val="000000"/>
+                <w:sz w:val="17"/>
+                <w:szCs w:val="17"/>
+              </w:rPr>
+              <w:t xml:space="preserve"/>
+            </w:r>
+          </w:p>
+        </w:tc>
+        <w:tc>
+          <w:tcPr>
+            <w:tcW w:type="dxa" w:w="1542"/>
+            <w:tcBorders>
+              <w:top w:val="single" w:color="C9D3E3" w:sz="4"/>
+              <w:left w:val="single" w:color="C9D3E3" w:sz="4"/>
+              <w:bottom w:val="single" w:color="C9D3E3" w:sz="4"/>
+              <w:right w:val="single" w:color="C9D3E3" w:sz="4"/>
+            </w:tcBorders>
+            <w:shd w:fill="EEF3FA" w:color="auto" w:val="clear"/>
+            <w:tcMar>
+              <w:top w:type="dxa" w:w="60"/>
+              <w:left w:type="dxa" w:w="90"/>
+              <w:bottom w:type="dxa" w:w="60"/>
+              <w:right w:type="dxa" w:w="90"/>
+            </w:tcMar>
+            <w:vAlign w:val="center"/>
+          </w:tcPr>
+          <w:p>
+            <w:pPr>
+              <w:spacing w:after="0"/>
+              <w:jc w:val="right"/>
+            </w:pPr>
+            <w:r>
+              <w:rPr>
+                <w:rFonts w:ascii="Arial" w:cs="Arial" w:eastAsia="Arial" w:hAnsi="Arial"/>
+                <w:b/>
+                <w:bCs/>
+                <w:color w:val="000000"/>
+                <w:sz w:val="17"/>
+                <w:szCs w:val="17"/>
+              </w:rPr>
+              <w:t xml:space="preserve"/>
+            </w:r>
+          </w:p>
+        </w:tc>
+        <w:tc>
+          <w:tcPr>
+            <w:tcW w:type="dxa" w:w="1159"/>
+            <w:tcBorders>
+              <w:top w:val="single" w:color="C9D3E3" w:sz="4"/>
+              <w:left w:val="single" w:color="C9D3E3" w:sz="4"/>
+              <w:bottom w:val="single" w:color="C9D3E3" w:sz="4"/>
+              <w:right w:val="single" w:color="C9D3E3" w:sz="4"/>
+            </w:tcBorders>
+            <w:shd w:fill="EEF3FA" w:color="auto" w:val="clear"/>
+            <w:tcMar>
+              <w:top w:type="dxa" w:w="60"/>
+              <w:left w:type="dxa" w:w="90"/>
+              <w:bottom w:type="dxa" w:w="60"/>
+              <w:right w:type="dxa" w:w="90"/>
+            </w:tcMar>
+            <w:vAlign w:val="center"/>
+          </w:tcPr>
+          <w:p>
+            <w:pPr>
+              <w:spacing w:after="0"/>
+              <w:jc w:val="right"/>
+            </w:pPr>
+            <w:r>
+              <w:rPr>
+                <w:rFonts w:ascii="Arial" w:cs="Arial" w:eastAsia="Arial" w:hAnsi="Arial"/>
+                <w:b/>
+                <w:bCs/>
+                <w:color w:val="000000"/>
+                <w:sz w:val="17"/>
+                <w:szCs w:val="17"/>
+              </w:rPr>
+              <w:t xml:space="preserve">1 225 390,60</w:t>
+            </w:r>
+          </w:p>
+        </w:tc>
+      </w:tr>
+      <w:tr>
+        <w:trPr>
+          <w:cantSplit/>
+          <w:tblHeader w:val="false"/>
+        </w:trPr>
+        <w:tc>
+          <w:tcPr>
+            <w:tcW w:type="dxa" w:w="3276"/>
+            <w:tcBorders>
+              <w:top w:val="single" w:color="C9D3E3" w:sz="4"/>
+              <w:left w:val="single" w:color="C9D3E3" w:sz="4"/>
+              <w:bottom w:val="single" w:color="C9D3E3" w:sz="4"/>
+              <w:right w:val="single" w:color="C9D3E3" w:sz="4"/>
+            </w:tcBorders>
+            <w:tcMar>
+              <w:top w:type="dxa" w:w="60"/>
+              <w:left w:type="dxa" w:w="90"/>
+              <w:bottom w:type="dxa" w:w="60"/>
+              <w:right w:type="dxa" w:w="90"/>
+            </w:tcMar>
+            <w:vAlign w:val="center"/>
+          </w:tcPr>
+          <w:p>
+            <w:pPr>
+              <w:spacing w:after="0"/>
+              <w:jc w:val="left"/>
+            </w:pPr>
+            <w:r>
+              <w:rPr>
+                <w:rFonts w:ascii="Arial" w:cs="Arial" w:eastAsia="Arial" w:hAnsi="Arial"/>
+                <w:b w:val="false"/>
+                <w:bCs w:val="false"/>
+                <w:color w:val="000000"/>
+                <w:sz w:val="17"/>
+                <w:szCs w:val="17"/>
+              </w:rPr>
+              <w:t xml:space="preserve">Działki nr 775/1 – 775/5 (10 789 m², metoda zróżnicowania lokalizacyjnego, 58,27 EUR/m²)</w:t>
+            </w:r>
+          </w:p>
+        </w:tc>
+        <w:tc>
+          <w:tcPr>
+            <w:tcW w:type="dxa" w:w="1349"/>
+            <w:tcBorders>
+              <w:top w:val="single" w:color="C9D3E3" w:sz="4"/>
+              <w:left w:val="single" w:color="C9D3E3" w:sz="4"/>
+              <w:bottom w:val="single" w:color="C9D3E3" w:sz="4"/>
+              <w:right w:val="single" w:color="C9D3E3" w:sz="4"/>
+            </w:tcBorders>
+            <w:tcMar>
+              <w:top w:type="dxa" w:w="60"/>
+              <w:left w:type="dxa" w:w="90"/>
+              <w:bottom w:type="dxa" w:w="60"/>
+              <w:right w:type="dxa" w:w="90"/>
+            </w:tcMar>
+            <w:vAlign w:val="center"/>
+          </w:tcPr>
+          <w:p>
+            <w:pPr>
+              <w:spacing w:after="0"/>
+              <w:jc w:val="right"/>
+            </w:pPr>
+            <w:r>
+              <w:rPr>
+                <w:rFonts w:ascii="Arial" w:cs="Arial" w:eastAsia="Arial" w:hAnsi="Arial"/>
+                <w:b w:val="false"/>
+                <w:bCs w:val="false"/>
+                <w:color w:val="000000"/>
+                <w:sz w:val="17"/>
+                <w:szCs w:val="17"/>
+              </w:rPr>
+              <w:t xml:space="preserve">–</w:t>
+            </w:r>
+          </w:p>
+        </w:tc>
+        <w:tc>
+          <w:tcPr>
+            <w:tcW w:type="dxa" w:w="1349"/>
+            <w:tcBorders>
+              <w:top w:val="single" w:color="C9D3E3" w:sz="4"/>
+              <w:left w:val="single" w:color="C9D3E3" w:sz="4"/>
+              <w:bottom w:val="single" w:color="C9D3E3" w:sz="4"/>
+              <w:right w:val="single" w:color="C9D3E3" w:sz="4"/>
+            </w:tcBorders>
+            <w:tcMar>
+              <w:top w:type="dxa" w:w="60"/>
+              <w:left w:type="dxa" w:w="90"/>
+              <w:bottom w:type="dxa" w:w="60"/>
+              <w:right w:type="dxa" w:w="90"/>
+            </w:tcMar>
+            <w:vAlign w:val="center"/>
+          </w:tcPr>
+          <w:p>
+            <w:pPr>
+              <w:spacing w:after="0"/>
+              <w:jc w:val="right"/>
+            </w:pPr>
+            <w:r>
+              <w:rPr>
+                <w:rFonts w:ascii="Arial" w:cs="Arial" w:eastAsia="Arial" w:hAnsi="Arial"/>
+                <w:b w:val="false"/>
+                <w:bCs w:val="false"/>
+                <w:color w:val="000000"/>
+                <w:sz w:val="17"/>
+                <w:szCs w:val="17"/>
+              </w:rPr>
+              <w:t xml:space="preserve">10 789</w:t>
+            </w:r>
+          </w:p>
+        </w:tc>
+        <w:tc>
+          <w:tcPr>
+            <w:tcW w:type="dxa" w:w="963"/>
+            <w:tcBorders>
+              <w:top w:val="single" w:color="C9D3E3" w:sz="4"/>
+              <w:left w:val="single" w:color="C9D3E3" w:sz="4"/>
+              <w:bottom w:val="single" w:color="C9D3E3" w:sz="4"/>
+              <w:right w:val="single" w:color="C9D3E3" w:sz="4"/>
+            </w:tcBorders>
+            <w:tcMar>
+              <w:top w:type="dxa" w:w="60"/>
+              <w:left w:type="dxa" w:w="90"/>
+              <w:bottom w:type="dxa" w:w="60"/>
+              <w:right w:type="dxa" w:w="90"/>
+            </w:tcMar>
+            <w:vAlign w:val="center"/>
+          </w:tcPr>
+          <w:p>
+            <w:pPr>
+              <w:spacing w:after="0"/>
+              <w:jc w:val="center"/>
+            </w:pPr>
+            <w:r>
+              <w:rPr>
+                <w:rFonts w:ascii="Arial" w:cs="Arial" w:eastAsia="Arial" w:hAnsi="Arial"/>
+                <w:b w:val="false"/>
+                <w:bCs w:val="false"/>
+                <w:color w:val="000000"/>
+                <w:sz w:val="17"/>
+                <w:szCs w:val="17"/>
+              </w:rPr>
+              <w:t xml:space="preserve">–</w:t>
+            </w:r>
+          </w:p>
+        </w:tc>
+        <w:tc>
+          <w:tcPr>
+            <w:tcW w:type="dxa" w:w="1542"/>
+            <w:tcBorders>
+              <w:top w:val="single" w:color="C9D3E3" w:sz="4"/>
+              <w:left w:val="single" w:color="C9D3E3" w:sz="4"/>
+              <w:bottom w:val="single" w:color="C9D3E3" w:sz="4"/>
+              <w:right w:val="single" w:color="C9D3E3" w:sz="4"/>
+            </w:tcBorders>
+            <w:tcMar>
+              <w:top w:type="dxa" w:w="60"/>
+              <w:left w:type="dxa" w:w="90"/>
+              <w:bottom w:type="dxa" w:w="60"/>
+              <w:right w:type="dxa" w:w="90"/>
+            </w:tcMar>
+            <w:vAlign w:val="center"/>
+          </w:tcPr>
+          <w:p>
+            <w:pPr>
+              <w:spacing w:after="0"/>
+              <w:jc w:val="right"/>
+            </w:pPr>
+            <w:r>
+              <w:rPr>
+                <w:rFonts w:ascii="Arial" w:cs="Arial" w:eastAsia="Arial" w:hAnsi="Arial"/>
+                <w:b w:val="false"/>
+                <w:bCs w:val="false"/>
+                <w:color w:val="000000"/>
+                <w:sz w:val="17"/>
+                <w:szCs w:val="17"/>
+              </w:rPr>
+              <w:t xml:space="preserve">tereny zabudowane i podwórza</w:t>
+            </w:r>
+          </w:p>
+        </w:tc>
+        <w:tc>
+          <w:tcPr>
+            <w:tcW w:type="dxa" w:w="1159"/>
+            <w:tcBorders>
+              <w:top w:val="single" w:color="C9D3E3" w:sz="4"/>
+              <w:left w:val="single" w:color="C9D3E3" w:sz="4"/>
+              <w:bottom w:val="single" w:color="C9D3E3" w:sz="4"/>
+              <w:right w:val="single" w:color="C9D3E3" w:sz="4"/>
+            </w:tcBorders>
+            <w:tcMar>
+              <w:top w:type="dxa" w:w="60"/>
+              <w:left w:type="dxa" w:w="90"/>
+              <w:bottom w:type="dxa" w:w="60"/>
+              <w:right w:type="dxa" w:w="90"/>
+            </w:tcMar>
+            <w:vAlign w:val="center"/>
+          </w:tcPr>
+          <w:p>
+            <w:pPr>
+              <w:spacing w:after="0"/>
+              <w:jc w:val="right"/>
+            </w:pPr>
+            <w:r>
+              <w:rPr>
+                <w:rFonts w:ascii="Arial" w:cs="Arial" w:eastAsia="Arial" w:hAnsi="Arial"/>
+                <w:b w:val="false"/>
+                <w:bCs w:val="false"/>
+                <w:color w:val="000000"/>
+                <w:sz w:val="17"/>
+                <w:szCs w:val="17"/>
+              </w:rPr>
+              <w:t xml:space="preserve">628 675,03</w:t>
+            </w:r>
+          </w:p>
+        </w:tc>
+      </w:tr>
+      <w:tr>
+        <w:trPr>
+          <w:cantSplit/>
+          <w:tblHeader w:val="false"/>
+        </w:trPr>
+        <w:tc>
+          <w:tcPr>
+            <w:tcW w:type="dxa" w:w="3276"/>
+            <w:tcBorders>
+              <w:top w:val="single" w:color="C9D3E3" w:sz="4"/>
+              <w:left w:val="single" w:color="C9D3E3" w:sz="4"/>
+              <w:bottom w:val="single" w:color="C9D3E3" w:sz="4"/>
+              <w:right w:val="single" w:color="C9D3E3" w:sz="4"/>
+            </w:tcBorders>
+            <w:shd w:fill="EEF3FA" w:color="auto" w:val="clear"/>
+            <w:tcMar>
+              <w:top w:type="dxa" w:w="60"/>
+              <w:left w:type="dxa" w:w="90"/>
+              <w:bottom w:type="dxa" w:w="60"/>
+              <w:right w:type="dxa" w:w="90"/>
+            </w:tcMar>
+            <w:vAlign w:val="center"/>
+          </w:tcPr>
+          <w:p>
+            <w:pPr>
+              <w:spacing w:after="0"/>
+              <w:jc w:val="left"/>
+            </w:pPr>
+            <w:r>
+              <w:rPr>
+                <w:rFonts w:ascii="Arial" w:cs="Arial" w:eastAsia="Arial" w:hAnsi="Arial"/>
+                <w:b/>
+                <w:bCs/>
+                <w:color w:val="000000"/>
+                <w:sz w:val="17"/>
+                <w:szCs w:val="17"/>
+              </w:rPr>
+              <w:t xml:space="preserve">Wartość rynkowa ogółem (w zaokrągleniu 1 850 000 EUR)</w:t>
+            </w:r>
+          </w:p>
+        </w:tc>
+        <w:tc>
+          <w:tcPr>
+            <w:tcW w:type="dxa" w:w="1349"/>
+            <w:tcBorders>
+              <w:top w:val="single" w:color="C9D3E3" w:sz="4"/>
+              <w:left w:val="single" w:color="C9D3E3" w:sz="4"/>
+              <w:bottom w:val="single" w:color="C9D3E3" w:sz="4"/>
+              <w:right w:val="single" w:color="C9D3E3" w:sz="4"/>
+            </w:tcBorders>
+            <w:shd w:fill="EEF3FA" w:color="auto" w:val="clear"/>
+            <w:tcMar>
+              <w:top w:type="dxa" w:w="60"/>
+              <w:left w:type="dxa" w:w="90"/>
+              <w:bottom w:type="dxa" w:w="60"/>
+              <w:right w:type="dxa" w:w="90"/>
+            </w:tcMar>
+            <w:vAlign w:val="center"/>
+          </w:tcPr>
+          <w:p>
+            <w:pPr>
+              <w:spacing w:after="0"/>
+              <w:jc w:val="right"/>
+            </w:pPr>
+            <w:r>
+              <w:rPr>
+                <w:rFonts w:ascii="Arial" w:cs="Arial" w:eastAsia="Arial" w:hAnsi="Arial"/>
+                <w:b/>
+                <w:bCs/>
+                <w:color w:val="000000"/>
+                <w:sz w:val="17"/>
+                <w:szCs w:val="17"/>
+              </w:rPr>
+              <w:t xml:space="preserve"/>
+            </w:r>
+          </w:p>
+        </w:tc>
+        <w:tc>
+          <w:tcPr>
+            <w:tcW w:type="dxa" w:w="1349"/>
+            <w:tcBorders>
+              <w:top w:val="single" w:color="C9D3E3" w:sz="4"/>
+              <w:left w:val="single" w:color="C9D3E3" w:sz="4"/>
+              <w:bottom w:val="single" w:color="C9D3E3" w:sz="4"/>
+              <w:right w:val="single" w:color="C9D3E3" w:sz="4"/>
+            </w:tcBorders>
+            <w:shd w:fill="EEF3FA" w:color="auto" w:val="clear"/>
+            <w:tcMar>
+              <w:top w:type="dxa" w:w="60"/>
+              <w:left w:type="dxa" w:w="90"/>
+              <w:bottom w:type="dxa" w:w="60"/>
+              <w:right w:type="dxa" w:w="90"/>
+            </w:tcMar>
+            <w:vAlign w:val="center"/>
+          </w:tcPr>
+          <w:p>
+            <w:pPr>
+              <w:spacing w:after="0"/>
+              <w:jc w:val="right"/>
+            </w:pPr>
+            <w:r>
+              <w:rPr>
+                <w:rFonts w:ascii="Arial" w:cs="Arial" w:eastAsia="Arial" w:hAnsi="Arial"/>
+                <w:b/>
+                <w:bCs/>
+                <w:color w:val="000000"/>
+                <w:sz w:val="17"/>
+                <w:szCs w:val="17"/>
+              </w:rPr>
+              <w:t xml:space="preserve"/>
+            </w:r>
+          </w:p>
+        </w:tc>
+        <w:tc>
+          <w:tcPr>
+            <w:tcW w:type="dxa" w:w="963"/>
+            <w:tcBorders>
+              <w:top w:val="single" w:color="C9D3E3" w:sz="4"/>
+              <w:left w:val="single" w:color="C9D3E3" w:sz="4"/>
+              <w:bottom w:val="single" w:color="C9D3E3" w:sz="4"/>
+              <w:right w:val="single" w:color="C9D3E3" w:sz="4"/>
+            </w:tcBorders>
+            <w:shd w:fill="EEF3FA" w:color="auto" w:val="clear"/>
+            <w:tcMar>
+              <w:top w:type="dxa" w:w="60"/>
+              <w:left w:type="dxa" w:w="90"/>
+              <w:bottom w:type="dxa" w:w="60"/>
+              <w:right w:type="dxa" w:w="90"/>
+            </w:tcMar>
+            <w:vAlign w:val="center"/>
+          </w:tcPr>
+          <w:p>
+            <w:pPr>
+              <w:spacing w:after="0"/>
+              <w:jc w:val="center"/>
+            </w:pPr>
+            <w:r>
+              <w:rPr>
+                <w:rFonts w:ascii="Arial" w:cs="Arial" w:eastAsia="Arial" w:hAnsi="Arial"/>
+                <w:b/>
+                <w:bCs/>
+                <w:color w:val="000000"/>
+                <w:sz w:val="17"/>
+                <w:szCs w:val="17"/>
+              </w:rPr>
+              <w:t xml:space="preserve"/>
+            </w:r>
+          </w:p>
+        </w:tc>
+        <w:tc>
+          <w:tcPr>
+            <w:tcW w:type="dxa" w:w="1542"/>
+            <w:tcBorders>
+              <w:top w:val="single" w:color="C9D3E3" w:sz="4"/>
+              <w:left w:val="single" w:color="C9D3E3" w:sz="4"/>
+              <w:bottom w:val="single" w:color="C9D3E3" w:sz="4"/>
+              <w:right w:val="single" w:color="C9D3E3" w:sz="4"/>
+            </w:tcBorders>
+            <w:shd w:fill="EEF3FA" w:color="auto" w:val="clear"/>
+            <w:tcMar>
+              <w:top w:type="dxa" w:w="60"/>
+              <w:left w:type="dxa" w:w="90"/>
+              <w:bottom w:type="dxa" w:w="60"/>
+              <w:right w:type="dxa" w:w="90"/>
+            </w:tcMar>
+            <w:vAlign w:val="center"/>
+          </w:tcPr>
+          <w:p>
+            <w:pPr>
+              <w:spacing w:after="0"/>
+              <w:jc w:val="right"/>
+            </w:pPr>
+            <w:r>
+              <w:rPr>
+                <w:rFonts w:ascii="Arial" w:cs="Arial" w:eastAsia="Arial" w:hAnsi="Arial"/>
+                <w:b/>
+                <w:bCs/>
+                <w:color w:val="000000"/>
+                <w:sz w:val="17"/>
+                <w:szCs w:val="17"/>
+              </w:rPr>
+              <w:t xml:space="preserve"/>
+            </w:r>
+          </w:p>
+        </w:tc>
+        <w:tc>
+          <w:tcPr>
+            <w:tcW w:type="dxa" w:w="1159"/>
+            <w:tcBorders>
+              <w:top w:val="single" w:color="C9D3E3" w:sz="4"/>
+              <w:left w:val="single" w:color="C9D3E3" w:sz="4"/>
+              <w:bottom w:val="single" w:color="C9D3E3" w:sz="4"/>
+              <w:right w:val="single" w:color="C9D3E3" w:sz="4"/>
+            </w:tcBorders>
+            <w:shd w:fill="EEF3FA" w:color="auto" w:val="clear"/>
+            <w:tcMar>
+              <w:top w:type="dxa" w:w="60"/>
+              <w:left w:type="dxa" w:w="90"/>
+              <w:bottom w:type="dxa" w:w="60"/>
+              <w:right w:type="dxa" w:w="90"/>
+            </w:tcMar>
+            <w:vAlign w:val="center"/>
+          </w:tcPr>
+          <w:p>
+            <w:pPr>
+              <w:spacing w:after="0"/>
+              <w:jc w:val="right"/>
+            </w:pPr>
+            <w:r>
+              <w:rPr>
+                <w:rFonts w:ascii="Arial" w:cs="Arial" w:eastAsia="Arial" w:hAnsi="Arial"/>
+                <w:b/>
+                <w:bCs/>
+                <w:color w:val="000000"/>
+                <w:sz w:val="17"/>
+                <w:szCs w:val="17"/>
+              </w:rPr>
+              <w:t xml:space="preserve">1 854 065,63</w:t>
+            </w:r>
+          </w:p>
+        </w:tc>
+      </w:tr>
+    </w:tbl>
+    <w:p>
+      <w:pPr>
+        <w:spacing w:after="160"/>
+      </w:pPr>
+      <w:r>
+        <w:rPr>
+          <w:rFonts w:ascii="Arial" w:cs="Arial" w:eastAsia="Arial" w:hAnsi="Arial"/>
+          <w:i/>
+          <w:iCs/>
+          <w:color w:val="52514E"/>
+          <w:sz w:val="17"/>
+          <w:szCs w:val="17"/>
+        </w:rPr>
+        <w:t xml:space="preserve">Źródło: operat szacunkowy nr 87/2024, rekapitulacja wartości rynkowej (metoda kombinowana dla budynków, metoda zróżnicowania lokalizacyjnego dla gruntów, poziom cen z VAT). Wartość słownie: jeden milion osiemset pięćdziesiąt tysięcy euro.</w:t>
+      </w:r>
+    </w:p>
+    <w:p>
+      <w:pPr>
+        <w:spacing w:after="120" w:line="276"/>
+        <w:jc w:val="both"/>
+      </w:pPr>
+      <w:r>
+        <w:rPr>
+          <w:rFonts w:ascii="Arial" w:cs="Arial" w:eastAsia="Arial" w:hAnsi="Arial"/>
+          <w:sz w:val="21"/>
+          <w:szCs w:val="21"/>
+        </w:rPr>
+        <w:t xml:space="preserve">Pełny operat (39 stron, w tym zestawienie najemców i kosztów za 2023 r., pozwolenie na budowę i decyzja o odbiorze) udostępnimy podczas wizji lokalnej. Na życzenie kupującego zostanie sporządzony zaktualizowany operat na dzień transakcji.</w:t>
+      </w:r>
+    </w:p>
+    <w:p>
+      <w:pPr>
+        <w:pStyle w:val="Heading1"/>
+        <w:spacing w:after="160" w:before="360"/>
+      </w:pPr>
+      <w:r>
+        <w:rPr>
+          <w:rFonts w:ascii="Arial" w:cs="Arial" w:eastAsia="Arial" w:hAnsi="Arial"/>
+          <w:b/>
+          <w:bCs/>
+          <w:color w:val="1F3B73"/>
+          <w:sz w:val="30"/>
+          <w:szCs w:val="30"/>
+        </w:rPr>
+        <w:t xml:space="preserve">4. Informacja planistyczna</w:t>
+      </w:r>
+    </w:p>
+    <w:p>
+      <w:pPr>
+        <w:spacing w:after="120" w:line="276"/>
+        <w:jc w:val="both"/>
+      </w:pPr>
+      <w:r>
+        <w:rPr>
+          <w:rFonts w:ascii="Arial" w:cs="Arial" w:eastAsia="Arial" w:hAnsi="Arial"/>
+          <w:sz w:val="21"/>
+          <w:szCs w:val="21"/>
+        </w:rPr>
+        <w:t xml:space="preserve">Plan zagospodarowania przestrzennego miasta Stará Ľubovňa (ÚPN mesta, opracowanie ARLAND s. r. o., Spišská Nová Ves; część wiążąca z lipca 2015 r.) zalicza teren do obszaru zabudowanego miasta jako istniejący teren produkcyjno-magazynowy w dolinie Jakubianki przy południowym wjeździe do miasta. Dla zamierzenia centrum handlowego istotne są następujące ustalenia części wiążącej:</w:t>
+      </w:r>
+    </w:p>
+    <w:tbl>
+      <w:tblPr>
+        <w:tblW w:type="dxa" w:w="9638"/>
+        <w:tblBorders>
+          <w:top w:val="single" w:color="auto" w:sz="4"/>
+          <w:left w:val="single" w:color="auto" w:sz="4"/>
+          <w:bottom w:val="single" w:color="auto" w:sz="4"/>
+          <w:right w:val="single" w:color="auto" w:sz="4"/>
+          <w:insideH w:val="single" w:color="auto" w:sz="4"/>
+          <w:insideV w:val="single" w:color="auto" w:sz="4"/>
+        </w:tblBorders>
+      </w:tblPr>
+      <w:tblGrid>
+        <w:gridCol w:w="2891"/>
+        <w:gridCol w:w="6747"/>
+      </w:tblGrid>
+      <w:tr>
+        <w:trPr>
+          <w:cantSplit/>
+          <w:tblHeader/>
+        </w:trPr>
+        <w:tc>
+          <w:tcPr>
+            <w:tcW w:type="dxa" w:w="2891"/>
+            <w:tcBorders>
+              <w:top w:val="single" w:color="C9D3E3" w:sz="4"/>
+              <w:left w:val="single" w:color="C9D3E3" w:sz="4"/>
+              <w:bottom w:val="single" w:color="C9D3E3" w:sz="4"/>
+              <w:right w:val="single" w:color="C9D3E3" w:sz="4"/>
+            </w:tcBorders>
+            <w:shd w:fill="1F3B73" w:color="auto" w:val="clear"/>
+            <w:tcMar>
+              <w:top w:type="dxa" w:w="60"/>
+              <w:left w:type="dxa" w:w="90"/>
+              <w:bottom w:type="dxa" w:w="60"/>
+              <w:right w:type="dxa" w:w="90"/>
+            </w:tcMar>
+            <w:vAlign w:val="center"/>
+          </w:tcPr>
+          <w:p>
+            <w:pPr>
+              <w:spacing w:after="0"/>
+              <w:jc w:val="left"/>
+            </w:pPr>
+            <w:r>
+              <w:rPr>
+                <w:rFonts w:ascii="Arial" w:cs="Arial" w:eastAsia="Arial" w:hAnsi="Arial"/>
+                <w:b/>
+                <w:bCs/>
+                <w:color w:val="FFFFFF"/>
+                <w:sz w:val="19"/>
+                <w:szCs w:val="19"/>
+              </w:rPr>
+              <w:t xml:space="preserve">Pozycja</w:t>
+            </w:r>
+          </w:p>
+        </w:tc>
+        <w:tc>
+          <w:tcPr>
+            <w:tcW w:type="dxa" w:w="6747"/>
+            <w:tcBorders>
+              <w:top w:val="single" w:color="C9D3E3" w:sz="4"/>
+              <w:left w:val="single" w:color="C9D3E3" w:sz="4"/>
+              <w:bottom w:val="single" w:color="C9D3E3" w:sz="4"/>
+              <w:right w:val="single" w:color="C9D3E3" w:sz="4"/>
+            </w:tcBorders>
+            <w:shd w:fill="1F3B73" w:color="auto" w:val="clear"/>
+            <w:tcMar>
+              <w:top w:type="dxa" w:w="60"/>
+              <w:left w:type="dxa" w:w="90"/>
+              <w:bottom w:type="dxa" w:w="60"/>
+              <w:right w:type="dxa" w:w="90"/>
+            </w:tcMar>
+            <w:vAlign w:val="center"/>
+          </w:tcPr>
+          <w:p>
+            <w:pPr>
+              <w:spacing w:after="0"/>
+              <w:jc w:val="left"/>
+            </w:pPr>
+            <w:r>
+              <w:rPr>
+                <w:rFonts w:ascii="Arial" w:cs="Arial" w:eastAsia="Arial" w:hAnsi="Arial"/>
+                <w:b/>
+                <w:bCs/>
+                <w:color w:val="FFFFFF"/>
+                <w:sz w:val="19"/>
+                <w:szCs w:val="19"/>
+              </w:rPr>
+              <w:t xml:space="preserve">Opis</w:t>
+            </w:r>
+          </w:p>
+        </w:tc>
+      </w:tr>
+      <w:tr>
+        <w:trPr>
+          <w:cantSplit/>
+          <w:tblHeader w:val="false"/>
+        </w:trPr>
+        <w:tc>
+          <w:tcPr>
+            <w:tcW w:type="dxa" w:w="2891"/>
+            <w:tcBorders>
+              <w:top w:val="single" w:color="C9D3E3" w:sz="4"/>
+              <w:left w:val="single" w:color="C9D3E3" w:sz="4"/>
+              <w:bottom w:val="single" w:color="C9D3E3" w:sz="4"/>
+              <w:right w:val="single" w:color="C9D3E3" w:sz="4"/>
+            </w:tcBorders>
+            <w:tcMar>
+              <w:top w:type="dxa" w:w="60"/>
+              <w:left w:type="dxa" w:w="90"/>
+              <w:bottom w:type="dxa" w:w="60"/>
+              <w:right w:type="dxa" w:w="90"/>
+            </w:tcMar>
+            <w:vAlign w:val="center"/>
+          </w:tcPr>
+          <w:p>
+            <w:pPr>
+              <w:spacing w:after="0"/>
+              <w:jc w:val="left"/>
+            </w:pPr>
+            <w:r>
+              <w:rPr>
+                <w:rFonts w:ascii="Arial" w:cs="Arial" w:eastAsia="Arial" w:hAnsi="Arial"/>
+                <w:b w:val="false"/>
+                <w:bCs w:val="false"/>
+                <w:color w:val="000000"/>
+                <w:sz w:val="19"/>
+                <w:szCs w:val="19"/>
+              </w:rPr>
+              <w:t xml:space="preserve">Tereny usług publicznych i komercyjnych (OV)</w:t>
+            </w:r>
+          </w:p>
+        </w:tc>
+        <w:tc>
+          <w:tcPr>
+            <w:tcW w:type="dxa" w:w="6747"/>
+            <w:tcBorders>
+              <w:top w:val="single" w:color="C9D3E3" w:sz="4"/>
+              <w:left w:val="single" w:color="C9D3E3" w:sz="4"/>
+              <w:bottom w:val="single" w:color="C9D3E3" w:sz="4"/>
+              <w:right w:val="single" w:color="C9D3E3" w:sz="4"/>
+            </w:tcBorders>
+            <w:tcMar>
+              <w:top w:type="dxa" w:w="60"/>
+              <w:left w:type="dxa" w:w="90"/>
+              <w:bottom w:type="dxa" w:w="60"/>
+              <w:right w:type="dxa" w:w="90"/>
+            </w:tcMar>
+            <w:vAlign w:val="center"/>
+          </w:tcPr>
+          <w:p>
+            <w:pPr>
+              <w:spacing w:after="0"/>
+              <w:jc w:val="left"/>
+            </w:pPr>
+            <w:r>
+              <w:rPr>
+                <w:rFonts w:ascii="Arial" w:cs="Arial" w:eastAsia="Arial" w:hAnsi="Arial"/>
+                <w:b w:val="false"/>
+                <w:bCs w:val="false"/>
+                <w:color w:val="000000"/>
+                <w:sz w:val="19"/>
+                <w:szCs w:val="19"/>
+              </w:rPr>
+              <w:t xml:space="preserve">teren służy podstawowym i wyższym usługom; plan wprost wymienia tereny centrów handlowych wśród terenów usług; dopuszczalne są obiekty handlu detalicznego i drobnych usług, administracja, infrastruktura techniczna, zieleń publiczna i place zabaw</w:t>
+            </w:r>
+          </w:p>
+        </w:tc>
+      </w:tr>
+      <w:tr>
+        <w:trPr>
+          <w:cantSplit/>
+          <w:tblHeader w:val="false"/>
+        </w:trPr>
+        <w:tc>
+          <w:tcPr>
+            <w:tcW w:type="dxa" w:w="2891"/>
+            <w:tcBorders>
+              <w:top w:val="single" w:color="C9D3E3" w:sz="4"/>
+              <w:left w:val="single" w:color="C9D3E3" w:sz="4"/>
+              <w:bottom w:val="single" w:color="C9D3E3" w:sz="4"/>
+              <w:right w:val="single" w:color="C9D3E3" w:sz="4"/>
+            </w:tcBorders>
+            <w:tcMar>
+              <w:top w:type="dxa" w:w="60"/>
+              <w:left w:type="dxa" w:w="90"/>
+              <w:bottom w:type="dxa" w:w="60"/>
+              <w:right w:type="dxa" w:w="90"/>
+            </w:tcMar>
+            <w:vAlign w:val="center"/>
+          </w:tcPr>
+          <w:p>
+            <w:pPr>
+              <w:spacing w:after="0"/>
+              <w:jc w:val="left"/>
+            </w:pPr>
+            <w:r>
+              <w:rPr>
+                <w:rFonts w:ascii="Arial" w:cs="Arial" w:eastAsia="Arial" w:hAnsi="Arial"/>
+                <w:b w:val="false"/>
+                <w:bCs w:val="false"/>
+                <w:color w:val="000000"/>
+                <w:sz w:val="19"/>
+                <w:szCs w:val="19"/>
+              </w:rPr>
+              <w:t xml:space="preserve">Transformacja terenów produkcyjnych (PFovv)</w:t>
+            </w:r>
+          </w:p>
+        </w:tc>
+        <w:tc>
+          <w:tcPr>
+            <w:tcW w:type="dxa" w:w="6747"/>
+            <w:tcBorders>
+              <w:top w:val="single" w:color="C9D3E3" w:sz="4"/>
+              <w:left w:val="single" w:color="C9D3E3" w:sz="4"/>
+              <w:bottom w:val="single" w:color="C9D3E3" w:sz="4"/>
+              <w:right w:val="single" w:color="C9D3E3" w:sz="4"/>
+            </w:tcBorders>
+            <w:tcMar>
+              <w:top w:type="dxa" w:w="60"/>
+              <w:left w:type="dxa" w:w="90"/>
+              <w:bottom w:type="dxa" w:w="60"/>
+              <w:right w:type="dxa" w:w="90"/>
+            </w:tcMar>
+            <w:vAlign w:val="center"/>
+          </w:tcPr>
+          <w:p>
+            <w:pPr>
+              <w:spacing w:after="0"/>
+              <w:jc w:val="left"/>
+            </w:pPr>
+            <w:r>
+              <w:rPr>
+                <w:rFonts w:ascii="Arial" w:cs="Arial" w:eastAsia="Arial" w:hAnsi="Arial"/>
+                <w:b w:val="false"/>
+                <w:bCs w:val="false"/>
+                <w:color w:val="000000"/>
+                <w:sz w:val="19"/>
+                <w:szCs w:val="19"/>
+              </w:rPr>
+              <w:t xml:space="preserve">plan przewiduje przekształcanie dawnych terenów produkcyjnych w tereny wielofunkcyjne usługi – produkcja z uzupełniającymi usługami handlowymi i administracyjnymi</w:t>
+            </w:r>
+          </w:p>
+        </w:tc>
+      </w:tr>
+      <w:tr>
+        <w:trPr>
+          <w:cantSplit/>
+          <w:tblHeader w:val="false"/>
+        </w:trPr>
+        <w:tc>
+          <w:tcPr>
+            <w:tcW w:type="dxa" w:w="2891"/>
+            <w:tcBorders>
+              <w:top w:val="single" w:color="C9D3E3" w:sz="4"/>
+              <w:left w:val="single" w:color="C9D3E3" w:sz="4"/>
+              <w:bottom w:val="single" w:color="C9D3E3" w:sz="4"/>
+              <w:right w:val="single" w:color="C9D3E3" w:sz="4"/>
+            </w:tcBorders>
+            <w:tcMar>
+              <w:top w:type="dxa" w:w="60"/>
+              <w:left w:type="dxa" w:w="90"/>
+              <w:bottom w:type="dxa" w:w="60"/>
+              <w:right w:type="dxa" w:w="90"/>
+            </w:tcMar>
+            <w:vAlign w:val="center"/>
+          </w:tcPr>
+          <w:p>
+            <w:pPr>
+              <w:spacing w:after="0"/>
+              <w:jc w:val="left"/>
+            </w:pPr>
+            <w:r>
+              <w:rPr>
+                <w:rFonts w:ascii="Arial" w:cs="Arial" w:eastAsia="Arial" w:hAnsi="Arial"/>
+                <w:b w:val="false"/>
+                <w:bCs w:val="false"/>
+                <w:color w:val="000000"/>
+                <w:sz w:val="19"/>
+                <w:szCs w:val="19"/>
+              </w:rPr>
+              <w:t xml:space="preserve">Ustalenie 1.1.1</w:t>
+            </w:r>
+          </w:p>
+        </w:tc>
+        <w:tc>
+          <w:tcPr>
+            <w:tcW w:type="dxa" w:w="6747"/>
+            <w:tcBorders>
+              <w:top w:val="single" w:color="C9D3E3" w:sz="4"/>
+              <w:left w:val="single" w:color="C9D3E3" w:sz="4"/>
+              <w:bottom w:val="single" w:color="C9D3E3" w:sz="4"/>
+              <w:right w:val="single" w:color="C9D3E3" w:sz="4"/>
+            </w:tcBorders>
+            <w:tcMar>
+              <w:top w:type="dxa" w:w="60"/>
+              <w:left w:type="dxa" w:w="90"/>
+              <w:bottom w:type="dxa" w:w="60"/>
+              <w:right w:type="dxa" w:w="90"/>
+            </w:tcMar>
+            <w:vAlign w:val="center"/>
+          </w:tcPr>
+          <w:p>
+            <w:pPr>
+              <w:spacing w:after="0"/>
+              <w:jc w:val="left"/>
+            </w:pPr>
+            <w:r>
+              <w:rPr>
+                <w:rFonts w:ascii="Arial" w:cs="Arial" w:eastAsia="Arial" w:hAnsi="Arial"/>
+                <w:b w:val="false"/>
+                <w:bCs w:val="false"/>
+                <w:color w:val="000000"/>
+                <w:sz w:val="19"/>
+                <w:szCs w:val="19"/>
+              </w:rPr>
+              <w:t xml:space="preserve">miasto jako centrum regionalne wyznacza tereny usług podstawowych i wyższych również dla obszaru oddziaływania powiatu</w:t>
+            </w:r>
+          </w:p>
+        </w:tc>
+      </w:tr>
+      <w:tr>
+        <w:trPr>
+          <w:cantSplit/>
+          <w:tblHeader w:val="false"/>
+        </w:trPr>
+        <w:tc>
+          <w:tcPr>
+            <w:tcW w:type="dxa" w:w="2891"/>
+            <w:tcBorders>
+              <w:top w:val="single" w:color="C9D3E3" w:sz="4"/>
+              <w:left w:val="single" w:color="C9D3E3" w:sz="4"/>
+              <w:bottom w:val="single" w:color="C9D3E3" w:sz="4"/>
+              <w:right w:val="single" w:color="C9D3E3" w:sz="4"/>
+            </w:tcBorders>
+            <w:tcMar>
+              <w:top w:type="dxa" w:w="60"/>
+              <w:left w:type="dxa" w:w="90"/>
+              <w:bottom w:type="dxa" w:w="60"/>
+              <w:right w:type="dxa" w:w="90"/>
+            </w:tcMar>
+            <w:vAlign w:val="center"/>
+          </w:tcPr>
+          <w:p>
+            <w:pPr>
+              <w:spacing w:after="0"/>
+              <w:jc w:val="left"/>
+            </w:pPr>
+            <w:r>
+              <w:rPr>
+                <w:rFonts w:ascii="Arial" w:cs="Arial" w:eastAsia="Arial" w:hAnsi="Arial"/>
+                <w:b w:val="false"/>
+                <w:bCs w:val="false"/>
+                <w:color w:val="000000"/>
+                <w:sz w:val="19"/>
+                <w:szCs w:val="19"/>
+              </w:rPr>
+              <w:t xml:space="preserve">Ustalenie 1.2</w:t>
+            </w:r>
+          </w:p>
+        </w:tc>
+        <w:tc>
+          <w:tcPr>
+            <w:tcW w:type="dxa" w:w="6747"/>
+            <w:tcBorders>
+              <w:top w:val="single" w:color="C9D3E3" w:sz="4"/>
+              <w:left w:val="single" w:color="C9D3E3" w:sz="4"/>
+              <w:bottom w:val="single" w:color="C9D3E3" w:sz="4"/>
+              <w:right w:val="single" w:color="C9D3E3" w:sz="4"/>
+            </w:tcBorders>
+            <w:tcMar>
+              <w:top w:type="dxa" w:w="60"/>
+              <w:left w:type="dxa" w:w="90"/>
+              <w:bottom w:type="dxa" w:w="60"/>
+              <w:right w:type="dxa" w:w="90"/>
+            </w:tcMar>
+            <w:vAlign w:val="center"/>
+          </w:tcPr>
+          <w:p>
+            <w:pPr>
+              <w:spacing w:after="0"/>
+              <w:jc w:val="left"/>
+            </w:pPr>
+            <w:r>
+              <w:rPr>
+                <w:rFonts w:ascii="Arial" w:cs="Arial" w:eastAsia="Arial" w:hAnsi="Arial"/>
+                <w:b w:val="false"/>
+                <w:bCs w:val="false"/>
+                <w:color w:val="000000"/>
+                <w:sz w:val="19"/>
+                <w:szCs w:val="19"/>
+              </w:rPr>
+              <w:t xml:space="preserve">w centrum miasta i centrach dzielnicowych rewitalizować usługi handlu i usług</w:t>
+            </w:r>
+          </w:p>
+        </w:tc>
+      </w:tr>
+      <w:tr>
+        <w:trPr>
+          <w:cantSplit/>
+          <w:tblHeader w:val="false"/>
+        </w:trPr>
+        <w:tc>
+          <w:tcPr>
+            <w:tcW w:type="dxa" w:w="2891"/>
+            <w:tcBorders>
+              <w:top w:val="single" w:color="C9D3E3" w:sz="4"/>
+              <w:left w:val="single" w:color="C9D3E3" w:sz="4"/>
+              <w:bottom w:val="single" w:color="C9D3E3" w:sz="4"/>
+              <w:right w:val="single" w:color="C9D3E3" w:sz="4"/>
+            </w:tcBorders>
+            <w:tcMar>
+              <w:top w:type="dxa" w:w="60"/>
+              <w:left w:type="dxa" w:w="90"/>
+              <w:bottom w:type="dxa" w:w="60"/>
+              <w:right w:type="dxa" w:w="90"/>
+            </w:tcMar>
+            <w:vAlign w:val="center"/>
+          </w:tcPr>
+          <w:p>
+            <w:pPr>
+              <w:spacing w:after="0"/>
+              <w:jc w:val="left"/>
+            </w:pPr>
+            <w:r>
+              <w:rPr>
+                <w:rFonts w:ascii="Arial" w:cs="Arial" w:eastAsia="Arial" w:hAnsi="Arial"/>
+                <w:b w:val="false"/>
+                <w:bCs w:val="false"/>
+                <w:color w:val="000000"/>
+                <w:sz w:val="19"/>
+                <w:szCs w:val="19"/>
+              </w:rPr>
+              <w:t xml:space="preserve">Komunikacja</w:t>
+            </w:r>
+          </w:p>
+        </w:tc>
+        <w:tc>
+          <w:tcPr>
+            <w:tcW w:type="dxa" w:w="6747"/>
+            <w:tcBorders>
+              <w:top w:val="single" w:color="C9D3E3" w:sz="4"/>
+              <w:left w:val="single" w:color="C9D3E3" w:sz="4"/>
+              <w:bottom w:val="single" w:color="C9D3E3" w:sz="4"/>
+              <w:right w:val="single" w:color="C9D3E3" w:sz="4"/>
+            </w:tcBorders>
+            <w:tcMar>
+              <w:top w:type="dxa" w:w="60"/>
+              <w:left w:type="dxa" w:w="90"/>
+              <w:bottom w:type="dxa" w:w="60"/>
+              <w:right w:type="dxa" w:w="90"/>
+            </w:tcMar>
+            <w:vAlign w:val="center"/>
+          </w:tcPr>
+          <w:p>
+            <w:pPr>
+              <w:spacing w:after="0"/>
+              <w:jc w:val="left"/>
+            </w:pPr>
+            <w:r>
+              <w:rPr>
+                <w:rFonts w:ascii="Arial" w:cs="Arial" w:eastAsia="Arial" w:hAnsi="Arial"/>
+                <w:b w:val="false"/>
+                <w:bCs w:val="false"/>
+                <w:color w:val="000000"/>
+                <w:sz w:val="19"/>
+                <w:szCs w:val="19"/>
+              </w:rPr>
+              <w:t xml:space="preserve">plan przewiduje wewnętrzną obwodnicę z przeprawą nad ul. Levočską oraz południowo-wschodnią obwodnicę Levočská – Prešovská, co dodatkowo poprawi dostępność lokalizacji</w:t>
+            </w:r>
+          </w:p>
+        </w:tc>
+      </w:tr>
+      <w:tr>
+        <w:trPr>
+          <w:cantSplit/>
+          <w:tblHeader w:val="false"/>
+        </w:trPr>
+        <w:tc>
+          <w:tcPr>
+            <w:tcW w:type="dxa" w:w="2891"/>
+            <w:tcBorders>
+              <w:top w:val="single" w:color="C9D3E3" w:sz="4"/>
+              <w:left w:val="single" w:color="C9D3E3" w:sz="4"/>
+              <w:bottom w:val="single" w:color="C9D3E3" w:sz="4"/>
+              <w:right w:val="single" w:color="C9D3E3" w:sz="4"/>
+            </w:tcBorders>
+            <w:tcMar>
+              <w:top w:type="dxa" w:w="60"/>
+              <w:left w:type="dxa" w:w="90"/>
+              <w:bottom w:type="dxa" w:w="60"/>
+              <w:right w:type="dxa" w:w="90"/>
+            </w:tcMar>
+            <w:vAlign w:val="center"/>
+          </w:tcPr>
+          <w:p>
+            <w:pPr>
+              <w:spacing w:after="0"/>
+              <w:jc w:val="left"/>
+            </w:pPr>
+            <w:r>
+              <w:rPr>
+                <w:rFonts w:ascii="Arial" w:cs="Arial" w:eastAsia="Arial" w:hAnsi="Arial"/>
+                <w:b w:val="false"/>
+                <w:bCs w:val="false"/>
+                <w:color w:val="000000"/>
+                <w:sz w:val="19"/>
+                <w:szCs w:val="19"/>
+              </w:rPr>
+              <w:t xml:space="preserve">Ciek wodny</w:t>
+            </w:r>
+          </w:p>
+        </w:tc>
+        <w:tc>
+          <w:tcPr>
+            <w:tcW w:type="dxa" w:w="6747"/>
+            <w:tcBorders>
+              <w:top w:val="single" w:color="C9D3E3" w:sz="4"/>
+              <w:left w:val="single" w:color="C9D3E3" w:sz="4"/>
+              <w:bottom w:val="single" w:color="C9D3E3" w:sz="4"/>
+              <w:right w:val="single" w:color="C9D3E3" w:sz="4"/>
+            </w:tcBorders>
+            <w:tcMar>
+              <w:top w:type="dxa" w:w="60"/>
+              <w:left w:type="dxa" w:w="90"/>
+              <w:bottom w:type="dxa" w:w="60"/>
+              <w:right w:type="dxa" w:w="90"/>
+            </w:tcMar>
+            <w:vAlign w:val="center"/>
+          </w:tcPr>
+          <w:p>
+            <w:pPr>
+              <w:spacing w:after="0"/>
+              <w:jc w:val="left"/>
+            </w:pPr>
+            <w:r>
+              <w:rPr>
+                <w:rFonts w:ascii="Arial" w:cs="Arial" w:eastAsia="Arial" w:hAnsi="Arial"/>
+                <w:b w:val="false"/>
+                <w:bCs w:val="false"/>
+                <w:color w:val="000000"/>
+                <w:sz w:val="19"/>
+                <w:szCs w:val="19"/>
+              </w:rPr>
+              <w:t xml:space="preserve">teren sąsiaduje z uregulowaną rzeką Jakubianka; warunki zabudowy przy rzece (strefa ochronna, ochrona przeciwpowodziowa) określi stanowisko zarządcy cieku oraz informacja planistyczna miasta</w:t>
+            </w:r>
+          </w:p>
+        </w:tc>
+      </w:tr>
+      <w:tr>
+        <w:trPr>
+          <w:cantSplit/>
+          <w:tblHeader w:val="false"/>
+        </w:trPr>
+        <w:tc>
+          <w:tcPr>
+            <w:tcW w:type="dxa" w:w="2891"/>
+            <w:tcBorders>
+              <w:top w:val="single" w:color="C9D3E3" w:sz="4"/>
+              <w:left w:val="single" w:color="C9D3E3" w:sz="4"/>
+              <w:bottom w:val="single" w:color="C9D3E3" w:sz="4"/>
+              <w:right w:val="single" w:color="C9D3E3" w:sz="4"/>
+            </w:tcBorders>
+            <w:tcMar>
+              <w:top w:type="dxa" w:w="60"/>
+              <w:left w:type="dxa" w:w="90"/>
+              <w:bottom w:type="dxa" w:w="60"/>
+              <w:right w:type="dxa" w:w="90"/>
+            </w:tcMar>
+            <w:vAlign w:val="center"/>
+          </w:tcPr>
+          <w:p>
+            <w:pPr>
+              <w:spacing w:after="0"/>
+              <w:jc w:val="left"/>
+            </w:pPr>
+            <w:r>
+              <w:rPr>
+                <w:rFonts w:ascii="Arial" w:cs="Arial" w:eastAsia="Arial" w:hAnsi="Arial"/>
+                <w:b w:val="false"/>
+                <w:bCs w:val="false"/>
+                <w:color w:val="000000"/>
+                <w:sz w:val="19"/>
+                <w:szCs w:val="19"/>
+              </w:rPr>
+              <w:t xml:space="preserve">Decyzja lokalizacyjna</w:t>
+            </w:r>
+          </w:p>
+        </w:tc>
+        <w:tc>
+          <w:tcPr>
+            <w:tcW w:type="dxa" w:w="6747"/>
+            <w:tcBorders>
+              <w:top w:val="single" w:color="C9D3E3" w:sz="4"/>
+              <w:left w:val="single" w:color="C9D3E3" w:sz="4"/>
+              <w:bottom w:val="single" w:color="C9D3E3" w:sz="4"/>
+              <w:right w:val="single" w:color="C9D3E3" w:sz="4"/>
+            </w:tcBorders>
+            <w:tcMar>
+              <w:top w:type="dxa" w:w="60"/>
+              <w:left w:type="dxa" w:w="90"/>
+              <w:bottom w:type="dxa" w:w="60"/>
+              <w:right w:type="dxa" w:w="90"/>
+            </w:tcMar>
+            <w:vAlign w:val="center"/>
+          </w:tcPr>
+          <w:p>
+            <w:pPr>
+              <w:spacing w:after="0"/>
+              <w:jc w:val="left"/>
+            </w:pPr>
+            <w:r>
+              <w:rPr>
+                <w:rFonts w:ascii="Arial" w:cs="Arial" w:eastAsia="Arial" w:hAnsi="Arial"/>
+                <w:b w:val="false"/>
+                <w:bCs w:val="false"/>
+                <w:color w:val="000000"/>
+                <w:sz w:val="19"/>
+                <w:szCs w:val="19"/>
+              </w:rPr>
+              <w:t xml:space="preserve">dla terenu wydana jest ważna decyzja lokalizacyjna dla nowej zabudowy; zamierzenie Merkury Market zostanie uzgodnione z miastem, a w razie potrzeby wydana zostanie nowa decyzja lokalizacyjna dla centrum handlowego</w:t>
+            </w:r>
+          </w:p>
+        </w:tc>
+      </w:tr>
+    </w:tbl>
+    <w:p>
+      <w:pPr>
+        <w:spacing w:after="120"/>
+      </w:pPr>
+    </w:p>
+    <w:p>
+      <w:pPr>
+        <w:spacing w:after="120" w:line="276"/>
+        <w:jc w:val="both"/>
+      </w:pPr>
+      <w:r>
+        <w:rPr>
+          <w:rFonts w:ascii="Arial" w:cs="Arial" w:eastAsia="Arial" w:hAnsi="Arial"/>
+          <w:sz w:val="21"/>
+          <w:szCs w:val="21"/>
+        </w:rPr>
+        <w:t xml:space="preserve">Wiążącą informację planistyczną dla działek 775/1 – 775/5 wydaje Miasto Stará Ľubovňa (urząd budowlany) na wniosek właściciela; BauHausEurope wystąpi o nią niezwłocznie po potwierdzeniu zainteresowania Merkury Market i dołączy ją do dokumentacji na wizję lokalną wraz ze stanowiskiem miasta wobec zamierzenia centrum handlowego.</w:t>
+      </w:r>
+    </w:p>
+    <w:p>
+      <w:pPr>
+        <w:pStyle w:val="Heading1"/>
+        <w:spacing w:after="160" w:before="360"/>
+      </w:pPr>
+      <w:r>
+        <w:rPr>
+          <w:rFonts w:ascii="Arial" w:cs="Arial" w:eastAsia="Arial" w:hAnsi="Arial"/>
+          <w:b/>
+          <w:bCs/>
+          <w:color w:val="1F3B73"/>
+          <w:sz w:val="30"/>
+          <w:szCs w:val="30"/>
+        </w:rPr>
+        <w:t xml:space="preserve">5. Lokalizacja i rynek</w:t>
       </w:r>
     </w:p>
     <w:p>
@@ -1965,7 +5398,7 @@
           <w:sz w:val="30"/>
           <w:szCs w:val="30"/>
         </w:rPr>
-        <w:t xml:space="preserve">4. Warianty współpracy</w:t>
+        <w:t xml:space="preserve">6. Warianty współpracy</w:t>
       </w:r>
     </w:p>
     <w:tbl>
@@ -2608,7 +6041,7 @@
           <w:sz w:val="30"/>
           <w:szCs w:val="30"/>
         </w:rPr>
-        <w:t xml:space="preserve">5. Co możemy zapewnić dodatkowo</w:t>
+        <w:t xml:space="preserve">7. Co możemy zapewnić dodatkowo</w:t>
       </w:r>
     </w:p>
     <w:p>
@@ -2646,7 +6079,7 @@
           <w:sz w:val="21"/>
           <w:szCs w:val="21"/>
         </w:rPr>
-        <w:t xml:space="preserve">Architekt i projektant: wybór i koordynacja architekta (współpracujemy z pracownią, która przygotowała studium dla tego terenu), konstrukcja, ochrona przeciwpożarowa, obsługa komunikacyjna.</w:t>
+        <w:t xml:space="preserve">Architekt i projektant: wybór i koordynacja architekta i projektantów, konstrukcja, ochrona przeciwpożarowa, obsługa komunikacyjna.</w:t>
       </w:r>
     </w:p>
     <w:p>
@@ -2739,7 +6172,7 @@
           <w:sz w:val="30"/>
           <w:szCs w:val="30"/>
         </w:rPr>
-        <w:t xml:space="preserve">6. Orientacyjny harmonogram</w:t>
+        <w:t xml:space="preserve">8. Orientacyjny harmonogram</w:t>
       </w:r>
     </w:p>
     <w:tbl>
@@ -2907,7 +6340,7 @@
                 <w:sz w:val="18"/>
                 <w:szCs w:val="18"/>
               </w:rPr>
-              <w:t xml:space="preserve">wizja lokalna, przekazanie dokumentacji (operat, pomiar, studium), pierwsze rozmowy o cenie i zakresie</w:t>
+              <w:t xml:space="preserve">wizja lokalna, przekazanie dokumentacji (operat, pomiar, informacja planistyczna), pierwsze rozmowy o cenie i zakresie</w:t>
             </w:r>
           </w:p>
         </w:tc>
@@ -3312,7 +6745,7 @@
           <w:sz w:val="30"/>
           <w:szCs w:val="30"/>
         </w:rPr>
-        <w:t xml:space="preserve">7. O firmie BauHausEurope</w:t>
+        <w:t xml:space="preserve">9. O firmie BauHausEurope</w:t>
       </w:r>
     </w:p>
     <w:p>
@@ -3570,7 +7003,7 @@
                 <w:sz w:val="19"/>
                 <w:szCs w:val="19"/>
               </w:rPr>
-              <w:t xml:space="preserve">River Residence Stará Ľubovňa (wielofunkcyjne budynki mieszkalne); sieci uzbrojenia dla osiedla Senec – Margovo (11,66 mln EUR netto, 38 ha, 835 mieszkań i domów); 27 apartamentów w Chorwacji; Sky Hill Residence Banská Bystrica; przebudowa obiektu w Vyšných Ružbachach na 62 mieszkania</w:t>
+              <w:t xml:space="preserve">sieci uzbrojenia dla osiedla Senec – Margovo (11,66 mln EUR netto, 38 ha, 835 mieszkań i domów); 27 apartamentów w Chorwacji; Sky Hill Residence Banská Bystrica; przebudowa obiektu w Vyšných Ružbachach na 62 mieszkania</w:t>
             </w:r>
           </w:p>
         </w:tc>
@@ -3823,7 +7256,7 @@
           <w:sz w:val="30"/>
           <w:szCs w:val="30"/>
         </w:rPr>
-        <w:t xml:space="preserve">8. Dalsze kroki i kontakt</w:t>
+        <w:t xml:space="preserve">10. Dalsze kroki i kontakt</w:t>
       </w:r>
     </w:p>
     <w:p>
@@ -3837,7 +7270,7 @@
           <w:sz w:val="21"/>
           <w:szCs w:val="21"/>
         </w:rPr>
-        <w:t xml:space="preserve">Proponujemy wizję lokalną terenu w listopadzie 2026 r. połączoną ze spotkaniem w urzędzie miasta. Na spotkanie przygotujemy komplet dokumentów (wypis z księgi wieczystej, operat szacunkowy, pomiar geodezyjny, studium, badania), a po otrzymaniu projektu typowego Merkury Market także wstępny kosztorys budowy i harmonogram.</w:t>
+        <w:t xml:space="preserve">Proponujemy wizję lokalną terenu w listopadzie 2026 r. połączoną ze spotkaniem w urzędzie miasta. Na spotkanie przygotujemy komplet dokumentów (wypis z księgi wieczystej, operat szacunkowy, pomiar geodezyjny, informację planistyczną, badania), a po otrzymaniu projektu typowego Merkury Market także wstępny kosztorys budowy i harmonogram.</w:t>
       </w:r>
     </w:p>
     <w:tbl>

</xml_diff>

<commit_message>
Offer: add company financial figures 2021-2025
Co-Authored-By: Claude Fable 5.1 <noreply@anthropic.com>
Claude-Session: https://claude.ai/code/session_01Y2BwyWrz2zGDUPQB2oEzRk
</commit_message>
<xml_diff>
--- a/business-plan/ponuka-merkury-market/Oferta_inwestycyjna_Stara_Lubovna_Merkury_Market_PL.docx
+++ b/business-plan/ponuka-merkury-market/Oferta_inwestycyjna_Stara_Lubovna_Merkury_Market_PL.docx
@@ -7241,6 +7241,2083 @@
       <w:pPr>
         <w:spacing w:after="120"/>
       </w:pPr>
+    </w:p>
+    <w:p>
+      <w:pPr>
+        <w:spacing w:after="120" w:line="276"/>
+        <w:jc w:val="both"/>
+      </w:pPr>
+      <w:r>
+        <w:rPr>
+          <w:rFonts w:ascii="Arial" w:cs="Arial" w:eastAsia="Arial" w:hAnsi="Arial"/>
+          <w:sz w:val="21"/>
+          <w:szCs w:val="21"/>
+        </w:rPr>
+        <w:t xml:space="preserve">Wskaźniki finansowe spółki według rocznych sprawozdań finansowych opublikowanych w słowackim Rejestrze Sprawozdań Finansowych (w EUR):</w:t>
+      </w:r>
+    </w:p>
+    <w:tbl>
+      <w:tblPr>
+        <w:tblW w:type="dxa" w:w="9638"/>
+        <w:tblBorders>
+          <w:top w:val="single" w:color="auto" w:sz="4"/>
+          <w:left w:val="single" w:color="auto" w:sz="4"/>
+          <w:bottom w:val="single" w:color="auto" w:sz="4"/>
+          <w:right w:val="single" w:color="auto" w:sz="4"/>
+          <w:insideH w:val="single" w:color="auto" w:sz="4"/>
+          <w:insideV w:val="single" w:color="auto" w:sz="4"/>
+        </w:tblBorders>
+      </w:tblPr>
+      <w:tblGrid>
+        <w:gridCol w:w="3276"/>
+        <w:gridCol w:w="1252"/>
+        <w:gridCol w:w="1252"/>
+        <w:gridCol w:w="1252"/>
+        <w:gridCol w:w="1349"/>
+        <w:gridCol w:w="1257"/>
+      </w:tblGrid>
+      <w:tr>
+        <w:trPr>
+          <w:cantSplit/>
+          <w:tblHeader/>
+        </w:trPr>
+        <w:tc>
+          <w:tcPr>
+            <w:tcW w:type="dxa" w:w="3276"/>
+            <w:tcBorders>
+              <w:top w:val="single" w:color="C9D3E3" w:sz="4"/>
+              <w:left w:val="single" w:color="C9D3E3" w:sz="4"/>
+              <w:bottom w:val="single" w:color="C9D3E3" w:sz="4"/>
+              <w:right w:val="single" w:color="C9D3E3" w:sz="4"/>
+            </w:tcBorders>
+            <w:shd w:fill="1F3B73" w:color="auto" w:val="clear"/>
+            <w:tcMar>
+              <w:top w:type="dxa" w:w="60"/>
+              <w:left w:type="dxa" w:w="90"/>
+              <w:bottom w:type="dxa" w:w="60"/>
+              <w:right w:type="dxa" w:w="90"/>
+            </w:tcMar>
+            <w:vAlign w:val="center"/>
+          </w:tcPr>
+          <w:p>
+            <w:pPr>
+              <w:spacing w:after="0"/>
+              <w:jc w:val="left"/>
+            </w:pPr>
+            <w:r>
+              <w:rPr>
+                <w:rFonts w:ascii="Arial" w:cs="Arial" w:eastAsia="Arial" w:hAnsi="Arial"/>
+                <w:b/>
+                <w:bCs/>
+                <w:color w:val="FFFFFF"/>
+                <w:sz w:val="17"/>
+                <w:szCs w:val="17"/>
+              </w:rPr>
+              <w:t xml:space="preserve">Wskaźnik (EUR)</w:t>
+            </w:r>
+          </w:p>
+        </w:tc>
+        <w:tc>
+          <w:tcPr>
+            <w:tcW w:type="dxa" w:w="1252"/>
+            <w:tcBorders>
+              <w:top w:val="single" w:color="C9D3E3" w:sz="4"/>
+              <w:left w:val="single" w:color="C9D3E3" w:sz="4"/>
+              <w:bottom w:val="single" w:color="C9D3E3" w:sz="4"/>
+              <w:right w:val="single" w:color="C9D3E3" w:sz="4"/>
+            </w:tcBorders>
+            <w:shd w:fill="1F3B73" w:color="auto" w:val="clear"/>
+            <w:tcMar>
+              <w:top w:type="dxa" w:w="60"/>
+              <w:left w:type="dxa" w:w="90"/>
+              <w:bottom w:type="dxa" w:w="60"/>
+              <w:right w:type="dxa" w:w="90"/>
+            </w:tcMar>
+            <w:vAlign w:val="center"/>
+          </w:tcPr>
+          <w:p>
+            <w:pPr>
+              <w:spacing w:after="0"/>
+              <w:jc w:val="right"/>
+            </w:pPr>
+            <w:r>
+              <w:rPr>
+                <w:rFonts w:ascii="Arial" w:cs="Arial" w:eastAsia="Arial" w:hAnsi="Arial"/>
+                <w:b/>
+                <w:bCs/>
+                <w:color w:val="FFFFFF"/>
+                <w:sz w:val="17"/>
+                <w:szCs w:val="17"/>
+              </w:rPr>
+              <w:t xml:space="preserve">2021</w:t>
+            </w:r>
+          </w:p>
+        </w:tc>
+        <w:tc>
+          <w:tcPr>
+            <w:tcW w:type="dxa" w:w="1252"/>
+            <w:tcBorders>
+              <w:top w:val="single" w:color="C9D3E3" w:sz="4"/>
+              <w:left w:val="single" w:color="C9D3E3" w:sz="4"/>
+              <w:bottom w:val="single" w:color="C9D3E3" w:sz="4"/>
+              <w:right w:val="single" w:color="C9D3E3" w:sz="4"/>
+            </w:tcBorders>
+            <w:shd w:fill="1F3B73" w:color="auto" w:val="clear"/>
+            <w:tcMar>
+              <w:top w:type="dxa" w:w="60"/>
+              <w:left w:type="dxa" w:w="90"/>
+              <w:bottom w:type="dxa" w:w="60"/>
+              <w:right w:type="dxa" w:w="90"/>
+            </w:tcMar>
+            <w:vAlign w:val="center"/>
+          </w:tcPr>
+          <w:p>
+            <w:pPr>
+              <w:spacing w:after="0"/>
+              <w:jc w:val="right"/>
+            </w:pPr>
+            <w:r>
+              <w:rPr>
+                <w:rFonts w:ascii="Arial" w:cs="Arial" w:eastAsia="Arial" w:hAnsi="Arial"/>
+                <w:b/>
+                <w:bCs/>
+                <w:color w:val="FFFFFF"/>
+                <w:sz w:val="17"/>
+                <w:szCs w:val="17"/>
+              </w:rPr>
+              <w:t xml:space="preserve">2022</w:t>
+            </w:r>
+          </w:p>
+        </w:tc>
+        <w:tc>
+          <w:tcPr>
+            <w:tcW w:type="dxa" w:w="1252"/>
+            <w:tcBorders>
+              <w:top w:val="single" w:color="C9D3E3" w:sz="4"/>
+              <w:left w:val="single" w:color="C9D3E3" w:sz="4"/>
+              <w:bottom w:val="single" w:color="C9D3E3" w:sz="4"/>
+              <w:right w:val="single" w:color="C9D3E3" w:sz="4"/>
+            </w:tcBorders>
+            <w:shd w:fill="1F3B73" w:color="auto" w:val="clear"/>
+            <w:tcMar>
+              <w:top w:type="dxa" w:w="60"/>
+              <w:left w:type="dxa" w:w="90"/>
+              <w:bottom w:type="dxa" w:w="60"/>
+              <w:right w:type="dxa" w:w="90"/>
+            </w:tcMar>
+            <w:vAlign w:val="center"/>
+          </w:tcPr>
+          <w:p>
+            <w:pPr>
+              <w:spacing w:after="0"/>
+              <w:jc w:val="right"/>
+            </w:pPr>
+            <w:r>
+              <w:rPr>
+                <w:rFonts w:ascii="Arial" w:cs="Arial" w:eastAsia="Arial" w:hAnsi="Arial"/>
+                <w:b/>
+                <w:bCs/>
+                <w:color w:val="FFFFFF"/>
+                <w:sz w:val="17"/>
+                <w:szCs w:val="17"/>
+              </w:rPr>
+              <w:t xml:space="preserve">2023</w:t>
+            </w:r>
+          </w:p>
+        </w:tc>
+        <w:tc>
+          <w:tcPr>
+            <w:tcW w:type="dxa" w:w="1349"/>
+            <w:tcBorders>
+              <w:top w:val="single" w:color="C9D3E3" w:sz="4"/>
+              <w:left w:val="single" w:color="C9D3E3" w:sz="4"/>
+              <w:bottom w:val="single" w:color="C9D3E3" w:sz="4"/>
+              <w:right w:val="single" w:color="C9D3E3" w:sz="4"/>
+            </w:tcBorders>
+            <w:shd w:fill="1F3B73" w:color="auto" w:val="clear"/>
+            <w:tcMar>
+              <w:top w:type="dxa" w:w="60"/>
+              <w:left w:type="dxa" w:w="90"/>
+              <w:bottom w:type="dxa" w:w="60"/>
+              <w:right w:type="dxa" w:w="90"/>
+            </w:tcMar>
+            <w:vAlign w:val="center"/>
+          </w:tcPr>
+          <w:p>
+            <w:pPr>
+              <w:spacing w:after="0"/>
+              <w:jc w:val="right"/>
+            </w:pPr>
+            <w:r>
+              <w:rPr>
+                <w:rFonts w:ascii="Arial" w:cs="Arial" w:eastAsia="Arial" w:hAnsi="Arial"/>
+                <w:b/>
+                <w:bCs/>
+                <w:color w:val="FFFFFF"/>
+                <w:sz w:val="17"/>
+                <w:szCs w:val="17"/>
+              </w:rPr>
+              <w:t xml:space="preserve">2024</w:t>
+            </w:r>
+          </w:p>
+        </w:tc>
+        <w:tc>
+          <w:tcPr>
+            <w:tcW w:type="dxa" w:w="1257"/>
+            <w:tcBorders>
+              <w:top w:val="single" w:color="C9D3E3" w:sz="4"/>
+              <w:left w:val="single" w:color="C9D3E3" w:sz="4"/>
+              <w:bottom w:val="single" w:color="C9D3E3" w:sz="4"/>
+              <w:right w:val="single" w:color="C9D3E3" w:sz="4"/>
+            </w:tcBorders>
+            <w:shd w:fill="1F3B73" w:color="auto" w:val="clear"/>
+            <w:tcMar>
+              <w:top w:type="dxa" w:w="60"/>
+              <w:left w:type="dxa" w:w="90"/>
+              <w:bottom w:type="dxa" w:w="60"/>
+              <w:right w:type="dxa" w:w="90"/>
+            </w:tcMar>
+            <w:vAlign w:val="center"/>
+          </w:tcPr>
+          <w:p>
+            <w:pPr>
+              <w:spacing w:after="0"/>
+              <w:jc w:val="right"/>
+            </w:pPr>
+            <w:r>
+              <w:rPr>
+                <w:rFonts w:ascii="Arial" w:cs="Arial" w:eastAsia="Arial" w:hAnsi="Arial"/>
+                <w:b/>
+                <w:bCs/>
+                <w:color w:val="FFFFFF"/>
+                <w:sz w:val="17"/>
+                <w:szCs w:val="17"/>
+              </w:rPr>
+              <w:t xml:space="preserve">2025</w:t>
+            </w:r>
+          </w:p>
+        </w:tc>
+      </w:tr>
+      <w:tr>
+        <w:trPr>
+          <w:cantSplit/>
+          <w:tblHeader w:val="false"/>
+        </w:trPr>
+        <w:tc>
+          <w:tcPr>
+            <w:tcW w:type="dxa" w:w="3276"/>
+            <w:tcBorders>
+              <w:top w:val="single" w:color="C9D3E3" w:sz="4"/>
+              <w:left w:val="single" w:color="C9D3E3" w:sz="4"/>
+              <w:bottom w:val="single" w:color="C9D3E3" w:sz="4"/>
+              <w:right w:val="single" w:color="C9D3E3" w:sz="4"/>
+            </w:tcBorders>
+            <w:tcMar>
+              <w:top w:type="dxa" w:w="60"/>
+              <w:left w:type="dxa" w:w="90"/>
+              <w:bottom w:type="dxa" w:w="60"/>
+              <w:right w:type="dxa" w:w="90"/>
+            </w:tcMar>
+            <w:vAlign w:val="center"/>
+          </w:tcPr>
+          <w:p>
+            <w:pPr>
+              <w:spacing w:after="0"/>
+              <w:jc w:val="left"/>
+            </w:pPr>
+            <w:r>
+              <w:rPr>
+                <w:rFonts w:ascii="Arial" w:cs="Arial" w:eastAsia="Arial" w:hAnsi="Arial"/>
+                <w:b w:val="false"/>
+                <w:bCs w:val="false"/>
+                <w:color w:val="000000"/>
+                <w:sz w:val="17"/>
+                <w:szCs w:val="17"/>
+              </w:rPr>
+              <w:t xml:space="preserve">Przychody z działalności operacyjnej (obrót)</w:t>
+            </w:r>
+          </w:p>
+        </w:tc>
+        <w:tc>
+          <w:tcPr>
+            <w:tcW w:type="dxa" w:w="1252"/>
+            <w:tcBorders>
+              <w:top w:val="single" w:color="C9D3E3" w:sz="4"/>
+              <w:left w:val="single" w:color="C9D3E3" w:sz="4"/>
+              <w:bottom w:val="single" w:color="C9D3E3" w:sz="4"/>
+              <w:right w:val="single" w:color="C9D3E3" w:sz="4"/>
+            </w:tcBorders>
+            <w:tcMar>
+              <w:top w:type="dxa" w:w="60"/>
+              <w:left w:type="dxa" w:w="90"/>
+              <w:bottom w:type="dxa" w:w="60"/>
+              <w:right w:type="dxa" w:w="90"/>
+            </w:tcMar>
+            <w:vAlign w:val="center"/>
+          </w:tcPr>
+          <w:p>
+            <w:pPr>
+              <w:spacing w:after="0"/>
+              <w:jc w:val="right"/>
+            </w:pPr>
+            <w:r>
+              <w:rPr>
+                <w:rFonts w:ascii="Arial" w:cs="Arial" w:eastAsia="Arial" w:hAnsi="Arial"/>
+                <w:b w:val="false"/>
+                <w:bCs w:val="false"/>
+                <w:color w:val="000000"/>
+                <w:sz w:val="17"/>
+                <w:szCs w:val="17"/>
+              </w:rPr>
+              <w:t xml:space="preserve">7 126 603</w:t>
+            </w:r>
+          </w:p>
+        </w:tc>
+        <w:tc>
+          <w:tcPr>
+            <w:tcW w:type="dxa" w:w="1252"/>
+            <w:tcBorders>
+              <w:top w:val="single" w:color="C9D3E3" w:sz="4"/>
+              <w:left w:val="single" w:color="C9D3E3" w:sz="4"/>
+              <w:bottom w:val="single" w:color="C9D3E3" w:sz="4"/>
+              <w:right w:val="single" w:color="C9D3E3" w:sz="4"/>
+            </w:tcBorders>
+            <w:tcMar>
+              <w:top w:type="dxa" w:w="60"/>
+              <w:left w:type="dxa" w:w="90"/>
+              <w:bottom w:type="dxa" w:w="60"/>
+              <w:right w:type="dxa" w:w="90"/>
+            </w:tcMar>
+            <w:vAlign w:val="center"/>
+          </w:tcPr>
+          <w:p>
+            <w:pPr>
+              <w:spacing w:after="0"/>
+              <w:jc w:val="right"/>
+            </w:pPr>
+            <w:r>
+              <w:rPr>
+                <w:rFonts w:ascii="Arial" w:cs="Arial" w:eastAsia="Arial" w:hAnsi="Arial"/>
+                <w:b w:val="false"/>
+                <w:bCs w:val="false"/>
+                <w:color w:val="000000"/>
+                <w:sz w:val="17"/>
+                <w:szCs w:val="17"/>
+              </w:rPr>
+              <w:t xml:space="preserve">8 743 155</w:t>
+            </w:r>
+          </w:p>
+        </w:tc>
+        <w:tc>
+          <w:tcPr>
+            <w:tcW w:type="dxa" w:w="1252"/>
+            <w:tcBorders>
+              <w:top w:val="single" w:color="C9D3E3" w:sz="4"/>
+              <w:left w:val="single" w:color="C9D3E3" w:sz="4"/>
+              <w:bottom w:val="single" w:color="C9D3E3" w:sz="4"/>
+              <w:right w:val="single" w:color="C9D3E3" w:sz="4"/>
+            </w:tcBorders>
+            <w:tcMar>
+              <w:top w:type="dxa" w:w="60"/>
+              <w:left w:type="dxa" w:w="90"/>
+              <w:bottom w:type="dxa" w:w="60"/>
+              <w:right w:type="dxa" w:w="90"/>
+            </w:tcMar>
+            <w:vAlign w:val="center"/>
+          </w:tcPr>
+          <w:p>
+            <w:pPr>
+              <w:spacing w:after="0"/>
+              <w:jc w:val="right"/>
+            </w:pPr>
+            <w:r>
+              <w:rPr>
+                <w:rFonts w:ascii="Arial" w:cs="Arial" w:eastAsia="Arial" w:hAnsi="Arial"/>
+                <w:b w:val="false"/>
+                <w:bCs w:val="false"/>
+                <w:color w:val="000000"/>
+                <w:sz w:val="17"/>
+                <w:szCs w:val="17"/>
+              </w:rPr>
+              <w:t xml:space="preserve">8 662 883</w:t>
+            </w:r>
+          </w:p>
+        </w:tc>
+        <w:tc>
+          <w:tcPr>
+            <w:tcW w:type="dxa" w:w="1349"/>
+            <w:tcBorders>
+              <w:top w:val="single" w:color="C9D3E3" w:sz="4"/>
+              <w:left w:val="single" w:color="C9D3E3" w:sz="4"/>
+              <w:bottom w:val="single" w:color="C9D3E3" w:sz="4"/>
+              <w:right w:val="single" w:color="C9D3E3" w:sz="4"/>
+            </w:tcBorders>
+            <w:tcMar>
+              <w:top w:type="dxa" w:w="60"/>
+              <w:left w:type="dxa" w:w="90"/>
+              <w:bottom w:type="dxa" w:w="60"/>
+              <w:right w:type="dxa" w:w="90"/>
+            </w:tcMar>
+            <w:vAlign w:val="center"/>
+          </w:tcPr>
+          <w:p>
+            <w:pPr>
+              <w:spacing w:after="0"/>
+              <w:jc w:val="right"/>
+            </w:pPr>
+            <w:r>
+              <w:rPr>
+                <w:rFonts w:ascii="Arial" w:cs="Arial" w:eastAsia="Arial" w:hAnsi="Arial"/>
+                <w:b w:val="false"/>
+                <w:bCs w:val="false"/>
+                <w:color w:val="000000"/>
+                <w:sz w:val="17"/>
+                <w:szCs w:val="17"/>
+              </w:rPr>
+              <w:t xml:space="preserve">11 307 204</w:t>
+            </w:r>
+          </w:p>
+        </w:tc>
+        <w:tc>
+          <w:tcPr>
+            <w:tcW w:type="dxa" w:w="1257"/>
+            <w:tcBorders>
+              <w:top w:val="single" w:color="C9D3E3" w:sz="4"/>
+              <w:left w:val="single" w:color="C9D3E3" w:sz="4"/>
+              <w:bottom w:val="single" w:color="C9D3E3" w:sz="4"/>
+              <w:right w:val="single" w:color="C9D3E3" w:sz="4"/>
+            </w:tcBorders>
+            <w:tcMar>
+              <w:top w:type="dxa" w:w="60"/>
+              <w:left w:type="dxa" w:w="90"/>
+              <w:bottom w:type="dxa" w:w="60"/>
+              <w:right w:type="dxa" w:w="90"/>
+            </w:tcMar>
+            <w:vAlign w:val="center"/>
+          </w:tcPr>
+          <w:p>
+            <w:pPr>
+              <w:spacing w:after="0"/>
+              <w:jc w:val="right"/>
+            </w:pPr>
+            <w:r>
+              <w:rPr>
+                <w:rFonts w:ascii="Arial" w:cs="Arial" w:eastAsia="Arial" w:hAnsi="Arial"/>
+                <w:b w:val="false"/>
+                <w:bCs w:val="false"/>
+                <w:color w:val="000000"/>
+                <w:sz w:val="17"/>
+                <w:szCs w:val="17"/>
+              </w:rPr>
+              <w:t xml:space="preserve">9 346 482</w:t>
+            </w:r>
+          </w:p>
+        </w:tc>
+      </w:tr>
+      <w:tr>
+        <w:trPr>
+          <w:cantSplit/>
+          <w:tblHeader w:val="false"/>
+        </w:trPr>
+        <w:tc>
+          <w:tcPr>
+            <w:tcW w:type="dxa" w:w="3276"/>
+            <w:tcBorders>
+              <w:top w:val="single" w:color="C9D3E3" w:sz="4"/>
+              <w:left w:val="single" w:color="C9D3E3" w:sz="4"/>
+              <w:bottom w:val="single" w:color="C9D3E3" w:sz="4"/>
+              <w:right w:val="single" w:color="C9D3E3" w:sz="4"/>
+            </w:tcBorders>
+            <w:tcMar>
+              <w:top w:type="dxa" w:w="60"/>
+              <w:left w:type="dxa" w:w="90"/>
+              <w:bottom w:type="dxa" w:w="60"/>
+              <w:right w:type="dxa" w:w="90"/>
+            </w:tcMar>
+            <w:vAlign w:val="center"/>
+          </w:tcPr>
+          <w:p>
+            <w:pPr>
+              <w:spacing w:after="0"/>
+              <w:jc w:val="left"/>
+            </w:pPr>
+            <w:r>
+              <w:rPr>
+                <w:rFonts w:ascii="Arial" w:cs="Arial" w:eastAsia="Arial" w:hAnsi="Arial"/>
+                <w:b w:val="false"/>
+                <w:bCs w:val="false"/>
+                <w:color w:val="000000"/>
+                <w:sz w:val="17"/>
+                <w:szCs w:val="17"/>
+              </w:rPr>
+              <w:t xml:space="preserve">Wynik z działalności operacyjnej</w:t>
+            </w:r>
+          </w:p>
+        </w:tc>
+        <w:tc>
+          <w:tcPr>
+            <w:tcW w:type="dxa" w:w="1252"/>
+            <w:tcBorders>
+              <w:top w:val="single" w:color="C9D3E3" w:sz="4"/>
+              <w:left w:val="single" w:color="C9D3E3" w:sz="4"/>
+              <w:bottom w:val="single" w:color="C9D3E3" w:sz="4"/>
+              <w:right w:val="single" w:color="C9D3E3" w:sz="4"/>
+            </w:tcBorders>
+            <w:tcMar>
+              <w:top w:type="dxa" w:w="60"/>
+              <w:left w:type="dxa" w:w="90"/>
+              <w:bottom w:type="dxa" w:w="60"/>
+              <w:right w:type="dxa" w:w="90"/>
+            </w:tcMar>
+            <w:vAlign w:val="center"/>
+          </w:tcPr>
+          <w:p>
+            <w:pPr>
+              <w:spacing w:after="0"/>
+              <w:jc w:val="right"/>
+            </w:pPr>
+            <w:r>
+              <w:rPr>
+                <w:rFonts w:ascii="Arial" w:cs="Arial" w:eastAsia="Arial" w:hAnsi="Arial"/>
+                <w:b w:val="false"/>
+                <w:bCs w:val="false"/>
+                <w:color w:val="000000"/>
+                <w:sz w:val="17"/>
+                <w:szCs w:val="17"/>
+              </w:rPr>
+              <w:t xml:space="preserve">36 165</w:t>
+            </w:r>
+          </w:p>
+        </w:tc>
+        <w:tc>
+          <w:tcPr>
+            <w:tcW w:type="dxa" w:w="1252"/>
+            <w:tcBorders>
+              <w:top w:val="single" w:color="C9D3E3" w:sz="4"/>
+              <w:left w:val="single" w:color="C9D3E3" w:sz="4"/>
+              <w:bottom w:val="single" w:color="C9D3E3" w:sz="4"/>
+              <w:right w:val="single" w:color="C9D3E3" w:sz="4"/>
+            </w:tcBorders>
+            <w:tcMar>
+              <w:top w:type="dxa" w:w="60"/>
+              <w:left w:type="dxa" w:w="90"/>
+              <w:bottom w:type="dxa" w:w="60"/>
+              <w:right w:type="dxa" w:w="90"/>
+            </w:tcMar>
+            <w:vAlign w:val="center"/>
+          </w:tcPr>
+          <w:p>
+            <w:pPr>
+              <w:spacing w:after="0"/>
+              <w:jc w:val="right"/>
+            </w:pPr>
+            <w:r>
+              <w:rPr>
+                <w:rFonts w:ascii="Arial" w:cs="Arial" w:eastAsia="Arial" w:hAnsi="Arial"/>
+                <w:b w:val="false"/>
+                <w:bCs w:val="false"/>
+                <w:color w:val="000000"/>
+                <w:sz w:val="17"/>
+                <w:szCs w:val="17"/>
+              </w:rPr>
+              <w:t xml:space="preserve">157 799</w:t>
+            </w:r>
+          </w:p>
+        </w:tc>
+        <w:tc>
+          <w:tcPr>
+            <w:tcW w:type="dxa" w:w="1252"/>
+            <w:tcBorders>
+              <w:top w:val="single" w:color="C9D3E3" w:sz="4"/>
+              <w:left w:val="single" w:color="C9D3E3" w:sz="4"/>
+              <w:bottom w:val="single" w:color="C9D3E3" w:sz="4"/>
+              <w:right w:val="single" w:color="C9D3E3" w:sz="4"/>
+            </w:tcBorders>
+            <w:tcMar>
+              <w:top w:type="dxa" w:w="60"/>
+              <w:left w:type="dxa" w:w="90"/>
+              <w:bottom w:type="dxa" w:w="60"/>
+              <w:right w:type="dxa" w:w="90"/>
+            </w:tcMar>
+            <w:vAlign w:val="center"/>
+          </w:tcPr>
+          <w:p>
+            <w:pPr>
+              <w:spacing w:after="0"/>
+              <w:jc w:val="right"/>
+            </w:pPr>
+            <w:r>
+              <w:rPr>
+                <w:rFonts w:ascii="Arial" w:cs="Arial" w:eastAsia="Arial" w:hAnsi="Arial"/>
+                <w:b w:val="false"/>
+                <w:bCs w:val="false"/>
+                <w:color w:val="000000"/>
+                <w:sz w:val="17"/>
+                <w:szCs w:val="17"/>
+              </w:rPr>
+              <w:t xml:space="preserve">22 315</w:t>
+            </w:r>
+          </w:p>
+        </w:tc>
+        <w:tc>
+          <w:tcPr>
+            <w:tcW w:type="dxa" w:w="1349"/>
+            <w:tcBorders>
+              <w:top w:val="single" w:color="C9D3E3" w:sz="4"/>
+              <w:left w:val="single" w:color="C9D3E3" w:sz="4"/>
+              <w:bottom w:val="single" w:color="C9D3E3" w:sz="4"/>
+              <w:right w:val="single" w:color="C9D3E3" w:sz="4"/>
+            </w:tcBorders>
+            <w:tcMar>
+              <w:top w:type="dxa" w:w="60"/>
+              <w:left w:type="dxa" w:w="90"/>
+              <w:bottom w:type="dxa" w:w="60"/>
+              <w:right w:type="dxa" w:w="90"/>
+            </w:tcMar>
+            <w:vAlign w:val="center"/>
+          </w:tcPr>
+          <w:p>
+            <w:pPr>
+              <w:spacing w:after="0"/>
+              <w:jc w:val="right"/>
+            </w:pPr>
+            <w:r>
+              <w:rPr>
+                <w:rFonts w:ascii="Arial" w:cs="Arial" w:eastAsia="Arial" w:hAnsi="Arial"/>
+                <w:b w:val="false"/>
+                <w:bCs w:val="false"/>
+                <w:color w:val="000000"/>
+                <w:sz w:val="17"/>
+                <w:szCs w:val="17"/>
+              </w:rPr>
+              <w:t xml:space="preserve">367 470</w:t>
+            </w:r>
+          </w:p>
+        </w:tc>
+        <w:tc>
+          <w:tcPr>
+            <w:tcW w:type="dxa" w:w="1257"/>
+            <w:tcBorders>
+              <w:top w:val="single" w:color="C9D3E3" w:sz="4"/>
+              <w:left w:val="single" w:color="C9D3E3" w:sz="4"/>
+              <w:bottom w:val="single" w:color="C9D3E3" w:sz="4"/>
+              <w:right w:val="single" w:color="C9D3E3" w:sz="4"/>
+            </w:tcBorders>
+            <w:tcMar>
+              <w:top w:type="dxa" w:w="60"/>
+              <w:left w:type="dxa" w:w="90"/>
+              <w:bottom w:type="dxa" w:w="60"/>
+              <w:right w:type="dxa" w:w="90"/>
+            </w:tcMar>
+            <w:vAlign w:val="center"/>
+          </w:tcPr>
+          <w:p>
+            <w:pPr>
+              <w:spacing w:after="0"/>
+              <w:jc w:val="right"/>
+            </w:pPr>
+            <w:r>
+              <w:rPr>
+                <w:rFonts w:ascii="Arial" w:cs="Arial" w:eastAsia="Arial" w:hAnsi="Arial"/>
+                <w:b w:val="false"/>
+                <w:bCs w:val="false"/>
+                <w:color w:val="000000"/>
+                <w:sz w:val="17"/>
+                <w:szCs w:val="17"/>
+              </w:rPr>
+              <w:t xml:space="preserve">211 159</w:t>
+            </w:r>
+          </w:p>
+        </w:tc>
+      </w:tr>
+      <w:tr>
+        <w:trPr>
+          <w:cantSplit/>
+          <w:tblHeader w:val="false"/>
+        </w:trPr>
+        <w:tc>
+          <w:tcPr>
+            <w:tcW w:type="dxa" w:w="3276"/>
+            <w:tcBorders>
+              <w:top w:val="single" w:color="C9D3E3" w:sz="4"/>
+              <w:left w:val="single" w:color="C9D3E3" w:sz="4"/>
+              <w:bottom w:val="single" w:color="C9D3E3" w:sz="4"/>
+              <w:right w:val="single" w:color="C9D3E3" w:sz="4"/>
+            </w:tcBorders>
+            <w:shd w:fill="EEF3FA" w:color="auto" w:val="clear"/>
+            <w:tcMar>
+              <w:top w:type="dxa" w:w="60"/>
+              <w:left w:type="dxa" w:w="90"/>
+              <w:bottom w:type="dxa" w:w="60"/>
+              <w:right w:type="dxa" w:w="90"/>
+            </w:tcMar>
+            <w:vAlign w:val="center"/>
+          </w:tcPr>
+          <w:p>
+            <w:pPr>
+              <w:spacing w:after="0"/>
+              <w:jc w:val="left"/>
+            </w:pPr>
+            <w:r>
+              <w:rPr>
+                <w:rFonts w:ascii="Arial" w:cs="Arial" w:eastAsia="Arial" w:hAnsi="Arial"/>
+                <w:b/>
+                <w:bCs/>
+                <w:color w:val="000000"/>
+                <w:sz w:val="17"/>
+                <w:szCs w:val="17"/>
+              </w:rPr>
+              <w:t xml:space="preserve">EBITDA (wynik operacyjny + amortyzacja)</w:t>
+            </w:r>
+          </w:p>
+        </w:tc>
+        <w:tc>
+          <w:tcPr>
+            <w:tcW w:type="dxa" w:w="1252"/>
+            <w:tcBorders>
+              <w:top w:val="single" w:color="C9D3E3" w:sz="4"/>
+              <w:left w:val="single" w:color="C9D3E3" w:sz="4"/>
+              <w:bottom w:val="single" w:color="C9D3E3" w:sz="4"/>
+              <w:right w:val="single" w:color="C9D3E3" w:sz="4"/>
+            </w:tcBorders>
+            <w:shd w:fill="EEF3FA" w:color="auto" w:val="clear"/>
+            <w:tcMar>
+              <w:top w:type="dxa" w:w="60"/>
+              <w:left w:type="dxa" w:w="90"/>
+              <w:bottom w:type="dxa" w:w="60"/>
+              <w:right w:type="dxa" w:w="90"/>
+            </w:tcMar>
+            <w:vAlign w:val="center"/>
+          </w:tcPr>
+          <w:p>
+            <w:pPr>
+              <w:spacing w:after="0"/>
+              <w:jc w:val="right"/>
+            </w:pPr>
+            <w:r>
+              <w:rPr>
+                <w:rFonts w:ascii="Arial" w:cs="Arial" w:eastAsia="Arial" w:hAnsi="Arial"/>
+                <w:b/>
+                <w:bCs/>
+                <w:color w:val="000000"/>
+                <w:sz w:val="17"/>
+                <w:szCs w:val="17"/>
+              </w:rPr>
+              <w:t xml:space="preserve">81 953</w:t>
+            </w:r>
+          </w:p>
+        </w:tc>
+        <w:tc>
+          <w:tcPr>
+            <w:tcW w:type="dxa" w:w="1252"/>
+            <w:tcBorders>
+              <w:top w:val="single" w:color="C9D3E3" w:sz="4"/>
+              <w:left w:val="single" w:color="C9D3E3" w:sz="4"/>
+              <w:bottom w:val="single" w:color="C9D3E3" w:sz="4"/>
+              <w:right w:val="single" w:color="C9D3E3" w:sz="4"/>
+            </w:tcBorders>
+            <w:shd w:fill="EEF3FA" w:color="auto" w:val="clear"/>
+            <w:tcMar>
+              <w:top w:type="dxa" w:w="60"/>
+              <w:left w:type="dxa" w:w="90"/>
+              <w:bottom w:type="dxa" w:w="60"/>
+              <w:right w:type="dxa" w:w="90"/>
+            </w:tcMar>
+            <w:vAlign w:val="center"/>
+          </w:tcPr>
+          <w:p>
+            <w:pPr>
+              <w:spacing w:after="0"/>
+              <w:jc w:val="right"/>
+            </w:pPr>
+            <w:r>
+              <w:rPr>
+                <w:rFonts w:ascii="Arial" w:cs="Arial" w:eastAsia="Arial" w:hAnsi="Arial"/>
+                <w:b/>
+                <w:bCs/>
+                <w:color w:val="000000"/>
+                <w:sz w:val="17"/>
+                <w:szCs w:val="17"/>
+              </w:rPr>
+              <w:t xml:space="preserve">380 821</w:t>
+            </w:r>
+          </w:p>
+        </w:tc>
+        <w:tc>
+          <w:tcPr>
+            <w:tcW w:type="dxa" w:w="1252"/>
+            <w:tcBorders>
+              <w:top w:val="single" w:color="C9D3E3" w:sz="4"/>
+              <w:left w:val="single" w:color="C9D3E3" w:sz="4"/>
+              <w:bottom w:val="single" w:color="C9D3E3" w:sz="4"/>
+              <w:right w:val="single" w:color="C9D3E3" w:sz="4"/>
+            </w:tcBorders>
+            <w:shd w:fill="EEF3FA" w:color="auto" w:val="clear"/>
+            <w:tcMar>
+              <w:top w:type="dxa" w:w="60"/>
+              <w:left w:type="dxa" w:w="90"/>
+              <w:bottom w:type="dxa" w:w="60"/>
+              <w:right w:type="dxa" w:w="90"/>
+            </w:tcMar>
+            <w:vAlign w:val="center"/>
+          </w:tcPr>
+          <w:p>
+            <w:pPr>
+              <w:spacing w:after="0"/>
+              <w:jc w:val="right"/>
+            </w:pPr>
+            <w:r>
+              <w:rPr>
+                <w:rFonts w:ascii="Arial" w:cs="Arial" w:eastAsia="Arial" w:hAnsi="Arial"/>
+                <w:b/>
+                <w:bCs/>
+                <w:color w:val="000000"/>
+                <w:sz w:val="17"/>
+                <w:szCs w:val="17"/>
+              </w:rPr>
+              <w:t xml:space="preserve">499 222</w:t>
+            </w:r>
+          </w:p>
+        </w:tc>
+        <w:tc>
+          <w:tcPr>
+            <w:tcW w:type="dxa" w:w="1349"/>
+            <w:tcBorders>
+              <w:top w:val="single" w:color="C9D3E3" w:sz="4"/>
+              <w:left w:val="single" w:color="C9D3E3" w:sz="4"/>
+              <w:bottom w:val="single" w:color="C9D3E3" w:sz="4"/>
+              <w:right w:val="single" w:color="C9D3E3" w:sz="4"/>
+            </w:tcBorders>
+            <w:shd w:fill="EEF3FA" w:color="auto" w:val="clear"/>
+            <w:tcMar>
+              <w:top w:type="dxa" w:w="60"/>
+              <w:left w:type="dxa" w:w="90"/>
+              <w:bottom w:type="dxa" w:w="60"/>
+              <w:right w:type="dxa" w:w="90"/>
+            </w:tcMar>
+            <w:vAlign w:val="center"/>
+          </w:tcPr>
+          <w:p>
+            <w:pPr>
+              <w:spacing w:after="0"/>
+              <w:jc w:val="right"/>
+            </w:pPr>
+            <w:r>
+              <w:rPr>
+                <w:rFonts w:ascii="Arial" w:cs="Arial" w:eastAsia="Arial" w:hAnsi="Arial"/>
+                <w:b/>
+                <w:bCs/>
+                <w:color w:val="000000"/>
+                <w:sz w:val="17"/>
+                <w:szCs w:val="17"/>
+              </w:rPr>
+              <w:t xml:space="preserve">801 544</w:t>
+            </w:r>
+          </w:p>
+        </w:tc>
+        <w:tc>
+          <w:tcPr>
+            <w:tcW w:type="dxa" w:w="1257"/>
+            <w:tcBorders>
+              <w:top w:val="single" w:color="C9D3E3" w:sz="4"/>
+              <w:left w:val="single" w:color="C9D3E3" w:sz="4"/>
+              <w:bottom w:val="single" w:color="C9D3E3" w:sz="4"/>
+              <w:right w:val="single" w:color="C9D3E3" w:sz="4"/>
+            </w:tcBorders>
+            <w:shd w:fill="EEF3FA" w:color="auto" w:val="clear"/>
+            <w:tcMar>
+              <w:top w:type="dxa" w:w="60"/>
+              <w:left w:type="dxa" w:w="90"/>
+              <w:bottom w:type="dxa" w:w="60"/>
+              <w:right w:type="dxa" w:w="90"/>
+            </w:tcMar>
+            <w:vAlign w:val="center"/>
+          </w:tcPr>
+          <w:p>
+            <w:pPr>
+              <w:spacing w:after="0"/>
+              <w:jc w:val="right"/>
+            </w:pPr>
+            <w:r>
+              <w:rPr>
+                <w:rFonts w:ascii="Arial" w:cs="Arial" w:eastAsia="Arial" w:hAnsi="Arial"/>
+                <w:b/>
+                <w:bCs/>
+                <w:color w:val="000000"/>
+                <w:sz w:val="17"/>
+                <w:szCs w:val="17"/>
+              </w:rPr>
+              <w:t xml:space="preserve">639 720</w:t>
+            </w:r>
+          </w:p>
+        </w:tc>
+      </w:tr>
+      <w:tr>
+        <w:trPr>
+          <w:cantSplit/>
+          <w:tblHeader w:val="false"/>
+        </w:trPr>
+        <w:tc>
+          <w:tcPr>
+            <w:tcW w:type="dxa" w:w="3276"/>
+            <w:tcBorders>
+              <w:top w:val="single" w:color="C9D3E3" w:sz="4"/>
+              <w:left w:val="single" w:color="C9D3E3" w:sz="4"/>
+              <w:bottom w:val="single" w:color="C9D3E3" w:sz="4"/>
+              <w:right w:val="single" w:color="C9D3E3" w:sz="4"/>
+            </w:tcBorders>
+            <w:tcMar>
+              <w:top w:type="dxa" w:w="60"/>
+              <w:left w:type="dxa" w:w="90"/>
+              <w:bottom w:type="dxa" w:w="60"/>
+              <w:right w:type="dxa" w:w="90"/>
+            </w:tcMar>
+            <w:vAlign w:val="center"/>
+          </w:tcPr>
+          <w:p>
+            <w:pPr>
+              <w:spacing w:after="0"/>
+              <w:jc w:val="left"/>
+            </w:pPr>
+            <w:r>
+              <w:rPr>
+                <w:rFonts w:ascii="Arial" w:cs="Arial" w:eastAsia="Arial" w:hAnsi="Arial"/>
+                <w:b w:val="false"/>
+                <w:bCs w:val="false"/>
+                <w:color w:val="000000"/>
+                <w:sz w:val="17"/>
+                <w:szCs w:val="17"/>
+              </w:rPr>
+              <w:t xml:space="preserve">Wynik netto</w:t>
+            </w:r>
+          </w:p>
+        </w:tc>
+        <w:tc>
+          <w:tcPr>
+            <w:tcW w:type="dxa" w:w="1252"/>
+            <w:tcBorders>
+              <w:top w:val="single" w:color="C9D3E3" w:sz="4"/>
+              <w:left w:val="single" w:color="C9D3E3" w:sz="4"/>
+              <w:bottom w:val="single" w:color="C9D3E3" w:sz="4"/>
+              <w:right w:val="single" w:color="C9D3E3" w:sz="4"/>
+            </w:tcBorders>
+            <w:tcMar>
+              <w:top w:type="dxa" w:w="60"/>
+              <w:left w:type="dxa" w:w="90"/>
+              <w:bottom w:type="dxa" w:w="60"/>
+              <w:right w:type="dxa" w:w="90"/>
+            </w:tcMar>
+            <w:vAlign w:val="center"/>
+          </w:tcPr>
+          <w:p>
+            <w:pPr>
+              <w:spacing w:after="0"/>
+              <w:jc w:val="right"/>
+            </w:pPr>
+            <w:r>
+              <w:rPr>
+                <w:rFonts w:ascii="Arial" w:cs="Arial" w:eastAsia="Arial" w:hAnsi="Arial"/>
+                <w:b w:val="false"/>
+                <w:bCs w:val="false"/>
+                <w:color w:val="000000"/>
+                <w:sz w:val="17"/>
+                <w:szCs w:val="17"/>
+              </w:rPr>
+              <w:t xml:space="preserve">18 686</w:t>
+            </w:r>
+          </w:p>
+        </w:tc>
+        <w:tc>
+          <w:tcPr>
+            <w:tcW w:type="dxa" w:w="1252"/>
+            <w:tcBorders>
+              <w:top w:val="single" w:color="C9D3E3" w:sz="4"/>
+              <w:left w:val="single" w:color="C9D3E3" w:sz="4"/>
+              <w:bottom w:val="single" w:color="C9D3E3" w:sz="4"/>
+              <w:right w:val="single" w:color="C9D3E3" w:sz="4"/>
+            </w:tcBorders>
+            <w:tcMar>
+              <w:top w:type="dxa" w:w="60"/>
+              <w:left w:type="dxa" w:w="90"/>
+              <w:bottom w:type="dxa" w:w="60"/>
+              <w:right w:type="dxa" w:w="90"/>
+            </w:tcMar>
+            <w:vAlign w:val="center"/>
+          </w:tcPr>
+          <w:p>
+            <w:pPr>
+              <w:spacing w:after="0"/>
+              <w:jc w:val="right"/>
+            </w:pPr>
+            <w:r>
+              <w:rPr>
+                <w:rFonts w:ascii="Arial" w:cs="Arial" w:eastAsia="Arial" w:hAnsi="Arial"/>
+                <w:b w:val="false"/>
+                <w:bCs w:val="false"/>
+                <w:color w:val="000000"/>
+                <w:sz w:val="17"/>
+                <w:szCs w:val="17"/>
+              </w:rPr>
+              <w:t xml:space="preserve">83 286</w:t>
+            </w:r>
+          </w:p>
+        </w:tc>
+        <w:tc>
+          <w:tcPr>
+            <w:tcW w:type="dxa" w:w="1252"/>
+            <w:tcBorders>
+              <w:top w:val="single" w:color="C9D3E3" w:sz="4"/>
+              <w:left w:val="single" w:color="C9D3E3" w:sz="4"/>
+              <w:bottom w:val="single" w:color="C9D3E3" w:sz="4"/>
+              <w:right w:val="single" w:color="C9D3E3" w:sz="4"/>
+            </w:tcBorders>
+            <w:tcMar>
+              <w:top w:type="dxa" w:w="60"/>
+              <w:left w:type="dxa" w:w="90"/>
+              <w:bottom w:type="dxa" w:w="60"/>
+              <w:right w:type="dxa" w:w="90"/>
+            </w:tcMar>
+            <w:vAlign w:val="center"/>
+          </w:tcPr>
+          <w:p>
+            <w:pPr>
+              <w:spacing w:after="0"/>
+              <w:jc w:val="right"/>
+            </w:pPr>
+            <w:r>
+              <w:rPr>
+                <w:rFonts w:ascii="Arial" w:cs="Arial" w:eastAsia="Arial" w:hAnsi="Arial"/>
+                <w:b w:val="false"/>
+                <w:bCs w:val="false"/>
+                <w:color w:val="000000"/>
+                <w:sz w:val="17"/>
+                <w:szCs w:val="17"/>
+              </w:rPr>
+              <w:t xml:space="preserve">-69 736</w:t>
+            </w:r>
+          </w:p>
+        </w:tc>
+        <w:tc>
+          <w:tcPr>
+            <w:tcW w:type="dxa" w:w="1349"/>
+            <w:tcBorders>
+              <w:top w:val="single" w:color="C9D3E3" w:sz="4"/>
+              <w:left w:val="single" w:color="C9D3E3" w:sz="4"/>
+              <w:bottom w:val="single" w:color="C9D3E3" w:sz="4"/>
+              <w:right w:val="single" w:color="C9D3E3" w:sz="4"/>
+            </w:tcBorders>
+            <w:tcMar>
+              <w:top w:type="dxa" w:w="60"/>
+              <w:left w:type="dxa" w:w="90"/>
+              <w:bottom w:type="dxa" w:w="60"/>
+              <w:right w:type="dxa" w:w="90"/>
+            </w:tcMar>
+            <w:vAlign w:val="center"/>
+          </w:tcPr>
+          <w:p>
+            <w:pPr>
+              <w:spacing w:after="0"/>
+              <w:jc w:val="right"/>
+            </w:pPr>
+            <w:r>
+              <w:rPr>
+                <w:rFonts w:ascii="Arial" w:cs="Arial" w:eastAsia="Arial" w:hAnsi="Arial"/>
+                <w:b w:val="false"/>
+                <w:bCs w:val="false"/>
+                <w:color w:val="000000"/>
+                <w:sz w:val="17"/>
+                <w:szCs w:val="17"/>
+              </w:rPr>
+              <w:t xml:space="preserve">220 503</w:t>
+            </w:r>
+          </w:p>
+        </w:tc>
+        <w:tc>
+          <w:tcPr>
+            <w:tcW w:type="dxa" w:w="1257"/>
+            <w:tcBorders>
+              <w:top w:val="single" w:color="C9D3E3" w:sz="4"/>
+              <w:left w:val="single" w:color="C9D3E3" w:sz="4"/>
+              <w:bottom w:val="single" w:color="C9D3E3" w:sz="4"/>
+              <w:right w:val="single" w:color="C9D3E3" w:sz="4"/>
+            </w:tcBorders>
+            <w:tcMar>
+              <w:top w:type="dxa" w:w="60"/>
+              <w:left w:type="dxa" w:w="90"/>
+              <w:bottom w:type="dxa" w:w="60"/>
+              <w:right w:type="dxa" w:w="90"/>
+            </w:tcMar>
+            <w:vAlign w:val="center"/>
+          </w:tcPr>
+          <w:p>
+            <w:pPr>
+              <w:spacing w:after="0"/>
+              <w:jc w:val="right"/>
+            </w:pPr>
+            <w:r>
+              <w:rPr>
+                <w:rFonts w:ascii="Arial" w:cs="Arial" w:eastAsia="Arial" w:hAnsi="Arial"/>
+                <w:b w:val="false"/>
+                <w:bCs w:val="false"/>
+                <w:color w:val="000000"/>
+                <w:sz w:val="17"/>
+                <w:szCs w:val="17"/>
+              </w:rPr>
+              <w:t xml:space="preserve">106 056</w:t>
+            </w:r>
+          </w:p>
+        </w:tc>
+      </w:tr>
+      <w:tr>
+        <w:trPr>
+          <w:cantSplit/>
+          <w:tblHeader w:val="false"/>
+        </w:trPr>
+        <w:tc>
+          <w:tcPr>
+            <w:tcW w:type="dxa" w:w="3276"/>
+            <w:tcBorders>
+              <w:top w:val="single" w:color="C9D3E3" w:sz="4"/>
+              <w:left w:val="single" w:color="C9D3E3" w:sz="4"/>
+              <w:bottom w:val="single" w:color="C9D3E3" w:sz="4"/>
+              <w:right w:val="single" w:color="C9D3E3" w:sz="4"/>
+            </w:tcBorders>
+            <w:tcMar>
+              <w:top w:type="dxa" w:w="60"/>
+              <w:left w:type="dxa" w:w="90"/>
+              <w:bottom w:type="dxa" w:w="60"/>
+              <w:right w:type="dxa" w:w="90"/>
+            </w:tcMar>
+            <w:vAlign w:val="center"/>
+          </w:tcPr>
+          <w:p>
+            <w:pPr>
+              <w:spacing w:after="0"/>
+              <w:jc w:val="left"/>
+            </w:pPr>
+            <w:r>
+              <w:rPr>
+                <w:rFonts w:ascii="Arial" w:cs="Arial" w:eastAsia="Arial" w:hAnsi="Arial"/>
+                <w:b w:val="false"/>
+                <w:bCs w:val="false"/>
+                <w:color w:val="000000"/>
+                <w:sz w:val="17"/>
+                <w:szCs w:val="17"/>
+              </w:rPr>
+              <w:t xml:space="preserve">Aktywa razem (netto)</w:t>
+            </w:r>
+          </w:p>
+        </w:tc>
+        <w:tc>
+          <w:tcPr>
+            <w:tcW w:type="dxa" w:w="1252"/>
+            <w:tcBorders>
+              <w:top w:val="single" w:color="C9D3E3" w:sz="4"/>
+              <w:left w:val="single" w:color="C9D3E3" w:sz="4"/>
+              <w:bottom w:val="single" w:color="C9D3E3" w:sz="4"/>
+              <w:right w:val="single" w:color="C9D3E3" w:sz="4"/>
+            </w:tcBorders>
+            <w:tcMar>
+              <w:top w:type="dxa" w:w="60"/>
+              <w:left w:type="dxa" w:w="90"/>
+              <w:bottom w:type="dxa" w:w="60"/>
+              <w:right w:type="dxa" w:w="90"/>
+            </w:tcMar>
+            <w:vAlign w:val="center"/>
+          </w:tcPr>
+          <w:p>
+            <w:pPr>
+              <w:spacing w:after="0"/>
+              <w:jc w:val="right"/>
+            </w:pPr>
+            <w:r>
+              <w:rPr>
+                <w:rFonts w:ascii="Arial" w:cs="Arial" w:eastAsia="Arial" w:hAnsi="Arial"/>
+                <w:b w:val="false"/>
+                <w:bCs w:val="false"/>
+                <w:color w:val="000000"/>
+                <w:sz w:val="17"/>
+                <w:szCs w:val="17"/>
+              </w:rPr>
+              <w:t xml:space="preserve">1 351 175</w:t>
+            </w:r>
+          </w:p>
+        </w:tc>
+        <w:tc>
+          <w:tcPr>
+            <w:tcW w:type="dxa" w:w="1252"/>
+            <w:tcBorders>
+              <w:top w:val="single" w:color="C9D3E3" w:sz="4"/>
+              <w:left w:val="single" w:color="C9D3E3" w:sz="4"/>
+              <w:bottom w:val="single" w:color="C9D3E3" w:sz="4"/>
+              <w:right w:val="single" w:color="C9D3E3" w:sz="4"/>
+            </w:tcBorders>
+            <w:tcMar>
+              <w:top w:type="dxa" w:w="60"/>
+              <w:left w:type="dxa" w:w="90"/>
+              <w:bottom w:type="dxa" w:w="60"/>
+              <w:right w:type="dxa" w:w="90"/>
+            </w:tcMar>
+            <w:vAlign w:val="center"/>
+          </w:tcPr>
+          <w:p>
+            <w:pPr>
+              <w:spacing w:after="0"/>
+              <w:jc w:val="right"/>
+            </w:pPr>
+            <w:r>
+              <w:rPr>
+                <w:rFonts w:ascii="Arial" w:cs="Arial" w:eastAsia="Arial" w:hAnsi="Arial"/>
+                <w:b w:val="false"/>
+                <w:bCs w:val="false"/>
+                <w:color w:val="000000"/>
+                <w:sz w:val="17"/>
+                <w:szCs w:val="17"/>
+              </w:rPr>
+              <w:t xml:space="preserve">2 974 620</w:t>
+            </w:r>
+          </w:p>
+        </w:tc>
+        <w:tc>
+          <w:tcPr>
+            <w:tcW w:type="dxa" w:w="1252"/>
+            <w:tcBorders>
+              <w:top w:val="single" w:color="C9D3E3" w:sz="4"/>
+              <w:left w:val="single" w:color="C9D3E3" w:sz="4"/>
+              <w:bottom w:val="single" w:color="C9D3E3" w:sz="4"/>
+              <w:right w:val="single" w:color="C9D3E3" w:sz="4"/>
+            </w:tcBorders>
+            <w:tcMar>
+              <w:top w:type="dxa" w:w="60"/>
+              <w:left w:type="dxa" w:w="90"/>
+              <w:bottom w:type="dxa" w:w="60"/>
+              <w:right w:type="dxa" w:w="90"/>
+            </w:tcMar>
+            <w:vAlign w:val="center"/>
+          </w:tcPr>
+          <w:p>
+            <w:pPr>
+              <w:spacing w:after="0"/>
+              <w:jc w:val="right"/>
+            </w:pPr>
+            <w:r>
+              <w:rPr>
+                <w:rFonts w:ascii="Arial" w:cs="Arial" w:eastAsia="Arial" w:hAnsi="Arial"/>
+                <w:b w:val="false"/>
+                <w:bCs w:val="false"/>
+                <w:color w:val="000000"/>
+                <w:sz w:val="17"/>
+                <w:szCs w:val="17"/>
+              </w:rPr>
+              <w:t xml:space="preserve">2 709 699</w:t>
+            </w:r>
+          </w:p>
+        </w:tc>
+        <w:tc>
+          <w:tcPr>
+            <w:tcW w:type="dxa" w:w="1349"/>
+            <w:tcBorders>
+              <w:top w:val="single" w:color="C9D3E3" w:sz="4"/>
+              <w:left w:val="single" w:color="C9D3E3" w:sz="4"/>
+              <w:bottom w:val="single" w:color="C9D3E3" w:sz="4"/>
+              <w:right w:val="single" w:color="C9D3E3" w:sz="4"/>
+            </w:tcBorders>
+            <w:tcMar>
+              <w:top w:type="dxa" w:w="60"/>
+              <w:left w:type="dxa" w:w="90"/>
+              <w:bottom w:type="dxa" w:w="60"/>
+              <w:right w:type="dxa" w:w="90"/>
+            </w:tcMar>
+            <w:vAlign w:val="center"/>
+          </w:tcPr>
+          <w:p>
+            <w:pPr>
+              <w:spacing w:after="0"/>
+              <w:jc w:val="right"/>
+            </w:pPr>
+            <w:r>
+              <w:rPr>
+                <w:rFonts w:ascii="Arial" w:cs="Arial" w:eastAsia="Arial" w:hAnsi="Arial"/>
+                <w:b w:val="false"/>
+                <w:bCs w:val="false"/>
+                <w:color w:val="000000"/>
+                <w:sz w:val="17"/>
+                <w:szCs w:val="17"/>
+              </w:rPr>
+              <w:t xml:space="preserve">3 386 125</w:t>
+            </w:r>
+          </w:p>
+        </w:tc>
+        <w:tc>
+          <w:tcPr>
+            <w:tcW w:type="dxa" w:w="1257"/>
+            <w:tcBorders>
+              <w:top w:val="single" w:color="C9D3E3" w:sz="4"/>
+              <w:left w:val="single" w:color="C9D3E3" w:sz="4"/>
+              <w:bottom w:val="single" w:color="C9D3E3" w:sz="4"/>
+              <w:right w:val="single" w:color="C9D3E3" w:sz="4"/>
+            </w:tcBorders>
+            <w:tcMar>
+              <w:top w:type="dxa" w:w="60"/>
+              <w:left w:type="dxa" w:w="90"/>
+              <w:bottom w:type="dxa" w:w="60"/>
+              <w:right w:type="dxa" w:w="90"/>
+            </w:tcMar>
+            <w:vAlign w:val="center"/>
+          </w:tcPr>
+          <w:p>
+            <w:pPr>
+              <w:spacing w:after="0"/>
+              <w:jc w:val="right"/>
+            </w:pPr>
+            <w:r>
+              <w:rPr>
+                <w:rFonts w:ascii="Arial" w:cs="Arial" w:eastAsia="Arial" w:hAnsi="Arial"/>
+                <w:b w:val="false"/>
+                <w:bCs w:val="false"/>
+                <w:color w:val="000000"/>
+                <w:sz w:val="17"/>
+                <w:szCs w:val="17"/>
+              </w:rPr>
+              <w:t xml:space="preserve">3 490 376</w:t>
+            </w:r>
+          </w:p>
+        </w:tc>
+      </w:tr>
+      <w:tr>
+        <w:trPr>
+          <w:cantSplit/>
+          <w:tblHeader w:val="false"/>
+        </w:trPr>
+        <w:tc>
+          <w:tcPr>
+            <w:tcW w:type="dxa" w:w="3276"/>
+            <w:tcBorders>
+              <w:top w:val="single" w:color="C9D3E3" w:sz="4"/>
+              <w:left w:val="single" w:color="C9D3E3" w:sz="4"/>
+              <w:bottom w:val="single" w:color="C9D3E3" w:sz="4"/>
+              <w:right w:val="single" w:color="C9D3E3" w:sz="4"/>
+            </w:tcBorders>
+            <w:tcMar>
+              <w:top w:type="dxa" w:w="60"/>
+              <w:left w:type="dxa" w:w="90"/>
+              <w:bottom w:type="dxa" w:w="60"/>
+              <w:right w:type="dxa" w:w="90"/>
+            </w:tcMar>
+            <w:vAlign w:val="center"/>
+          </w:tcPr>
+          <w:p>
+            <w:pPr>
+              <w:spacing w:after="0"/>
+              <w:jc w:val="left"/>
+            </w:pPr>
+            <w:r>
+              <w:rPr>
+                <w:rFonts w:ascii="Arial" w:cs="Arial" w:eastAsia="Arial" w:hAnsi="Arial"/>
+                <w:b w:val="false"/>
+                <w:bCs w:val="false"/>
+                <w:color w:val="000000"/>
+                <w:sz w:val="17"/>
+                <w:szCs w:val="17"/>
+              </w:rPr>
+              <w:t xml:space="preserve">w tym rzeczowe aktywa trwałe</w:t>
+            </w:r>
+          </w:p>
+        </w:tc>
+        <w:tc>
+          <w:tcPr>
+            <w:tcW w:type="dxa" w:w="1252"/>
+            <w:tcBorders>
+              <w:top w:val="single" w:color="C9D3E3" w:sz="4"/>
+              <w:left w:val="single" w:color="C9D3E3" w:sz="4"/>
+              <w:bottom w:val="single" w:color="C9D3E3" w:sz="4"/>
+              <w:right w:val="single" w:color="C9D3E3" w:sz="4"/>
+            </w:tcBorders>
+            <w:tcMar>
+              <w:top w:type="dxa" w:w="60"/>
+              <w:left w:type="dxa" w:w="90"/>
+              <w:bottom w:type="dxa" w:w="60"/>
+              <w:right w:type="dxa" w:w="90"/>
+            </w:tcMar>
+            <w:vAlign w:val="center"/>
+          </w:tcPr>
+          <w:p>
+            <w:pPr>
+              <w:spacing w:after="0"/>
+              <w:jc w:val="right"/>
+            </w:pPr>
+            <w:r>
+              <w:rPr>
+                <w:rFonts w:ascii="Arial" w:cs="Arial" w:eastAsia="Arial" w:hAnsi="Arial"/>
+                <w:b w:val="false"/>
+                <w:bCs w:val="false"/>
+                <w:color w:val="000000"/>
+                <w:sz w:val="17"/>
+                <w:szCs w:val="17"/>
+              </w:rPr>
+              <w:t xml:space="preserve">287 167</w:t>
+            </w:r>
+          </w:p>
+        </w:tc>
+        <w:tc>
+          <w:tcPr>
+            <w:tcW w:type="dxa" w:w="1252"/>
+            <w:tcBorders>
+              <w:top w:val="single" w:color="C9D3E3" w:sz="4"/>
+              <w:left w:val="single" w:color="C9D3E3" w:sz="4"/>
+              <w:bottom w:val="single" w:color="C9D3E3" w:sz="4"/>
+              <w:right w:val="single" w:color="C9D3E3" w:sz="4"/>
+            </w:tcBorders>
+            <w:tcMar>
+              <w:top w:type="dxa" w:w="60"/>
+              <w:left w:type="dxa" w:w="90"/>
+              <w:bottom w:type="dxa" w:w="60"/>
+              <w:right w:type="dxa" w:w="90"/>
+            </w:tcMar>
+            <w:vAlign w:val="center"/>
+          </w:tcPr>
+          <w:p>
+            <w:pPr>
+              <w:spacing w:after="0"/>
+              <w:jc w:val="right"/>
+            </w:pPr>
+            <w:r>
+              <w:rPr>
+                <w:rFonts w:ascii="Arial" w:cs="Arial" w:eastAsia="Arial" w:hAnsi="Arial"/>
+                <w:b w:val="false"/>
+                <w:bCs w:val="false"/>
+                <w:color w:val="000000"/>
+                <w:sz w:val="17"/>
+                <w:szCs w:val="17"/>
+              </w:rPr>
+              <w:t xml:space="preserve">1 783 967</w:t>
+            </w:r>
+          </w:p>
+        </w:tc>
+        <w:tc>
+          <w:tcPr>
+            <w:tcW w:type="dxa" w:w="1252"/>
+            <w:tcBorders>
+              <w:top w:val="single" w:color="C9D3E3" w:sz="4"/>
+              <w:left w:val="single" w:color="C9D3E3" w:sz="4"/>
+              <w:bottom w:val="single" w:color="C9D3E3" w:sz="4"/>
+              <w:right w:val="single" w:color="C9D3E3" w:sz="4"/>
+            </w:tcBorders>
+            <w:tcMar>
+              <w:top w:type="dxa" w:w="60"/>
+              <w:left w:type="dxa" w:w="90"/>
+              <w:bottom w:type="dxa" w:w="60"/>
+              <w:right w:type="dxa" w:w="90"/>
+            </w:tcMar>
+            <w:vAlign w:val="center"/>
+          </w:tcPr>
+          <w:p>
+            <w:pPr>
+              <w:spacing w:after="0"/>
+              <w:jc w:val="right"/>
+            </w:pPr>
+            <w:r>
+              <w:rPr>
+                <w:rFonts w:ascii="Arial" w:cs="Arial" w:eastAsia="Arial" w:hAnsi="Arial"/>
+                <w:b w:val="false"/>
+                <w:bCs w:val="false"/>
+                <w:color w:val="000000"/>
+                <w:sz w:val="17"/>
+                <w:szCs w:val="17"/>
+              </w:rPr>
+              <w:t xml:space="preserve">1 672 519</w:t>
+            </w:r>
+          </w:p>
+        </w:tc>
+        <w:tc>
+          <w:tcPr>
+            <w:tcW w:type="dxa" w:w="1349"/>
+            <w:tcBorders>
+              <w:top w:val="single" w:color="C9D3E3" w:sz="4"/>
+              <w:left w:val="single" w:color="C9D3E3" w:sz="4"/>
+              <w:bottom w:val="single" w:color="C9D3E3" w:sz="4"/>
+              <w:right w:val="single" w:color="C9D3E3" w:sz="4"/>
+            </w:tcBorders>
+            <w:tcMar>
+              <w:top w:type="dxa" w:w="60"/>
+              <w:left w:type="dxa" w:w="90"/>
+              <w:bottom w:type="dxa" w:w="60"/>
+              <w:right w:type="dxa" w:w="90"/>
+            </w:tcMar>
+            <w:vAlign w:val="center"/>
+          </w:tcPr>
+          <w:p>
+            <w:pPr>
+              <w:spacing w:after="0"/>
+              <w:jc w:val="right"/>
+            </w:pPr>
+            <w:r>
+              <w:rPr>
+                <w:rFonts w:ascii="Arial" w:cs="Arial" w:eastAsia="Arial" w:hAnsi="Arial"/>
+                <w:b w:val="false"/>
+                <w:bCs w:val="false"/>
+                <w:color w:val="000000"/>
+                <w:sz w:val="17"/>
+                <w:szCs w:val="17"/>
+              </w:rPr>
+              <w:t xml:space="preserve">1 865 839</w:t>
+            </w:r>
+          </w:p>
+        </w:tc>
+        <w:tc>
+          <w:tcPr>
+            <w:tcW w:type="dxa" w:w="1257"/>
+            <w:tcBorders>
+              <w:top w:val="single" w:color="C9D3E3" w:sz="4"/>
+              <w:left w:val="single" w:color="C9D3E3" w:sz="4"/>
+              <w:bottom w:val="single" w:color="C9D3E3" w:sz="4"/>
+              <w:right w:val="single" w:color="C9D3E3" w:sz="4"/>
+            </w:tcBorders>
+            <w:tcMar>
+              <w:top w:type="dxa" w:w="60"/>
+              <w:left w:type="dxa" w:w="90"/>
+              <w:bottom w:type="dxa" w:w="60"/>
+              <w:right w:type="dxa" w:w="90"/>
+            </w:tcMar>
+            <w:vAlign w:val="center"/>
+          </w:tcPr>
+          <w:p>
+            <w:pPr>
+              <w:spacing w:after="0"/>
+              <w:jc w:val="right"/>
+            </w:pPr>
+            <w:r>
+              <w:rPr>
+                <w:rFonts w:ascii="Arial" w:cs="Arial" w:eastAsia="Arial" w:hAnsi="Arial"/>
+                <w:b w:val="false"/>
+                <w:bCs w:val="false"/>
+                <w:color w:val="000000"/>
+                <w:sz w:val="17"/>
+                <w:szCs w:val="17"/>
+              </w:rPr>
+              <w:t xml:space="preserve">1 537 681</w:t>
+            </w:r>
+          </w:p>
+        </w:tc>
+      </w:tr>
+      <w:tr>
+        <w:trPr>
+          <w:cantSplit/>
+          <w:tblHeader w:val="false"/>
+        </w:trPr>
+        <w:tc>
+          <w:tcPr>
+            <w:tcW w:type="dxa" w:w="3276"/>
+            <w:tcBorders>
+              <w:top w:val="single" w:color="C9D3E3" w:sz="4"/>
+              <w:left w:val="single" w:color="C9D3E3" w:sz="4"/>
+              <w:bottom w:val="single" w:color="C9D3E3" w:sz="4"/>
+              <w:right w:val="single" w:color="C9D3E3" w:sz="4"/>
+            </w:tcBorders>
+            <w:shd w:fill="EEF3FA" w:color="auto" w:val="clear"/>
+            <w:tcMar>
+              <w:top w:type="dxa" w:w="60"/>
+              <w:left w:type="dxa" w:w="90"/>
+              <w:bottom w:type="dxa" w:w="60"/>
+              <w:right w:type="dxa" w:w="90"/>
+            </w:tcMar>
+            <w:vAlign w:val="center"/>
+          </w:tcPr>
+          <w:p>
+            <w:pPr>
+              <w:spacing w:after="0"/>
+              <w:jc w:val="left"/>
+            </w:pPr>
+            <w:r>
+              <w:rPr>
+                <w:rFonts w:ascii="Arial" w:cs="Arial" w:eastAsia="Arial" w:hAnsi="Arial"/>
+                <w:b/>
+                <w:bCs/>
+                <w:color w:val="000000"/>
+                <w:sz w:val="17"/>
+                <w:szCs w:val="17"/>
+              </w:rPr>
+              <w:t xml:space="preserve">Kapitał własny</w:t>
+            </w:r>
+          </w:p>
+        </w:tc>
+        <w:tc>
+          <w:tcPr>
+            <w:tcW w:type="dxa" w:w="1252"/>
+            <w:tcBorders>
+              <w:top w:val="single" w:color="C9D3E3" w:sz="4"/>
+              <w:left w:val="single" w:color="C9D3E3" w:sz="4"/>
+              <w:bottom w:val="single" w:color="C9D3E3" w:sz="4"/>
+              <w:right w:val="single" w:color="C9D3E3" w:sz="4"/>
+            </w:tcBorders>
+            <w:shd w:fill="EEF3FA" w:color="auto" w:val="clear"/>
+            <w:tcMar>
+              <w:top w:type="dxa" w:w="60"/>
+              <w:left w:type="dxa" w:w="90"/>
+              <w:bottom w:type="dxa" w:w="60"/>
+              <w:right w:type="dxa" w:w="90"/>
+            </w:tcMar>
+            <w:vAlign w:val="center"/>
+          </w:tcPr>
+          <w:p>
+            <w:pPr>
+              <w:spacing w:after="0"/>
+              <w:jc w:val="right"/>
+            </w:pPr>
+            <w:r>
+              <w:rPr>
+                <w:rFonts w:ascii="Arial" w:cs="Arial" w:eastAsia="Arial" w:hAnsi="Arial"/>
+                <w:b/>
+                <w:bCs/>
+                <w:color w:val="000000"/>
+                <w:sz w:val="17"/>
+                <w:szCs w:val="17"/>
+              </w:rPr>
+              <w:t xml:space="preserve">155 468</w:t>
+            </w:r>
+          </w:p>
+        </w:tc>
+        <w:tc>
+          <w:tcPr>
+            <w:tcW w:type="dxa" w:w="1252"/>
+            <w:tcBorders>
+              <w:top w:val="single" w:color="C9D3E3" w:sz="4"/>
+              <w:left w:val="single" w:color="C9D3E3" w:sz="4"/>
+              <w:bottom w:val="single" w:color="C9D3E3" w:sz="4"/>
+              <w:right w:val="single" w:color="C9D3E3" w:sz="4"/>
+            </w:tcBorders>
+            <w:shd w:fill="EEF3FA" w:color="auto" w:val="clear"/>
+            <w:tcMar>
+              <w:top w:type="dxa" w:w="60"/>
+              <w:left w:type="dxa" w:w="90"/>
+              <w:bottom w:type="dxa" w:w="60"/>
+              <w:right w:type="dxa" w:w="90"/>
+            </w:tcMar>
+            <w:vAlign w:val="center"/>
+          </w:tcPr>
+          <w:p>
+            <w:pPr>
+              <w:spacing w:after="0"/>
+              <w:jc w:val="right"/>
+            </w:pPr>
+            <w:r>
+              <w:rPr>
+                <w:rFonts w:ascii="Arial" w:cs="Arial" w:eastAsia="Arial" w:hAnsi="Arial"/>
+                <w:b/>
+                <w:bCs/>
+                <w:color w:val="000000"/>
+                <w:sz w:val="17"/>
+                <w:szCs w:val="17"/>
+              </w:rPr>
+              <w:t xml:space="preserve">608 454</w:t>
+            </w:r>
+          </w:p>
+        </w:tc>
+        <w:tc>
+          <w:tcPr>
+            <w:tcW w:type="dxa" w:w="1252"/>
+            <w:tcBorders>
+              <w:top w:val="single" w:color="C9D3E3" w:sz="4"/>
+              <w:left w:val="single" w:color="C9D3E3" w:sz="4"/>
+              <w:bottom w:val="single" w:color="C9D3E3" w:sz="4"/>
+              <w:right w:val="single" w:color="C9D3E3" w:sz="4"/>
+            </w:tcBorders>
+            <w:shd w:fill="EEF3FA" w:color="auto" w:val="clear"/>
+            <w:tcMar>
+              <w:top w:type="dxa" w:w="60"/>
+              <w:left w:type="dxa" w:w="90"/>
+              <w:bottom w:type="dxa" w:w="60"/>
+              <w:right w:type="dxa" w:w="90"/>
+            </w:tcMar>
+            <w:vAlign w:val="center"/>
+          </w:tcPr>
+          <w:p>
+            <w:pPr>
+              <w:spacing w:after="0"/>
+              <w:jc w:val="right"/>
+            </w:pPr>
+            <w:r>
+              <w:rPr>
+                <w:rFonts w:ascii="Arial" w:cs="Arial" w:eastAsia="Arial" w:hAnsi="Arial"/>
+                <w:b/>
+                <w:bCs/>
+                <w:color w:val="000000"/>
+                <w:sz w:val="17"/>
+                <w:szCs w:val="17"/>
+              </w:rPr>
+              <w:t xml:space="preserve">521 694</w:t>
+            </w:r>
+          </w:p>
+        </w:tc>
+        <w:tc>
+          <w:tcPr>
+            <w:tcW w:type="dxa" w:w="1349"/>
+            <w:tcBorders>
+              <w:top w:val="single" w:color="C9D3E3" w:sz="4"/>
+              <w:left w:val="single" w:color="C9D3E3" w:sz="4"/>
+              <w:bottom w:val="single" w:color="C9D3E3" w:sz="4"/>
+              <w:right w:val="single" w:color="C9D3E3" w:sz="4"/>
+            </w:tcBorders>
+            <w:shd w:fill="EEF3FA" w:color="auto" w:val="clear"/>
+            <w:tcMar>
+              <w:top w:type="dxa" w:w="60"/>
+              <w:left w:type="dxa" w:w="90"/>
+              <w:bottom w:type="dxa" w:w="60"/>
+              <w:right w:type="dxa" w:w="90"/>
+            </w:tcMar>
+            <w:vAlign w:val="center"/>
+          </w:tcPr>
+          <w:p>
+            <w:pPr>
+              <w:spacing w:after="0"/>
+              <w:jc w:val="right"/>
+            </w:pPr>
+            <w:r>
+              <w:rPr>
+                <w:rFonts w:ascii="Arial" w:cs="Arial" w:eastAsia="Arial" w:hAnsi="Arial"/>
+                <w:b/>
+                <w:bCs/>
+                <w:color w:val="000000"/>
+                <w:sz w:val="17"/>
+                <w:szCs w:val="17"/>
+              </w:rPr>
+              <w:t xml:space="preserve">742 198</w:t>
+            </w:r>
+          </w:p>
+        </w:tc>
+        <w:tc>
+          <w:tcPr>
+            <w:tcW w:type="dxa" w:w="1257"/>
+            <w:tcBorders>
+              <w:top w:val="single" w:color="C9D3E3" w:sz="4"/>
+              <w:left w:val="single" w:color="C9D3E3" w:sz="4"/>
+              <w:bottom w:val="single" w:color="C9D3E3" w:sz="4"/>
+              <w:right w:val="single" w:color="C9D3E3" w:sz="4"/>
+            </w:tcBorders>
+            <w:shd w:fill="EEF3FA" w:color="auto" w:val="clear"/>
+            <w:tcMar>
+              <w:top w:type="dxa" w:w="60"/>
+              <w:left w:type="dxa" w:w="90"/>
+              <w:bottom w:type="dxa" w:w="60"/>
+              <w:right w:type="dxa" w:w="90"/>
+            </w:tcMar>
+            <w:vAlign w:val="center"/>
+          </w:tcPr>
+          <w:p>
+            <w:pPr>
+              <w:spacing w:after="0"/>
+              <w:jc w:val="right"/>
+            </w:pPr>
+            <w:r>
+              <w:rPr>
+                <w:rFonts w:ascii="Arial" w:cs="Arial" w:eastAsia="Arial" w:hAnsi="Arial"/>
+                <w:b/>
+                <w:bCs/>
+                <w:color w:val="000000"/>
+                <w:sz w:val="17"/>
+                <w:szCs w:val="17"/>
+              </w:rPr>
+              <w:t xml:space="preserve">839 335</w:t>
+            </w:r>
+          </w:p>
+        </w:tc>
+      </w:tr>
+      <w:tr>
+        <w:trPr>
+          <w:cantSplit/>
+          <w:tblHeader w:val="false"/>
+        </w:trPr>
+        <w:tc>
+          <w:tcPr>
+            <w:tcW w:type="dxa" w:w="3276"/>
+            <w:tcBorders>
+              <w:top w:val="single" w:color="C9D3E3" w:sz="4"/>
+              <w:left w:val="single" w:color="C9D3E3" w:sz="4"/>
+              <w:bottom w:val="single" w:color="C9D3E3" w:sz="4"/>
+              <w:right w:val="single" w:color="C9D3E3" w:sz="4"/>
+            </w:tcBorders>
+            <w:tcMar>
+              <w:top w:type="dxa" w:w="60"/>
+              <w:left w:type="dxa" w:w="90"/>
+              <w:bottom w:type="dxa" w:w="60"/>
+              <w:right w:type="dxa" w:w="90"/>
+            </w:tcMar>
+            <w:vAlign w:val="center"/>
+          </w:tcPr>
+          <w:p>
+            <w:pPr>
+              <w:spacing w:after="0"/>
+              <w:jc w:val="left"/>
+            </w:pPr>
+            <w:r>
+              <w:rPr>
+                <w:rFonts w:ascii="Arial" w:cs="Arial" w:eastAsia="Arial" w:hAnsi="Arial"/>
+                <w:b w:val="false"/>
+                <w:bCs w:val="false"/>
+                <w:color w:val="000000"/>
+                <w:sz w:val="17"/>
+                <w:szCs w:val="17"/>
+              </w:rPr>
+              <w:t xml:space="preserve">Bieżące kredyty bankowe</w:t>
+            </w:r>
+          </w:p>
+        </w:tc>
+        <w:tc>
+          <w:tcPr>
+            <w:tcW w:type="dxa" w:w="1252"/>
+            <w:tcBorders>
+              <w:top w:val="single" w:color="C9D3E3" w:sz="4"/>
+              <w:left w:val="single" w:color="C9D3E3" w:sz="4"/>
+              <w:bottom w:val="single" w:color="C9D3E3" w:sz="4"/>
+              <w:right w:val="single" w:color="C9D3E3" w:sz="4"/>
+            </w:tcBorders>
+            <w:tcMar>
+              <w:top w:type="dxa" w:w="60"/>
+              <w:left w:type="dxa" w:w="90"/>
+              <w:bottom w:type="dxa" w:w="60"/>
+              <w:right w:type="dxa" w:w="90"/>
+            </w:tcMar>
+            <w:vAlign w:val="center"/>
+          </w:tcPr>
+          <w:p>
+            <w:pPr>
+              <w:spacing w:after="0"/>
+              <w:jc w:val="right"/>
+            </w:pPr>
+            <w:r>
+              <w:rPr>
+                <w:rFonts w:ascii="Arial" w:cs="Arial" w:eastAsia="Arial" w:hAnsi="Arial"/>
+                <w:b w:val="false"/>
+                <w:bCs w:val="false"/>
+                <w:color w:val="000000"/>
+                <w:sz w:val="17"/>
+                <w:szCs w:val="17"/>
+              </w:rPr>
+              <w:t xml:space="preserve">7 008</w:t>
+            </w:r>
+          </w:p>
+        </w:tc>
+        <w:tc>
+          <w:tcPr>
+            <w:tcW w:type="dxa" w:w="1252"/>
+            <w:tcBorders>
+              <w:top w:val="single" w:color="C9D3E3" w:sz="4"/>
+              <w:left w:val="single" w:color="C9D3E3" w:sz="4"/>
+              <w:bottom w:val="single" w:color="C9D3E3" w:sz="4"/>
+              <w:right w:val="single" w:color="C9D3E3" w:sz="4"/>
+            </w:tcBorders>
+            <w:tcMar>
+              <w:top w:type="dxa" w:w="60"/>
+              <w:left w:type="dxa" w:w="90"/>
+              <w:bottom w:type="dxa" w:w="60"/>
+              <w:right w:type="dxa" w:w="90"/>
+            </w:tcMar>
+            <w:vAlign w:val="center"/>
+          </w:tcPr>
+          <w:p>
+            <w:pPr>
+              <w:spacing w:after="0"/>
+              <w:jc w:val="right"/>
+            </w:pPr>
+            <w:r>
+              <w:rPr>
+                <w:rFonts w:ascii="Arial" w:cs="Arial" w:eastAsia="Arial" w:hAnsi="Arial"/>
+                <w:b w:val="false"/>
+                <w:bCs w:val="false"/>
+                <w:color w:val="000000"/>
+                <w:sz w:val="17"/>
+                <w:szCs w:val="17"/>
+              </w:rPr>
+              <w:t xml:space="preserve">91 392</w:t>
+            </w:r>
+          </w:p>
+        </w:tc>
+        <w:tc>
+          <w:tcPr>
+            <w:tcW w:type="dxa" w:w="1252"/>
+            <w:tcBorders>
+              <w:top w:val="single" w:color="C9D3E3" w:sz="4"/>
+              <w:left w:val="single" w:color="C9D3E3" w:sz="4"/>
+              <w:bottom w:val="single" w:color="C9D3E3" w:sz="4"/>
+              <w:right w:val="single" w:color="C9D3E3" w:sz="4"/>
+            </w:tcBorders>
+            <w:tcMar>
+              <w:top w:type="dxa" w:w="60"/>
+              <w:left w:type="dxa" w:w="90"/>
+              <w:bottom w:type="dxa" w:w="60"/>
+              <w:right w:type="dxa" w:w="90"/>
+            </w:tcMar>
+            <w:vAlign w:val="center"/>
+          </w:tcPr>
+          <w:p>
+            <w:pPr>
+              <w:spacing w:after="0"/>
+              <w:jc w:val="right"/>
+            </w:pPr>
+            <w:r>
+              <w:rPr>
+                <w:rFonts w:ascii="Arial" w:cs="Arial" w:eastAsia="Arial" w:hAnsi="Arial"/>
+                <w:b w:val="false"/>
+                <w:bCs w:val="false"/>
+                <w:color w:val="000000"/>
+                <w:sz w:val="17"/>
+                <w:szCs w:val="17"/>
+              </w:rPr>
+              <w:t xml:space="preserve">109 919</w:t>
+            </w:r>
+          </w:p>
+        </w:tc>
+        <w:tc>
+          <w:tcPr>
+            <w:tcW w:type="dxa" w:w="1349"/>
+            <w:tcBorders>
+              <w:top w:val="single" w:color="C9D3E3" w:sz="4"/>
+              <w:left w:val="single" w:color="C9D3E3" w:sz="4"/>
+              <w:bottom w:val="single" w:color="C9D3E3" w:sz="4"/>
+              <w:right w:val="single" w:color="C9D3E3" w:sz="4"/>
+            </w:tcBorders>
+            <w:tcMar>
+              <w:top w:type="dxa" w:w="60"/>
+              <w:left w:type="dxa" w:w="90"/>
+              <w:bottom w:type="dxa" w:w="60"/>
+              <w:right w:type="dxa" w:w="90"/>
+            </w:tcMar>
+            <w:vAlign w:val="center"/>
+          </w:tcPr>
+          <w:p>
+            <w:pPr>
+              <w:spacing w:after="0"/>
+              <w:jc w:val="right"/>
+            </w:pPr>
+            <w:r>
+              <w:rPr>
+                <w:rFonts w:ascii="Arial" w:cs="Arial" w:eastAsia="Arial" w:hAnsi="Arial"/>
+                <w:b w:val="false"/>
+                <w:bCs w:val="false"/>
+                <w:color w:val="000000"/>
+                <w:sz w:val="17"/>
+                <w:szCs w:val="17"/>
+              </w:rPr>
+              <w:t xml:space="preserve">117 901</w:t>
+            </w:r>
+          </w:p>
+        </w:tc>
+        <w:tc>
+          <w:tcPr>
+            <w:tcW w:type="dxa" w:w="1257"/>
+            <w:tcBorders>
+              <w:top w:val="single" w:color="C9D3E3" w:sz="4"/>
+              <w:left w:val="single" w:color="C9D3E3" w:sz="4"/>
+              <w:bottom w:val="single" w:color="C9D3E3" w:sz="4"/>
+              <w:right w:val="single" w:color="C9D3E3" w:sz="4"/>
+            </w:tcBorders>
+            <w:tcMar>
+              <w:top w:type="dxa" w:w="60"/>
+              <w:left w:type="dxa" w:w="90"/>
+              <w:bottom w:type="dxa" w:w="60"/>
+              <w:right w:type="dxa" w:w="90"/>
+            </w:tcMar>
+            <w:vAlign w:val="center"/>
+          </w:tcPr>
+          <w:p>
+            <w:pPr>
+              <w:spacing w:after="0"/>
+              <w:jc w:val="right"/>
+            </w:pPr>
+            <w:r>
+              <w:rPr>
+                <w:rFonts w:ascii="Arial" w:cs="Arial" w:eastAsia="Arial" w:hAnsi="Arial"/>
+                <w:b w:val="false"/>
+                <w:bCs w:val="false"/>
+                <w:color w:val="000000"/>
+                <w:sz w:val="17"/>
+                <w:szCs w:val="17"/>
+              </w:rPr>
+              <w:t xml:space="preserve">175 227</w:t>
+            </w:r>
+          </w:p>
+        </w:tc>
+      </w:tr>
+    </w:tbl>
+    <w:p>
+      <w:pPr>
+        <w:spacing w:after="160"/>
+      </w:pPr>
+      <w:r>
+        <w:rPr>
+          <w:rFonts w:ascii="Arial" w:cs="Arial" w:eastAsia="Arial" w:hAnsi="Arial"/>
+          <w:i/>
+          <w:iCs/>
+          <w:color w:val="52514E"/>
+          <w:sz w:val="17"/>
+          <w:szCs w:val="17"/>
+        </w:rPr>
+        <w:t xml:space="preserve">Źródło: słowacki Rejestr Sprawozdań Finansowych (registeruz.sk), IČO 47 420 171; dalsze dane o spółce: finstat.sk/47420171. Spółka od założenia jest nieprzerwanie rentowna na poziomie operacyjnym, kapitał własny wzrósł w ciągu pięciu lat 5,4-krotnie wyłącznie z zysków zatrzymanych, a zależność od finansowania bankowego jest minimalna.</w:t>
+      </w:r>
+    </w:p>
+    <w:p>
+      <w:pPr>
+        <w:keepNext/>
+        <w:spacing w:after="60" w:before="120"/>
+        <w:jc w:val="center"/>
+      </w:pPr>
+      <w:r>
+        <w:drawing>
+          <wp:inline distT="0" distB="0" distL="0" distR="0">
+            <wp:extent cx="4953000" cy="2343150"/>
+            <wp:effectExtent t="0" r="0" b="0" l="0"/>
+            <wp:docPr id="1" name="" descr="" title=""/>
+            <wp:cNvGraphicFramePr>
+              <a:graphicFrameLocks xmlns:a="http://schemas.openxmlformats.org/drawingml/2006/main" noChangeAspect="1"/>
+            </wp:cNvGraphicFramePr>
+            <a:graphic xmlns:a="http://schemas.openxmlformats.org/drawingml/2006/main">
+              <a:graphicData uri="http://schemas.openxmlformats.org/drawingml/2006/picture">
+                <pic:pic xmlns:pic="http://schemas.openxmlformats.org/drawingml/2006/picture">
+                  <pic:nvPicPr>
+                    <pic:cNvPr id="0" name="" descr=""/>
+                    <pic:cNvPicPr>
+                      <a:picLocks noChangeAspect="1" noChangeArrowheads="1"/>
+                    </pic:cNvPicPr>
+                  </pic:nvPicPr>
+                  <pic:blipFill>
+                    <a:blip r:embed="rId14" cstate="none"/>
+                    <a:srcRect/>
+                    <a:stretch>
+                      <a:fillRect/>
+                    </a:stretch>
+                  </pic:blipFill>
+                  <pic:spPr bwMode="auto">
+                    <a:xfrm>
+                      <a:off x="0" y="0"/>
+                      <a:ext cx="4953000" cy="2343150"/>
+                    </a:xfrm>
+                    <a:prstGeom prst="rect">
+                      <a:avLst/>
+                    </a:prstGeom>
+                  </pic:spPr>
+                </pic:pic>
+              </a:graphicData>
+            </a:graphic>
+          </wp:inline>
+        </w:drawing>
+      </w:r>
+    </w:p>
+    <w:p>
+      <w:pPr>
+        <w:spacing w:after="200" w:before="60"/>
+        <w:jc w:val="center"/>
+      </w:pPr>
+      <w:r>
+        <w:rPr>
+          <w:rFonts w:ascii="Arial" w:cs="Arial" w:eastAsia="Arial" w:hAnsi="Arial"/>
+          <w:i/>
+          <w:iCs/>
+          <w:color w:val="52514E"/>
+          <w:sz w:val="17"/>
+          <w:szCs w:val="17"/>
+        </w:rPr>
+        <w:t xml:space="preserve">Wykres – Przychody BauHausEurope s. r. o. w latach 2021 – 2025 (mln EUR)</w:t>
+      </w:r>
     </w:p>
     <w:p>
       <w:pPr>

</xml_diff>

<commit_message>
Offer: trim zoning information table
Co-Authored-By: Claude Fable 5.1 <noreply@anthropic.com>
Claude-Session: https://claude.ai/code/session_01Y2BwyWrz2zGDUPQB2oEzRk
</commit_message>
<xml_diff>
--- a/business-plan/ponuka-merkury-market/Oferta_inwestycyjna_Stara_Lubovna_Merkury_Market_PL.docx
+++ b/business-plan/ponuka-merkury-market/Oferta_inwestycyjna_Stara_Lubovna_Merkury_Market_PL.docx
@@ -4647,7 +4647,7 @@
                 <w:sz w:val="19"/>
                 <w:szCs w:val="19"/>
               </w:rPr>
-              <w:t xml:space="preserve">Komunikacja</w:t>
+              <w:t xml:space="preserve">Decyzja lokalizacyjna</w:t>
             </w:r>
           </w:p>
         </w:tc>
@@ -4682,159 +4682,7 @@
                 <w:sz w:val="19"/>
                 <w:szCs w:val="19"/>
               </w:rPr>
-              <w:t xml:space="preserve">plan przewiduje wewnętrzną obwodnicę z przeprawą nad ul. Levočską oraz południowo-wschodnią obwodnicę Levočská – Prešovská, co dodatkowo poprawi dostępność lokalizacji</w:t>
-            </w:r>
-          </w:p>
-        </w:tc>
-      </w:tr>
-      <w:tr>
-        <w:trPr>
-          <w:cantSplit/>
-          <w:tblHeader w:val="false"/>
-        </w:trPr>
-        <w:tc>
-          <w:tcPr>
-            <w:tcW w:type="dxa" w:w="2891"/>
-            <w:tcBorders>
-              <w:top w:val="single" w:color="C9D3E3" w:sz="4"/>
-              <w:left w:val="single" w:color="C9D3E3" w:sz="4"/>
-              <w:bottom w:val="single" w:color="C9D3E3" w:sz="4"/>
-              <w:right w:val="single" w:color="C9D3E3" w:sz="4"/>
-            </w:tcBorders>
-            <w:tcMar>
-              <w:top w:type="dxa" w:w="60"/>
-              <w:left w:type="dxa" w:w="90"/>
-              <w:bottom w:type="dxa" w:w="60"/>
-              <w:right w:type="dxa" w:w="90"/>
-            </w:tcMar>
-            <w:vAlign w:val="center"/>
-          </w:tcPr>
-          <w:p>
-            <w:pPr>
-              <w:spacing w:after="0"/>
-              <w:jc w:val="left"/>
-            </w:pPr>
-            <w:r>
-              <w:rPr>
-                <w:rFonts w:ascii="Arial" w:cs="Arial" w:eastAsia="Arial" w:hAnsi="Arial"/>
-                <w:b w:val="false"/>
-                <w:bCs w:val="false"/>
-                <w:color w:val="000000"/>
-                <w:sz w:val="19"/>
-                <w:szCs w:val="19"/>
-              </w:rPr>
-              <w:t xml:space="preserve">Ciek wodny</w:t>
-            </w:r>
-          </w:p>
-        </w:tc>
-        <w:tc>
-          <w:tcPr>
-            <w:tcW w:type="dxa" w:w="6747"/>
-            <w:tcBorders>
-              <w:top w:val="single" w:color="C9D3E3" w:sz="4"/>
-              <w:left w:val="single" w:color="C9D3E3" w:sz="4"/>
-              <w:bottom w:val="single" w:color="C9D3E3" w:sz="4"/>
-              <w:right w:val="single" w:color="C9D3E3" w:sz="4"/>
-            </w:tcBorders>
-            <w:tcMar>
-              <w:top w:type="dxa" w:w="60"/>
-              <w:left w:type="dxa" w:w="90"/>
-              <w:bottom w:type="dxa" w:w="60"/>
-              <w:right w:type="dxa" w:w="90"/>
-            </w:tcMar>
-            <w:vAlign w:val="center"/>
-          </w:tcPr>
-          <w:p>
-            <w:pPr>
-              <w:spacing w:after="0"/>
-              <w:jc w:val="left"/>
-            </w:pPr>
-            <w:r>
-              <w:rPr>
-                <w:rFonts w:ascii="Arial" w:cs="Arial" w:eastAsia="Arial" w:hAnsi="Arial"/>
-                <w:b w:val="false"/>
-                <w:bCs w:val="false"/>
-                <w:color w:val="000000"/>
-                <w:sz w:val="19"/>
-                <w:szCs w:val="19"/>
-              </w:rPr>
-              <w:t xml:space="preserve">teren sąsiaduje z uregulowaną rzeką Jakubianka; warunki zabudowy przy rzece (strefa ochronna, ochrona przeciwpowodziowa) określi stanowisko zarządcy cieku oraz informacja planistyczna miasta</w:t>
-            </w:r>
-          </w:p>
-        </w:tc>
-      </w:tr>
-      <w:tr>
-        <w:trPr>
-          <w:cantSplit/>
-          <w:tblHeader w:val="false"/>
-        </w:trPr>
-        <w:tc>
-          <w:tcPr>
-            <w:tcW w:type="dxa" w:w="2891"/>
-            <w:tcBorders>
-              <w:top w:val="single" w:color="C9D3E3" w:sz="4"/>
-              <w:left w:val="single" w:color="C9D3E3" w:sz="4"/>
-              <w:bottom w:val="single" w:color="C9D3E3" w:sz="4"/>
-              <w:right w:val="single" w:color="C9D3E3" w:sz="4"/>
-            </w:tcBorders>
-            <w:tcMar>
-              <w:top w:type="dxa" w:w="60"/>
-              <w:left w:type="dxa" w:w="90"/>
-              <w:bottom w:type="dxa" w:w="60"/>
-              <w:right w:type="dxa" w:w="90"/>
-            </w:tcMar>
-            <w:vAlign w:val="center"/>
-          </w:tcPr>
-          <w:p>
-            <w:pPr>
-              <w:spacing w:after="0"/>
-              <w:jc w:val="left"/>
-            </w:pPr>
-            <w:r>
-              <w:rPr>
-                <w:rFonts w:ascii="Arial" w:cs="Arial" w:eastAsia="Arial" w:hAnsi="Arial"/>
-                <w:b w:val="false"/>
-                <w:bCs w:val="false"/>
-                <w:color w:val="000000"/>
-                <w:sz w:val="19"/>
-                <w:szCs w:val="19"/>
-              </w:rPr>
-              <w:t xml:space="preserve">Decyzja lokalizacyjna</w:t>
-            </w:r>
-          </w:p>
-        </w:tc>
-        <w:tc>
-          <w:tcPr>
-            <w:tcW w:type="dxa" w:w="6747"/>
-            <w:tcBorders>
-              <w:top w:val="single" w:color="C9D3E3" w:sz="4"/>
-              <w:left w:val="single" w:color="C9D3E3" w:sz="4"/>
-              <w:bottom w:val="single" w:color="C9D3E3" w:sz="4"/>
-              <w:right w:val="single" w:color="C9D3E3" w:sz="4"/>
-            </w:tcBorders>
-            <w:tcMar>
-              <w:top w:type="dxa" w:w="60"/>
-              <w:left w:type="dxa" w:w="90"/>
-              <w:bottom w:type="dxa" w:w="60"/>
-              <w:right w:type="dxa" w:w="90"/>
-            </w:tcMar>
-            <w:vAlign w:val="center"/>
-          </w:tcPr>
-          <w:p>
-            <w:pPr>
-              <w:spacing w:after="0"/>
-              <w:jc w:val="left"/>
-            </w:pPr>
-            <w:r>
-              <w:rPr>
-                <w:rFonts w:ascii="Arial" w:cs="Arial" w:eastAsia="Arial" w:hAnsi="Arial"/>
-                <w:b w:val="false"/>
-                <w:bCs w:val="false"/>
-                <w:color w:val="000000"/>
-                <w:sz w:val="19"/>
-                <w:szCs w:val="19"/>
-              </w:rPr>
-              <w:t xml:space="preserve">dla terenu wydana jest ważna decyzja lokalizacyjna dla nowej zabudowy; zamierzenie Merkury Market zostanie uzgodnione z miastem, a w razie potrzeby wydana zostanie nowa decyzja lokalizacyjna dla centrum handlowego</w:t>
+              <w:t xml:space="preserve">dla terenu wydana jest ważna decyzja lokalizacyjna dla nowej zabudowy</w:t>
             </w:r>
           </w:p>
         </w:tc>

</xml_diff>

<commit_message>
Offer: cadastral boundary image and official zoning information
Výrez katastrálnej mapy s ortofotom a hranicami parciel 775/1–775/5;
časť 4 nahradená údajmi z ÚPI mesta č. MsÚ-SL-151/195/2025 (9. 1. 2026):
obvod V06, polyfunkčná plocha, max. 8 NP, zastavanosť 50 %, zeleň 20 %,
statická doprava, vodný tok Jakubianka.

Co-Authored-By: Claude Fable 5.1 <noreply@anthropic.com>
Claude-Session: https://claude.ai/code/session_01Y2BwyWrz2zGDUPQB2oEzRk
</commit_message>
<xml_diff>
--- a/business-plan/ponuka-merkury-market/Oferta_inwestycyjna_Stara_Lubovna_Merkury_Market_PL.docx
+++ b/business-plan/ponuka-merkury-market/Oferta_inwestycyjna_Stara_Lubovna_Merkury_Market_PL.docx
@@ -691,7 +691,7 @@
                 <w:sz w:val="19"/>
                 <w:szCs w:val="19"/>
               </w:rPr>
-              <w:t xml:space="preserve">nr KN-C 775/1 (7 415 m²), 775/2 (2 608 m²), 775/3 (598 m²), 775/4 (111 m²), 775/5 (57 m²); łącznie 10 789 m², rodzaj: tereny zabudowane i podwórza</w:t>
+              <w:t xml:space="preserve">nr KN-C 775/1 (7 415 m²), 775/2 (2 608 m²), 775/3 (598 m²), 775/4 (111 m²), 775/5 (57 m²); łącznie 10 789 m² wg KW LV nr 1382 (ZBGIS podaje dla działki 775/1 powierzchnię 7 389 m²), rodzaj: tereny zabudowane i podwórza</w:t>
             </w:r>
           </w:p>
         </w:tc>
@@ -995,7 +995,7 @@
                 <w:sz w:val="19"/>
                 <w:szCs w:val="19"/>
               </w:rPr>
-              <w:t xml:space="preserve">obszar zabudowany miasta, istniejący teren produkcyjno-magazynowy; przeznaczenie według planu miasta i ważna decyzja lokalizacyjna – zob. część 4</w:t>
+              <w:t xml:space="preserve">jednostka urbanistyczna V06; teren wielofunkcyjny pod zabudowę mieszkaniową wielorodzinną i usługi (informacja planistyczna miasta nr MsÚ-SL-151/195/2025 z 9.01.2026); maks. 8 kondygnacji, zabudowa do 50 %, zieleń min. 20 % – zob. część 4</w:t>
             </w:r>
           </w:p>
         </w:tc>
@@ -1223,7 +1223,7 @@
                 <w:sz w:val="19"/>
                 <w:szCs w:val="19"/>
               </w:rPr>
-              <w:t xml:space="preserve">operat szacunkowy nr 87/2024, wypis z księgi wieczystej i mapa katastralna, pomiar geodezyjny, informacja planistyczna miasta, badania geologiczno-inżynierskie i hydrogeologiczne (w toku), dokumentacja projektowa istniejących obiektów, pozwolenie na budowę i decyzja o odbiorze</w:t>
+              <w:t xml:space="preserve">operat szacunkowy nr 87/2024, wypis z księgi wieczystej i mapa katastralna, pomiar geodezyjny, informacja planistyczna miasta nr MsÚ-SL-151/195/2025 (9.01.2026), badania geologiczno-inżynierskie i hydrogeologiczne (w toku), dokumentacja projektowa istniejących obiektów, pozwolenie na budowę i decyzja o odbiorze</w:t>
             </w:r>
           </w:p>
         </w:tc>
@@ -1371,7 +1371,7 @@
       <w:r>
         <w:drawing>
           <wp:inline distT="0" distB="0" distL="0" distR="0">
-            <wp:extent cx="5334000" cy="3429000"/>
+            <wp:extent cx="5715000" cy="4181475"/>
             <wp:effectExtent t="0" r="0" b="0" l="0"/>
             <wp:docPr id="1" name="" descr="" title=""/>
             <wp:cNvGraphicFramePr>
@@ -1396,7 +1396,7 @@
                   <pic:spPr bwMode="auto">
                     <a:xfrm>
                       <a:off x="0" y="0"/>
-                      <a:ext cx="5334000" cy="3429000"/>
+                      <a:ext cx="5715000" cy="4181475"/>
                     </a:xfrm>
                     <a:prstGeom prst="rect">
                       <a:avLst/>
@@ -1423,7 +1423,7 @@
           <w:sz w:val="17"/>
           <w:szCs w:val="17"/>
         </w:rPr>
-        <w:t xml:space="preserve">Rys. 3 – Położenie terenu na mapie miasta (OpenStreetMap)</w:t>
+        <w:t xml:space="preserve">Rys. 3 – Granice terenu według mapy katastralnej: działki 775/1 (7 389 m² wg ZBGIS), 775/2, 775/3, 775/4 i 775/5, właściciel BauHausEurope s. r. o., udział 1/1 (ZBGIS, ortofoto GKÚ/NLC)</w:t>
       </w:r>
     </w:p>
     <w:p>
@@ -1487,7 +1487,71 @@
           <w:sz w:val="17"/>
           <w:szCs w:val="17"/>
         </w:rPr>
-        <w:t xml:space="preserve">Rys. 4 – Szersze otoczenie: Stará Ľubovňa przy drodze I/68 między Preszowem a granicą polską (OpenStreetMap)</w:t>
+        <w:t xml:space="preserve">Rys. 4 – Położenie terenu na mapie miasta (OpenStreetMap)</w:t>
+      </w:r>
+    </w:p>
+    <w:p>
+      <w:pPr>
+        <w:keepNext/>
+        <w:spacing w:after="60" w:before="120"/>
+        <w:jc w:val="center"/>
+      </w:pPr>
+      <w:r>
+        <w:drawing>
+          <wp:inline distT="0" distB="0" distL="0" distR="0">
+            <wp:extent cx="5334000" cy="3429000"/>
+            <wp:effectExtent t="0" r="0" b="0" l="0"/>
+            <wp:docPr id="1" name="" descr="" title=""/>
+            <wp:cNvGraphicFramePr>
+              <a:graphicFrameLocks xmlns:a="http://schemas.openxmlformats.org/drawingml/2006/main" noChangeAspect="1"/>
+            </wp:cNvGraphicFramePr>
+            <a:graphic xmlns:a="http://schemas.openxmlformats.org/drawingml/2006/main">
+              <a:graphicData uri="http://schemas.openxmlformats.org/drawingml/2006/picture">
+                <pic:pic xmlns:pic="http://schemas.openxmlformats.org/drawingml/2006/picture">
+                  <pic:nvPicPr>
+                    <pic:cNvPr id="0" name="" descr=""/>
+                    <pic:cNvPicPr>
+                      <a:picLocks noChangeAspect="1" noChangeArrowheads="1"/>
+                    </pic:cNvPicPr>
+                  </pic:nvPicPr>
+                  <pic:blipFill>
+                    <a:blip r:embed="rId14" cstate="none"/>
+                    <a:srcRect/>
+                    <a:stretch>
+                      <a:fillRect/>
+                    </a:stretch>
+                  </pic:blipFill>
+                  <pic:spPr bwMode="auto">
+                    <a:xfrm>
+                      <a:off x="0" y="0"/>
+                      <a:ext cx="5334000" cy="3429000"/>
+                    </a:xfrm>
+                    <a:prstGeom prst="rect">
+                      <a:avLst/>
+                    </a:prstGeom>
+                  </pic:spPr>
+                </pic:pic>
+              </a:graphicData>
+            </a:graphic>
+          </wp:inline>
+        </w:drawing>
+      </w:r>
+    </w:p>
+    <w:p>
+      <w:pPr>
+        <w:spacing w:after="200" w:before="60"/>
+        <w:jc w:val="center"/>
+      </w:pPr>
+      <w:r>
+        <w:rPr>
+          <w:rFonts w:ascii="Arial" w:cs="Arial" w:eastAsia="Arial" w:hAnsi="Arial"/>
+          <w:i/>
+          <w:iCs/>
+          <w:color w:val="52514E"/>
+          <w:sz w:val="17"/>
+          <w:szCs w:val="17"/>
+        </w:rPr>
+        <w:t xml:space="preserve">Rys. 5 – Szersze otoczenie: Stará Ľubovňa przy drodze I/68 między Preszowem a granicą polską (OpenStreetMap)</w:t>
       </w:r>
     </w:p>
     <w:p>
@@ -4210,7 +4274,7 @@
           <w:sz w:val="21"/>
           <w:szCs w:val="21"/>
         </w:rPr>
-        <w:t xml:space="preserve">Plan zagospodarowania przestrzennego miasta Stará Ľubovňa (ÚPN mesta, opracowanie ARLAND s. r. o., Spišská Nová Ves; część wiążąca z lipca 2015 r.) zalicza teren do obszaru zabudowanego miasta jako istniejący teren produkcyjno-magazynowy w dolinie Jakubianki przy południowym wjeździe do miasta. Dla zamierzenia centrum handlowego istotne są następujące ustalenia części wiążącej:</w:t>
+        <w:t xml:space="preserve">Urząd Miasta Stará Ľubovňa, wydział budownictwa, rozwoju przestrzennego i środowiska, wydał dla działek C KN nr 775/1, 775/2, 775/3, 775/4 i 775/5, obręb Stará Ľubovňa (KW LV nr 1382) informację planistyczną – potwierdzenie przeznaczenia terenu, nr MsÚ-SL-151/195/2025 z dnia 9.01.2026 (prowadząca: inż. Anna Hrebíková, kierownik wydziału). Zgodnie z obowiązującą dokumentacją planistyczną miasta w brzmieniu zmian i uzupełnień nr 1, 2, 3 i 4 działki leżą w jednostce urbanistycznej V06 i są przeznaczone jako teren wielofunkcyjny pod zabudowę mieszkaniową wielorodzinną oraz usługi publiczne i komercyjne w zakresie projektu. Usługi, do których plan zalicza również centra handlowe, są zatem funkcją dopuszczalną. Wiążące ustalenia dla tego terenu:</w:t>
       </w:r>
     </w:p>
     <w:tbl>
@@ -4343,7 +4407,7 @@
                 <w:sz w:val="19"/>
                 <w:szCs w:val="19"/>
               </w:rPr>
-              <w:t xml:space="preserve">Tereny usług publicznych i komercyjnych (OV)</w:t>
+              <w:t xml:space="preserve">Przeznaczenie</w:t>
             </w:r>
           </w:p>
         </w:tc>
@@ -4378,7 +4442,7 @@
                 <w:sz w:val="19"/>
                 <w:szCs w:val="19"/>
               </w:rPr>
-              <w:t xml:space="preserve">teren służy podstawowym i wyższym usługom; plan wprost wymienia tereny centrów handlowych wśród terenów usług; dopuszczalne są obiekty handlu detalicznego i drobnych usług, administracja, infrastruktura techniczna, zieleń publiczna i place zabaw</w:t>
+              <w:t xml:space="preserve">teren wielofunkcyjny pod zabudowę mieszkaniową wielorodzinną oraz usługi; tereny wielofunkcyjne to obszary o co najmniej dwóch wzajemnie uzupełniających się funkcjach</w:t>
             </w:r>
           </w:p>
         </w:tc>
@@ -4419,7 +4483,7 @@
                 <w:sz w:val="19"/>
                 <w:szCs w:val="19"/>
               </w:rPr>
-              <w:t xml:space="preserve">Transformacja terenów produkcyjnych (PFovv)</w:t>
+              <w:t xml:space="preserve">Wysokość zabudowy</w:t>
             </w:r>
           </w:p>
         </w:tc>
@@ -4454,7 +4518,7 @@
                 <w:sz w:val="19"/>
                 <w:szCs w:val="19"/>
               </w:rPr>
-              <w:t xml:space="preserve">plan przewiduje przekształcanie dawnych terenów produkcyjnych w tereny wielofunkcyjne usługi – produkcja z uzupełniającymi usługami handlowymi i administracyjnymi</w:t>
+              <w:t xml:space="preserve">maks. 8 kondygnacji nadziemnych łącznie z poddaszem, niedopuszczalna kondygnacja cofnięta</w:t>
             </w:r>
           </w:p>
         </w:tc>
@@ -4495,7 +4559,7 @@
                 <w:sz w:val="19"/>
                 <w:szCs w:val="19"/>
               </w:rPr>
-              <w:t xml:space="preserve">Ustalenie 1.1.1</w:t>
+              <w:t xml:space="preserve">Powierzchnia zabudowy</w:t>
             </w:r>
           </w:p>
         </w:tc>
@@ -4530,7 +4594,7 @@
                 <w:sz w:val="19"/>
                 <w:szCs w:val="19"/>
               </w:rPr>
-              <w:t xml:space="preserve">miasto jako centrum regionalne wyznacza tereny usług podstawowych i wyższych również dla obszaru oddziaływania powiatu</w:t>
+              <w:t xml:space="preserve">budynkami do 50 % powierzchni działki (tj. do ok. 5 390 m² powierzchni zabudowy)</w:t>
             </w:r>
           </w:p>
         </w:tc>
@@ -4571,7 +4635,7 @@
                 <w:sz w:val="19"/>
                 <w:szCs w:val="19"/>
               </w:rPr>
-              <w:t xml:space="preserve">Ustalenie 1.2</w:t>
+              <w:t xml:space="preserve">Parkowanie</w:t>
             </w:r>
           </w:p>
         </w:tc>
@@ -4606,7 +4670,235 @@
                 <w:sz w:val="19"/>
                 <w:szCs w:val="19"/>
               </w:rPr>
-              <w:t xml:space="preserve">w centrum miasta i centrach dzielnicowych rewitalizować usługi handlu i usług</w:t>
+              <w:t xml:space="preserve">dla lokali niemieszkalnych według właściwej normy STN; przy działalności gospodarczej na terenach usług miejsca postojowe wg STN 73 6110 zawsze na własnej działce; dla mieszkań 2 miejsca / 1 mieszkanie</w:t>
+            </w:r>
+          </w:p>
+        </w:tc>
+      </w:tr>
+      <w:tr>
+        <w:trPr>
+          <w:cantSplit/>
+          <w:tblHeader w:val="false"/>
+        </w:trPr>
+        <w:tc>
+          <w:tcPr>
+            <w:tcW w:type="dxa" w:w="2891"/>
+            <w:tcBorders>
+              <w:top w:val="single" w:color="C9D3E3" w:sz="4"/>
+              <w:left w:val="single" w:color="C9D3E3" w:sz="4"/>
+              <w:bottom w:val="single" w:color="C9D3E3" w:sz="4"/>
+              <w:right w:val="single" w:color="C9D3E3" w:sz="4"/>
+            </w:tcBorders>
+            <w:tcMar>
+              <w:top w:type="dxa" w:w="60"/>
+              <w:left w:type="dxa" w:w="90"/>
+              <w:bottom w:type="dxa" w:w="60"/>
+              <w:right w:type="dxa" w:w="90"/>
+            </w:tcMar>
+            <w:vAlign w:val="center"/>
+          </w:tcPr>
+          <w:p>
+            <w:pPr>
+              <w:spacing w:after="0"/>
+              <w:jc w:val="left"/>
+            </w:pPr>
+            <w:r>
+              <w:rPr>
+                <w:rFonts w:ascii="Arial" w:cs="Arial" w:eastAsia="Arial" w:hAnsi="Arial"/>
+                <w:b w:val="false"/>
+                <w:bCs w:val="false"/>
+                <w:color w:val="000000"/>
+                <w:sz w:val="19"/>
+                <w:szCs w:val="19"/>
+              </w:rPr>
+              <w:t xml:space="preserve">Zieleń</w:t>
+            </w:r>
+          </w:p>
+        </w:tc>
+        <w:tc>
+          <w:tcPr>
+            <w:tcW w:type="dxa" w:w="6747"/>
+            <w:tcBorders>
+              <w:top w:val="single" w:color="C9D3E3" w:sz="4"/>
+              <w:left w:val="single" w:color="C9D3E3" w:sz="4"/>
+              <w:bottom w:val="single" w:color="C9D3E3" w:sz="4"/>
+              <w:right w:val="single" w:color="C9D3E3" w:sz="4"/>
+            </w:tcBorders>
+            <w:tcMar>
+              <w:top w:type="dxa" w:w="60"/>
+              <w:left w:type="dxa" w:w="90"/>
+              <w:bottom w:type="dxa" w:w="60"/>
+              <w:right w:type="dxa" w:w="90"/>
+            </w:tcMar>
+            <w:vAlign w:val="center"/>
+          </w:tcPr>
+          <w:p>
+            <w:pPr>
+              <w:spacing w:after="0"/>
+              <w:jc w:val="left"/>
+            </w:pPr>
+            <w:r>
+              <w:rPr>
+                <w:rFonts w:ascii="Arial" w:cs="Arial" w:eastAsia="Arial" w:hAnsi="Arial"/>
+                <w:b w:val="false"/>
+                <w:bCs w:val="false"/>
+                <w:color w:val="000000"/>
+                <w:sz w:val="19"/>
+                <w:szCs w:val="19"/>
+              </w:rPr>
+              <w:t xml:space="preserve">wskaźnik zieleni min. 20 % powierzchni działki (zielone dachy i ściany nie są wliczane)</w:t>
+            </w:r>
+          </w:p>
+        </w:tc>
+      </w:tr>
+      <w:tr>
+        <w:trPr>
+          <w:cantSplit/>
+          <w:tblHeader w:val="false"/>
+        </w:trPr>
+        <w:tc>
+          <w:tcPr>
+            <w:tcW w:type="dxa" w:w="2891"/>
+            <w:tcBorders>
+              <w:top w:val="single" w:color="C9D3E3" w:sz="4"/>
+              <w:left w:val="single" w:color="C9D3E3" w:sz="4"/>
+              <w:bottom w:val="single" w:color="C9D3E3" w:sz="4"/>
+              <w:right w:val="single" w:color="C9D3E3" w:sz="4"/>
+            </w:tcBorders>
+            <w:tcMar>
+              <w:top w:type="dxa" w:w="60"/>
+              <w:left w:type="dxa" w:w="90"/>
+              <w:bottom w:type="dxa" w:w="60"/>
+              <w:right w:type="dxa" w:w="90"/>
+            </w:tcMar>
+            <w:vAlign w:val="center"/>
+          </w:tcPr>
+          <w:p>
+            <w:pPr>
+              <w:spacing w:after="0"/>
+              <w:jc w:val="left"/>
+            </w:pPr>
+            <w:r>
+              <w:rPr>
+                <w:rFonts w:ascii="Arial" w:cs="Arial" w:eastAsia="Arial" w:hAnsi="Arial"/>
+                <w:b w:val="false"/>
+                <w:bCs w:val="false"/>
+                <w:color w:val="000000"/>
+                <w:sz w:val="19"/>
+                <w:szCs w:val="19"/>
+              </w:rPr>
+              <w:t xml:space="preserve">Pozostałe wymagania</w:t>
+            </w:r>
+          </w:p>
+        </w:tc>
+        <w:tc>
+          <w:tcPr>
+            <w:tcW w:type="dxa" w:w="6747"/>
+            <w:tcBorders>
+              <w:top w:val="single" w:color="C9D3E3" w:sz="4"/>
+              <w:left w:val="single" w:color="C9D3E3" w:sz="4"/>
+              <w:bottom w:val="single" w:color="C9D3E3" w:sz="4"/>
+              <w:right w:val="single" w:color="C9D3E3" w:sz="4"/>
+            </w:tcBorders>
+            <w:tcMar>
+              <w:top w:type="dxa" w:w="60"/>
+              <w:left w:type="dxa" w:w="90"/>
+              <w:bottom w:type="dxa" w:w="60"/>
+              <w:right w:type="dxa" w:w="90"/>
+            </w:tcMar>
+            <w:vAlign w:val="center"/>
+          </w:tcPr>
+          <w:p>
+            <w:pPr>
+              <w:spacing w:after="0"/>
+              <w:jc w:val="left"/>
+            </w:pPr>
+            <w:r>
+              <w:rPr>
+                <w:rFonts w:ascii="Arial" w:cs="Arial" w:eastAsia="Arial" w:hAnsi="Arial"/>
+                <w:b w:val="false"/>
+                <w:bCs w:val="false"/>
+                <w:color w:val="000000"/>
+                <w:sz w:val="19"/>
+                <w:szCs w:val="19"/>
+              </w:rPr>
+              <w:t xml:space="preserve">zadaszone i zamykane miejsce na odpady jako część projektu; ocena hałasu drogowego przed budową; brak nietypowych kolorów jako dominujących na elewacjach, przy kilku obiektach jednolita kolorystyka; przyłączenie do istniejących sieci ulicznych</w:t>
+            </w:r>
+          </w:p>
+        </w:tc>
+      </w:tr>
+      <w:tr>
+        <w:trPr>
+          <w:cantSplit/>
+          <w:tblHeader w:val="false"/>
+        </w:trPr>
+        <w:tc>
+          <w:tcPr>
+            <w:tcW w:type="dxa" w:w="2891"/>
+            <w:tcBorders>
+              <w:top w:val="single" w:color="C9D3E3" w:sz="4"/>
+              <w:left w:val="single" w:color="C9D3E3" w:sz="4"/>
+              <w:bottom w:val="single" w:color="C9D3E3" w:sz="4"/>
+              <w:right w:val="single" w:color="C9D3E3" w:sz="4"/>
+            </w:tcBorders>
+            <w:tcMar>
+              <w:top w:type="dxa" w:w="60"/>
+              <w:left w:type="dxa" w:w="90"/>
+              <w:bottom w:type="dxa" w:w="60"/>
+              <w:right w:type="dxa" w:w="90"/>
+            </w:tcMar>
+            <w:vAlign w:val="center"/>
+          </w:tcPr>
+          <w:p>
+            <w:pPr>
+              <w:spacing w:after="0"/>
+              <w:jc w:val="left"/>
+            </w:pPr>
+            <w:r>
+              <w:rPr>
+                <w:rFonts w:ascii="Arial" w:cs="Arial" w:eastAsia="Arial" w:hAnsi="Arial"/>
+                <w:b w:val="false"/>
+                <w:bCs w:val="false"/>
+                <w:color w:val="000000"/>
+                <w:sz w:val="19"/>
+                <w:szCs w:val="19"/>
+              </w:rPr>
+              <w:t xml:space="preserve">Ciek wodny (ustalenie 2.13.7.4, lokalizacja 4/2024-08)</w:t>
+            </w:r>
+          </w:p>
+        </w:tc>
+        <w:tc>
+          <w:tcPr>
+            <w:tcW w:type="dxa" w:w="6747"/>
+            <w:tcBorders>
+              <w:top w:val="single" w:color="C9D3E3" w:sz="4"/>
+              <w:left w:val="single" w:color="C9D3E3" w:sz="4"/>
+              <w:bottom w:val="single" w:color="C9D3E3" w:sz="4"/>
+              <w:right w:val="single" w:color="C9D3E3" w:sz="4"/>
+            </w:tcBorders>
+            <w:tcMar>
+              <w:top w:type="dxa" w:w="60"/>
+              <w:left w:type="dxa" w:w="90"/>
+              <w:bottom w:type="dxa" w:w="60"/>
+              <w:right w:type="dxa" w:w="90"/>
+            </w:tcMar>
+            <w:vAlign w:val="center"/>
+          </w:tcPr>
+          <w:p>
+            <w:pPr>
+              <w:spacing w:after="0"/>
+              <w:jc w:val="left"/>
+            </w:pPr>
+            <w:r>
+              <w:rPr>
+                <w:rFonts w:ascii="Arial" w:cs="Arial" w:eastAsia="Arial" w:hAnsi="Arial"/>
+                <w:b w:val="false"/>
+                <w:bCs w:val="false"/>
+                <w:color w:val="000000"/>
+                <w:sz w:val="19"/>
+                <w:szCs w:val="19"/>
+              </w:rPr>
+              <w:t xml:space="preserve">teren leży na lewym brzegu istotnego gospodarczo cieku Jakubianka (ID 3-01-03-625) w km 1,300; ciek płynie uregulowanym korytem o przepustowości Q100; projekt drogi na lewym brzegu należy przed dokumentacją projektową uzgodnić ze Słowackim Przedsiębiorstwem Gospodarki Wodnej (SVP, š. p.)</w:t>
             </w:r>
           </w:p>
         </w:tc>
@@ -4704,7 +4996,7 @@
           <w:sz w:val="21"/>
           <w:szCs w:val="21"/>
         </w:rPr>
-        <w:t xml:space="preserve">Wiążącą informację planistyczną dla działek 775/1 – 775/5 wydaje Miasto Stará Ľubovňa (urząd budowlany) na wniosek właściciela; BauHausEurope wystąpi o nią niezwłocznie po potwierdzeniu zainteresowania Merkury Market i dołączy ją do dokumentacji na wizję lokalną wraz ze stanowiskiem miasta wobec zamierzenia centrum handlowego.</w:t>
+        <w:t xml:space="preserve">Stanowisko miasta ma charakter informacyjny i nie zastępuje decyzji ani uzgodnień organów w postępowaniu o pozwolenie na budowę. Kopię informacji planistycznej w pełnym brzmieniu dołączymy do dokumentacji na wizję lokalną. Dla sklepu o powierzchni 3 000 – 5 000 m² z parkingiem na własnej działce wskaźniki zabudowy (50 %) i zieleni (20 %) są możliwe do spełnienia.</w:t>
       </w:r>
     </w:p>
     <w:p>
@@ -9128,7 +9420,7 @@
                     </pic:cNvPicPr>
                   </pic:nvPicPr>
                   <pic:blipFill>
-                    <a:blip r:embed="rId14" cstate="none"/>
+                    <a:blip r:embed="rId15" cstate="none"/>
                     <a:srcRect/>
                     <a:stretch>
                       <a:fillRect/>

</xml_diff>

<commit_message>
Offer: remove watercourse row from zoning table
Co-Authored-By: Claude Fable 5.1 <noreply@anthropic.com>
Claude-Session: https://claude.ai/code/session_01Y2BwyWrz2zGDUPQB2oEzRk
</commit_message>
<xml_diff>
--- a/business-plan/ponuka-merkury-market/Oferta_inwestycyjna_Stara_Lubovna_Merkury_Market_PL.docx
+++ b/business-plan/ponuka-merkury-market/Oferta_inwestycyjna_Stara_Lubovna_Merkury_Market_PL.docx
@@ -4823,82 +4823,6 @@
                 <w:szCs w:val="19"/>
               </w:rPr>
               <w:t xml:space="preserve">zadaszone i zamykane miejsce na odpady jako część projektu; ocena hałasu drogowego przed budową; brak nietypowych kolorów jako dominujących na elewacjach, przy kilku obiektach jednolita kolorystyka; przyłączenie do istniejących sieci ulicznych</w:t>
-            </w:r>
-          </w:p>
-        </w:tc>
-      </w:tr>
-      <w:tr>
-        <w:trPr>
-          <w:cantSplit/>
-          <w:tblHeader w:val="false"/>
-        </w:trPr>
-        <w:tc>
-          <w:tcPr>
-            <w:tcW w:type="dxa" w:w="2891"/>
-            <w:tcBorders>
-              <w:top w:val="single" w:color="C9D3E3" w:sz="4"/>
-              <w:left w:val="single" w:color="C9D3E3" w:sz="4"/>
-              <w:bottom w:val="single" w:color="C9D3E3" w:sz="4"/>
-              <w:right w:val="single" w:color="C9D3E3" w:sz="4"/>
-            </w:tcBorders>
-            <w:tcMar>
-              <w:top w:type="dxa" w:w="60"/>
-              <w:left w:type="dxa" w:w="90"/>
-              <w:bottom w:type="dxa" w:w="60"/>
-              <w:right w:type="dxa" w:w="90"/>
-            </w:tcMar>
-            <w:vAlign w:val="center"/>
-          </w:tcPr>
-          <w:p>
-            <w:pPr>
-              <w:spacing w:after="0"/>
-              <w:jc w:val="left"/>
-            </w:pPr>
-            <w:r>
-              <w:rPr>
-                <w:rFonts w:ascii="Arial" w:cs="Arial" w:eastAsia="Arial" w:hAnsi="Arial"/>
-                <w:b w:val="false"/>
-                <w:bCs w:val="false"/>
-                <w:color w:val="000000"/>
-                <w:sz w:val="19"/>
-                <w:szCs w:val="19"/>
-              </w:rPr>
-              <w:t xml:space="preserve">Ciek wodny (ustalenie 2.13.7.4, lokalizacja 4/2024-08)</w:t>
-            </w:r>
-          </w:p>
-        </w:tc>
-        <w:tc>
-          <w:tcPr>
-            <w:tcW w:type="dxa" w:w="6747"/>
-            <w:tcBorders>
-              <w:top w:val="single" w:color="C9D3E3" w:sz="4"/>
-              <w:left w:val="single" w:color="C9D3E3" w:sz="4"/>
-              <w:bottom w:val="single" w:color="C9D3E3" w:sz="4"/>
-              <w:right w:val="single" w:color="C9D3E3" w:sz="4"/>
-            </w:tcBorders>
-            <w:tcMar>
-              <w:top w:type="dxa" w:w="60"/>
-              <w:left w:type="dxa" w:w="90"/>
-              <w:bottom w:type="dxa" w:w="60"/>
-              <w:right w:type="dxa" w:w="90"/>
-            </w:tcMar>
-            <w:vAlign w:val="center"/>
-          </w:tcPr>
-          <w:p>
-            <w:pPr>
-              <w:spacing w:after="0"/>
-              <w:jc w:val="left"/>
-            </w:pPr>
-            <w:r>
-              <w:rPr>
-                <w:rFonts w:ascii="Arial" w:cs="Arial" w:eastAsia="Arial" w:hAnsi="Arial"/>
-                <w:b w:val="false"/>
-                <w:bCs w:val="false"/>
-                <w:color w:val="000000"/>
-                <w:sz w:val="19"/>
-                <w:szCs w:val="19"/>
-              </w:rPr>
-              <w:t xml:space="preserve">teren leży na lewym brzegu istotnego gospodarczo cieku Jakubianka (ID 3-01-03-625) w km 1,300; ciek płynie uregulowanym korytem o przepustowości Q100; projekt drogi na lewym brzegu należy przed dokumentacją projektową uzgodnić ze Słowackim Przedsiębiorstwem Gospodarki Wodnej (SVP, š. p.)</w:t>
             </w:r>
           </w:p>
         </w:tc>

</xml_diff>

<commit_message>
Offer: geological survey completed with satisfactory result
Co-Authored-By: Claude Fable 5.1 <noreply@anthropic.com>
Claude-Session: https://claude.ai/code/session_01Y2BwyWrz2zGDUPQB2oEzRk
</commit_message>
<xml_diff>
--- a/business-plan/ponuka-merkury-market/Oferta_inwestycyjna_Stara_Lubovna_Merkury_Market_PL.docx
+++ b/business-plan/ponuka-merkury-market/Oferta_inwestycyjna_Stara_Lubovna_Merkury_Market_PL.docx
@@ -1223,7 +1223,7 @@
                 <w:sz w:val="19"/>
                 <w:szCs w:val="19"/>
               </w:rPr>
-              <w:t xml:space="preserve">operat szacunkowy nr 87/2024, wypis z księgi wieczystej i mapa katastralna, pomiar geodezyjny, informacja planistyczna miasta nr MsÚ-SL-151/195/2025 (9.01.2026), badania geologiczno-inżynierskie i hydrogeologiczne (w toku), dokumentacja projektowa istniejących obiektów, pozwolenie na budowę i decyzja o odbiorze</w:t>
+              <w:t xml:space="preserve">operat szacunkowy nr 87/2024, wypis z księgi wieczystej i mapa katastralna, pomiar geodezyjny, informacja planistyczna miasta nr MsÚ-SL-151/195/2025 (9.01.2026), badania geologiczno-inżynierskie i hydrogeologiczne (wykonane, podłoże odpowiednie pod zabudowę), dokumentacja projektowa istniejących obiektów, pozwolenie na budowę i decyzja o odbiorze</w:t>
             </w:r>
           </w:p>
         </w:tc>
@@ -6200,7 +6200,7 @@
           <w:sz w:val="21"/>
           <w:szCs w:val="21"/>
         </w:rPr>
-        <w:t xml:space="preserve">Sieci i media: istniejące przyłącza wody, kanalizacji, gazu i energii elektrycznej oraz własna stacja transformatorowa skracają czas przygotowania; badania podłoża są w toku.</w:t>
+        <w:t xml:space="preserve">Sieci i media: istniejące przyłącza wody, kanalizacji, gazu i energii elektrycznej oraz własna stacja transformatorowa skracają czas przygotowania; badania geologiczno-inżynierskie i hydrogeologiczne zostały wykonane z wynikiem pozytywnym – podłoże nadaje się do posadowienia budynku bez nadzwyczajnych środków.</w:t>
       </w:r>
     </w:p>
     <w:p>

</xml_diff>

<commit_message>
Offer: add contact phone number
Co-Authored-By: Claude Fable 5.1 <noreply@anthropic.com>
Claude-Session: https://claude.ai/code/session_01Y2BwyWrz2zGDUPQB2oEzRk
</commit_message>
<xml_diff>
--- a/business-plan/ponuka-merkury-market/Oferta_inwestycyjna_Stara_Lubovna_Merkury_Market_PL.docx
+++ b/business-plan/ponuka-merkury-market/Oferta_inwestycyjna_Stara_Lubovna_Merkury_Market_PL.docx
@@ -141,7 +141,7 @@
           <w:sz w:val="22"/>
           <w:szCs w:val="22"/>
         </w:rPr>
-        <w:t xml:space="preserve">Nr rej. (IČO) 47 420 171  |  Bc. Ľubomír Kruk, prezes zarządu (konateľ)  |  info@bauhauseurope.de</w:t>
+        <w:t xml:space="preserve">Nr rej. (IČO) 47 420 171  |  Bc. Ľubomír Kruk, prezes zarządu (konateľ)  |  info@bauhauseurope.de  |  +421 904 027 703</w:t>
       </w:r>
     </w:p>
     <w:p>
@@ -9883,7 +9883,7 @@
                 <w:sz w:val="19"/>
                 <w:szCs w:val="19"/>
               </w:rPr>
-              <w:t xml:space="preserve"/>
+              <w:t xml:space="preserve">+421 904 027 703</w:t>
             </w:r>
           </w:p>
         </w:tc>

</xml_diff>

<commit_message>
Offer: add signature and company stamp to the signature block
Co-Authored-By: Claude Fable 5.1 <noreply@anthropic.com>
Claude-Session: https://claude.ai/code/session_01Y2BwyWrz2zGDUPQB2oEzRk
</commit_message>
<xml_diff>
--- a/business-plan/ponuka-merkury-market/Oferta_inwestycyjna_Stara_Lubovna_Merkury_Market_PL.docx
+++ b/business-plan/ponuka-merkury-market/Oferta_inwestycyjna_Stara_Lubovna_Merkury_Market_PL.docx
@@ -9968,7 +9968,7 @@
     <w:p>
       <w:pPr>
         <w:keepNext/>
-        <w:spacing w:after="60" w:before="600"/>
+        <w:spacing w:after="60" w:before="500"/>
       </w:pPr>
       <w:r>
         <w:rPr>
@@ -9979,10 +9979,160 @@
         <w:t xml:space="preserve">Bratysława, 29.10.2026</w:t>
       </w:r>
     </w:p>
+    <w:tbl>
+      <w:tblPr>
+        <w:tblW w:type="dxa" w:w="9638"/>
+        <w:tblBorders>
+          <w:top w:val="none" w:color="FFFFFF" w:sz="0"/>
+          <w:left w:val="none" w:color="FFFFFF" w:sz="0"/>
+          <w:bottom w:val="none" w:color="FFFFFF" w:sz="0"/>
+          <w:right w:val="none" w:color="FFFFFF" w:sz="0"/>
+          <w:insideH w:val="none" w:color="FFFFFF" w:sz="0"/>
+          <w:insideV w:val="none" w:color="FFFFFF" w:sz="0"/>
+        </w:tblBorders>
+      </w:tblPr>
+      <w:tblGrid>
+        <w:gridCol w:w="4819"/>
+        <w:gridCol w:w="4819"/>
+      </w:tblGrid>
+      <w:tr>
+        <w:trPr>
+          <w:cantSplit/>
+        </w:trPr>
+        <w:tc>
+          <w:tcPr>
+            <w:tcW w:type="dxa" w:w="4819"/>
+            <w:tcBorders>
+              <w:top w:val="none" w:color="FFFFFF" w:sz="0"/>
+              <w:left w:val="none" w:color="FFFFFF" w:sz="0"/>
+              <w:bottom w:val="none" w:color="FFFFFF" w:sz="0"/>
+              <w:right w:val="none" w:color="FFFFFF" w:sz="0"/>
+            </w:tcBorders>
+            <w:tcMar>
+              <w:top w:type="dxa" w:w="40"/>
+              <w:left w:type="dxa" w:w="0"/>
+              <w:bottom w:type="dxa" w:w="0"/>
+              <w:right w:type="dxa" w:w="40"/>
+            </w:tcMar>
+            <w:vAlign w:val="bottom"/>
+          </w:tcPr>
+          <w:p>
+            <w:pPr>
+              <w:keepNext/>
+              <w:spacing w:after="0"/>
+            </w:pPr>
+            <w:r>
+              <w:drawing>
+                <wp:inline distT="0" distB="0" distL="0" distR="0">
+                  <wp:extent cx="1905000" cy="409575"/>
+                  <wp:effectExtent t="0" r="0" b="0" l="0"/>
+                  <wp:docPr id="1" name="" descr="" title=""/>
+                  <wp:cNvGraphicFramePr>
+                    <a:graphicFrameLocks xmlns:a="http://schemas.openxmlformats.org/drawingml/2006/main" noChangeAspect="1"/>
+                  </wp:cNvGraphicFramePr>
+                  <a:graphic xmlns:a="http://schemas.openxmlformats.org/drawingml/2006/main">
+                    <a:graphicData uri="http://schemas.openxmlformats.org/drawingml/2006/picture">
+                      <pic:pic xmlns:pic="http://schemas.openxmlformats.org/drawingml/2006/picture">
+                        <pic:nvPicPr>
+                          <pic:cNvPr id="0" name="" descr=""/>
+                          <pic:cNvPicPr>
+                            <a:picLocks noChangeAspect="1" noChangeArrowheads="1"/>
+                          </pic:cNvPicPr>
+                        </pic:nvPicPr>
+                        <pic:blipFill>
+                          <a:blip r:embed="rId16" cstate="none"/>
+                          <a:srcRect/>
+                          <a:stretch>
+                            <a:fillRect/>
+                          </a:stretch>
+                        </pic:blipFill>
+                        <pic:spPr bwMode="auto">
+                          <a:xfrm>
+                            <a:off x="0" y="0"/>
+                            <a:ext cx="1905000" cy="409575"/>
+                          </a:xfrm>
+                          <a:prstGeom prst="rect">
+                            <a:avLst/>
+                          </a:prstGeom>
+                        </pic:spPr>
+                      </pic:pic>
+                    </a:graphicData>
+                  </a:graphic>
+                </wp:inline>
+              </w:drawing>
+            </w:r>
+          </w:p>
+        </w:tc>
+        <w:tc>
+          <w:tcPr>
+            <w:tcW w:type="dxa" w:w="4819"/>
+            <w:tcBorders>
+              <w:top w:val="none" w:color="FFFFFF" w:sz="0"/>
+              <w:left w:val="none" w:color="FFFFFF" w:sz="0"/>
+              <w:bottom w:val="none" w:color="FFFFFF" w:sz="0"/>
+              <w:right w:val="none" w:color="FFFFFF" w:sz="0"/>
+            </w:tcBorders>
+            <w:tcMar>
+              <w:top w:type="dxa" w:w="40"/>
+              <w:left w:type="dxa" w:w="40"/>
+              <w:bottom w:type="dxa" w:w="0"/>
+              <w:right w:type="dxa" w:w="0"/>
+            </w:tcMar>
+            <w:vAlign w:val="bottom"/>
+          </w:tcPr>
+          <w:p>
+            <w:pPr>
+              <w:keepNext/>
+              <w:spacing w:after="0"/>
+            </w:pPr>
+            <w:r>
+              <w:drawing>
+                <wp:inline distT="0" distB="0" distL="0" distR="0">
+                  <wp:extent cx="1428750" cy="742950"/>
+                  <wp:effectExtent t="0" r="0" b="0" l="0"/>
+                  <wp:docPr id="1" name="" descr="" title=""/>
+                  <wp:cNvGraphicFramePr>
+                    <a:graphicFrameLocks xmlns:a="http://schemas.openxmlformats.org/drawingml/2006/main" noChangeAspect="1"/>
+                  </wp:cNvGraphicFramePr>
+                  <a:graphic xmlns:a="http://schemas.openxmlformats.org/drawingml/2006/main">
+                    <a:graphicData uri="http://schemas.openxmlformats.org/drawingml/2006/picture">
+                      <pic:pic xmlns:pic="http://schemas.openxmlformats.org/drawingml/2006/picture">
+                        <pic:nvPicPr>
+                          <pic:cNvPr id="0" name="" descr=""/>
+                          <pic:cNvPicPr>
+                            <a:picLocks noChangeAspect="1" noChangeArrowheads="1"/>
+                          </pic:cNvPicPr>
+                        </pic:nvPicPr>
+                        <pic:blipFill>
+                          <a:blip r:embed="rId17" cstate="none"/>
+                          <a:srcRect/>
+                          <a:stretch>
+                            <a:fillRect/>
+                          </a:stretch>
+                        </pic:blipFill>
+                        <pic:spPr bwMode="auto">
+                          <a:xfrm>
+                            <a:off x="0" y="0"/>
+                            <a:ext cx="1428750" cy="742950"/>
+                          </a:xfrm>
+                          <a:prstGeom prst="rect">
+                            <a:avLst/>
+                          </a:prstGeom>
+                        </pic:spPr>
+                      </pic:pic>
+                    </a:graphicData>
+                  </a:graphic>
+                </wp:inline>
+              </w:drawing>
+            </w:r>
+          </w:p>
+        </w:tc>
+      </w:tr>
+    </w:tbl>
     <w:p>
       <w:pPr>
         <w:keepNext/>
-        <w:spacing w:after="0" w:before="500"/>
+        <w:spacing w:after="0" w:before="0"/>
       </w:pPr>
       <w:r>
         <w:rPr>

</xml_diff>

<commit_message>
Offer: apply BauHausEurope brand design (logo, navy and orange palette)
Co-Authored-By: Claude Fable 5.1 <noreply@anthropic.com>
Claude-Session: https://claude.ai/code/session_01Y2BwyWrz2zGDUPQB2oEzRk
</commit_message>
<xml_diff>
--- a/business-plan/ponuka-merkury-market/Oferta_inwestycyjna_Stara_Lubovna_Merkury_Market_PL.docx
+++ b/business-plan/ponuka-merkury-market/Oferta_inwestycyjna_Stara_Lubovna_Merkury_Market_PL.docx
@@ -4,169 +4,14 @@
   <w:body>
     <w:p>
       <w:pPr>
-        <w:spacing w:after="200" w:before="1600"/>
-      </w:pPr>
-      <w:r>
-        <w:rPr>
-          <w:rFonts w:ascii="Arial" w:cs="Arial" w:eastAsia="Arial" w:hAnsi="Arial"/>
-          <w:b/>
-          <w:bCs/>
-          <w:color w:val="2A78D6"/>
-          <w:sz w:val="28"/>
-          <w:szCs w:val="28"/>
-        </w:rPr>
-        <w:t xml:space="preserve">OFERTA INWESTYCYJNA</w:t>
-      </w:r>
-    </w:p>
-    <w:p>
-      <w:pPr>
-        <w:spacing w:after="200"/>
-      </w:pPr>
-      <w:r>
-        <w:rPr>
-          <w:rFonts w:ascii="Arial" w:cs="Arial" w:eastAsia="Arial" w:hAnsi="Arial"/>
-          <w:b/>
-          <w:bCs/>
-          <w:color w:val="1F3B73"/>
-          <w:sz w:val="44"/>
-          <w:szCs w:val="44"/>
-        </w:rPr>
-        <w:t xml:space="preserve">Teren „Stará Pekáreň”, Levočská 11, Stará Ľubovňa (Słowacja)</w:t>
-      </w:r>
-    </w:p>
-    <w:p>
-      <w:pPr>
-        <w:spacing w:after="300"/>
-      </w:pPr>
-      <w:r>
-        <w:rPr>
-          <w:rFonts w:ascii="Arial" w:cs="Arial" w:eastAsia="Arial" w:hAnsi="Arial"/>
-          <w:color w:val="1F3B73"/>
-          <w:sz w:val="28"/>
-          <w:szCs w:val="28"/>
-        </w:rPr>
-        <w:t xml:space="preserve">Sprzedaż działki 10 789 m² pod centrum handlowe Merkury Market oraz budowa „pod klucz”</w:t>
-      </w:r>
-    </w:p>
-    <w:p>
-      <w:pPr>
-        <w:pBdr>
-          <w:bottom w:val="single" w:color="2A78D6" w:sz="12" w:space="8"/>
-        </w:pBdr>
-        <w:spacing w:after="100"/>
-      </w:pPr>
-      <w:r>
-        <w:rPr>
-          <w:rFonts w:ascii="Arial" w:cs="Arial" w:eastAsia="Arial" w:hAnsi="Arial"/>
-        </w:rPr>
-        <w:t xml:space="preserve"/>
-      </w:r>
-    </w:p>
-    <w:p>
-      <w:pPr>
-        <w:spacing w:after="60" w:before="400"/>
-      </w:pPr>
-      <w:r>
-        <w:rPr>
-          <w:rFonts w:ascii="Arial" w:cs="Arial" w:eastAsia="Arial" w:hAnsi="Arial"/>
-          <w:b/>
-          <w:bCs/>
-          <w:sz w:val="22"/>
-          <w:szCs w:val="22"/>
-        </w:rPr>
-        <w:t xml:space="preserve">Dla:</w:t>
-      </w:r>
-    </w:p>
-    <w:p>
-      <w:pPr>
-        <w:spacing w:after="40"/>
-      </w:pPr>
-      <w:r>
-        <w:rPr>
-          <w:rFonts w:ascii="Arial" w:cs="Arial" w:eastAsia="Arial" w:hAnsi="Arial"/>
-          <w:sz w:val="22"/>
-          <w:szCs w:val="22"/>
-        </w:rPr>
-        <w:t xml:space="preserve">Merkury Market Spółka z ograniczoną odpowiedzialnością Sp.k., Krosno</w:t>
-      </w:r>
-    </w:p>
-    <w:p>
-      <w:pPr>
-        <w:spacing w:after="300"/>
-      </w:pPr>
-      <w:r>
-        <w:rPr>
-          <w:rFonts w:ascii="Arial" w:cs="Arial" w:eastAsia="Arial" w:hAnsi="Arial"/>
-          <w:sz w:val="22"/>
-          <w:szCs w:val="22"/>
-        </w:rPr>
-        <w:t xml:space="preserve">Pan Marcin Oleksy, Manager ds. ekspansji, tel. 605 667 609</w:t>
-      </w:r>
-    </w:p>
-    <w:p>
-      <w:pPr>
-        <w:spacing w:after="60"/>
-      </w:pPr>
-      <w:r>
-        <w:rPr>
-          <w:rFonts w:ascii="Arial" w:cs="Arial" w:eastAsia="Arial" w:hAnsi="Arial"/>
-          <w:b/>
-          <w:bCs/>
-          <w:sz w:val="22"/>
-          <w:szCs w:val="22"/>
-        </w:rPr>
-        <w:t xml:space="preserve">Oferent:</w:t>
-      </w:r>
-    </w:p>
-    <w:p>
-      <w:pPr>
-        <w:spacing w:after="40"/>
-      </w:pPr>
-      <w:r>
-        <w:rPr>
-          <w:rFonts w:ascii="Arial" w:cs="Arial" w:eastAsia="Arial" w:hAnsi="Arial"/>
-          <w:sz w:val="22"/>
-          <w:szCs w:val="22"/>
-        </w:rPr>
-        <w:t xml:space="preserve">BauHausEurope s. r. o., Konventná 9, 811 03 Bratysława, Republika Słowacka</w:t>
-      </w:r>
-    </w:p>
-    <w:p>
-      <w:pPr>
-        <w:spacing w:after="300"/>
-      </w:pPr>
-      <w:r>
-        <w:rPr>
-          <w:rFonts w:ascii="Arial" w:cs="Arial" w:eastAsia="Arial" w:hAnsi="Arial"/>
-          <w:sz w:val="22"/>
-          <w:szCs w:val="22"/>
-        </w:rPr>
-        <w:t xml:space="preserve">Nr rej. (IČO) 47 420 171  |  Bc. Ľubomír Kruk, prezes zarządu (konateľ)  |  info@bauhauseurope.de  |  +421 904 027 703</w:t>
-      </w:r>
-    </w:p>
-    <w:p>
-      <w:pPr>
-        <w:spacing w:after="60"/>
-      </w:pPr>
-      <w:r>
-        <w:rPr>
-          <w:rFonts w:ascii="Arial" w:cs="Arial" w:eastAsia="Arial" w:hAnsi="Arial"/>
-          <w:sz w:val="22"/>
-          <w:szCs w:val="22"/>
-        </w:rPr>
-        <w:t xml:space="preserve">Bratysława, 29.10.2026</w:t>
-      </w:r>
-    </w:p>
-    <w:p>
-      <w:pPr>
         <w:keepNext/>
         <w:spacing w:after="60" w:before="120"/>
-        <w:jc w:val="center"/>
+        <w:jc w:val="left"/>
       </w:pPr>
       <w:r>
         <w:drawing>
           <wp:inline distT="0" distB="0" distL="0" distR="0">
-            <wp:extent cx="5334000" cy="3619500"/>
+            <wp:extent cx="5905500" cy="1381125"/>
             <wp:effectExtent t="0" r="0" b="0" l="0"/>
             <wp:docPr id="1" name="" descr="" title=""/>
             <wp:cNvGraphicFramePr>
@@ -182,7 +27,7 @@
                     </pic:cNvPicPr>
                   </pic:nvPicPr>
                   <pic:blipFill>
-                    <a:blip r:embed="rId9" cstate="none"/>
+                    <a:blip r:embed="rId11" cstate="none"/>
                     <a:srcRect/>
                     <a:stretch>
                       <a:fillRect/>
@@ -191,7 +36,7 @@
                   <pic:spPr bwMode="auto">
                     <a:xfrm>
                       <a:off x="0" y="0"/>
-                      <a:ext cx="5334000" cy="3619500"/>
+                      <a:ext cx="5905500" cy="1381125"/>
                     </a:xfrm>
                     <a:prstGeom prst="rect">
                       <a:avLst/>
@@ -206,7 +51,197 @@
     </w:p>
     <w:p>
       <w:pPr>
-        <w:spacing w:after="60" w:before="200"/>
+        <w:spacing w:after="160" w:before="500"/>
+      </w:pPr>
+      <w:r>
+        <w:rPr>
+          <w:rFonts w:ascii="Arial" w:cs="Arial" w:eastAsia="Arial" w:hAnsi="Arial"/>
+          <w:b/>
+          <w:bCs/>
+          <w:color w:val="FF4000"/>
+          <w:sz w:val="26"/>
+          <w:szCs w:val="26"/>
+        </w:rPr>
+        <w:t xml:space="preserve">OFERTA INWESTYCYJNA</w:t>
+      </w:r>
+    </w:p>
+    <w:p>
+      <w:pPr>
+        <w:spacing w:after="160"/>
+      </w:pPr>
+      <w:r>
+        <w:rPr>
+          <w:rFonts w:ascii="Arial" w:cs="Arial" w:eastAsia="Arial" w:hAnsi="Arial"/>
+          <w:b/>
+          <w:bCs/>
+          <w:color w:val="010222"/>
+          <w:sz w:val="42"/>
+          <w:szCs w:val="42"/>
+        </w:rPr>
+        <w:t xml:space="preserve">Teren „Stará Pekáreň”, Levočská 11, Stará Ľubovňa (Słowacja)</w:t>
+      </w:r>
+    </w:p>
+    <w:p>
+      <w:pPr>
+        <w:spacing w:after="240"/>
+      </w:pPr>
+      <w:r>
+        <w:rPr>
+          <w:rFonts w:ascii="Arial" w:cs="Arial" w:eastAsia="Arial" w:hAnsi="Arial"/>
+          <w:color w:val="010222"/>
+          <w:sz w:val="26"/>
+          <w:szCs w:val="26"/>
+        </w:rPr>
+        <w:t xml:space="preserve">Sprzedaż działki 10 789 m² pod centrum handlowe Merkury Market oraz budowa „pod klucz”</w:t>
+      </w:r>
+    </w:p>
+    <w:p>
+      <w:pPr>
+        <w:keepNext/>
+        <w:spacing w:after="60" w:before="120"/>
+        <w:jc w:val="left"/>
+      </w:pPr>
+      <w:r>
+        <w:drawing>
+          <wp:inline distT="0" distB="0" distL="0" distR="0">
+            <wp:extent cx="5715000" cy="3876675"/>
+            <wp:effectExtent t="0" r="0" b="0" l="0"/>
+            <wp:docPr id="1" name="" descr="" title=""/>
+            <wp:cNvGraphicFramePr>
+              <a:graphicFrameLocks xmlns:a="http://schemas.openxmlformats.org/drawingml/2006/main" noChangeAspect="1"/>
+            </wp:cNvGraphicFramePr>
+            <a:graphic xmlns:a="http://schemas.openxmlformats.org/drawingml/2006/main">
+              <a:graphicData uri="http://schemas.openxmlformats.org/drawingml/2006/picture">
+                <pic:pic xmlns:pic="http://schemas.openxmlformats.org/drawingml/2006/picture">
+                  <pic:nvPicPr>
+                    <pic:cNvPr id="0" name="" descr=""/>
+                    <pic:cNvPicPr>
+                      <a:picLocks noChangeAspect="1" noChangeArrowheads="1"/>
+                    </pic:cNvPicPr>
+                  </pic:nvPicPr>
+                  <pic:blipFill>
+                    <a:blip r:embed="rId12" cstate="none"/>
+                    <a:srcRect/>
+                    <a:stretch>
+                      <a:fillRect/>
+                    </a:stretch>
+                  </pic:blipFill>
+                  <pic:spPr bwMode="auto">
+                    <a:xfrm>
+                      <a:off x="0" y="0"/>
+                      <a:ext cx="5715000" cy="3876675"/>
+                    </a:xfrm>
+                    <a:prstGeom prst="rect">
+                      <a:avLst/>
+                    </a:prstGeom>
+                  </pic:spPr>
+                </pic:pic>
+              </a:graphicData>
+            </a:graphic>
+          </wp:inline>
+        </w:drawing>
+      </w:r>
+    </w:p>
+    <w:p>
+      <w:pPr>
+        <w:spacing w:after="60" w:before="300"/>
+      </w:pPr>
+      <w:r>
+        <w:rPr>
+          <w:rFonts w:ascii="Arial" w:cs="Arial" w:eastAsia="Arial" w:hAnsi="Arial"/>
+          <w:b/>
+          <w:bCs/>
+          <w:color w:val="010222"/>
+          <w:sz w:val="21"/>
+          <w:szCs w:val="21"/>
+        </w:rPr>
+        <w:t xml:space="preserve">Dla:</w:t>
+      </w:r>
+    </w:p>
+    <w:p>
+      <w:pPr>
+        <w:spacing w:after="40"/>
+      </w:pPr>
+      <w:r>
+        <w:rPr>
+          <w:rFonts w:ascii="Arial" w:cs="Arial" w:eastAsia="Arial" w:hAnsi="Arial"/>
+          <w:sz w:val="21"/>
+          <w:szCs w:val="21"/>
+        </w:rPr>
+        <w:t xml:space="preserve">Merkury Market Spółka z ograniczoną odpowiedzialnością Sp.k., Krosno</w:t>
+      </w:r>
+    </w:p>
+    <w:p>
+      <w:pPr>
+        <w:spacing w:after="200"/>
+      </w:pPr>
+      <w:r>
+        <w:rPr>
+          <w:rFonts w:ascii="Arial" w:cs="Arial" w:eastAsia="Arial" w:hAnsi="Arial"/>
+          <w:sz w:val="21"/>
+          <w:szCs w:val="21"/>
+        </w:rPr>
+        <w:t xml:space="preserve">Pan Marcin Oleksy, Manager ds. ekspansji, tel. 605 667 609</w:t>
+      </w:r>
+    </w:p>
+    <w:p>
+      <w:pPr>
+        <w:spacing w:after="60"/>
+      </w:pPr>
+      <w:r>
+        <w:rPr>
+          <w:rFonts w:ascii="Arial" w:cs="Arial" w:eastAsia="Arial" w:hAnsi="Arial"/>
+          <w:b/>
+          <w:bCs/>
+          <w:color w:val="010222"/>
+          <w:sz w:val="21"/>
+          <w:szCs w:val="21"/>
+        </w:rPr>
+        <w:t xml:space="preserve">Oferent:</w:t>
+      </w:r>
+    </w:p>
+    <w:p>
+      <w:pPr>
+        <w:spacing w:after="40"/>
+      </w:pPr>
+      <w:r>
+        <w:rPr>
+          <w:rFonts w:ascii="Arial" w:cs="Arial" w:eastAsia="Arial" w:hAnsi="Arial"/>
+          <w:sz w:val="21"/>
+          <w:szCs w:val="21"/>
+        </w:rPr>
+        <w:t xml:space="preserve">BauHausEurope s. r. o., Konventná 9, 811 03 Bratysława, Republika Słowacka</w:t>
+      </w:r>
+    </w:p>
+    <w:p>
+      <w:pPr>
+        <w:spacing w:after="200"/>
+      </w:pPr>
+      <w:r>
+        <w:rPr>
+          <w:rFonts w:ascii="Arial" w:cs="Arial" w:eastAsia="Arial" w:hAnsi="Arial"/>
+          <w:sz w:val="21"/>
+          <w:szCs w:val="21"/>
+        </w:rPr>
+        <w:t xml:space="preserve">Nr rej. (IČO) 47 420 171  |  Bc. Ľubomír Kruk, prezes zarządu (konateľ)  |  info@bauhauseurope.de  |  +421 904 027 703</w:t>
+      </w:r>
+    </w:p>
+    <w:p>
+      <w:pPr>
+        <w:spacing w:after="60"/>
+      </w:pPr>
+      <w:r>
+        <w:rPr>
+          <w:rFonts w:ascii="Arial" w:cs="Arial" w:eastAsia="Arial" w:hAnsi="Arial"/>
+          <w:sz w:val="21"/>
+          <w:szCs w:val="21"/>
+        </w:rPr>
+        <w:t xml:space="preserve">Bratysława, 29.10.2026</w:t>
+      </w:r>
+    </w:p>
+    <w:p>
+      <w:pPr>
+        <w:spacing w:after="60" w:before="160"/>
       </w:pPr>
       <w:r>
         <w:rPr>
@@ -228,14 +263,17 @@
     <w:p>
       <w:pPr>
         <w:pStyle w:val="Heading1"/>
-        <w:spacing w:after="160" w:before="360"/>
+        <w:pBdr>
+          <w:bottom w:val="single" w:color="FF4000" w:sz="12" w:space="4"/>
+        </w:pBdr>
+        <w:spacing w:after="200" w:before="360"/>
       </w:pPr>
       <w:r>
         <w:rPr>
           <w:rFonts w:ascii="Arial" w:cs="Arial" w:eastAsia="Arial" w:hAnsi="Arial"/>
           <w:b/>
           <w:bCs/>
-          <w:color w:val="1F3B73"/>
+          <w:color w:val="010222"/>
           <w:sz w:val="30"/>
           <w:szCs w:val="30"/>
         </w:rPr>
@@ -360,14 +398,17 @@
     <w:p>
       <w:pPr>
         <w:pStyle w:val="Heading1"/>
-        <w:spacing w:after="160" w:before="360"/>
+        <w:pBdr>
+          <w:bottom w:val="single" w:color="FF4000" w:sz="12" w:space="4"/>
+        </w:pBdr>
+        <w:spacing w:after="200" w:before="360"/>
       </w:pPr>
       <w:r>
         <w:rPr>
           <w:rFonts w:ascii="Arial" w:cs="Arial" w:eastAsia="Arial" w:hAnsi="Arial"/>
           <w:b/>
           <w:bCs/>
-          <w:color w:val="1F3B73"/>
+          <w:color w:val="010222"/>
           <w:sz w:val="30"/>
           <w:szCs w:val="30"/>
         </w:rPr>
@@ -399,12 +440,12 @@
           <w:tcPr>
             <w:tcW w:type="dxa" w:w="2891"/>
             <w:tcBorders>
-              <w:top w:val="single" w:color="C9D3E3" w:sz="4"/>
-              <w:left w:val="single" w:color="C9D3E3" w:sz="4"/>
-              <w:bottom w:val="single" w:color="C9D3E3" w:sz="4"/>
-              <w:right w:val="single" w:color="C9D3E3" w:sz="4"/>
-            </w:tcBorders>
-            <w:shd w:fill="1F3B73" w:color="auto" w:val="clear"/>
+              <w:top w:val="single" w:color="C9C9D6" w:sz="4"/>
+              <w:left w:val="single" w:color="C9C9D6" w:sz="4"/>
+              <w:bottom w:val="single" w:color="C9C9D6" w:sz="4"/>
+              <w:right w:val="single" w:color="C9C9D6" w:sz="4"/>
+            </w:tcBorders>
+            <w:shd w:fill="010222" w:color="auto" w:val="clear"/>
             <w:tcMar>
               <w:top w:type="dxa" w:w="60"/>
               <w:left w:type="dxa" w:w="90"/>
@@ -435,12 +476,12 @@
           <w:tcPr>
             <w:tcW w:type="dxa" w:w="6747"/>
             <w:tcBorders>
-              <w:top w:val="single" w:color="C9D3E3" w:sz="4"/>
-              <w:left w:val="single" w:color="C9D3E3" w:sz="4"/>
-              <w:bottom w:val="single" w:color="C9D3E3" w:sz="4"/>
-              <w:right w:val="single" w:color="C9D3E3" w:sz="4"/>
-            </w:tcBorders>
-            <w:shd w:fill="1F3B73" w:color="auto" w:val="clear"/>
+              <w:top w:val="single" w:color="C9C9D6" w:sz="4"/>
+              <w:left w:val="single" w:color="C9C9D6" w:sz="4"/>
+              <w:bottom w:val="single" w:color="C9C9D6" w:sz="4"/>
+              <w:right w:val="single" w:color="C9C9D6" w:sz="4"/>
+            </w:tcBorders>
+            <w:shd w:fill="010222" w:color="auto" w:val="clear"/>
             <w:tcMar>
               <w:top w:type="dxa" w:w="60"/>
               <w:left w:type="dxa" w:w="90"/>
@@ -477,10 +518,10 @@
           <w:tcPr>
             <w:tcW w:type="dxa" w:w="2891"/>
             <w:tcBorders>
-              <w:top w:val="single" w:color="C9D3E3" w:sz="4"/>
-              <w:left w:val="single" w:color="C9D3E3" w:sz="4"/>
-              <w:bottom w:val="single" w:color="C9D3E3" w:sz="4"/>
-              <w:right w:val="single" w:color="C9D3E3" w:sz="4"/>
+              <w:top w:val="single" w:color="C9C9D6" w:sz="4"/>
+              <w:left w:val="single" w:color="C9C9D6" w:sz="4"/>
+              <w:bottom w:val="single" w:color="C9C9D6" w:sz="4"/>
+              <w:right w:val="single" w:color="C9C9D6" w:sz="4"/>
             </w:tcBorders>
             <w:tcMar>
               <w:top w:type="dxa" w:w="60"/>
@@ -512,10 +553,10 @@
           <w:tcPr>
             <w:tcW w:type="dxa" w:w="6747"/>
             <w:tcBorders>
-              <w:top w:val="single" w:color="C9D3E3" w:sz="4"/>
-              <w:left w:val="single" w:color="C9D3E3" w:sz="4"/>
-              <w:bottom w:val="single" w:color="C9D3E3" w:sz="4"/>
-              <w:right w:val="single" w:color="C9D3E3" w:sz="4"/>
+              <w:top w:val="single" w:color="C9C9D6" w:sz="4"/>
+              <w:left w:val="single" w:color="C9C9D6" w:sz="4"/>
+              <w:bottom w:val="single" w:color="C9C9D6" w:sz="4"/>
+              <w:right w:val="single" w:color="C9C9D6" w:sz="4"/>
             </w:tcBorders>
             <w:tcMar>
               <w:top w:type="dxa" w:w="60"/>
@@ -553,10 +594,10 @@
           <w:tcPr>
             <w:tcW w:type="dxa" w:w="2891"/>
             <w:tcBorders>
-              <w:top w:val="single" w:color="C9D3E3" w:sz="4"/>
-              <w:left w:val="single" w:color="C9D3E3" w:sz="4"/>
-              <w:bottom w:val="single" w:color="C9D3E3" w:sz="4"/>
-              <w:right w:val="single" w:color="C9D3E3" w:sz="4"/>
+              <w:top w:val="single" w:color="C9C9D6" w:sz="4"/>
+              <w:left w:val="single" w:color="C9C9D6" w:sz="4"/>
+              <w:bottom w:val="single" w:color="C9C9D6" w:sz="4"/>
+              <w:right w:val="single" w:color="C9C9D6" w:sz="4"/>
             </w:tcBorders>
             <w:tcMar>
               <w:top w:type="dxa" w:w="60"/>
@@ -588,10 +629,10 @@
           <w:tcPr>
             <w:tcW w:type="dxa" w:w="6747"/>
             <w:tcBorders>
-              <w:top w:val="single" w:color="C9D3E3" w:sz="4"/>
-              <w:left w:val="single" w:color="C9D3E3" w:sz="4"/>
-              <w:bottom w:val="single" w:color="C9D3E3" w:sz="4"/>
-              <w:right w:val="single" w:color="C9D3E3" w:sz="4"/>
+              <w:top w:val="single" w:color="C9C9D6" w:sz="4"/>
+              <w:left w:val="single" w:color="C9C9D6" w:sz="4"/>
+              <w:bottom w:val="single" w:color="C9C9D6" w:sz="4"/>
+              <w:right w:val="single" w:color="C9C9D6" w:sz="4"/>
             </w:tcBorders>
             <w:tcMar>
               <w:top w:type="dxa" w:w="60"/>
@@ -629,10 +670,10 @@
           <w:tcPr>
             <w:tcW w:type="dxa" w:w="2891"/>
             <w:tcBorders>
-              <w:top w:val="single" w:color="C9D3E3" w:sz="4"/>
-              <w:left w:val="single" w:color="C9D3E3" w:sz="4"/>
-              <w:bottom w:val="single" w:color="C9D3E3" w:sz="4"/>
-              <w:right w:val="single" w:color="C9D3E3" w:sz="4"/>
+              <w:top w:val="single" w:color="C9C9D6" w:sz="4"/>
+              <w:left w:val="single" w:color="C9C9D6" w:sz="4"/>
+              <w:bottom w:val="single" w:color="C9C9D6" w:sz="4"/>
+              <w:right w:val="single" w:color="C9C9D6" w:sz="4"/>
             </w:tcBorders>
             <w:tcMar>
               <w:top w:type="dxa" w:w="60"/>
@@ -664,10 +705,10 @@
           <w:tcPr>
             <w:tcW w:type="dxa" w:w="6747"/>
             <w:tcBorders>
-              <w:top w:val="single" w:color="C9D3E3" w:sz="4"/>
-              <w:left w:val="single" w:color="C9D3E3" w:sz="4"/>
-              <w:bottom w:val="single" w:color="C9D3E3" w:sz="4"/>
-              <w:right w:val="single" w:color="C9D3E3" w:sz="4"/>
+              <w:top w:val="single" w:color="C9C9D6" w:sz="4"/>
+              <w:left w:val="single" w:color="C9C9D6" w:sz="4"/>
+              <w:bottom w:val="single" w:color="C9C9D6" w:sz="4"/>
+              <w:right w:val="single" w:color="C9C9D6" w:sz="4"/>
             </w:tcBorders>
             <w:tcMar>
               <w:top w:type="dxa" w:w="60"/>
@@ -705,10 +746,10 @@
           <w:tcPr>
             <w:tcW w:type="dxa" w:w="2891"/>
             <w:tcBorders>
-              <w:top w:val="single" w:color="C9D3E3" w:sz="4"/>
-              <w:left w:val="single" w:color="C9D3E3" w:sz="4"/>
-              <w:bottom w:val="single" w:color="C9D3E3" w:sz="4"/>
-              <w:right w:val="single" w:color="C9D3E3" w:sz="4"/>
+              <w:top w:val="single" w:color="C9C9D6" w:sz="4"/>
+              <w:left w:val="single" w:color="C9C9D6" w:sz="4"/>
+              <w:bottom w:val="single" w:color="C9C9D6" w:sz="4"/>
+              <w:right w:val="single" w:color="C9C9D6" w:sz="4"/>
             </w:tcBorders>
             <w:tcMar>
               <w:top w:type="dxa" w:w="60"/>
@@ -740,10 +781,10 @@
           <w:tcPr>
             <w:tcW w:type="dxa" w:w="6747"/>
             <w:tcBorders>
-              <w:top w:val="single" w:color="C9D3E3" w:sz="4"/>
-              <w:left w:val="single" w:color="C9D3E3" w:sz="4"/>
-              <w:bottom w:val="single" w:color="C9D3E3" w:sz="4"/>
-              <w:right w:val="single" w:color="C9D3E3" w:sz="4"/>
+              <w:top w:val="single" w:color="C9C9D6" w:sz="4"/>
+              <w:left w:val="single" w:color="C9C9D6" w:sz="4"/>
+              <w:bottom w:val="single" w:color="C9C9D6" w:sz="4"/>
+              <w:right w:val="single" w:color="C9C9D6" w:sz="4"/>
             </w:tcBorders>
             <w:tcMar>
               <w:top w:type="dxa" w:w="60"/>
@@ -781,10 +822,10 @@
           <w:tcPr>
             <w:tcW w:type="dxa" w:w="2891"/>
             <w:tcBorders>
-              <w:top w:val="single" w:color="C9D3E3" w:sz="4"/>
-              <w:left w:val="single" w:color="C9D3E3" w:sz="4"/>
-              <w:bottom w:val="single" w:color="C9D3E3" w:sz="4"/>
-              <w:right w:val="single" w:color="C9D3E3" w:sz="4"/>
+              <w:top w:val="single" w:color="C9C9D6" w:sz="4"/>
+              <w:left w:val="single" w:color="C9C9D6" w:sz="4"/>
+              <w:bottom w:val="single" w:color="C9C9D6" w:sz="4"/>
+              <w:right w:val="single" w:color="C9C9D6" w:sz="4"/>
             </w:tcBorders>
             <w:tcMar>
               <w:top w:type="dxa" w:w="60"/>
@@ -816,10 +857,10 @@
           <w:tcPr>
             <w:tcW w:type="dxa" w:w="6747"/>
             <w:tcBorders>
-              <w:top w:val="single" w:color="C9D3E3" w:sz="4"/>
-              <w:left w:val="single" w:color="C9D3E3" w:sz="4"/>
-              <w:bottom w:val="single" w:color="C9D3E3" w:sz="4"/>
-              <w:right w:val="single" w:color="C9D3E3" w:sz="4"/>
+              <w:top w:val="single" w:color="C9C9D6" w:sz="4"/>
+              <w:left w:val="single" w:color="C9C9D6" w:sz="4"/>
+              <w:bottom w:val="single" w:color="C9C9D6" w:sz="4"/>
+              <w:right w:val="single" w:color="C9C9D6" w:sz="4"/>
             </w:tcBorders>
             <w:tcMar>
               <w:top w:type="dxa" w:w="60"/>
@@ -857,10 +898,10 @@
           <w:tcPr>
             <w:tcW w:type="dxa" w:w="2891"/>
             <w:tcBorders>
-              <w:top w:val="single" w:color="C9D3E3" w:sz="4"/>
-              <w:left w:val="single" w:color="C9D3E3" w:sz="4"/>
-              <w:bottom w:val="single" w:color="C9D3E3" w:sz="4"/>
-              <w:right w:val="single" w:color="C9D3E3" w:sz="4"/>
+              <w:top w:val="single" w:color="C9C9D6" w:sz="4"/>
+              <w:left w:val="single" w:color="C9C9D6" w:sz="4"/>
+              <w:bottom w:val="single" w:color="C9C9D6" w:sz="4"/>
+              <w:right w:val="single" w:color="C9C9D6" w:sz="4"/>
             </w:tcBorders>
             <w:tcMar>
               <w:top w:type="dxa" w:w="60"/>
@@ -892,10 +933,10 @@
           <w:tcPr>
             <w:tcW w:type="dxa" w:w="6747"/>
             <w:tcBorders>
-              <w:top w:val="single" w:color="C9D3E3" w:sz="4"/>
-              <w:left w:val="single" w:color="C9D3E3" w:sz="4"/>
-              <w:bottom w:val="single" w:color="C9D3E3" w:sz="4"/>
-              <w:right w:val="single" w:color="C9D3E3" w:sz="4"/>
+              <w:top w:val="single" w:color="C9C9D6" w:sz="4"/>
+              <w:left w:val="single" w:color="C9C9D6" w:sz="4"/>
+              <w:bottom w:val="single" w:color="C9C9D6" w:sz="4"/>
+              <w:right w:val="single" w:color="C9C9D6" w:sz="4"/>
             </w:tcBorders>
             <w:tcMar>
               <w:top w:type="dxa" w:w="60"/>
@@ -933,10 +974,10 @@
           <w:tcPr>
             <w:tcW w:type="dxa" w:w="2891"/>
             <w:tcBorders>
-              <w:top w:val="single" w:color="C9D3E3" w:sz="4"/>
-              <w:left w:val="single" w:color="C9D3E3" w:sz="4"/>
-              <w:bottom w:val="single" w:color="C9D3E3" w:sz="4"/>
-              <w:right w:val="single" w:color="C9D3E3" w:sz="4"/>
+              <w:top w:val="single" w:color="C9C9D6" w:sz="4"/>
+              <w:left w:val="single" w:color="C9C9D6" w:sz="4"/>
+              <w:bottom w:val="single" w:color="C9C9D6" w:sz="4"/>
+              <w:right w:val="single" w:color="C9C9D6" w:sz="4"/>
             </w:tcBorders>
             <w:tcMar>
               <w:top w:type="dxa" w:w="60"/>
@@ -968,10 +1009,10 @@
           <w:tcPr>
             <w:tcW w:type="dxa" w:w="6747"/>
             <w:tcBorders>
-              <w:top w:val="single" w:color="C9D3E3" w:sz="4"/>
-              <w:left w:val="single" w:color="C9D3E3" w:sz="4"/>
-              <w:bottom w:val="single" w:color="C9D3E3" w:sz="4"/>
-              <w:right w:val="single" w:color="C9D3E3" w:sz="4"/>
+              <w:top w:val="single" w:color="C9C9D6" w:sz="4"/>
+              <w:left w:val="single" w:color="C9C9D6" w:sz="4"/>
+              <w:bottom w:val="single" w:color="C9C9D6" w:sz="4"/>
+              <w:right w:val="single" w:color="C9C9D6" w:sz="4"/>
             </w:tcBorders>
             <w:tcMar>
               <w:top w:type="dxa" w:w="60"/>
@@ -1009,10 +1050,10 @@
           <w:tcPr>
             <w:tcW w:type="dxa" w:w="2891"/>
             <w:tcBorders>
-              <w:top w:val="single" w:color="C9D3E3" w:sz="4"/>
-              <w:left w:val="single" w:color="C9D3E3" w:sz="4"/>
-              <w:bottom w:val="single" w:color="C9D3E3" w:sz="4"/>
-              <w:right w:val="single" w:color="C9D3E3" w:sz="4"/>
+              <w:top w:val="single" w:color="C9C9D6" w:sz="4"/>
+              <w:left w:val="single" w:color="C9C9D6" w:sz="4"/>
+              <w:bottom w:val="single" w:color="C9C9D6" w:sz="4"/>
+              <w:right w:val="single" w:color="C9C9D6" w:sz="4"/>
             </w:tcBorders>
             <w:tcMar>
               <w:top w:type="dxa" w:w="60"/>
@@ -1044,10 +1085,10 @@
           <w:tcPr>
             <w:tcW w:type="dxa" w:w="6747"/>
             <w:tcBorders>
-              <w:top w:val="single" w:color="C9D3E3" w:sz="4"/>
-              <w:left w:val="single" w:color="C9D3E3" w:sz="4"/>
-              <w:bottom w:val="single" w:color="C9D3E3" w:sz="4"/>
-              <w:right w:val="single" w:color="C9D3E3" w:sz="4"/>
+              <w:top w:val="single" w:color="C9C9D6" w:sz="4"/>
+              <w:left w:val="single" w:color="C9C9D6" w:sz="4"/>
+              <w:bottom w:val="single" w:color="C9C9D6" w:sz="4"/>
+              <w:right w:val="single" w:color="C9C9D6" w:sz="4"/>
             </w:tcBorders>
             <w:tcMar>
               <w:top w:type="dxa" w:w="60"/>
@@ -1085,10 +1126,10 @@
           <w:tcPr>
             <w:tcW w:type="dxa" w:w="2891"/>
             <w:tcBorders>
-              <w:top w:val="single" w:color="C9D3E3" w:sz="4"/>
-              <w:left w:val="single" w:color="C9D3E3" w:sz="4"/>
-              <w:bottom w:val="single" w:color="C9D3E3" w:sz="4"/>
-              <w:right w:val="single" w:color="C9D3E3" w:sz="4"/>
+              <w:top w:val="single" w:color="C9C9D6" w:sz="4"/>
+              <w:left w:val="single" w:color="C9C9D6" w:sz="4"/>
+              <w:bottom w:val="single" w:color="C9C9D6" w:sz="4"/>
+              <w:right w:val="single" w:color="C9C9D6" w:sz="4"/>
             </w:tcBorders>
             <w:tcMar>
               <w:top w:type="dxa" w:w="60"/>
@@ -1120,10 +1161,10 @@
           <w:tcPr>
             <w:tcW w:type="dxa" w:w="6747"/>
             <w:tcBorders>
-              <w:top w:val="single" w:color="C9D3E3" w:sz="4"/>
-              <w:left w:val="single" w:color="C9D3E3" w:sz="4"/>
-              <w:bottom w:val="single" w:color="C9D3E3" w:sz="4"/>
-              <w:right w:val="single" w:color="C9D3E3" w:sz="4"/>
+              <w:top w:val="single" w:color="C9C9D6" w:sz="4"/>
+              <w:left w:val="single" w:color="C9C9D6" w:sz="4"/>
+              <w:bottom w:val="single" w:color="C9C9D6" w:sz="4"/>
+              <w:right w:val="single" w:color="C9C9D6" w:sz="4"/>
             </w:tcBorders>
             <w:tcMar>
               <w:top w:type="dxa" w:w="60"/>
@@ -1161,10 +1202,10 @@
           <w:tcPr>
             <w:tcW w:type="dxa" w:w="2891"/>
             <w:tcBorders>
-              <w:top w:val="single" w:color="C9D3E3" w:sz="4"/>
-              <w:left w:val="single" w:color="C9D3E3" w:sz="4"/>
-              <w:bottom w:val="single" w:color="C9D3E3" w:sz="4"/>
-              <w:right w:val="single" w:color="C9D3E3" w:sz="4"/>
+              <w:top w:val="single" w:color="C9C9D6" w:sz="4"/>
+              <w:left w:val="single" w:color="C9C9D6" w:sz="4"/>
+              <w:bottom w:val="single" w:color="C9C9D6" w:sz="4"/>
+              <w:right w:val="single" w:color="C9C9D6" w:sz="4"/>
             </w:tcBorders>
             <w:tcMar>
               <w:top w:type="dxa" w:w="60"/>
@@ -1196,10 +1237,10 @@
           <w:tcPr>
             <w:tcW w:type="dxa" w:w="6747"/>
             <w:tcBorders>
-              <w:top w:val="single" w:color="C9D3E3" w:sz="4"/>
-              <w:left w:val="single" w:color="C9D3E3" w:sz="4"/>
-              <w:bottom w:val="single" w:color="C9D3E3" w:sz="4"/>
-              <w:right w:val="single" w:color="C9D3E3" w:sz="4"/>
+              <w:top w:val="single" w:color="C9C9D6" w:sz="4"/>
+              <w:left w:val="single" w:color="C9C9D6" w:sz="4"/>
+              <w:bottom w:val="single" w:color="C9C9D6" w:sz="4"/>
+              <w:right w:val="single" w:color="C9C9D6" w:sz="4"/>
             </w:tcBorders>
             <w:tcMar>
               <w:top w:type="dxa" w:w="60"/>
@@ -1259,7 +1300,7 @@
                     </pic:cNvPicPr>
                   </pic:nvPicPr>
                   <pic:blipFill>
-                    <a:blip r:embed="rId10" cstate="none"/>
+                    <a:blip r:embed="rId13" cstate="none"/>
                     <a:srcRect/>
                     <a:stretch>
                       <a:fillRect/>
@@ -1323,7 +1364,7 @@
                     </pic:cNvPicPr>
                   </pic:nvPicPr>
                   <pic:blipFill>
-                    <a:blip r:embed="rId11" cstate="none"/>
+                    <a:blip r:embed="rId14" cstate="none"/>
                     <a:srcRect/>
                     <a:stretch>
                       <a:fillRect/>
@@ -1387,7 +1428,7 @@
                     </pic:cNvPicPr>
                   </pic:nvPicPr>
                   <pic:blipFill>
-                    <a:blip r:embed="rId12" cstate="none"/>
+                    <a:blip r:embed="rId15" cstate="none"/>
                     <a:srcRect/>
                     <a:stretch>
                       <a:fillRect/>
@@ -1451,7 +1492,7 @@
                     </pic:cNvPicPr>
                   </pic:nvPicPr>
                   <pic:blipFill>
-                    <a:blip r:embed="rId13" cstate="none"/>
+                    <a:blip r:embed="rId16" cstate="none"/>
                     <a:srcRect/>
                     <a:stretch>
                       <a:fillRect/>
@@ -1515,7 +1556,7 @@
                     </pic:cNvPicPr>
                   </pic:nvPicPr>
                   <pic:blipFill>
-                    <a:blip r:embed="rId14" cstate="none"/>
+                    <a:blip r:embed="rId17" cstate="none"/>
                     <a:srcRect/>
                     <a:stretch>
                       <a:fillRect/>
@@ -1557,14 +1598,17 @@
     <w:p>
       <w:pPr>
         <w:pStyle w:val="Heading1"/>
-        <w:spacing w:after="160" w:before="360"/>
+        <w:pBdr>
+          <w:bottom w:val="single" w:color="FF4000" w:sz="12" w:space="4"/>
+        </w:pBdr>
+        <w:spacing w:after="200" w:before="360"/>
       </w:pPr>
       <w:r>
         <w:rPr>
           <w:rFonts w:ascii="Arial" w:cs="Arial" w:eastAsia="Arial" w:hAnsi="Arial"/>
           <w:b/>
           <w:bCs/>
-          <w:color w:val="1F3B73"/>
+          <w:color w:val="010222"/>
           <w:sz w:val="30"/>
           <w:szCs w:val="30"/>
         </w:rPr>
@@ -1614,12 +1658,12 @@
           <w:tcPr>
             <w:tcW w:type="dxa" w:w="3276"/>
             <w:tcBorders>
-              <w:top w:val="single" w:color="C9D3E3" w:sz="4"/>
-              <w:left w:val="single" w:color="C9D3E3" w:sz="4"/>
-              <w:bottom w:val="single" w:color="C9D3E3" w:sz="4"/>
-              <w:right w:val="single" w:color="C9D3E3" w:sz="4"/>
-            </w:tcBorders>
-            <w:shd w:fill="1F3B73" w:color="auto" w:val="clear"/>
+              <w:top w:val="single" w:color="C9C9D6" w:sz="4"/>
+              <w:left w:val="single" w:color="C9C9D6" w:sz="4"/>
+              <w:bottom w:val="single" w:color="C9C9D6" w:sz="4"/>
+              <w:right w:val="single" w:color="C9C9D6" w:sz="4"/>
+            </w:tcBorders>
+            <w:shd w:fill="010222" w:color="auto" w:val="clear"/>
             <w:tcMar>
               <w:top w:type="dxa" w:w="60"/>
               <w:left w:type="dxa" w:w="90"/>
@@ -1650,12 +1694,12 @@
           <w:tcPr>
             <w:tcW w:type="dxa" w:w="1349"/>
             <w:tcBorders>
-              <w:top w:val="single" w:color="C9D3E3" w:sz="4"/>
-              <w:left w:val="single" w:color="C9D3E3" w:sz="4"/>
-              <w:bottom w:val="single" w:color="C9D3E3" w:sz="4"/>
-              <w:right w:val="single" w:color="C9D3E3" w:sz="4"/>
-            </w:tcBorders>
-            <w:shd w:fill="1F3B73" w:color="auto" w:val="clear"/>
+              <w:top w:val="single" w:color="C9C9D6" w:sz="4"/>
+              <w:left w:val="single" w:color="C9C9D6" w:sz="4"/>
+              <w:bottom w:val="single" w:color="C9C9D6" w:sz="4"/>
+              <w:right w:val="single" w:color="C9C9D6" w:sz="4"/>
+            </w:tcBorders>
+            <w:shd w:fill="010222" w:color="auto" w:val="clear"/>
             <w:tcMar>
               <w:top w:type="dxa" w:w="60"/>
               <w:left w:type="dxa" w:w="90"/>
@@ -1686,12 +1730,12 @@
           <w:tcPr>
             <w:tcW w:type="dxa" w:w="1349"/>
             <w:tcBorders>
-              <w:top w:val="single" w:color="C9D3E3" w:sz="4"/>
-              <w:left w:val="single" w:color="C9D3E3" w:sz="4"/>
-              <w:bottom w:val="single" w:color="C9D3E3" w:sz="4"/>
-              <w:right w:val="single" w:color="C9D3E3" w:sz="4"/>
-            </w:tcBorders>
-            <w:shd w:fill="1F3B73" w:color="auto" w:val="clear"/>
+              <w:top w:val="single" w:color="C9C9D6" w:sz="4"/>
+              <w:left w:val="single" w:color="C9C9D6" w:sz="4"/>
+              <w:bottom w:val="single" w:color="C9C9D6" w:sz="4"/>
+              <w:right w:val="single" w:color="C9C9D6" w:sz="4"/>
+            </w:tcBorders>
+            <w:shd w:fill="010222" w:color="auto" w:val="clear"/>
             <w:tcMar>
               <w:top w:type="dxa" w:w="60"/>
               <w:left w:type="dxa" w:w="90"/>
@@ -1722,12 +1766,12 @@
           <w:tcPr>
             <w:tcW w:type="dxa" w:w="963"/>
             <w:tcBorders>
-              <w:top w:val="single" w:color="C9D3E3" w:sz="4"/>
-              <w:left w:val="single" w:color="C9D3E3" w:sz="4"/>
-              <w:bottom w:val="single" w:color="C9D3E3" w:sz="4"/>
-              <w:right w:val="single" w:color="C9D3E3" w:sz="4"/>
-            </w:tcBorders>
-            <w:shd w:fill="1F3B73" w:color="auto" w:val="clear"/>
+              <w:top w:val="single" w:color="C9C9D6" w:sz="4"/>
+              <w:left w:val="single" w:color="C9C9D6" w:sz="4"/>
+              <w:bottom w:val="single" w:color="C9C9D6" w:sz="4"/>
+              <w:right w:val="single" w:color="C9C9D6" w:sz="4"/>
+            </w:tcBorders>
+            <w:shd w:fill="010222" w:color="auto" w:val="clear"/>
             <w:tcMar>
               <w:top w:type="dxa" w:w="60"/>
               <w:left w:type="dxa" w:w="90"/>
@@ -1758,12 +1802,12 @@
           <w:tcPr>
             <w:tcW w:type="dxa" w:w="1542"/>
             <w:tcBorders>
-              <w:top w:val="single" w:color="C9D3E3" w:sz="4"/>
-              <w:left w:val="single" w:color="C9D3E3" w:sz="4"/>
-              <w:bottom w:val="single" w:color="C9D3E3" w:sz="4"/>
-              <w:right w:val="single" w:color="C9D3E3" w:sz="4"/>
-            </w:tcBorders>
-            <w:shd w:fill="1F3B73" w:color="auto" w:val="clear"/>
+              <w:top w:val="single" w:color="C9C9D6" w:sz="4"/>
+              <w:left w:val="single" w:color="C9C9D6" w:sz="4"/>
+              <w:bottom w:val="single" w:color="C9C9D6" w:sz="4"/>
+              <w:right w:val="single" w:color="C9C9D6" w:sz="4"/>
+            </w:tcBorders>
+            <w:shd w:fill="010222" w:color="auto" w:val="clear"/>
             <w:tcMar>
               <w:top w:type="dxa" w:w="60"/>
               <w:left w:type="dxa" w:w="90"/>
@@ -1794,12 +1838,12 @@
           <w:tcPr>
             <w:tcW w:type="dxa" w:w="1159"/>
             <w:tcBorders>
-              <w:top w:val="single" w:color="C9D3E3" w:sz="4"/>
-              <w:left w:val="single" w:color="C9D3E3" w:sz="4"/>
-              <w:bottom w:val="single" w:color="C9D3E3" w:sz="4"/>
-              <w:right w:val="single" w:color="C9D3E3" w:sz="4"/>
-            </w:tcBorders>
-            <w:shd w:fill="1F3B73" w:color="auto" w:val="clear"/>
+              <w:top w:val="single" w:color="C9C9D6" w:sz="4"/>
+              <w:left w:val="single" w:color="C9C9D6" w:sz="4"/>
+              <w:bottom w:val="single" w:color="C9C9D6" w:sz="4"/>
+              <w:right w:val="single" w:color="C9C9D6" w:sz="4"/>
+            </w:tcBorders>
+            <w:shd w:fill="010222" w:color="auto" w:val="clear"/>
             <w:tcMar>
               <w:top w:type="dxa" w:w="60"/>
               <w:left w:type="dxa" w:w="90"/>
@@ -1836,10 +1880,10 @@
           <w:tcPr>
             <w:tcW w:type="dxa" w:w="3276"/>
             <w:tcBorders>
-              <w:top w:val="single" w:color="C9D3E3" w:sz="4"/>
-              <w:left w:val="single" w:color="C9D3E3" w:sz="4"/>
-              <w:bottom w:val="single" w:color="C9D3E3" w:sz="4"/>
-              <w:right w:val="single" w:color="C9D3E3" w:sz="4"/>
+              <w:top w:val="single" w:color="C9C9D6" w:sz="4"/>
+              <w:left w:val="single" w:color="C9C9D6" w:sz="4"/>
+              <w:bottom w:val="single" w:color="C9C9D6" w:sz="4"/>
+              <w:right w:val="single" w:color="C9C9D6" w:sz="4"/>
             </w:tcBorders>
             <w:tcMar>
               <w:top w:type="dxa" w:w="60"/>
@@ -1871,10 +1915,10 @@
           <w:tcPr>
             <w:tcW w:type="dxa" w:w="1349"/>
             <w:tcBorders>
-              <w:top w:val="single" w:color="C9D3E3" w:sz="4"/>
-              <w:left w:val="single" w:color="C9D3E3" w:sz="4"/>
-              <w:bottom w:val="single" w:color="C9D3E3" w:sz="4"/>
-              <w:right w:val="single" w:color="C9D3E3" w:sz="4"/>
+              <w:top w:val="single" w:color="C9C9D6" w:sz="4"/>
+              <w:left w:val="single" w:color="C9C9D6" w:sz="4"/>
+              <w:bottom w:val="single" w:color="C9C9D6" w:sz="4"/>
+              <w:right w:val="single" w:color="C9C9D6" w:sz="4"/>
             </w:tcBorders>
             <w:tcMar>
               <w:top w:type="dxa" w:w="60"/>
@@ -1906,10 +1950,10 @@
           <w:tcPr>
             <w:tcW w:type="dxa" w:w="1349"/>
             <w:tcBorders>
-              <w:top w:val="single" w:color="C9D3E3" w:sz="4"/>
-              <w:left w:val="single" w:color="C9D3E3" w:sz="4"/>
-              <w:bottom w:val="single" w:color="C9D3E3" w:sz="4"/>
-              <w:right w:val="single" w:color="C9D3E3" w:sz="4"/>
+              <w:top w:val="single" w:color="C9C9D6" w:sz="4"/>
+              <w:left w:val="single" w:color="C9C9D6" w:sz="4"/>
+              <w:bottom w:val="single" w:color="C9C9D6" w:sz="4"/>
+              <w:right w:val="single" w:color="C9C9D6" w:sz="4"/>
             </w:tcBorders>
             <w:tcMar>
               <w:top w:type="dxa" w:w="60"/>
@@ -1941,10 +1985,10 @@
           <w:tcPr>
             <w:tcW w:type="dxa" w:w="963"/>
             <w:tcBorders>
-              <w:top w:val="single" w:color="C9D3E3" w:sz="4"/>
-              <w:left w:val="single" w:color="C9D3E3" w:sz="4"/>
-              <w:bottom w:val="single" w:color="C9D3E3" w:sz="4"/>
-              <w:right w:val="single" w:color="C9D3E3" w:sz="4"/>
+              <w:top w:val="single" w:color="C9C9D6" w:sz="4"/>
+              <w:left w:val="single" w:color="C9C9D6" w:sz="4"/>
+              <w:bottom w:val="single" w:color="C9C9D6" w:sz="4"/>
+              <w:right w:val="single" w:color="C9C9D6" w:sz="4"/>
             </w:tcBorders>
             <w:tcMar>
               <w:top w:type="dxa" w:w="60"/>
@@ -1976,10 +2020,10 @@
           <w:tcPr>
             <w:tcW w:type="dxa" w:w="1542"/>
             <w:tcBorders>
-              <w:top w:val="single" w:color="C9D3E3" w:sz="4"/>
-              <w:left w:val="single" w:color="C9D3E3" w:sz="4"/>
-              <w:bottom w:val="single" w:color="C9D3E3" w:sz="4"/>
-              <w:right w:val="single" w:color="C9D3E3" w:sz="4"/>
+              <w:top w:val="single" w:color="C9C9D6" w:sz="4"/>
+              <w:left w:val="single" w:color="C9C9D6" w:sz="4"/>
+              <w:bottom w:val="single" w:color="C9C9D6" w:sz="4"/>
+              <w:right w:val="single" w:color="C9C9D6" w:sz="4"/>
             </w:tcBorders>
             <w:tcMar>
               <w:top w:type="dxa" w:w="60"/>
@@ -2011,10 +2055,10 @@
           <w:tcPr>
             <w:tcW w:type="dxa" w:w="1159"/>
             <w:tcBorders>
-              <w:top w:val="single" w:color="C9D3E3" w:sz="4"/>
-              <w:left w:val="single" w:color="C9D3E3" w:sz="4"/>
-              <w:bottom w:val="single" w:color="C9D3E3" w:sz="4"/>
-              <w:right w:val="single" w:color="C9D3E3" w:sz="4"/>
+              <w:top w:val="single" w:color="C9C9D6" w:sz="4"/>
+              <w:left w:val="single" w:color="C9C9D6" w:sz="4"/>
+              <w:bottom w:val="single" w:color="C9C9D6" w:sz="4"/>
+              <w:right w:val="single" w:color="C9C9D6" w:sz="4"/>
             </w:tcBorders>
             <w:tcMar>
               <w:top w:type="dxa" w:w="60"/>
@@ -2052,10 +2096,10 @@
           <w:tcPr>
             <w:tcW w:type="dxa" w:w="3276"/>
             <w:tcBorders>
-              <w:top w:val="single" w:color="C9D3E3" w:sz="4"/>
-              <w:left w:val="single" w:color="C9D3E3" w:sz="4"/>
-              <w:bottom w:val="single" w:color="C9D3E3" w:sz="4"/>
-              <w:right w:val="single" w:color="C9D3E3" w:sz="4"/>
+              <w:top w:val="single" w:color="C9C9D6" w:sz="4"/>
+              <w:left w:val="single" w:color="C9C9D6" w:sz="4"/>
+              <w:bottom w:val="single" w:color="C9C9D6" w:sz="4"/>
+              <w:right w:val="single" w:color="C9C9D6" w:sz="4"/>
             </w:tcBorders>
             <w:tcMar>
               <w:top w:type="dxa" w:w="60"/>
@@ -2087,10 +2131,10 @@
           <w:tcPr>
             <w:tcW w:type="dxa" w:w="1349"/>
             <w:tcBorders>
-              <w:top w:val="single" w:color="C9D3E3" w:sz="4"/>
-              <w:left w:val="single" w:color="C9D3E3" w:sz="4"/>
-              <w:bottom w:val="single" w:color="C9D3E3" w:sz="4"/>
-              <w:right w:val="single" w:color="C9D3E3" w:sz="4"/>
+              <w:top w:val="single" w:color="C9C9D6" w:sz="4"/>
+              <w:left w:val="single" w:color="C9C9D6" w:sz="4"/>
+              <w:bottom w:val="single" w:color="C9C9D6" w:sz="4"/>
+              <w:right w:val="single" w:color="C9C9D6" w:sz="4"/>
             </w:tcBorders>
             <w:tcMar>
               <w:top w:type="dxa" w:w="60"/>
@@ -2122,10 +2166,10 @@
           <w:tcPr>
             <w:tcW w:type="dxa" w:w="1349"/>
             <w:tcBorders>
-              <w:top w:val="single" w:color="C9D3E3" w:sz="4"/>
-              <w:left w:val="single" w:color="C9D3E3" w:sz="4"/>
-              <w:bottom w:val="single" w:color="C9D3E3" w:sz="4"/>
-              <w:right w:val="single" w:color="C9D3E3" w:sz="4"/>
+              <w:top w:val="single" w:color="C9C9D6" w:sz="4"/>
+              <w:left w:val="single" w:color="C9C9D6" w:sz="4"/>
+              <w:bottom w:val="single" w:color="C9C9D6" w:sz="4"/>
+              <w:right w:val="single" w:color="C9C9D6" w:sz="4"/>
             </w:tcBorders>
             <w:tcMar>
               <w:top w:type="dxa" w:w="60"/>
@@ -2157,10 +2201,10 @@
           <w:tcPr>
             <w:tcW w:type="dxa" w:w="963"/>
             <w:tcBorders>
-              <w:top w:val="single" w:color="C9D3E3" w:sz="4"/>
-              <w:left w:val="single" w:color="C9D3E3" w:sz="4"/>
-              <w:bottom w:val="single" w:color="C9D3E3" w:sz="4"/>
-              <w:right w:val="single" w:color="C9D3E3" w:sz="4"/>
+              <w:top w:val="single" w:color="C9C9D6" w:sz="4"/>
+              <w:left w:val="single" w:color="C9C9D6" w:sz="4"/>
+              <w:bottom w:val="single" w:color="C9C9D6" w:sz="4"/>
+              <w:right w:val="single" w:color="C9C9D6" w:sz="4"/>
             </w:tcBorders>
             <w:tcMar>
               <w:top w:type="dxa" w:w="60"/>
@@ -2192,10 +2236,10 @@
           <w:tcPr>
             <w:tcW w:type="dxa" w:w="1542"/>
             <w:tcBorders>
-              <w:top w:val="single" w:color="C9D3E3" w:sz="4"/>
-              <w:left w:val="single" w:color="C9D3E3" w:sz="4"/>
-              <w:bottom w:val="single" w:color="C9D3E3" w:sz="4"/>
-              <w:right w:val="single" w:color="C9D3E3" w:sz="4"/>
+              <w:top w:val="single" w:color="C9C9D6" w:sz="4"/>
+              <w:left w:val="single" w:color="C9C9D6" w:sz="4"/>
+              <w:bottom w:val="single" w:color="C9C9D6" w:sz="4"/>
+              <w:right w:val="single" w:color="C9C9D6" w:sz="4"/>
             </w:tcBorders>
             <w:tcMar>
               <w:top w:type="dxa" w:w="60"/>
@@ -2227,10 +2271,10 @@
           <w:tcPr>
             <w:tcW w:type="dxa" w:w="1159"/>
             <w:tcBorders>
-              <w:top w:val="single" w:color="C9D3E3" w:sz="4"/>
-              <w:left w:val="single" w:color="C9D3E3" w:sz="4"/>
-              <w:bottom w:val="single" w:color="C9D3E3" w:sz="4"/>
-              <w:right w:val="single" w:color="C9D3E3" w:sz="4"/>
+              <w:top w:val="single" w:color="C9C9D6" w:sz="4"/>
+              <w:left w:val="single" w:color="C9C9D6" w:sz="4"/>
+              <w:bottom w:val="single" w:color="C9C9D6" w:sz="4"/>
+              <w:right w:val="single" w:color="C9C9D6" w:sz="4"/>
             </w:tcBorders>
             <w:tcMar>
               <w:top w:type="dxa" w:w="60"/>
@@ -2268,10 +2312,10 @@
           <w:tcPr>
             <w:tcW w:type="dxa" w:w="3276"/>
             <w:tcBorders>
-              <w:top w:val="single" w:color="C9D3E3" w:sz="4"/>
-              <w:left w:val="single" w:color="C9D3E3" w:sz="4"/>
-              <w:bottom w:val="single" w:color="C9D3E3" w:sz="4"/>
-              <w:right w:val="single" w:color="C9D3E3" w:sz="4"/>
+              <w:top w:val="single" w:color="C9C9D6" w:sz="4"/>
+              <w:left w:val="single" w:color="C9C9D6" w:sz="4"/>
+              <w:bottom w:val="single" w:color="C9C9D6" w:sz="4"/>
+              <w:right w:val="single" w:color="C9C9D6" w:sz="4"/>
             </w:tcBorders>
             <w:tcMar>
               <w:top w:type="dxa" w:w="60"/>
@@ -2303,10 +2347,10 @@
           <w:tcPr>
             <w:tcW w:type="dxa" w:w="1349"/>
             <w:tcBorders>
-              <w:top w:val="single" w:color="C9D3E3" w:sz="4"/>
-              <w:left w:val="single" w:color="C9D3E3" w:sz="4"/>
-              <w:bottom w:val="single" w:color="C9D3E3" w:sz="4"/>
-              <w:right w:val="single" w:color="C9D3E3" w:sz="4"/>
+              <w:top w:val="single" w:color="C9C9D6" w:sz="4"/>
+              <w:left w:val="single" w:color="C9C9D6" w:sz="4"/>
+              <w:bottom w:val="single" w:color="C9C9D6" w:sz="4"/>
+              <w:right w:val="single" w:color="C9C9D6" w:sz="4"/>
             </w:tcBorders>
             <w:tcMar>
               <w:top w:type="dxa" w:w="60"/>
@@ -2338,10 +2382,10 @@
           <w:tcPr>
             <w:tcW w:type="dxa" w:w="1349"/>
             <w:tcBorders>
-              <w:top w:val="single" w:color="C9D3E3" w:sz="4"/>
-              <w:left w:val="single" w:color="C9D3E3" w:sz="4"/>
-              <w:bottom w:val="single" w:color="C9D3E3" w:sz="4"/>
-              <w:right w:val="single" w:color="C9D3E3" w:sz="4"/>
+              <w:top w:val="single" w:color="C9C9D6" w:sz="4"/>
+              <w:left w:val="single" w:color="C9C9D6" w:sz="4"/>
+              <w:bottom w:val="single" w:color="C9C9D6" w:sz="4"/>
+              <w:right w:val="single" w:color="C9C9D6" w:sz="4"/>
             </w:tcBorders>
             <w:tcMar>
               <w:top w:type="dxa" w:w="60"/>
@@ -2373,10 +2417,10 @@
           <w:tcPr>
             <w:tcW w:type="dxa" w:w="963"/>
             <w:tcBorders>
-              <w:top w:val="single" w:color="C9D3E3" w:sz="4"/>
-              <w:left w:val="single" w:color="C9D3E3" w:sz="4"/>
-              <w:bottom w:val="single" w:color="C9D3E3" w:sz="4"/>
-              <w:right w:val="single" w:color="C9D3E3" w:sz="4"/>
+              <w:top w:val="single" w:color="C9C9D6" w:sz="4"/>
+              <w:left w:val="single" w:color="C9C9D6" w:sz="4"/>
+              <w:bottom w:val="single" w:color="C9C9D6" w:sz="4"/>
+              <w:right w:val="single" w:color="C9C9D6" w:sz="4"/>
             </w:tcBorders>
             <w:tcMar>
               <w:top w:type="dxa" w:w="60"/>
@@ -2408,10 +2452,10 @@
           <w:tcPr>
             <w:tcW w:type="dxa" w:w="1542"/>
             <w:tcBorders>
-              <w:top w:val="single" w:color="C9D3E3" w:sz="4"/>
-              <w:left w:val="single" w:color="C9D3E3" w:sz="4"/>
-              <w:bottom w:val="single" w:color="C9D3E3" w:sz="4"/>
-              <w:right w:val="single" w:color="C9D3E3" w:sz="4"/>
+              <w:top w:val="single" w:color="C9C9D6" w:sz="4"/>
+              <w:left w:val="single" w:color="C9C9D6" w:sz="4"/>
+              <w:bottom w:val="single" w:color="C9C9D6" w:sz="4"/>
+              <w:right w:val="single" w:color="C9C9D6" w:sz="4"/>
             </w:tcBorders>
             <w:tcMar>
               <w:top w:type="dxa" w:w="60"/>
@@ -2443,10 +2487,10 @@
           <w:tcPr>
             <w:tcW w:type="dxa" w:w="1159"/>
             <w:tcBorders>
-              <w:top w:val="single" w:color="C9D3E3" w:sz="4"/>
-              <w:left w:val="single" w:color="C9D3E3" w:sz="4"/>
-              <w:bottom w:val="single" w:color="C9D3E3" w:sz="4"/>
-              <w:right w:val="single" w:color="C9D3E3" w:sz="4"/>
+              <w:top w:val="single" w:color="C9C9D6" w:sz="4"/>
+              <w:left w:val="single" w:color="C9C9D6" w:sz="4"/>
+              <w:bottom w:val="single" w:color="C9C9D6" w:sz="4"/>
+              <w:right w:val="single" w:color="C9C9D6" w:sz="4"/>
             </w:tcBorders>
             <w:tcMar>
               <w:top w:type="dxa" w:w="60"/>
@@ -2484,10 +2528,10 @@
           <w:tcPr>
             <w:tcW w:type="dxa" w:w="3276"/>
             <w:tcBorders>
-              <w:top w:val="single" w:color="C9D3E3" w:sz="4"/>
-              <w:left w:val="single" w:color="C9D3E3" w:sz="4"/>
-              <w:bottom w:val="single" w:color="C9D3E3" w:sz="4"/>
-              <w:right w:val="single" w:color="C9D3E3" w:sz="4"/>
+              <w:top w:val="single" w:color="C9C9D6" w:sz="4"/>
+              <w:left w:val="single" w:color="C9C9D6" w:sz="4"/>
+              <w:bottom w:val="single" w:color="C9C9D6" w:sz="4"/>
+              <w:right w:val="single" w:color="C9C9D6" w:sz="4"/>
             </w:tcBorders>
             <w:tcMar>
               <w:top w:type="dxa" w:w="60"/>
@@ -2519,10 +2563,10 @@
           <w:tcPr>
             <w:tcW w:type="dxa" w:w="1349"/>
             <w:tcBorders>
-              <w:top w:val="single" w:color="C9D3E3" w:sz="4"/>
-              <w:left w:val="single" w:color="C9D3E3" w:sz="4"/>
-              <w:bottom w:val="single" w:color="C9D3E3" w:sz="4"/>
-              <w:right w:val="single" w:color="C9D3E3" w:sz="4"/>
+              <w:top w:val="single" w:color="C9C9D6" w:sz="4"/>
+              <w:left w:val="single" w:color="C9C9D6" w:sz="4"/>
+              <w:bottom w:val="single" w:color="C9C9D6" w:sz="4"/>
+              <w:right w:val="single" w:color="C9C9D6" w:sz="4"/>
             </w:tcBorders>
             <w:tcMar>
               <w:top w:type="dxa" w:w="60"/>
@@ -2554,10 +2598,10 @@
           <w:tcPr>
             <w:tcW w:type="dxa" w:w="1349"/>
             <w:tcBorders>
-              <w:top w:val="single" w:color="C9D3E3" w:sz="4"/>
-              <w:left w:val="single" w:color="C9D3E3" w:sz="4"/>
-              <w:bottom w:val="single" w:color="C9D3E3" w:sz="4"/>
-              <w:right w:val="single" w:color="C9D3E3" w:sz="4"/>
+              <w:top w:val="single" w:color="C9C9D6" w:sz="4"/>
+              <w:left w:val="single" w:color="C9C9D6" w:sz="4"/>
+              <w:bottom w:val="single" w:color="C9C9D6" w:sz="4"/>
+              <w:right w:val="single" w:color="C9C9D6" w:sz="4"/>
             </w:tcBorders>
             <w:tcMar>
               <w:top w:type="dxa" w:w="60"/>
@@ -2589,10 +2633,10 @@
           <w:tcPr>
             <w:tcW w:type="dxa" w:w="963"/>
             <w:tcBorders>
-              <w:top w:val="single" w:color="C9D3E3" w:sz="4"/>
-              <w:left w:val="single" w:color="C9D3E3" w:sz="4"/>
-              <w:bottom w:val="single" w:color="C9D3E3" w:sz="4"/>
-              <w:right w:val="single" w:color="C9D3E3" w:sz="4"/>
+              <w:top w:val="single" w:color="C9C9D6" w:sz="4"/>
+              <w:left w:val="single" w:color="C9C9D6" w:sz="4"/>
+              <w:bottom w:val="single" w:color="C9C9D6" w:sz="4"/>
+              <w:right w:val="single" w:color="C9C9D6" w:sz="4"/>
             </w:tcBorders>
             <w:tcMar>
               <w:top w:type="dxa" w:w="60"/>
@@ -2624,10 +2668,10 @@
           <w:tcPr>
             <w:tcW w:type="dxa" w:w="1542"/>
             <w:tcBorders>
-              <w:top w:val="single" w:color="C9D3E3" w:sz="4"/>
-              <w:left w:val="single" w:color="C9D3E3" w:sz="4"/>
-              <w:bottom w:val="single" w:color="C9D3E3" w:sz="4"/>
-              <w:right w:val="single" w:color="C9D3E3" w:sz="4"/>
+              <w:top w:val="single" w:color="C9C9D6" w:sz="4"/>
+              <w:left w:val="single" w:color="C9C9D6" w:sz="4"/>
+              <w:bottom w:val="single" w:color="C9C9D6" w:sz="4"/>
+              <w:right w:val="single" w:color="C9C9D6" w:sz="4"/>
             </w:tcBorders>
             <w:tcMar>
               <w:top w:type="dxa" w:w="60"/>
@@ -2659,10 +2703,10 @@
           <w:tcPr>
             <w:tcW w:type="dxa" w:w="1159"/>
             <w:tcBorders>
-              <w:top w:val="single" w:color="C9D3E3" w:sz="4"/>
-              <w:left w:val="single" w:color="C9D3E3" w:sz="4"/>
-              <w:bottom w:val="single" w:color="C9D3E3" w:sz="4"/>
-              <w:right w:val="single" w:color="C9D3E3" w:sz="4"/>
+              <w:top w:val="single" w:color="C9C9D6" w:sz="4"/>
+              <w:left w:val="single" w:color="C9C9D6" w:sz="4"/>
+              <w:bottom w:val="single" w:color="C9C9D6" w:sz="4"/>
+              <w:right w:val="single" w:color="C9C9D6" w:sz="4"/>
             </w:tcBorders>
             <w:tcMar>
               <w:top w:type="dxa" w:w="60"/>
@@ -2700,10 +2744,10 @@
           <w:tcPr>
             <w:tcW w:type="dxa" w:w="3276"/>
             <w:tcBorders>
-              <w:top w:val="single" w:color="C9D3E3" w:sz="4"/>
-              <w:left w:val="single" w:color="C9D3E3" w:sz="4"/>
-              <w:bottom w:val="single" w:color="C9D3E3" w:sz="4"/>
-              <w:right w:val="single" w:color="C9D3E3" w:sz="4"/>
+              <w:top w:val="single" w:color="C9C9D6" w:sz="4"/>
+              <w:left w:val="single" w:color="C9C9D6" w:sz="4"/>
+              <w:bottom w:val="single" w:color="C9C9D6" w:sz="4"/>
+              <w:right w:val="single" w:color="C9C9D6" w:sz="4"/>
             </w:tcBorders>
             <w:tcMar>
               <w:top w:type="dxa" w:w="60"/>
@@ -2735,10 +2779,10 @@
           <w:tcPr>
             <w:tcW w:type="dxa" w:w="1349"/>
             <w:tcBorders>
-              <w:top w:val="single" w:color="C9D3E3" w:sz="4"/>
-              <w:left w:val="single" w:color="C9D3E3" w:sz="4"/>
-              <w:bottom w:val="single" w:color="C9D3E3" w:sz="4"/>
-              <w:right w:val="single" w:color="C9D3E3" w:sz="4"/>
+              <w:top w:val="single" w:color="C9C9D6" w:sz="4"/>
+              <w:left w:val="single" w:color="C9C9D6" w:sz="4"/>
+              <w:bottom w:val="single" w:color="C9C9D6" w:sz="4"/>
+              <w:right w:val="single" w:color="C9C9D6" w:sz="4"/>
             </w:tcBorders>
             <w:tcMar>
               <w:top w:type="dxa" w:w="60"/>
@@ -2770,10 +2814,10 @@
           <w:tcPr>
             <w:tcW w:type="dxa" w:w="1349"/>
             <w:tcBorders>
-              <w:top w:val="single" w:color="C9D3E3" w:sz="4"/>
-              <w:left w:val="single" w:color="C9D3E3" w:sz="4"/>
-              <w:bottom w:val="single" w:color="C9D3E3" w:sz="4"/>
-              <w:right w:val="single" w:color="C9D3E3" w:sz="4"/>
+              <w:top w:val="single" w:color="C9C9D6" w:sz="4"/>
+              <w:left w:val="single" w:color="C9C9D6" w:sz="4"/>
+              <w:bottom w:val="single" w:color="C9C9D6" w:sz="4"/>
+              <w:right w:val="single" w:color="C9C9D6" w:sz="4"/>
             </w:tcBorders>
             <w:tcMar>
               <w:top w:type="dxa" w:w="60"/>
@@ -2805,10 +2849,10 @@
           <w:tcPr>
             <w:tcW w:type="dxa" w:w="963"/>
             <w:tcBorders>
-              <w:top w:val="single" w:color="C9D3E3" w:sz="4"/>
-              <w:left w:val="single" w:color="C9D3E3" w:sz="4"/>
-              <w:bottom w:val="single" w:color="C9D3E3" w:sz="4"/>
-              <w:right w:val="single" w:color="C9D3E3" w:sz="4"/>
+              <w:top w:val="single" w:color="C9C9D6" w:sz="4"/>
+              <w:left w:val="single" w:color="C9C9D6" w:sz="4"/>
+              <w:bottom w:val="single" w:color="C9C9D6" w:sz="4"/>
+              <w:right w:val="single" w:color="C9C9D6" w:sz="4"/>
             </w:tcBorders>
             <w:tcMar>
               <w:top w:type="dxa" w:w="60"/>
@@ -2840,10 +2884,10 @@
           <w:tcPr>
             <w:tcW w:type="dxa" w:w="1542"/>
             <w:tcBorders>
-              <w:top w:val="single" w:color="C9D3E3" w:sz="4"/>
-              <w:left w:val="single" w:color="C9D3E3" w:sz="4"/>
-              <w:bottom w:val="single" w:color="C9D3E3" w:sz="4"/>
-              <w:right w:val="single" w:color="C9D3E3" w:sz="4"/>
+              <w:top w:val="single" w:color="C9C9D6" w:sz="4"/>
+              <w:left w:val="single" w:color="C9C9D6" w:sz="4"/>
+              <w:bottom w:val="single" w:color="C9C9D6" w:sz="4"/>
+              <w:right w:val="single" w:color="C9C9D6" w:sz="4"/>
             </w:tcBorders>
             <w:tcMar>
               <w:top w:type="dxa" w:w="60"/>
@@ -2875,10 +2919,10 @@
           <w:tcPr>
             <w:tcW w:type="dxa" w:w="1159"/>
             <w:tcBorders>
-              <w:top w:val="single" w:color="C9D3E3" w:sz="4"/>
-              <w:left w:val="single" w:color="C9D3E3" w:sz="4"/>
-              <w:bottom w:val="single" w:color="C9D3E3" w:sz="4"/>
-              <w:right w:val="single" w:color="C9D3E3" w:sz="4"/>
+              <w:top w:val="single" w:color="C9C9D6" w:sz="4"/>
+              <w:left w:val="single" w:color="C9C9D6" w:sz="4"/>
+              <w:bottom w:val="single" w:color="C9C9D6" w:sz="4"/>
+              <w:right w:val="single" w:color="C9C9D6" w:sz="4"/>
             </w:tcBorders>
             <w:tcMar>
               <w:top w:type="dxa" w:w="60"/>
@@ -2916,10 +2960,10 @@
           <w:tcPr>
             <w:tcW w:type="dxa" w:w="3276"/>
             <w:tcBorders>
-              <w:top w:val="single" w:color="C9D3E3" w:sz="4"/>
-              <w:left w:val="single" w:color="C9D3E3" w:sz="4"/>
-              <w:bottom w:val="single" w:color="C9D3E3" w:sz="4"/>
-              <w:right w:val="single" w:color="C9D3E3" w:sz="4"/>
+              <w:top w:val="single" w:color="C9C9D6" w:sz="4"/>
+              <w:left w:val="single" w:color="C9C9D6" w:sz="4"/>
+              <w:bottom w:val="single" w:color="C9C9D6" w:sz="4"/>
+              <w:right w:val="single" w:color="C9C9D6" w:sz="4"/>
             </w:tcBorders>
             <w:tcMar>
               <w:top w:type="dxa" w:w="60"/>
@@ -2951,10 +2995,10 @@
           <w:tcPr>
             <w:tcW w:type="dxa" w:w="1349"/>
             <w:tcBorders>
-              <w:top w:val="single" w:color="C9D3E3" w:sz="4"/>
-              <w:left w:val="single" w:color="C9D3E3" w:sz="4"/>
-              <w:bottom w:val="single" w:color="C9D3E3" w:sz="4"/>
-              <w:right w:val="single" w:color="C9D3E3" w:sz="4"/>
+              <w:top w:val="single" w:color="C9C9D6" w:sz="4"/>
+              <w:left w:val="single" w:color="C9C9D6" w:sz="4"/>
+              <w:bottom w:val="single" w:color="C9C9D6" w:sz="4"/>
+              <w:right w:val="single" w:color="C9C9D6" w:sz="4"/>
             </w:tcBorders>
             <w:tcMar>
               <w:top w:type="dxa" w:w="60"/>
@@ -2986,10 +3030,10 @@
           <w:tcPr>
             <w:tcW w:type="dxa" w:w="1349"/>
             <w:tcBorders>
-              <w:top w:val="single" w:color="C9D3E3" w:sz="4"/>
-              <w:left w:val="single" w:color="C9D3E3" w:sz="4"/>
-              <w:bottom w:val="single" w:color="C9D3E3" w:sz="4"/>
-              <w:right w:val="single" w:color="C9D3E3" w:sz="4"/>
+              <w:top w:val="single" w:color="C9C9D6" w:sz="4"/>
+              <w:left w:val="single" w:color="C9C9D6" w:sz="4"/>
+              <w:bottom w:val="single" w:color="C9C9D6" w:sz="4"/>
+              <w:right w:val="single" w:color="C9C9D6" w:sz="4"/>
             </w:tcBorders>
             <w:tcMar>
               <w:top w:type="dxa" w:w="60"/>
@@ -3021,10 +3065,10 @@
           <w:tcPr>
             <w:tcW w:type="dxa" w:w="963"/>
             <w:tcBorders>
-              <w:top w:val="single" w:color="C9D3E3" w:sz="4"/>
-              <w:left w:val="single" w:color="C9D3E3" w:sz="4"/>
-              <w:bottom w:val="single" w:color="C9D3E3" w:sz="4"/>
-              <w:right w:val="single" w:color="C9D3E3" w:sz="4"/>
+              <w:top w:val="single" w:color="C9C9D6" w:sz="4"/>
+              <w:left w:val="single" w:color="C9C9D6" w:sz="4"/>
+              <w:bottom w:val="single" w:color="C9C9D6" w:sz="4"/>
+              <w:right w:val="single" w:color="C9C9D6" w:sz="4"/>
             </w:tcBorders>
             <w:tcMar>
               <w:top w:type="dxa" w:w="60"/>
@@ -3056,10 +3100,10 @@
           <w:tcPr>
             <w:tcW w:type="dxa" w:w="1542"/>
             <w:tcBorders>
-              <w:top w:val="single" w:color="C9D3E3" w:sz="4"/>
-              <w:left w:val="single" w:color="C9D3E3" w:sz="4"/>
-              <w:bottom w:val="single" w:color="C9D3E3" w:sz="4"/>
-              <w:right w:val="single" w:color="C9D3E3" w:sz="4"/>
+              <w:top w:val="single" w:color="C9C9D6" w:sz="4"/>
+              <w:left w:val="single" w:color="C9C9D6" w:sz="4"/>
+              <w:bottom w:val="single" w:color="C9C9D6" w:sz="4"/>
+              <w:right w:val="single" w:color="C9C9D6" w:sz="4"/>
             </w:tcBorders>
             <w:tcMar>
               <w:top w:type="dxa" w:w="60"/>
@@ -3091,10 +3135,10 @@
           <w:tcPr>
             <w:tcW w:type="dxa" w:w="1159"/>
             <w:tcBorders>
-              <w:top w:val="single" w:color="C9D3E3" w:sz="4"/>
-              <w:left w:val="single" w:color="C9D3E3" w:sz="4"/>
-              <w:bottom w:val="single" w:color="C9D3E3" w:sz="4"/>
-              <w:right w:val="single" w:color="C9D3E3" w:sz="4"/>
+              <w:top w:val="single" w:color="C9C9D6" w:sz="4"/>
+              <w:left w:val="single" w:color="C9C9D6" w:sz="4"/>
+              <w:bottom w:val="single" w:color="C9C9D6" w:sz="4"/>
+              <w:right w:val="single" w:color="C9C9D6" w:sz="4"/>
             </w:tcBorders>
             <w:tcMar>
               <w:top w:type="dxa" w:w="60"/>
@@ -3132,10 +3176,10 @@
           <w:tcPr>
             <w:tcW w:type="dxa" w:w="3276"/>
             <w:tcBorders>
-              <w:top w:val="single" w:color="C9D3E3" w:sz="4"/>
-              <w:left w:val="single" w:color="C9D3E3" w:sz="4"/>
-              <w:bottom w:val="single" w:color="C9D3E3" w:sz="4"/>
-              <w:right w:val="single" w:color="C9D3E3" w:sz="4"/>
+              <w:top w:val="single" w:color="C9C9D6" w:sz="4"/>
+              <w:left w:val="single" w:color="C9C9D6" w:sz="4"/>
+              <w:bottom w:val="single" w:color="C9C9D6" w:sz="4"/>
+              <w:right w:val="single" w:color="C9C9D6" w:sz="4"/>
             </w:tcBorders>
             <w:tcMar>
               <w:top w:type="dxa" w:w="60"/>
@@ -3167,10 +3211,10 @@
           <w:tcPr>
             <w:tcW w:type="dxa" w:w="1349"/>
             <w:tcBorders>
-              <w:top w:val="single" w:color="C9D3E3" w:sz="4"/>
-              <w:left w:val="single" w:color="C9D3E3" w:sz="4"/>
-              <w:bottom w:val="single" w:color="C9D3E3" w:sz="4"/>
-              <w:right w:val="single" w:color="C9D3E3" w:sz="4"/>
+              <w:top w:val="single" w:color="C9C9D6" w:sz="4"/>
+              <w:left w:val="single" w:color="C9C9D6" w:sz="4"/>
+              <w:bottom w:val="single" w:color="C9C9D6" w:sz="4"/>
+              <w:right w:val="single" w:color="C9C9D6" w:sz="4"/>
             </w:tcBorders>
             <w:tcMar>
               <w:top w:type="dxa" w:w="60"/>
@@ -3202,10 +3246,10 @@
           <w:tcPr>
             <w:tcW w:type="dxa" w:w="1349"/>
             <w:tcBorders>
-              <w:top w:val="single" w:color="C9D3E3" w:sz="4"/>
-              <w:left w:val="single" w:color="C9D3E3" w:sz="4"/>
-              <w:bottom w:val="single" w:color="C9D3E3" w:sz="4"/>
-              <w:right w:val="single" w:color="C9D3E3" w:sz="4"/>
+              <w:top w:val="single" w:color="C9C9D6" w:sz="4"/>
+              <w:left w:val="single" w:color="C9C9D6" w:sz="4"/>
+              <w:bottom w:val="single" w:color="C9C9D6" w:sz="4"/>
+              <w:right w:val="single" w:color="C9C9D6" w:sz="4"/>
             </w:tcBorders>
             <w:tcMar>
               <w:top w:type="dxa" w:w="60"/>
@@ -3237,10 +3281,10 @@
           <w:tcPr>
             <w:tcW w:type="dxa" w:w="963"/>
             <w:tcBorders>
-              <w:top w:val="single" w:color="C9D3E3" w:sz="4"/>
-              <w:left w:val="single" w:color="C9D3E3" w:sz="4"/>
-              <w:bottom w:val="single" w:color="C9D3E3" w:sz="4"/>
-              <w:right w:val="single" w:color="C9D3E3" w:sz="4"/>
+              <w:top w:val="single" w:color="C9C9D6" w:sz="4"/>
+              <w:left w:val="single" w:color="C9C9D6" w:sz="4"/>
+              <w:bottom w:val="single" w:color="C9C9D6" w:sz="4"/>
+              <w:right w:val="single" w:color="C9C9D6" w:sz="4"/>
             </w:tcBorders>
             <w:tcMar>
               <w:top w:type="dxa" w:w="60"/>
@@ -3272,10 +3316,10 @@
           <w:tcPr>
             <w:tcW w:type="dxa" w:w="1542"/>
             <w:tcBorders>
-              <w:top w:val="single" w:color="C9D3E3" w:sz="4"/>
-              <w:left w:val="single" w:color="C9D3E3" w:sz="4"/>
-              <w:bottom w:val="single" w:color="C9D3E3" w:sz="4"/>
-              <w:right w:val="single" w:color="C9D3E3" w:sz="4"/>
+              <w:top w:val="single" w:color="C9C9D6" w:sz="4"/>
+              <w:left w:val="single" w:color="C9C9D6" w:sz="4"/>
+              <w:bottom w:val="single" w:color="C9C9D6" w:sz="4"/>
+              <w:right w:val="single" w:color="C9C9D6" w:sz="4"/>
             </w:tcBorders>
             <w:tcMar>
               <w:top w:type="dxa" w:w="60"/>
@@ -3307,10 +3351,10 @@
           <w:tcPr>
             <w:tcW w:type="dxa" w:w="1159"/>
             <w:tcBorders>
-              <w:top w:val="single" w:color="C9D3E3" w:sz="4"/>
-              <w:left w:val="single" w:color="C9D3E3" w:sz="4"/>
-              <w:bottom w:val="single" w:color="C9D3E3" w:sz="4"/>
-              <w:right w:val="single" w:color="C9D3E3" w:sz="4"/>
+              <w:top w:val="single" w:color="C9C9D6" w:sz="4"/>
+              <w:left w:val="single" w:color="C9C9D6" w:sz="4"/>
+              <w:bottom w:val="single" w:color="C9C9D6" w:sz="4"/>
+              <w:right w:val="single" w:color="C9C9D6" w:sz="4"/>
             </w:tcBorders>
             <w:tcMar>
               <w:top w:type="dxa" w:w="60"/>
@@ -3348,10 +3392,10 @@
           <w:tcPr>
             <w:tcW w:type="dxa" w:w="3276"/>
             <w:tcBorders>
-              <w:top w:val="single" w:color="C9D3E3" w:sz="4"/>
-              <w:left w:val="single" w:color="C9D3E3" w:sz="4"/>
-              <w:bottom w:val="single" w:color="C9D3E3" w:sz="4"/>
-              <w:right w:val="single" w:color="C9D3E3" w:sz="4"/>
+              <w:top w:val="single" w:color="C9C9D6" w:sz="4"/>
+              <w:left w:val="single" w:color="C9C9D6" w:sz="4"/>
+              <w:bottom w:val="single" w:color="C9C9D6" w:sz="4"/>
+              <w:right w:val="single" w:color="C9C9D6" w:sz="4"/>
             </w:tcBorders>
             <w:tcMar>
               <w:top w:type="dxa" w:w="60"/>
@@ -3383,10 +3427,10 @@
           <w:tcPr>
             <w:tcW w:type="dxa" w:w="1349"/>
             <w:tcBorders>
-              <w:top w:val="single" w:color="C9D3E3" w:sz="4"/>
-              <w:left w:val="single" w:color="C9D3E3" w:sz="4"/>
-              <w:bottom w:val="single" w:color="C9D3E3" w:sz="4"/>
-              <w:right w:val="single" w:color="C9D3E3" w:sz="4"/>
+              <w:top w:val="single" w:color="C9C9D6" w:sz="4"/>
+              <w:left w:val="single" w:color="C9C9D6" w:sz="4"/>
+              <w:bottom w:val="single" w:color="C9C9D6" w:sz="4"/>
+              <w:right w:val="single" w:color="C9C9D6" w:sz="4"/>
             </w:tcBorders>
             <w:tcMar>
               <w:top w:type="dxa" w:w="60"/>
@@ -3418,10 +3462,10 @@
           <w:tcPr>
             <w:tcW w:type="dxa" w:w="1349"/>
             <w:tcBorders>
-              <w:top w:val="single" w:color="C9D3E3" w:sz="4"/>
-              <w:left w:val="single" w:color="C9D3E3" w:sz="4"/>
-              <w:bottom w:val="single" w:color="C9D3E3" w:sz="4"/>
-              <w:right w:val="single" w:color="C9D3E3" w:sz="4"/>
+              <w:top w:val="single" w:color="C9C9D6" w:sz="4"/>
+              <w:left w:val="single" w:color="C9C9D6" w:sz="4"/>
+              <w:bottom w:val="single" w:color="C9C9D6" w:sz="4"/>
+              <w:right w:val="single" w:color="C9C9D6" w:sz="4"/>
             </w:tcBorders>
             <w:tcMar>
               <w:top w:type="dxa" w:w="60"/>
@@ -3453,10 +3497,10 @@
           <w:tcPr>
             <w:tcW w:type="dxa" w:w="963"/>
             <w:tcBorders>
-              <w:top w:val="single" w:color="C9D3E3" w:sz="4"/>
-              <w:left w:val="single" w:color="C9D3E3" w:sz="4"/>
-              <w:bottom w:val="single" w:color="C9D3E3" w:sz="4"/>
-              <w:right w:val="single" w:color="C9D3E3" w:sz="4"/>
+              <w:top w:val="single" w:color="C9C9D6" w:sz="4"/>
+              <w:left w:val="single" w:color="C9C9D6" w:sz="4"/>
+              <w:bottom w:val="single" w:color="C9C9D6" w:sz="4"/>
+              <w:right w:val="single" w:color="C9C9D6" w:sz="4"/>
             </w:tcBorders>
             <w:tcMar>
               <w:top w:type="dxa" w:w="60"/>
@@ -3488,10 +3532,10 @@
           <w:tcPr>
             <w:tcW w:type="dxa" w:w="1542"/>
             <w:tcBorders>
-              <w:top w:val="single" w:color="C9D3E3" w:sz="4"/>
-              <w:left w:val="single" w:color="C9D3E3" w:sz="4"/>
-              <w:bottom w:val="single" w:color="C9D3E3" w:sz="4"/>
-              <w:right w:val="single" w:color="C9D3E3" w:sz="4"/>
+              <w:top w:val="single" w:color="C9C9D6" w:sz="4"/>
+              <w:left w:val="single" w:color="C9C9D6" w:sz="4"/>
+              <w:bottom w:val="single" w:color="C9C9D6" w:sz="4"/>
+              <w:right w:val="single" w:color="C9C9D6" w:sz="4"/>
             </w:tcBorders>
             <w:tcMar>
               <w:top w:type="dxa" w:w="60"/>
@@ -3523,10 +3567,10 @@
           <w:tcPr>
             <w:tcW w:type="dxa" w:w="1159"/>
             <w:tcBorders>
-              <w:top w:val="single" w:color="C9D3E3" w:sz="4"/>
-              <w:left w:val="single" w:color="C9D3E3" w:sz="4"/>
-              <w:bottom w:val="single" w:color="C9D3E3" w:sz="4"/>
-              <w:right w:val="single" w:color="C9D3E3" w:sz="4"/>
+              <w:top w:val="single" w:color="C9C9D6" w:sz="4"/>
+              <w:left w:val="single" w:color="C9C9D6" w:sz="4"/>
+              <w:bottom w:val="single" w:color="C9C9D6" w:sz="4"/>
+              <w:right w:val="single" w:color="C9C9D6" w:sz="4"/>
             </w:tcBorders>
             <w:tcMar>
               <w:top w:type="dxa" w:w="60"/>
@@ -3564,12 +3608,12 @@
           <w:tcPr>
             <w:tcW w:type="dxa" w:w="3276"/>
             <w:tcBorders>
-              <w:top w:val="single" w:color="C9D3E3" w:sz="4"/>
-              <w:left w:val="single" w:color="C9D3E3" w:sz="4"/>
-              <w:bottom w:val="single" w:color="C9D3E3" w:sz="4"/>
-              <w:right w:val="single" w:color="C9D3E3" w:sz="4"/>
-            </w:tcBorders>
-            <w:shd w:fill="EEF3FA" w:color="auto" w:val="clear"/>
+              <w:top w:val="single" w:color="C9C9D6" w:sz="4"/>
+              <w:left w:val="single" w:color="C9C9D6" w:sz="4"/>
+              <w:bottom w:val="single" w:color="C9C9D6" w:sz="4"/>
+              <w:right w:val="single" w:color="C9C9D6" w:sz="4"/>
+            </w:tcBorders>
+            <w:shd w:fill="F3F3F7" w:color="auto" w:val="clear"/>
             <w:tcMar>
               <w:top w:type="dxa" w:w="60"/>
               <w:left w:type="dxa" w:w="90"/>
@@ -3600,12 +3644,12 @@
           <w:tcPr>
             <w:tcW w:type="dxa" w:w="1349"/>
             <w:tcBorders>
-              <w:top w:val="single" w:color="C9D3E3" w:sz="4"/>
-              <w:left w:val="single" w:color="C9D3E3" w:sz="4"/>
-              <w:bottom w:val="single" w:color="C9D3E3" w:sz="4"/>
-              <w:right w:val="single" w:color="C9D3E3" w:sz="4"/>
-            </w:tcBorders>
-            <w:shd w:fill="EEF3FA" w:color="auto" w:val="clear"/>
+              <w:top w:val="single" w:color="C9C9D6" w:sz="4"/>
+              <w:left w:val="single" w:color="C9C9D6" w:sz="4"/>
+              <w:bottom w:val="single" w:color="C9C9D6" w:sz="4"/>
+              <w:right w:val="single" w:color="C9C9D6" w:sz="4"/>
+            </w:tcBorders>
+            <w:shd w:fill="F3F3F7" w:color="auto" w:val="clear"/>
             <w:tcMar>
               <w:top w:type="dxa" w:w="60"/>
               <w:left w:type="dxa" w:w="90"/>
@@ -3636,12 +3680,12 @@
           <w:tcPr>
             <w:tcW w:type="dxa" w:w="1349"/>
             <w:tcBorders>
-              <w:top w:val="single" w:color="C9D3E3" w:sz="4"/>
-              <w:left w:val="single" w:color="C9D3E3" w:sz="4"/>
-              <w:bottom w:val="single" w:color="C9D3E3" w:sz="4"/>
-              <w:right w:val="single" w:color="C9D3E3" w:sz="4"/>
-            </w:tcBorders>
-            <w:shd w:fill="EEF3FA" w:color="auto" w:val="clear"/>
+              <w:top w:val="single" w:color="C9C9D6" w:sz="4"/>
+              <w:left w:val="single" w:color="C9C9D6" w:sz="4"/>
+              <w:bottom w:val="single" w:color="C9C9D6" w:sz="4"/>
+              <w:right w:val="single" w:color="C9C9D6" w:sz="4"/>
+            </w:tcBorders>
+            <w:shd w:fill="F3F3F7" w:color="auto" w:val="clear"/>
             <w:tcMar>
               <w:top w:type="dxa" w:w="60"/>
               <w:left w:type="dxa" w:w="90"/>
@@ -3672,12 +3716,12 @@
           <w:tcPr>
             <w:tcW w:type="dxa" w:w="963"/>
             <w:tcBorders>
-              <w:top w:val="single" w:color="C9D3E3" w:sz="4"/>
-              <w:left w:val="single" w:color="C9D3E3" w:sz="4"/>
-              <w:bottom w:val="single" w:color="C9D3E3" w:sz="4"/>
-              <w:right w:val="single" w:color="C9D3E3" w:sz="4"/>
-            </w:tcBorders>
-            <w:shd w:fill="EEF3FA" w:color="auto" w:val="clear"/>
+              <w:top w:val="single" w:color="C9C9D6" w:sz="4"/>
+              <w:left w:val="single" w:color="C9C9D6" w:sz="4"/>
+              <w:bottom w:val="single" w:color="C9C9D6" w:sz="4"/>
+              <w:right w:val="single" w:color="C9C9D6" w:sz="4"/>
+            </w:tcBorders>
+            <w:shd w:fill="F3F3F7" w:color="auto" w:val="clear"/>
             <w:tcMar>
               <w:top w:type="dxa" w:w="60"/>
               <w:left w:type="dxa" w:w="90"/>
@@ -3708,12 +3752,12 @@
           <w:tcPr>
             <w:tcW w:type="dxa" w:w="1542"/>
             <w:tcBorders>
-              <w:top w:val="single" w:color="C9D3E3" w:sz="4"/>
-              <w:left w:val="single" w:color="C9D3E3" w:sz="4"/>
-              <w:bottom w:val="single" w:color="C9D3E3" w:sz="4"/>
-              <w:right w:val="single" w:color="C9D3E3" w:sz="4"/>
-            </w:tcBorders>
-            <w:shd w:fill="EEF3FA" w:color="auto" w:val="clear"/>
+              <w:top w:val="single" w:color="C9C9D6" w:sz="4"/>
+              <w:left w:val="single" w:color="C9C9D6" w:sz="4"/>
+              <w:bottom w:val="single" w:color="C9C9D6" w:sz="4"/>
+              <w:right w:val="single" w:color="C9C9D6" w:sz="4"/>
+            </w:tcBorders>
+            <w:shd w:fill="F3F3F7" w:color="auto" w:val="clear"/>
             <w:tcMar>
               <w:top w:type="dxa" w:w="60"/>
               <w:left w:type="dxa" w:w="90"/>
@@ -3744,12 +3788,12 @@
           <w:tcPr>
             <w:tcW w:type="dxa" w:w="1159"/>
             <w:tcBorders>
-              <w:top w:val="single" w:color="C9D3E3" w:sz="4"/>
-              <w:left w:val="single" w:color="C9D3E3" w:sz="4"/>
-              <w:bottom w:val="single" w:color="C9D3E3" w:sz="4"/>
-              <w:right w:val="single" w:color="C9D3E3" w:sz="4"/>
-            </w:tcBorders>
-            <w:shd w:fill="EEF3FA" w:color="auto" w:val="clear"/>
+              <w:top w:val="single" w:color="C9C9D6" w:sz="4"/>
+              <w:left w:val="single" w:color="C9C9D6" w:sz="4"/>
+              <w:bottom w:val="single" w:color="C9C9D6" w:sz="4"/>
+              <w:right w:val="single" w:color="C9C9D6" w:sz="4"/>
+            </w:tcBorders>
+            <w:shd w:fill="F3F3F7" w:color="auto" w:val="clear"/>
             <w:tcMar>
               <w:top w:type="dxa" w:w="60"/>
               <w:left w:type="dxa" w:w="90"/>
@@ -3786,10 +3830,10 @@
           <w:tcPr>
             <w:tcW w:type="dxa" w:w="3276"/>
             <w:tcBorders>
-              <w:top w:val="single" w:color="C9D3E3" w:sz="4"/>
-              <w:left w:val="single" w:color="C9D3E3" w:sz="4"/>
-              <w:bottom w:val="single" w:color="C9D3E3" w:sz="4"/>
-              <w:right w:val="single" w:color="C9D3E3" w:sz="4"/>
+              <w:top w:val="single" w:color="C9C9D6" w:sz="4"/>
+              <w:left w:val="single" w:color="C9C9D6" w:sz="4"/>
+              <w:bottom w:val="single" w:color="C9C9D6" w:sz="4"/>
+              <w:right w:val="single" w:color="C9C9D6" w:sz="4"/>
             </w:tcBorders>
             <w:tcMar>
               <w:top w:type="dxa" w:w="60"/>
@@ -3821,10 +3865,10 @@
           <w:tcPr>
             <w:tcW w:type="dxa" w:w="1349"/>
             <w:tcBorders>
-              <w:top w:val="single" w:color="C9D3E3" w:sz="4"/>
-              <w:left w:val="single" w:color="C9D3E3" w:sz="4"/>
-              <w:bottom w:val="single" w:color="C9D3E3" w:sz="4"/>
-              <w:right w:val="single" w:color="C9D3E3" w:sz="4"/>
+              <w:top w:val="single" w:color="C9C9D6" w:sz="4"/>
+              <w:left w:val="single" w:color="C9C9D6" w:sz="4"/>
+              <w:bottom w:val="single" w:color="C9C9D6" w:sz="4"/>
+              <w:right w:val="single" w:color="C9C9D6" w:sz="4"/>
             </w:tcBorders>
             <w:tcMar>
               <w:top w:type="dxa" w:w="60"/>
@@ -3856,10 +3900,10 @@
           <w:tcPr>
             <w:tcW w:type="dxa" w:w="1349"/>
             <w:tcBorders>
-              <w:top w:val="single" w:color="C9D3E3" w:sz="4"/>
-              <w:left w:val="single" w:color="C9D3E3" w:sz="4"/>
-              <w:bottom w:val="single" w:color="C9D3E3" w:sz="4"/>
-              <w:right w:val="single" w:color="C9D3E3" w:sz="4"/>
+              <w:top w:val="single" w:color="C9C9D6" w:sz="4"/>
+              <w:left w:val="single" w:color="C9C9D6" w:sz="4"/>
+              <w:bottom w:val="single" w:color="C9C9D6" w:sz="4"/>
+              <w:right w:val="single" w:color="C9C9D6" w:sz="4"/>
             </w:tcBorders>
             <w:tcMar>
               <w:top w:type="dxa" w:w="60"/>
@@ -3891,10 +3935,10 @@
           <w:tcPr>
             <w:tcW w:type="dxa" w:w="963"/>
             <w:tcBorders>
-              <w:top w:val="single" w:color="C9D3E3" w:sz="4"/>
-              <w:left w:val="single" w:color="C9D3E3" w:sz="4"/>
-              <w:bottom w:val="single" w:color="C9D3E3" w:sz="4"/>
-              <w:right w:val="single" w:color="C9D3E3" w:sz="4"/>
+              <w:top w:val="single" w:color="C9C9D6" w:sz="4"/>
+              <w:left w:val="single" w:color="C9C9D6" w:sz="4"/>
+              <w:bottom w:val="single" w:color="C9C9D6" w:sz="4"/>
+              <w:right w:val="single" w:color="C9C9D6" w:sz="4"/>
             </w:tcBorders>
             <w:tcMar>
               <w:top w:type="dxa" w:w="60"/>
@@ -3926,10 +3970,10 @@
           <w:tcPr>
             <w:tcW w:type="dxa" w:w="1542"/>
             <w:tcBorders>
-              <w:top w:val="single" w:color="C9D3E3" w:sz="4"/>
-              <w:left w:val="single" w:color="C9D3E3" w:sz="4"/>
-              <w:bottom w:val="single" w:color="C9D3E3" w:sz="4"/>
-              <w:right w:val="single" w:color="C9D3E3" w:sz="4"/>
+              <w:top w:val="single" w:color="C9C9D6" w:sz="4"/>
+              <w:left w:val="single" w:color="C9C9D6" w:sz="4"/>
+              <w:bottom w:val="single" w:color="C9C9D6" w:sz="4"/>
+              <w:right w:val="single" w:color="C9C9D6" w:sz="4"/>
             </w:tcBorders>
             <w:tcMar>
               <w:top w:type="dxa" w:w="60"/>
@@ -3961,10 +4005,10 @@
           <w:tcPr>
             <w:tcW w:type="dxa" w:w="1159"/>
             <w:tcBorders>
-              <w:top w:val="single" w:color="C9D3E3" w:sz="4"/>
-              <w:left w:val="single" w:color="C9D3E3" w:sz="4"/>
-              <w:bottom w:val="single" w:color="C9D3E3" w:sz="4"/>
-              <w:right w:val="single" w:color="C9D3E3" w:sz="4"/>
+              <w:top w:val="single" w:color="C9C9D6" w:sz="4"/>
+              <w:left w:val="single" w:color="C9C9D6" w:sz="4"/>
+              <w:bottom w:val="single" w:color="C9C9D6" w:sz="4"/>
+              <w:right w:val="single" w:color="C9C9D6" w:sz="4"/>
             </w:tcBorders>
             <w:tcMar>
               <w:top w:type="dxa" w:w="60"/>
@@ -4002,12 +4046,12 @@
           <w:tcPr>
             <w:tcW w:type="dxa" w:w="3276"/>
             <w:tcBorders>
-              <w:top w:val="single" w:color="C9D3E3" w:sz="4"/>
-              <w:left w:val="single" w:color="C9D3E3" w:sz="4"/>
-              <w:bottom w:val="single" w:color="C9D3E3" w:sz="4"/>
-              <w:right w:val="single" w:color="C9D3E3" w:sz="4"/>
-            </w:tcBorders>
-            <w:shd w:fill="EEF3FA" w:color="auto" w:val="clear"/>
+              <w:top w:val="single" w:color="C9C9D6" w:sz="4"/>
+              <w:left w:val="single" w:color="C9C9D6" w:sz="4"/>
+              <w:bottom w:val="single" w:color="C9C9D6" w:sz="4"/>
+              <w:right w:val="single" w:color="C9C9D6" w:sz="4"/>
+            </w:tcBorders>
+            <w:shd w:fill="F3F3F7" w:color="auto" w:val="clear"/>
             <w:tcMar>
               <w:top w:type="dxa" w:w="60"/>
               <w:left w:type="dxa" w:w="90"/>
@@ -4038,12 +4082,12 @@
           <w:tcPr>
             <w:tcW w:type="dxa" w:w="1349"/>
             <w:tcBorders>
-              <w:top w:val="single" w:color="C9D3E3" w:sz="4"/>
-              <w:left w:val="single" w:color="C9D3E3" w:sz="4"/>
-              <w:bottom w:val="single" w:color="C9D3E3" w:sz="4"/>
-              <w:right w:val="single" w:color="C9D3E3" w:sz="4"/>
-            </w:tcBorders>
-            <w:shd w:fill="EEF3FA" w:color="auto" w:val="clear"/>
+              <w:top w:val="single" w:color="C9C9D6" w:sz="4"/>
+              <w:left w:val="single" w:color="C9C9D6" w:sz="4"/>
+              <w:bottom w:val="single" w:color="C9C9D6" w:sz="4"/>
+              <w:right w:val="single" w:color="C9C9D6" w:sz="4"/>
+            </w:tcBorders>
+            <w:shd w:fill="F3F3F7" w:color="auto" w:val="clear"/>
             <w:tcMar>
               <w:top w:type="dxa" w:w="60"/>
               <w:left w:type="dxa" w:w="90"/>
@@ -4074,12 +4118,12 @@
           <w:tcPr>
             <w:tcW w:type="dxa" w:w="1349"/>
             <w:tcBorders>
-              <w:top w:val="single" w:color="C9D3E3" w:sz="4"/>
-              <w:left w:val="single" w:color="C9D3E3" w:sz="4"/>
-              <w:bottom w:val="single" w:color="C9D3E3" w:sz="4"/>
-              <w:right w:val="single" w:color="C9D3E3" w:sz="4"/>
-            </w:tcBorders>
-            <w:shd w:fill="EEF3FA" w:color="auto" w:val="clear"/>
+              <w:top w:val="single" w:color="C9C9D6" w:sz="4"/>
+              <w:left w:val="single" w:color="C9C9D6" w:sz="4"/>
+              <w:bottom w:val="single" w:color="C9C9D6" w:sz="4"/>
+              <w:right w:val="single" w:color="C9C9D6" w:sz="4"/>
+            </w:tcBorders>
+            <w:shd w:fill="F3F3F7" w:color="auto" w:val="clear"/>
             <w:tcMar>
               <w:top w:type="dxa" w:w="60"/>
               <w:left w:type="dxa" w:w="90"/>
@@ -4110,12 +4154,12 @@
           <w:tcPr>
             <w:tcW w:type="dxa" w:w="963"/>
             <w:tcBorders>
-              <w:top w:val="single" w:color="C9D3E3" w:sz="4"/>
-              <w:left w:val="single" w:color="C9D3E3" w:sz="4"/>
-              <w:bottom w:val="single" w:color="C9D3E3" w:sz="4"/>
-              <w:right w:val="single" w:color="C9D3E3" w:sz="4"/>
-            </w:tcBorders>
-            <w:shd w:fill="EEF3FA" w:color="auto" w:val="clear"/>
+              <w:top w:val="single" w:color="C9C9D6" w:sz="4"/>
+              <w:left w:val="single" w:color="C9C9D6" w:sz="4"/>
+              <w:bottom w:val="single" w:color="C9C9D6" w:sz="4"/>
+              <w:right w:val="single" w:color="C9C9D6" w:sz="4"/>
+            </w:tcBorders>
+            <w:shd w:fill="F3F3F7" w:color="auto" w:val="clear"/>
             <w:tcMar>
               <w:top w:type="dxa" w:w="60"/>
               <w:left w:type="dxa" w:w="90"/>
@@ -4146,12 +4190,12 @@
           <w:tcPr>
             <w:tcW w:type="dxa" w:w="1542"/>
             <w:tcBorders>
-              <w:top w:val="single" w:color="C9D3E3" w:sz="4"/>
-              <w:left w:val="single" w:color="C9D3E3" w:sz="4"/>
-              <w:bottom w:val="single" w:color="C9D3E3" w:sz="4"/>
-              <w:right w:val="single" w:color="C9D3E3" w:sz="4"/>
-            </w:tcBorders>
-            <w:shd w:fill="EEF3FA" w:color="auto" w:val="clear"/>
+              <w:top w:val="single" w:color="C9C9D6" w:sz="4"/>
+              <w:left w:val="single" w:color="C9C9D6" w:sz="4"/>
+              <w:bottom w:val="single" w:color="C9C9D6" w:sz="4"/>
+              <w:right w:val="single" w:color="C9C9D6" w:sz="4"/>
+            </w:tcBorders>
+            <w:shd w:fill="F3F3F7" w:color="auto" w:val="clear"/>
             <w:tcMar>
               <w:top w:type="dxa" w:w="60"/>
               <w:left w:type="dxa" w:w="90"/>
@@ -4182,12 +4226,12 @@
           <w:tcPr>
             <w:tcW w:type="dxa" w:w="1159"/>
             <w:tcBorders>
-              <w:top w:val="single" w:color="C9D3E3" w:sz="4"/>
-              <w:left w:val="single" w:color="C9D3E3" w:sz="4"/>
-              <w:bottom w:val="single" w:color="C9D3E3" w:sz="4"/>
-              <w:right w:val="single" w:color="C9D3E3" w:sz="4"/>
-            </w:tcBorders>
-            <w:shd w:fill="EEF3FA" w:color="auto" w:val="clear"/>
+              <w:top w:val="single" w:color="C9C9D6" w:sz="4"/>
+              <w:left w:val="single" w:color="C9C9D6" w:sz="4"/>
+              <w:bottom w:val="single" w:color="C9C9D6" w:sz="4"/>
+              <w:right w:val="single" w:color="C9C9D6" w:sz="4"/>
+            </w:tcBorders>
+            <w:shd w:fill="F3F3F7" w:color="auto" w:val="clear"/>
             <w:tcMar>
               <w:top w:type="dxa" w:w="60"/>
               <w:left w:type="dxa" w:w="90"/>
@@ -4249,14 +4293,17 @@
     <w:p>
       <w:pPr>
         <w:pStyle w:val="Heading1"/>
-        <w:spacing w:after="160" w:before="360"/>
+        <w:pBdr>
+          <w:bottom w:val="single" w:color="FF4000" w:sz="12" w:space="4"/>
+        </w:pBdr>
+        <w:spacing w:after="200" w:before="360"/>
       </w:pPr>
       <w:r>
         <w:rPr>
           <w:rFonts w:ascii="Arial" w:cs="Arial" w:eastAsia="Arial" w:hAnsi="Arial"/>
           <w:b/>
           <w:bCs/>
-          <w:color w:val="1F3B73"/>
+          <w:color w:val="010222"/>
           <w:sz w:val="30"/>
           <w:szCs w:val="30"/>
         </w:rPr>
@@ -4302,12 +4349,12 @@
           <w:tcPr>
             <w:tcW w:type="dxa" w:w="2891"/>
             <w:tcBorders>
-              <w:top w:val="single" w:color="C9D3E3" w:sz="4"/>
-              <w:left w:val="single" w:color="C9D3E3" w:sz="4"/>
-              <w:bottom w:val="single" w:color="C9D3E3" w:sz="4"/>
-              <w:right w:val="single" w:color="C9D3E3" w:sz="4"/>
-            </w:tcBorders>
-            <w:shd w:fill="1F3B73" w:color="auto" w:val="clear"/>
+              <w:top w:val="single" w:color="C9C9D6" w:sz="4"/>
+              <w:left w:val="single" w:color="C9C9D6" w:sz="4"/>
+              <w:bottom w:val="single" w:color="C9C9D6" w:sz="4"/>
+              <w:right w:val="single" w:color="C9C9D6" w:sz="4"/>
+            </w:tcBorders>
+            <w:shd w:fill="010222" w:color="auto" w:val="clear"/>
             <w:tcMar>
               <w:top w:type="dxa" w:w="60"/>
               <w:left w:type="dxa" w:w="90"/>
@@ -4338,12 +4385,12 @@
           <w:tcPr>
             <w:tcW w:type="dxa" w:w="6747"/>
             <w:tcBorders>
-              <w:top w:val="single" w:color="C9D3E3" w:sz="4"/>
-              <w:left w:val="single" w:color="C9D3E3" w:sz="4"/>
-              <w:bottom w:val="single" w:color="C9D3E3" w:sz="4"/>
-              <w:right w:val="single" w:color="C9D3E3" w:sz="4"/>
-            </w:tcBorders>
-            <w:shd w:fill="1F3B73" w:color="auto" w:val="clear"/>
+              <w:top w:val="single" w:color="C9C9D6" w:sz="4"/>
+              <w:left w:val="single" w:color="C9C9D6" w:sz="4"/>
+              <w:bottom w:val="single" w:color="C9C9D6" w:sz="4"/>
+              <w:right w:val="single" w:color="C9C9D6" w:sz="4"/>
+            </w:tcBorders>
+            <w:shd w:fill="010222" w:color="auto" w:val="clear"/>
             <w:tcMar>
               <w:top w:type="dxa" w:w="60"/>
               <w:left w:type="dxa" w:w="90"/>
@@ -4380,10 +4427,10 @@
           <w:tcPr>
             <w:tcW w:type="dxa" w:w="2891"/>
             <w:tcBorders>
-              <w:top w:val="single" w:color="C9D3E3" w:sz="4"/>
-              <w:left w:val="single" w:color="C9D3E3" w:sz="4"/>
-              <w:bottom w:val="single" w:color="C9D3E3" w:sz="4"/>
-              <w:right w:val="single" w:color="C9D3E3" w:sz="4"/>
+              <w:top w:val="single" w:color="C9C9D6" w:sz="4"/>
+              <w:left w:val="single" w:color="C9C9D6" w:sz="4"/>
+              <w:bottom w:val="single" w:color="C9C9D6" w:sz="4"/>
+              <w:right w:val="single" w:color="C9C9D6" w:sz="4"/>
             </w:tcBorders>
             <w:tcMar>
               <w:top w:type="dxa" w:w="60"/>
@@ -4415,10 +4462,10 @@
           <w:tcPr>
             <w:tcW w:type="dxa" w:w="6747"/>
             <w:tcBorders>
-              <w:top w:val="single" w:color="C9D3E3" w:sz="4"/>
-              <w:left w:val="single" w:color="C9D3E3" w:sz="4"/>
-              <w:bottom w:val="single" w:color="C9D3E3" w:sz="4"/>
-              <w:right w:val="single" w:color="C9D3E3" w:sz="4"/>
+              <w:top w:val="single" w:color="C9C9D6" w:sz="4"/>
+              <w:left w:val="single" w:color="C9C9D6" w:sz="4"/>
+              <w:bottom w:val="single" w:color="C9C9D6" w:sz="4"/>
+              <w:right w:val="single" w:color="C9C9D6" w:sz="4"/>
             </w:tcBorders>
             <w:tcMar>
               <w:top w:type="dxa" w:w="60"/>
@@ -4456,10 +4503,10 @@
           <w:tcPr>
             <w:tcW w:type="dxa" w:w="2891"/>
             <w:tcBorders>
-              <w:top w:val="single" w:color="C9D3E3" w:sz="4"/>
-              <w:left w:val="single" w:color="C9D3E3" w:sz="4"/>
-              <w:bottom w:val="single" w:color="C9D3E3" w:sz="4"/>
-              <w:right w:val="single" w:color="C9D3E3" w:sz="4"/>
+              <w:top w:val="single" w:color="C9C9D6" w:sz="4"/>
+              <w:left w:val="single" w:color="C9C9D6" w:sz="4"/>
+              <w:bottom w:val="single" w:color="C9C9D6" w:sz="4"/>
+              <w:right w:val="single" w:color="C9C9D6" w:sz="4"/>
             </w:tcBorders>
             <w:tcMar>
               <w:top w:type="dxa" w:w="60"/>
@@ -4491,10 +4538,10 @@
           <w:tcPr>
             <w:tcW w:type="dxa" w:w="6747"/>
             <w:tcBorders>
-              <w:top w:val="single" w:color="C9D3E3" w:sz="4"/>
-              <w:left w:val="single" w:color="C9D3E3" w:sz="4"/>
-              <w:bottom w:val="single" w:color="C9D3E3" w:sz="4"/>
-              <w:right w:val="single" w:color="C9D3E3" w:sz="4"/>
+              <w:top w:val="single" w:color="C9C9D6" w:sz="4"/>
+              <w:left w:val="single" w:color="C9C9D6" w:sz="4"/>
+              <w:bottom w:val="single" w:color="C9C9D6" w:sz="4"/>
+              <w:right w:val="single" w:color="C9C9D6" w:sz="4"/>
             </w:tcBorders>
             <w:tcMar>
               <w:top w:type="dxa" w:w="60"/>
@@ -4532,10 +4579,10 @@
           <w:tcPr>
             <w:tcW w:type="dxa" w:w="2891"/>
             <w:tcBorders>
-              <w:top w:val="single" w:color="C9D3E3" w:sz="4"/>
-              <w:left w:val="single" w:color="C9D3E3" w:sz="4"/>
-              <w:bottom w:val="single" w:color="C9D3E3" w:sz="4"/>
-              <w:right w:val="single" w:color="C9D3E3" w:sz="4"/>
+              <w:top w:val="single" w:color="C9C9D6" w:sz="4"/>
+              <w:left w:val="single" w:color="C9C9D6" w:sz="4"/>
+              <w:bottom w:val="single" w:color="C9C9D6" w:sz="4"/>
+              <w:right w:val="single" w:color="C9C9D6" w:sz="4"/>
             </w:tcBorders>
             <w:tcMar>
               <w:top w:type="dxa" w:w="60"/>
@@ -4567,10 +4614,10 @@
           <w:tcPr>
             <w:tcW w:type="dxa" w:w="6747"/>
             <w:tcBorders>
-              <w:top w:val="single" w:color="C9D3E3" w:sz="4"/>
-              <w:left w:val="single" w:color="C9D3E3" w:sz="4"/>
-              <w:bottom w:val="single" w:color="C9D3E3" w:sz="4"/>
-              <w:right w:val="single" w:color="C9D3E3" w:sz="4"/>
+              <w:top w:val="single" w:color="C9C9D6" w:sz="4"/>
+              <w:left w:val="single" w:color="C9C9D6" w:sz="4"/>
+              <w:bottom w:val="single" w:color="C9C9D6" w:sz="4"/>
+              <w:right w:val="single" w:color="C9C9D6" w:sz="4"/>
             </w:tcBorders>
             <w:tcMar>
               <w:top w:type="dxa" w:w="60"/>
@@ -4608,10 +4655,10 @@
           <w:tcPr>
             <w:tcW w:type="dxa" w:w="2891"/>
             <w:tcBorders>
-              <w:top w:val="single" w:color="C9D3E3" w:sz="4"/>
-              <w:left w:val="single" w:color="C9D3E3" w:sz="4"/>
-              <w:bottom w:val="single" w:color="C9D3E3" w:sz="4"/>
-              <w:right w:val="single" w:color="C9D3E3" w:sz="4"/>
+              <w:top w:val="single" w:color="C9C9D6" w:sz="4"/>
+              <w:left w:val="single" w:color="C9C9D6" w:sz="4"/>
+              <w:bottom w:val="single" w:color="C9C9D6" w:sz="4"/>
+              <w:right w:val="single" w:color="C9C9D6" w:sz="4"/>
             </w:tcBorders>
             <w:tcMar>
               <w:top w:type="dxa" w:w="60"/>
@@ -4643,10 +4690,10 @@
           <w:tcPr>
             <w:tcW w:type="dxa" w:w="6747"/>
             <w:tcBorders>
-              <w:top w:val="single" w:color="C9D3E3" w:sz="4"/>
-              <w:left w:val="single" w:color="C9D3E3" w:sz="4"/>
-              <w:bottom w:val="single" w:color="C9D3E3" w:sz="4"/>
-              <w:right w:val="single" w:color="C9D3E3" w:sz="4"/>
+              <w:top w:val="single" w:color="C9C9D6" w:sz="4"/>
+              <w:left w:val="single" w:color="C9C9D6" w:sz="4"/>
+              <w:bottom w:val="single" w:color="C9C9D6" w:sz="4"/>
+              <w:right w:val="single" w:color="C9C9D6" w:sz="4"/>
             </w:tcBorders>
             <w:tcMar>
               <w:top w:type="dxa" w:w="60"/>
@@ -4684,10 +4731,10 @@
           <w:tcPr>
             <w:tcW w:type="dxa" w:w="2891"/>
             <w:tcBorders>
-              <w:top w:val="single" w:color="C9D3E3" w:sz="4"/>
-              <w:left w:val="single" w:color="C9D3E3" w:sz="4"/>
-              <w:bottom w:val="single" w:color="C9D3E3" w:sz="4"/>
-              <w:right w:val="single" w:color="C9D3E3" w:sz="4"/>
+              <w:top w:val="single" w:color="C9C9D6" w:sz="4"/>
+              <w:left w:val="single" w:color="C9C9D6" w:sz="4"/>
+              <w:bottom w:val="single" w:color="C9C9D6" w:sz="4"/>
+              <w:right w:val="single" w:color="C9C9D6" w:sz="4"/>
             </w:tcBorders>
             <w:tcMar>
               <w:top w:type="dxa" w:w="60"/>
@@ -4719,10 +4766,10 @@
           <w:tcPr>
             <w:tcW w:type="dxa" w:w="6747"/>
             <w:tcBorders>
-              <w:top w:val="single" w:color="C9D3E3" w:sz="4"/>
-              <w:left w:val="single" w:color="C9D3E3" w:sz="4"/>
-              <w:bottom w:val="single" w:color="C9D3E3" w:sz="4"/>
-              <w:right w:val="single" w:color="C9D3E3" w:sz="4"/>
+              <w:top w:val="single" w:color="C9C9D6" w:sz="4"/>
+              <w:left w:val="single" w:color="C9C9D6" w:sz="4"/>
+              <w:bottom w:val="single" w:color="C9C9D6" w:sz="4"/>
+              <w:right w:val="single" w:color="C9C9D6" w:sz="4"/>
             </w:tcBorders>
             <w:tcMar>
               <w:top w:type="dxa" w:w="60"/>
@@ -4760,10 +4807,10 @@
           <w:tcPr>
             <w:tcW w:type="dxa" w:w="2891"/>
             <w:tcBorders>
-              <w:top w:val="single" w:color="C9D3E3" w:sz="4"/>
-              <w:left w:val="single" w:color="C9D3E3" w:sz="4"/>
-              <w:bottom w:val="single" w:color="C9D3E3" w:sz="4"/>
-              <w:right w:val="single" w:color="C9D3E3" w:sz="4"/>
+              <w:top w:val="single" w:color="C9C9D6" w:sz="4"/>
+              <w:left w:val="single" w:color="C9C9D6" w:sz="4"/>
+              <w:bottom w:val="single" w:color="C9C9D6" w:sz="4"/>
+              <w:right w:val="single" w:color="C9C9D6" w:sz="4"/>
             </w:tcBorders>
             <w:tcMar>
               <w:top w:type="dxa" w:w="60"/>
@@ -4795,10 +4842,10 @@
           <w:tcPr>
             <w:tcW w:type="dxa" w:w="6747"/>
             <w:tcBorders>
-              <w:top w:val="single" w:color="C9D3E3" w:sz="4"/>
-              <w:left w:val="single" w:color="C9D3E3" w:sz="4"/>
-              <w:bottom w:val="single" w:color="C9D3E3" w:sz="4"/>
-              <w:right w:val="single" w:color="C9D3E3" w:sz="4"/>
+              <w:top w:val="single" w:color="C9C9D6" w:sz="4"/>
+              <w:left w:val="single" w:color="C9C9D6" w:sz="4"/>
+              <w:bottom w:val="single" w:color="C9C9D6" w:sz="4"/>
+              <w:right w:val="single" w:color="C9C9D6" w:sz="4"/>
             </w:tcBorders>
             <w:tcMar>
               <w:top w:type="dxa" w:w="60"/>
@@ -4836,10 +4883,10 @@
           <w:tcPr>
             <w:tcW w:type="dxa" w:w="2891"/>
             <w:tcBorders>
-              <w:top w:val="single" w:color="C9D3E3" w:sz="4"/>
-              <w:left w:val="single" w:color="C9D3E3" w:sz="4"/>
-              <w:bottom w:val="single" w:color="C9D3E3" w:sz="4"/>
-              <w:right w:val="single" w:color="C9D3E3" w:sz="4"/>
+              <w:top w:val="single" w:color="C9C9D6" w:sz="4"/>
+              <w:left w:val="single" w:color="C9C9D6" w:sz="4"/>
+              <w:bottom w:val="single" w:color="C9C9D6" w:sz="4"/>
+              <w:right w:val="single" w:color="C9C9D6" w:sz="4"/>
             </w:tcBorders>
             <w:tcMar>
               <w:top w:type="dxa" w:w="60"/>
@@ -4871,10 +4918,10 @@
           <w:tcPr>
             <w:tcW w:type="dxa" w:w="6747"/>
             <w:tcBorders>
-              <w:top w:val="single" w:color="C9D3E3" w:sz="4"/>
-              <w:left w:val="single" w:color="C9D3E3" w:sz="4"/>
-              <w:bottom w:val="single" w:color="C9D3E3" w:sz="4"/>
-              <w:right w:val="single" w:color="C9D3E3" w:sz="4"/>
+              <w:top w:val="single" w:color="C9C9D6" w:sz="4"/>
+              <w:left w:val="single" w:color="C9C9D6" w:sz="4"/>
+              <w:bottom w:val="single" w:color="C9C9D6" w:sz="4"/>
+              <w:right w:val="single" w:color="C9C9D6" w:sz="4"/>
             </w:tcBorders>
             <w:tcMar>
               <w:top w:type="dxa" w:w="60"/>
@@ -4926,14 +4973,17 @@
     <w:p>
       <w:pPr>
         <w:pStyle w:val="Heading1"/>
-        <w:spacing w:after="160" w:before="360"/>
+        <w:pBdr>
+          <w:bottom w:val="single" w:color="FF4000" w:sz="12" w:space="4"/>
+        </w:pBdr>
+        <w:spacing w:after="200" w:before="360"/>
       </w:pPr>
       <w:r>
         <w:rPr>
           <w:rFonts w:ascii="Arial" w:cs="Arial" w:eastAsia="Arial" w:hAnsi="Arial"/>
           <w:b/>
           <w:bCs/>
-          <w:color w:val="1F3B73"/>
+          <w:color w:val="010222"/>
           <w:sz w:val="30"/>
           <w:szCs w:val="30"/>
         </w:rPr>
@@ -4993,12 +5043,12 @@
           <w:tcPr>
             <w:tcW w:type="dxa" w:w="2891"/>
             <w:tcBorders>
-              <w:top w:val="single" w:color="C9D3E3" w:sz="4"/>
-              <w:left w:val="single" w:color="C9D3E3" w:sz="4"/>
-              <w:bottom w:val="single" w:color="C9D3E3" w:sz="4"/>
-              <w:right w:val="single" w:color="C9D3E3" w:sz="4"/>
-            </w:tcBorders>
-            <w:shd w:fill="1F3B73" w:color="auto" w:val="clear"/>
+              <w:top w:val="single" w:color="C9C9D6" w:sz="4"/>
+              <w:left w:val="single" w:color="C9C9D6" w:sz="4"/>
+              <w:bottom w:val="single" w:color="C9C9D6" w:sz="4"/>
+              <w:right w:val="single" w:color="C9C9D6" w:sz="4"/>
+            </w:tcBorders>
+            <w:shd w:fill="010222" w:color="auto" w:val="clear"/>
             <w:tcMar>
               <w:top w:type="dxa" w:w="60"/>
               <w:left w:type="dxa" w:w="90"/>
@@ -5029,12 +5079,12 @@
           <w:tcPr>
             <w:tcW w:type="dxa" w:w="6747"/>
             <w:tcBorders>
-              <w:top w:val="single" w:color="C9D3E3" w:sz="4"/>
-              <w:left w:val="single" w:color="C9D3E3" w:sz="4"/>
-              <w:bottom w:val="single" w:color="C9D3E3" w:sz="4"/>
-              <w:right w:val="single" w:color="C9D3E3" w:sz="4"/>
-            </w:tcBorders>
-            <w:shd w:fill="1F3B73" w:color="auto" w:val="clear"/>
+              <w:top w:val="single" w:color="C9C9D6" w:sz="4"/>
+              <w:left w:val="single" w:color="C9C9D6" w:sz="4"/>
+              <w:bottom w:val="single" w:color="C9C9D6" w:sz="4"/>
+              <w:right w:val="single" w:color="C9C9D6" w:sz="4"/>
+            </w:tcBorders>
+            <w:shd w:fill="010222" w:color="auto" w:val="clear"/>
             <w:tcMar>
               <w:top w:type="dxa" w:w="60"/>
               <w:left w:type="dxa" w:w="90"/>
@@ -5071,10 +5121,10 @@
           <w:tcPr>
             <w:tcW w:type="dxa" w:w="2891"/>
             <w:tcBorders>
-              <w:top w:val="single" w:color="C9D3E3" w:sz="4"/>
-              <w:left w:val="single" w:color="C9D3E3" w:sz="4"/>
-              <w:bottom w:val="single" w:color="C9D3E3" w:sz="4"/>
-              <w:right w:val="single" w:color="C9D3E3" w:sz="4"/>
+              <w:top w:val="single" w:color="C9C9D6" w:sz="4"/>
+              <w:left w:val="single" w:color="C9C9D6" w:sz="4"/>
+              <w:bottom w:val="single" w:color="C9C9D6" w:sz="4"/>
+              <w:right w:val="single" w:color="C9C9D6" w:sz="4"/>
             </w:tcBorders>
             <w:tcMar>
               <w:top w:type="dxa" w:w="60"/>
@@ -5106,10 +5156,10 @@
           <w:tcPr>
             <w:tcW w:type="dxa" w:w="6747"/>
             <w:tcBorders>
-              <w:top w:val="single" w:color="C9D3E3" w:sz="4"/>
-              <w:left w:val="single" w:color="C9D3E3" w:sz="4"/>
-              <w:bottom w:val="single" w:color="C9D3E3" w:sz="4"/>
-              <w:right w:val="single" w:color="C9D3E3" w:sz="4"/>
+              <w:top w:val="single" w:color="C9C9D6" w:sz="4"/>
+              <w:left w:val="single" w:color="C9C9D6" w:sz="4"/>
+              <w:bottom w:val="single" w:color="C9C9D6" w:sz="4"/>
+              <w:right w:val="single" w:color="C9C9D6" w:sz="4"/>
             </w:tcBorders>
             <w:tcMar>
               <w:top w:type="dxa" w:w="60"/>
@@ -5147,10 +5197,10 @@
           <w:tcPr>
             <w:tcW w:type="dxa" w:w="2891"/>
             <w:tcBorders>
-              <w:top w:val="single" w:color="C9D3E3" w:sz="4"/>
-              <w:left w:val="single" w:color="C9D3E3" w:sz="4"/>
-              <w:bottom w:val="single" w:color="C9D3E3" w:sz="4"/>
-              <w:right w:val="single" w:color="C9D3E3" w:sz="4"/>
+              <w:top w:val="single" w:color="C9C9D6" w:sz="4"/>
+              <w:left w:val="single" w:color="C9C9D6" w:sz="4"/>
+              <w:bottom w:val="single" w:color="C9C9D6" w:sz="4"/>
+              <w:right w:val="single" w:color="C9C9D6" w:sz="4"/>
             </w:tcBorders>
             <w:tcMar>
               <w:top w:type="dxa" w:w="60"/>
@@ -5182,10 +5232,10 @@
           <w:tcPr>
             <w:tcW w:type="dxa" w:w="6747"/>
             <w:tcBorders>
-              <w:top w:val="single" w:color="C9D3E3" w:sz="4"/>
-              <w:left w:val="single" w:color="C9D3E3" w:sz="4"/>
-              <w:bottom w:val="single" w:color="C9D3E3" w:sz="4"/>
-              <w:right w:val="single" w:color="C9D3E3" w:sz="4"/>
+              <w:top w:val="single" w:color="C9C9D6" w:sz="4"/>
+              <w:left w:val="single" w:color="C9C9D6" w:sz="4"/>
+              <w:bottom w:val="single" w:color="C9C9D6" w:sz="4"/>
+              <w:right w:val="single" w:color="C9C9D6" w:sz="4"/>
             </w:tcBorders>
             <w:tcMar>
               <w:top w:type="dxa" w:w="60"/>
@@ -5223,10 +5273,10 @@
           <w:tcPr>
             <w:tcW w:type="dxa" w:w="2891"/>
             <w:tcBorders>
-              <w:top w:val="single" w:color="C9D3E3" w:sz="4"/>
-              <w:left w:val="single" w:color="C9D3E3" w:sz="4"/>
-              <w:bottom w:val="single" w:color="C9D3E3" w:sz="4"/>
-              <w:right w:val="single" w:color="C9D3E3" w:sz="4"/>
+              <w:top w:val="single" w:color="C9C9D6" w:sz="4"/>
+              <w:left w:val="single" w:color="C9C9D6" w:sz="4"/>
+              <w:bottom w:val="single" w:color="C9C9D6" w:sz="4"/>
+              <w:right w:val="single" w:color="C9C9D6" w:sz="4"/>
             </w:tcBorders>
             <w:tcMar>
               <w:top w:type="dxa" w:w="60"/>
@@ -5258,10 +5308,10 @@
           <w:tcPr>
             <w:tcW w:type="dxa" w:w="6747"/>
             <w:tcBorders>
-              <w:top w:val="single" w:color="C9D3E3" w:sz="4"/>
-              <w:left w:val="single" w:color="C9D3E3" w:sz="4"/>
-              <w:bottom w:val="single" w:color="C9D3E3" w:sz="4"/>
-              <w:right w:val="single" w:color="C9D3E3" w:sz="4"/>
+              <w:top w:val="single" w:color="C9C9D6" w:sz="4"/>
+              <w:left w:val="single" w:color="C9C9D6" w:sz="4"/>
+              <w:bottom w:val="single" w:color="C9C9D6" w:sz="4"/>
+              <w:right w:val="single" w:color="C9C9D6" w:sz="4"/>
             </w:tcBorders>
             <w:tcMar>
               <w:top w:type="dxa" w:w="60"/>
@@ -5299,10 +5349,10 @@
           <w:tcPr>
             <w:tcW w:type="dxa" w:w="2891"/>
             <w:tcBorders>
-              <w:top w:val="single" w:color="C9D3E3" w:sz="4"/>
-              <w:left w:val="single" w:color="C9D3E3" w:sz="4"/>
-              <w:bottom w:val="single" w:color="C9D3E3" w:sz="4"/>
-              <w:right w:val="single" w:color="C9D3E3" w:sz="4"/>
+              <w:top w:val="single" w:color="C9C9D6" w:sz="4"/>
+              <w:left w:val="single" w:color="C9C9D6" w:sz="4"/>
+              <w:bottom w:val="single" w:color="C9C9D6" w:sz="4"/>
+              <w:right w:val="single" w:color="C9C9D6" w:sz="4"/>
             </w:tcBorders>
             <w:tcMar>
               <w:top w:type="dxa" w:w="60"/>
@@ -5334,10 +5384,10 @@
           <w:tcPr>
             <w:tcW w:type="dxa" w:w="6747"/>
             <w:tcBorders>
-              <w:top w:val="single" w:color="C9D3E3" w:sz="4"/>
-              <w:left w:val="single" w:color="C9D3E3" w:sz="4"/>
-              <w:bottom w:val="single" w:color="C9D3E3" w:sz="4"/>
-              <w:right w:val="single" w:color="C9D3E3" w:sz="4"/>
+              <w:top w:val="single" w:color="C9C9D6" w:sz="4"/>
+              <w:left w:val="single" w:color="C9C9D6" w:sz="4"/>
+              <w:bottom w:val="single" w:color="C9C9D6" w:sz="4"/>
+              <w:right w:val="single" w:color="C9C9D6" w:sz="4"/>
             </w:tcBorders>
             <w:tcMar>
               <w:top w:type="dxa" w:w="60"/>
@@ -5375,10 +5425,10 @@
           <w:tcPr>
             <w:tcW w:type="dxa" w:w="2891"/>
             <w:tcBorders>
-              <w:top w:val="single" w:color="C9D3E3" w:sz="4"/>
-              <w:left w:val="single" w:color="C9D3E3" w:sz="4"/>
-              <w:bottom w:val="single" w:color="C9D3E3" w:sz="4"/>
-              <w:right w:val="single" w:color="C9D3E3" w:sz="4"/>
+              <w:top w:val="single" w:color="C9C9D6" w:sz="4"/>
+              <w:left w:val="single" w:color="C9C9D6" w:sz="4"/>
+              <w:bottom w:val="single" w:color="C9C9D6" w:sz="4"/>
+              <w:right w:val="single" w:color="C9C9D6" w:sz="4"/>
             </w:tcBorders>
             <w:tcMar>
               <w:top w:type="dxa" w:w="60"/>
@@ -5410,10 +5460,10 @@
           <w:tcPr>
             <w:tcW w:type="dxa" w:w="6747"/>
             <w:tcBorders>
-              <w:top w:val="single" w:color="C9D3E3" w:sz="4"/>
-              <w:left w:val="single" w:color="C9D3E3" w:sz="4"/>
-              <w:bottom w:val="single" w:color="C9D3E3" w:sz="4"/>
-              <w:right w:val="single" w:color="C9D3E3" w:sz="4"/>
+              <w:top w:val="single" w:color="C9C9D6" w:sz="4"/>
+              <w:left w:val="single" w:color="C9C9D6" w:sz="4"/>
+              <w:bottom w:val="single" w:color="C9C9D6" w:sz="4"/>
+              <w:right w:val="single" w:color="C9C9D6" w:sz="4"/>
             </w:tcBorders>
             <w:tcMar>
               <w:top w:type="dxa" w:w="60"/>
@@ -5451,14 +5501,17 @@
     <w:p>
       <w:pPr>
         <w:pStyle w:val="Heading1"/>
-        <w:spacing w:after="160" w:before="360"/>
+        <w:pBdr>
+          <w:bottom w:val="single" w:color="FF4000" w:sz="12" w:space="4"/>
+        </w:pBdr>
+        <w:spacing w:after="200" w:before="360"/>
       </w:pPr>
       <w:r>
         <w:rPr>
           <w:rFonts w:ascii="Arial" w:cs="Arial" w:eastAsia="Arial" w:hAnsi="Arial"/>
           <w:b/>
           <w:bCs/>
-          <w:color w:val="1F3B73"/>
+          <w:color w:val="010222"/>
           <w:sz w:val="30"/>
           <w:szCs w:val="30"/>
         </w:rPr>
@@ -5492,12 +5545,12 @@
           <w:tcPr>
             <w:tcW w:type="dxa" w:w="1542"/>
             <w:tcBorders>
-              <w:top w:val="single" w:color="C9D3E3" w:sz="4"/>
-              <w:left w:val="single" w:color="C9D3E3" w:sz="4"/>
-              <w:bottom w:val="single" w:color="C9D3E3" w:sz="4"/>
-              <w:right w:val="single" w:color="C9D3E3" w:sz="4"/>
-            </w:tcBorders>
-            <w:shd w:fill="1F3B73" w:color="auto" w:val="clear"/>
+              <w:top w:val="single" w:color="C9C9D6" w:sz="4"/>
+              <w:left w:val="single" w:color="C9C9D6" w:sz="4"/>
+              <w:bottom w:val="single" w:color="C9C9D6" w:sz="4"/>
+              <w:right w:val="single" w:color="C9C9D6" w:sz="4"/>
+            </w:tcBorders>
+            <w:shd w:fill="010222" w:color="auto" w:val="clear"/>
             <w:tcMar>
               <w:top w:type="dxa" w:w="60"/>
               <w:left w:type="dxa" w:w="90"/>
@@ -5528,12 +5581,12 @@
           <w:tcPr>
             <w:tcW w:type="dxa" w:w="2313"/>
             <w:tcBorders>
-              <w:top w:val="single" w:color="C9D3E3" w:sz="4"/>
-              <w:left w:val="single" w:color="C9D3E3" w:sz="4"/>
-              <w:bottom w:val="single" w:color="C9D3E3" w:sz="4"/>
-              <w:right w:val="single" w:color="C9D3E3" w:sz="4"/>
-            </w:tcBorders>
-            <w:shd w:fill="1F3B73" w:color="auto" w:val="clear"/>
+              <w:top w:val="single" w:color="C9C9D6" w:sz="4"/>
+              <w:left w:val="single" w:color="C9C9D6" w:sz="4"/>
+              <w:bottom w:val="single" w:color="C9C9D6" w:sz="4"/>
+              <w:right w:val="single" w:color="C9C9D6" w:sz="4"/>
+            </w:tcBorders>
+            <w:shd w:fill="010222" w:color="auto" w:val="clear"/>
             <w:tcMar>
               <w:top w:type="dxa" w:w="60"/>
               <w:left w:type="dxa" w:w="90"/>
@@ -5564,12 +5617,12 @@
           <w:tcPr>
             <w:tcW w:type="dxa" w:w="3276"/>
             <w:tcBorders>
-              <w:top w:val="single" w:color="C9D3E3" w:sz="4"/>
-              <w:left w:val="single" w:color="C9D3E3" w:sz="4"/>
-              <w:bottom w:val="single" w:color="C9D3E3" w:sz="4"/>
-              <w:right w:val="single" w:color="C9D3E3" w:sz="4"/>
-            </w:tcBorders>
-            <w:shd w:fill="1F3B73" w:color="auto" w:val="clear"/>
+              <w:top w:val="single" w:color="C9C9D6" w:sz="4"/>
+              <w:left w:val="single" w:color="C9C9D6" w:sz="4"/>
+              <w:bottom w:val="single" w:color="C9C9D6" w:sz="4"/>
+              <w:right w:val="single" w:color="C9C9D6" w:sz="4"/>
+            </w:tcBorders>
+            <w:shd w:fill="010222" w:color="auto" w:val="clear"/>
             <w:tcMar>
               <w:top w:type="dxa" w:w="60"/>
               <w:left w:type="dxa" w:w="90"/>
@@ -5600,12 +5653,12 @@
           <w:tcPr>
             <w:tcW w:type="dxa" w:w="2507"/>
             <w:tcBorders>
-              <w:top w:val="single" w:color="C9D3E3" w:sz="4"/>
-              <w:left w:val="single" w:color="C9D3E3" w:sz="4"/>
-              <w:bottom w:val="single" w:color="C9D3E3" w:sz="4"/>
-              <w:right w:val="single" w:color="C9D3E3" w:sz="4"/>
-            </w:tcBorders>
-            <w:shd w:fill="1F3B73" w:color="auto" w:val="clear"/>
+              <w:top w:val="single" w:color="C9C9D6" w:sz="4"/>
+              <w:left w:val="single" w:color="C9C9D6" w:sz="4"/>
+              <w:bottom w:val="single" w:color="C9C9D6" w:sz="4"/>
+              <w:right w:val="single" w:color="C9C9D6" w:sz="4"/>
+            </w:tcBorders>
+            <w:shd w:fill="010222" w:color="auto" w:val="clear"/>
             <w:tcMar>
               <w:top w:type="dxa" w:w="60"/>
               <w:left w:type="dxa" w:w="90"/>
@@ -5642,10 +5695,10 @@
           <w:tcPr>
             <w:tcW w:type="dxa" w:w="1542"/>
             <w:tcBorders>
-              <w:top w:val="single" w:color="C9D3E3" w:sz="4"/>
-              <w:left w:val="single" w:color="C9D3E3" w:sz="4"/>
-              <w:bottom w:val="single" w:color="C9D3E3" w:sz="4"/>
-              <w:right w:val="single" w:color="C9D3E3" w:sz="4"/>
+              <w:top w:val="single" w:color="C9C9D6" w:sz="4"/>
+              <w:left w:val="single" w:color="C9C9D6" w:sz="4"/>
+              <w:bottom w:val="single" w:color="C9C9D6" w:sz="4"/>
+              <w:right w:val="single" w:color="C9C9D6" w:sz="4"/>
             </w:tcBorders>
             <w:tcMar>
               <w:top w:type="dxa" w:w="60"/>
@@ -5677,10 +5730,10 @@
           <w:tcPr>
             <w:tcW w:type="dxa" w:w="2313"/>
             <w:tcBorders>
-              <w:top w:val="single" w:color="C9D3E3" w:sz="4"/>
-              <w:left w:val="single" w:color="C9D3E3" w:sz="4"/>
-              <w:bottom w:val="single" w:color="C9D3E3" w:sz="4"/>
-              <w:right w:val="single" w:color="C9D3E3" w:sz="4"/>
+              <w:top w:val="single" w:color="C9C9D6" w:sz="4"/>
+              <w:left w:val="single" w:color="C9C9D6" w:sz="4"/>
+              <w:bottom w:val="single" w:color="C9C9D6" w:sz="4"/>
+              <w:right w:val="single" w:color="C9C9D6" w:sz="4"/>
             </w:tcBorders>
             <w:tcMar>
               <w:top w:type="dxa" w:w="60"/>
@@ -5712,10 +5765,10 @@
           <w:tcPr>
             <w:tcW w:type="dxa" w:w="3276"/>
             <w:tcBorders>
-              <w:top w:val="single" w:color="C9D3E3" w:sz="4"/>
-              <w:left w:val="single" w:color="C9D3E3" w:sz="4"/>
-              <w:bottom w:val="single" w:color="C9D3E3" w:sz="4"/>
-              <w:right w:val="single" w:color="C9D3E3" w:sz="4"/>
+              <w:top w:val="single" w:color="C9C9D6" w:sz="4"/>
+              <w:left w:val="single" w:color="C9C9D6" w:sz="4"/>
+              <w:bottom w:val="single" w:color="C9C9D6" w:sz="4"/>
+              <w:right w:val="single" w:color="C9C9D6" w:sz="4"/>
             </w:tcBorders>
             <w:tcMar>
               <w:top w:type="dxa" w:w="60"/>
@@ -5747,10 +5800,10 @@
           <w:tcPr>
             <w:tcW w:type="dxa" w:w="2507"/>
             <w:tcBorders>
-              <w:top w:val="single" w:color="C9D3E3" w:sz="4"/>
-              <w:left w:val="single" w:color="C9D3E3" w:sz="4"/>
-              <w:bottom w:val="single" w:color="C9D3E3" w:sz="4"/>
-              <w:right w:val="single" w:color="C9D3E3" w:sz="4"/>
+              <w:top w:val="single" w:color="C9C9D6" w:sz="4"/>
+              <w:left w:val="single" w:color="C9C9D6" w:sz="4"/>
+              <w:bottom w:val="single" w:color="C9C9D6" w:sz="4"/>
+              <w:right w:val="single" w:color="C9C9D6" w:sz="4"/>
             </w:tcBorders>
             <w:tcMar>
               <w:top w:type="dxa" w:w="60"/>
@@ -5788,10 +5841,10 @@
           <w:tcPr>
             <w:tcW w:type="dxa" w:w="1542"/>
             <w:tcBorders>
-              <w:top w:val="single" w:color="C9D3E3" w:sz="4"/>
-              <w:left w:val="single" w:color="C9D3E3" w:sz="4"/>
-              <w:bottom w:val="single" w:color="C9D3E3" w:sz="4"/>
-              <w:right w:val="single" w:color="C9D3E3" w:sz="4"/>
+              <w:top w:val="single" w:color="C9C9D6" w:sz="4"/>
+              <w:left w:val="single" w:color="C9C9D6" w:sz="4"/>
+              <w:bottom w:val="single" w:color="C9C9D6" w:sz="4"/>
+              <w:right w:val="single" w:color="C9C9D6" w:sz="4"/>
             </w:tcBorders>
             <w:tcMar>
               <w:top w:type="dxa" w:w="60"/>
@@ -5823,10 +5876,10 @@
           <w:tcPr>
             <w:tcW w:type="dxa" w:w="2313"/>
             <w:tcBorders>
-              <w:top w:val="single" w:color="C9D3E3" w:sz="4"/>
-              <w:left w:val="single" w:color="C9D3E3" w:sz="4"/>
-              <w:bottom w:val="single" w:color="C9D3E3" w:sz="4"/>
-              <w:right w:val="single" w:color="C9D3E3" w:sz="4"/>
+              <w:top w:val="single" w:color="C9C9D6" w:sz="4"/>
+              <w:left w:val="single" w:color="C9C9D6" w:sz="4"/>
+              <w:bottom w:val="single" w:color="C9C9D6" w:sz="4"/>
+              <w:right w:val="single" w:color="C9C9D6" w:sz="4"/>
             </w:tcBorders>
             <w:tcMar>
               <w:top w:type="dxa" w:w="60"/>
@@ -5858,10 +5911,10 @@
           <w:tcPr>
             <w:tcW w:type="dxa" w:w="3276"/>
             <w:tcBorders>
-              <w:top w:val="single" w:color="C9D3E3" w:sz="4"/>
-              <w:left w:val="single" w:color="C9D3E3" w:sz="4"/>
-              <w:bottom w:val="single" w:color="C9D3E3" w:sz="4"/>
-              <w:right w:val="single" w:color="C9D3E3" w:sz="4"/>
+              <w:top w:val="single" w:color="C9C9D6" w:sz="4"/>
+              <w:left w:val="single" w:color="C9C9D6" w:sz="4"/>
+              <w:bottom w:val="single" w:color="C9C9D6" w:sz="4"/>
+              <w:right w:val="single" w:color="C9C9D6" w:sz="4"/>
             </w:tcBorders>
             <w:tcMar>
               <w:top w:type="dxa" w:w="60"/>
@@ -5893,10 +5946,10 @@
           <w:tcPr>
             <w:tcW w:type="dxa" w:w="2507"/>
             <w:tcBorders>
-              <w:top w:val="single" w:color="C9D3E3" w:sz="4"/>
-              <w:left w:val="single" w:color="C9D3E3" w:sz="4"/>
-              <w:bottom w:val="single" w:color="C9D3E3" w:sz="4"/>
-              <w:right w:val="single" w:color="C9D3E3" w:sz="4"/>
+              <w:top w:val="single" w:color="C9C9D6" w:sz="4"/>
+              <w:left w:val="single" w:color="C9C9D6" w:sz="4"/>
+              <w:bottom w:val="single" w:color="C9C9D6" w:sz="4"/>
+              <w:right w:val="single" w:color="C9C9D6" w:sz="4"/>
             </w:tcBorders>
             <w:tcMar>
               <w:top w:type="dxa" w:w="60"/>
@@ -5934,10 +5987,10 @@
           <w:tcPr>
             <w:tcW w:type="dxa" w:w="1542"/>
             <w:tcBorders>
-              <w:top w:val="single" w:color="C9D3E3" w:sz="4"/>
-              <w:left w:val="single" w:color="C9D3E3" w:sz="4"/>
-              <w:bottom w:val="single" w:color="C9D3E3" w:sz="4"/>
-              <w:right w:val="single" w:color="C9D3E3" w:sz="4"/>
+              <w:top w:val="single" w:color="C9C9D6" w:sz="4"/>
+              <w:left w:val="single" w:color="C9C9D6" w:sz="4"/>
+              <w:bottom w:val="single" w:color="C9C9D6" w:sz="4"/>
+              <w:right w:val="single" w:color="C9C9D6" w:sz="4"/>
             </w:tcBorders>
             <w:tcMar>
               <w:top w:type="dxa" w:w="60"/>
@@ -5969,10 +6022,10 @@
           <w:tcPr>
             <w:tcW w:type="dxa" w:w="2313"/>
             <w:tcBorders>
-              <w:top w:val="single" w:color="C9D3E3" w:sz="4"/>
-              <w:left w:val="single" w:color="C9D3E3" w:sz="4"/>
-              <w:bottom w:val="single" w:color="C9D3E3" w:sz="4"/>
-              <w:right w:val="single" w:color="C9D3E3" w:sz="4"/>
+              <w:top w:val="single" w:color="C9C9D6" w:sz="4"/>
+              <w:left w:val="single" w:color="C9C9D6" w:sz="4"/>
+              <w:bottom w:val="single" w:color="C9C9D6" w:sz="4"/>
+              <w:right w:val="single" w:color="C9C9D6" w:sz="4"/>
             </w:tcBorders>
             <w:tcMar>
               <w:top w:type="dxa" w:w="60"/>
@@ -6004,10 +6057,10 @@
           <w:tcPr>
             <w:tcW w:type="dxa" w:w="3276"/>
             <w:tcBorders>
-              <w:top w:val="single" w:color="C9D3E3" w:sz="4"/>
-              <w:left w:val="single" w:color="C9D3E3" w:sz="4"/>
-              <w:bottom w:val="single" w:color="C9D3E3" w:sz="4"/>
-              <w:right w:val="single" w:color="C9D3E3" w:sz="4"/>
+              <w:top w:val="single" w:color="C9C9D6" w:sz="4"/>
+              <w:left w:val="single" w:color="C9C9D6" w:sz="4"/>
+              <w:bottom w:val="single" w:color="C9C9D6" w:sz="4"/>
+              <w:right w:val="single" w:color="C9C9D6" w:sz="4"/>
             </w:tcBorders>
             <w:tcMar>
               <w:top w:type="dxa" w:w="60"/>
@@ -6039,10 +6092,10 @@
           <w:tcPr>
             <w:tcW w:type="dxa" w:w="2507"/>
             <w:tcBorders>
-              <w:top w:val="single" w:color="C9D3E3" w:sz="4"/>
-              <w:left w:val="single" w:color="C9D3E3" w:sz="4"/>
-              <w:bottom w:val="single" w:color="C9D3E3" w:sz="4"/>
-              <w:right w:val="single" w:color="C9D3E3" w:sz="4"/>
+              <w:top w:val="single" w:color="C9C9D6" w:sz="4"/>
+              <w:left w:val="single" w:color="C9C9D6" w:sz="4"/>
+              <w:bottom w:val="single" w:color="C9C9D6" w:sz="4"/>
+              <w:right w:val="single" w:color="C9C9D6" w:sz="4"/>
             </w:tcBorders>
             <w:tcMar>
               <w:top w:type="dxa" w:w="60"/>
@@ -6094,14 +6147,17 @@
     <w:p>
       <w:pPr>
         <w:pStyle w:val="Heading1"/>
-        <w:spacing w:after="160" w:before="360"/>
+        <w:pBdr>
+          <w:bottom w:val="single" w:color="FF4000" w:sz="12" w:space="4"/>
+        </w:pBdr>
+        <w:spacing w:after="200" w:before="360"/>
       </w:pPr>
       <w:r>
         <w:rPr>
           <w:rFonts w:ascii="Arial" w:cs="Arial" w:eastAsia="Arial" w:hAnsi="Arial"/>
           <w:b/>
           <w:bCs/>
-          <w:color w:val="1F3B73"/>
+          <w:color w:val="010222"/>
           <w:sz w:val="30"/>
           <w:szCs w:val="30"/>
         </w:rPr>
@@ -6225,14 +6281,17 @@
     <w:p>
       <w:pPr>
         <w:pStyle w:val="Heading1"/>
-        <w:spacing w:after="160" w:before="360"/>
+        <w:pBdr>
+          <w:bottom w:val="single" w:color="FF4000" w:sz="12" w:space="4"/>
+        </w:pBdr>
+        <w:spacing w:after="200" w:before="360"/>
       </w:pPr>
       <w:r>
         <w:rPr>
           <w:rFonts w:ascii="Arial" w:cs="Arial" w:eastAsia="Arial" w:hAnsi="Arial"/>
           <w:b/>
           <w:bCs/>
-          <w:color w:val="1F3B73"/>
+          <w:color w:val="010222"/>
           <w:sz w:val="30"/>
           <w:szCs w:val="30"/>
         </w:rPr>
@@ -6264,12 +6323,12 @@
           <w:tcPr>
             <w:tcW w:type="dxa" w:w="2120"/>
             <w:tcBorders>
-              <w:top w:val="single" w:color="C9D3E3" w:sz="4"/>
-              <w:left w:val="single" w:color="C9D3E3" w:sz="4"/>
-              <w:bottom w:val="single" w:color="C9D3E3" w:sz="4"/>
-              <w:right w:val="single" w:color="C9D3E3" w:sz="4"/>
-            </w:tcBorders>
-            <w:shd w:fill="1F3B73" w:color="auto" w:val="clear"/>
+              <w:top w:val="single" w:color="C9C9D6" w:sz="4"/>
+              <w:left w:val="single" w:color="C9C9D6" w:sz="4"/>
+              <w:bottom w:val="single" w:color="C9C9D6" w:sz="4"/>
+              <w:right w:val="single" w:color="C9C9D6" w:sz="4"/>
+            </w:tcBorders>
+            <w:shd w:fill="010222" w:color="auto" w:val="clear"/>
             <w:tcMar>
               <w:top w:type="dxa" w:w="60"/>
               <w:left w:type="dxa" w:w="90"/>
@@ -6300,12 +6359,12 @@
           <w:tcPr>
             <w:tcW w:type="dxa" w:w="7518"/>
             <w:tcBorders>
-              <w:top w:val="single" w:color="C9D3E3" w:sz="4"/>
-              <w:left w:val="single" w:color="C9D3E3" w:sz="4"/>
-              <w:bottom w:val="single" w:color="C9D3E3" w:sz="4"/>
-              <w:right w:val="single" w:color="C9D3E3" w:sz="4"/>
-            </w:tcBorders>
-            <w:shd w:fill="1F3B73" w:color="auto" w:val="clear"/>
+              <w:top w:val="single" w:color="C9C9D6" w:sz="4"/>
+              <w:left w:val="single" w:color="C9C9D6" w:sz="4"/>
+              <w:bottom w:val="single" w:color="C9C9D6" w:sz="4"/>
+              <w:right w:val="single" w:color="C9C9D6" w:sz="4"/>
+            </w:tcBorders>
+            <w:shd w:fill="010222" w:color="auto" w:val="clear"/>
             <w:tcMar>
               <w:top w:type="dxa" w:w="60"/>
               <w:left w:type="dxa" w:w="90"/>
@@ -6342,10 +6401,10 @@
           <w:tcPr>
             <w:tcW w:type="dxa" w:w="2120"/>
             <w:tcBorders>
-              <w:top w:val="single" w:color="C9D3E3" w:sz="4"/>
-              <w:left w:val="single" w:color="C9D3E3" w:sz="4"/>
-              <w:bottom w:val="single" w:color="C9D3E3" w:sz="4"/>
-              <w:right w:val="single" w:color="C9D3E3" w:sz="4"/>
+              <w:top w:val="single" w:color="C9C9D6" w:sz="4"/>
+              <w:left w:val="single" w:color="C9C9D6" w:sz="4"/>
+              <w:bottom w:val="single" w:color="C9C9D6" w:sz="4"/>
+              <w:right w:val="single" w:color="C9C9D6" w:sz="4"/>
             </w:tcBorders>
             <w:tcMar>
               <w:top w:type="dxa" w:w="60"/>
@@ -6377,10 +6436,10 @@
           <w:tcPr>
             <w:tcW w:type="dxa" w:w="7518"/>
             <w:tcBorders>
-              <w:top w:val="single" w:color="C9D3E3" w:sz="4"/>
-              <w:left w:val="single" w:color="C9D3E3" w:sz="4"/>
-              <w:bottom w:val="single" w:color="C9D3E3" w:sz="4"/>
-              <w:right w:val="single" w:color="C9D3E3" w:sz="4"/>
+              <w:top w:val="single" w:color="C9C9D6" w:sz="4"/>
+              <w:left w:val="single" w:color="C9C9D6" w:sz="4"/>
+              <w:bottom w:val="single" w:color="C9C9D6" w:sz="4"/>
+              <w:right w:val="single" w:color="C9C9D6" w:sz="4"/>
             </w:tcBorders>
             <w:tcMar>
               <w:top w:type="dxa" w:w="60"/>
@@ -6418,10 +6477,10 @@
           <w:tcPr>
             <w:tcW w:type="dxa" w:w="2120"/>
             <w:tcBorders>
-              <w:top w:val="single" w:color="C9D3E3" w:sz="4"/>
-              <w:left w:val="single" w:color="C9D3E3" w:sz="4"/>
-              <w:bottom w:val="single" w:color="C9D3E3" w:sz="4"/>
-              <w:right w:val="single" w:color="C9D3E3" w:sz="4"/>
+              <w:top w:val="single" w:color="C9C9D6" w:sz="4"/>
+              <w:left w:val="single" w:color="C9C9D6" w:sz="4"/>
+              <w:bottom w:val="single" w:color="C9C9D6" w:sz="4"/>
+              <w:right w:val="single" w:color="C9C9D6" w:sz="4"/>
             </w:tcBorders>
             <w:tcMar>
               <w:top w:type="dxa" w:w="60"/>
@@ -6453,10 +6512,10 @@
           <w:tcPr>
             <w:tcW w:type="dxa" w:w="7518"/>
             <w:tcBorders>
-              <w:top w:val="single" w:color="C9D3E3" w:sz="4"/>
-              <w:left w:val="single" w:color="C9D3E3" w:sz="4"/>
-              <w:bottom w:val="single" w:color="C9D3E3" w:sz="4"/>
-              <w:right w:val="single" w:color="C9D3E3" w:sz="4"/>
+              <w:top w:val="single" w:color="C9C9D6" w:sz="4"/>
+              <w:left w:val="single" w:color="C9C9D6" w:sz="4"/>
+              <w:bottom w:val="single" w:color="C9C9D6" w:sz="4"/>
+              <w:right w:val="single" w:color="C9C9D6" w:sz="4"/>
             </w:tcBorders>
             <w:tcMar>
               <w:top w:type="dxa" w:w="60"/>
@@ -6494,10 +6553,10 @@
           <w:tcPr>
             <w:tcW w:type="dxa" w:w="2120"/>
             <w:tcBorders>
-              <w:top w:val="single" w:color="C9D3E3" w:sz="4"/>
-              <w:left w:val="single" w:color="C9D3E3" w:sz="4"/>
-              <w:bottom w:val="single" w:color="C9D3E3" w:sz="4"/>
-              <w:right w:val="single" w:color="C9D3E3" w:sz="4"/>
+              <w:top w:val="single" w:color="C9C9D6" w:sz="4"/>
+              <w:left w:val="single" w:color="C9C9D6" w:sz="4"/>
+              <w:bottom w:val="single" w:color="C9C9D6" w:sz="4"/>
+              <w:right w:val="single" w:color="C9C9D6" w:sz="4"/>
             </w:tcBorders>
             <w:tcMar>
               <w:top w:type="dxa" w:w="60"/>
@@ -6529,10 +6588,10 @@
           <w:tcPr>
             <w:tcW w:type="dxa" w:w="7518"/>
             <w:tcBorders>
-              <w:top w:val="single" w:color="C9D3E3" w:sz="4"/>
-              <w:left w:val="single" w:color="C9D3E3" w:sz="4"/>
-              <w:bottom w:val="single" w:color="C9D3E3" w:sz="4"/>
-              <w:right w:val="single" w:color="C9D3E3" w:sz="4"/>
+              <w:top w:val="single" w:color="C9C9D6" w:sz="4"/>
+              <w:left w:val="single" w:color="C9C9D6" w:sz="4"/>
+              <w:bottom w:val="single" w:color="C9C9D6" w:sz="4"/>
+              <w:right w:val="single" w:color="C9C9D6" w:sz="4"/>
             </w:tcBorders>
             <w:tcMar>
               <w:top w:type="dxa" w:w="60"/>
@@ -6570,10 +6629,10 @@
           <w:tcPr>
             <w:tcW w:type="dxa" w:w="2120"/>
             <w:tcBorders>
-              <w:top w:val="single" w:color="C9D3E3" w:sz="4"/>
-              <w:left w:val="single" w:color="C9D3E3" w:sz="4"/>
-              <w:bottom w:val="single" w:color="C9D3E3" w:sz="4"/>
-              <w:right w:val="single" w:color="C9D3E3" w:sz="4"/>
+              <w:top w:val="single" w:color="C9C9D6" w:sz="4"/>
+              <w:left w:val="single" w:color="C9C9D6" w:sz="4"/>
+              <w:bottom w:val="single" w:color="C9C9D6" w:sz="4"/>
+              <w:right w:val="single" w:color="C9C9D6" w:sz="4"/>
             </w:tcBorders>
             <w:tcMar>
               <w:top w:type="dxa" w:w="60"/>
@@ -6605,10 +6664,10 @@
           <w:tcPr>
             <w:tcW w:type="dxa" w:w="7518"/>
             <w:tcBorders>
-              <w:top w:val="single" w:color="C9D3E3" w:sz="4"/>
-              <w:left w:val="single" w:color="C9D3E3" w:sz="4"/>
-              <w:bottom w:val="single" w:color="C9D3E3" w:sz="4"/>
-              <w:right w:val="single" w:color="C9D3E3" w:sz="4"/>
+              <w:top w:val="single" w:color="C9C9D6" w:sz="4"/>
+              <w:left w:val="single" w:color="C9C9D6" w:sz="4"/>
+              <w:bottom w:val="single" w:color="C9C9D6" w:sz="4"/>
+              <w:right w:val="single" w:color="C9C9D6" w:sz="4"/>
             </w:tcBorders>
             <w:tcMar>
               <w:top w:type="dxa" w:w="60"/>
@@ -6646,10 +6705,10 @@
           <w:tcPr>
             <w:tcW w:type="dxa" w:w="2120"/>
             <w:tcBorders>
-              <w:top w:val="single" w:color="C9D3E3" w:sz="4"/>
-              <w:left w:val="single" w:color="C9D3E3" w:sz="4"/>
-              <w:bottom w:val="single" w:color="C9D3E3" w:sz="4"/>
-              <w:right w:val="single" w:color="C9D3E3" w:sz="4"/>
+              <w:top w:val="single" w:color="C9C9D6" w:sz="4"/>
+              <w:left w:val="single" w:color="C9C9D6" w:sz="4"/>
+              <w:bottom w:val="single" w:color="C9C9D6" w:sz="4"/>
+              <w:right w:val="single" w:color="C9C9D6" w:sz="4"/>
             </w:tcBorders>
             <w:tcMar>
               <w:top w:type="dxa" w:w="60"/>
@@ -6681,10 +6740,10 @@
           <w:tcPr>
             <w:tcW w:type="dxa" w:w="7518"/>
             <w:tcBorders>
-              <w:top w:val="single" w:color="C9D3E3" w:sz="4"/>
-              <w:left w:val="single" w:color="C9D3E3" w:sz="4"/>
-              <w:bottom w:val="single" w:color="C9D3E3" w:sz="4"/>
-              <w:right w:val="single" w:color="C9D3E3" w:sz="4"/>
+              <w:top w:val="single" w:color="C9C9D6" w:sz="4"/>
+              <w:left w:val="single" w:color="C9C9D6" w:sz="4"/>
+              <w:bottom w:val="single" w:color="C9C9D6" w:sz="4"/>
+              <w:right w:val="single" w:color="C9C9D6" w:sz="4"/>
             </w:tcBorders>
             <w:tcMar>
               <w:top w:type="dxa" w:w="60"/>
@@ -6722,10 +6781,10 @@
           <w:tcPr>
             <w:tcW w:type="dxa" w:w="2120"/>
             <w:tcBorders>
-              <w:top w:val="single" w:color="C9D3E3" w:sz="4"/>
-              <w:left w:val="single" w:color="C9D3E3" w:sz="4"/>
-              <w:bottom w:val="single" w:color="C9D3E3" w:sz="4"/>
-              <w:right w:val="single" w:color="C9D3E3" w:sz="4"/>
+              <w:top w:val="single" w:color="C9C9D6" w:sz="4"/>
+              <w:left w:val="single" w:color="C9C9D6" w:sz="4"/>
+              <w:bottom w:val="single" w:color="C9C9D6" w:sz="4"/>
+              <w:right w:val="single" w:color="C9C9D6" w:sz="4"/>
             </w:tcBorders>
             <w:tcMar>
               <w:top w:type="dxa" w:w="60"/>
@@ -6757,10 +6816,10 @@
           <w:tcPr>
             <w:tcW w:type="dxa" w:w="7518"/>
             <w:tcBorders>
-              <w:top w:val="single" w:color="C9D3E3" w:sz="4"/>
-              <w:left w:val="single" w:color="C9D3E3" w:sz="4"/>
-              <w:bottom w:val="single" w:color="C9D3E3" w:sz="4"/>
-              <w:right w:val="single" w:color="C9D3E3" w:sz="4"/>
+              <w:top w:val="single" w:color="C9C9D6" w:sz="4"/>
+              <w:left w:val="single" w:color="C9C9D6" w:sz="4"/>
+              <w:bottom w:val="single" w:color="C9C9D6" w:sz="4"/>
+              <w:right w:val="single" w:color="C9C9D6" w:sz="4"/>
             </w:tcBorders>
             <w:tcMar>
               <w:top w:type="dxa" w:w="60"/>
@@ -6798,14 +6857,17 @@
     <w:p>
       <w:pPr>
         <w:pStyle w:val="Heading1"/>
-        <w:spacing w:after="160" w:before="360"/>
+        <w:pBdr>
+          <w:bottom w:val="single" w:color="FF4000" w:sz="12" w:space="4"/>
+        </w:pBdr>
+        <w:spacing w:after="200" w:before="360"/>
       </w:pPr>
       <w:r>
         <w:rPr>
           <w:rFonts w:ascii="Arial" w:cs="Arial" w:eastAsia="Arial" w:hAnsi="Arial"/>
           <w:b/>
           <w:bCs/>
-          <w:color w:val="1F3B73"/>
+          <w:color w:val="010222"/>
           <w:sz w:val="30"/>
           <w:szCs w:val="30"/>
         </w:rPr>
@@ -6851,12 +6913,12 @@
           <w:tcPr>
             <w:tcW w:type="dxa" w:w="2891"/>
             <w:tcBorders>
-              <w:top w:val="single" w:color="C9D3E3" w:sz="4"/>
-              <w:left w:val="single" w:color="C9D3E3" w:sz="4"/>
-              <w:bottom w:val="single" w:color="C9D3E3" w:sz="4"/>
-              <w:right w:val="single" w:color="C9D3E3" w:sz="4"/>
-            </w:tcBorders>
-            <w:shd w:fill="1F3B73" w:color="auto" w:val="clear"/>
+              <w:top w:val="single" w:color="C9C9D6" w:sz="4"/>
+              <w:left w:val="single" w:color="C9C9D6" w:sz="4"/>
+              <w:bottom w:val="single" w:color="C9C9D6" w:sz="4"/>
+              <w:right w:val="single" w:color="C9C9D6" w:sz="4"/>
+            </w:tcBorders>
+            <w:shd w:fill="010222" w:color="auto" w:val="clear"/>
             <w:tcMar>
               <w:top w:type="dxa" w:w="60"/>
               <w:left w:type="dxa" w:w="90"/>
@@ -6887,12 +6949,12 @@
           <w:tcPr>
             <w:tcW w:type="dxa" w:w="6747"/>
             <w:tcBorders>
-              <w:top w:val="single" w:color="C9D3E3" w:sz="4"/>
-              <w:left w:val="single" w:color="C9D3E3" w:sz="4"/>
-              <w:bottom w:val="single" w:color="C9D3E3" w:sz="4"/>
-              <w:right w:val="single" w:color="C9D3E3" w:sz="4"/>
-            </w:tcBorders>
-            <w:shd w:fill="1F3B73" w:color="auto" w:val="clear"/>
+              <w:top w:val="single" w:color="C9C9D6" w:sz="4"/>
+              <w:left w:val="single" w:color="C9C9D6" w:sz="4"/>
+              <w:bottom w:val="single" w:color="C9C9D6" w:sz="4"/>
+              <w:right w:val="single" w:color="C9C9D6" w:sz="4"/>
+            </w:tcBorders>
+            <w:shd w:fill="010222" w:color="auto" w:val="clear"/>
             <w:tcMar>
               <w:top w:type="dxa" w:w="60"/>
               <w:left w:type="dxa" w:w="90"/>
@@ -6929,10 +6991,10 @@
           <w:tcPr>
             <w:tcW w:type="dxa" w:w="2891"/>
             <w:tcBorders>
-              <w:top w:val="single" w:color="C9D3E3" w:sz="4"/>
-              <w:left w:val="single" w:color="C9D3E3" w:sz="4"/>
-              <w:bottom w:val="single" w:color="C9D3E3" w:sz="4"/>
-              <w:right w:val="single" w:color="C9D3E3" w:sz="4"/>
+              <w:top w:val="single" w:color="C9C9D6" w:sz="4"/>
+              <w:left w:val="single" w:color="C9C9D6" w:sz="4"/>
+              <w:bottom w:val="single" w:color="C9C9D6" w:sz="4"/>
+              <w:right w:val="single" w:color="C9C9D6" w:sz="4"/>
             </w:tcBorders>
             <w:tcMar>
               <w:top w:type="dxa" w:w="60"/>
@@ -6964,10 +7026,10 @@
           <w:tcPr>
             <w:tcW w:type="dxa" w:w="6747"/>
             <w:tcBorders>
-              <w:top w:val="single" w:color="C9D3E3" w:sz="4"/>
-              <w:left w:val="single" w:color="C9D3E3" w:sz="4"/>
-              <w:bottom w:val="single" w:color="C9D3E3" w:sz="4"/>
-              <w:right w:val="single" w:color="C9D3E3" w:sz="4"/>
+              <w:top w:val="single" w:color="C9C9D6" w:sz="4"/>
+              <w:left w:val="single" w:color="C9C9D6" w:sz="4"/>
+              <w:bottom w:val="single" w:color="C9C9D6" w:sz="4"/>
+              <w:right w:val="single" w:color="C9C9D6" w:sz="4"/>
             </w:tcBorders>
             <w:tcMar>
               <w:top w:type="dxa" w:w="60"/>
@@ -7005,10 +7067,10 @@
           <w:tcPr>
             <w:tcW w:type="dxa" w:w="2891"/>
             <w:tcBorders>
-              <w:top w:val="single" w:color="C9D3E3" w:sz="4"/>
-              <w:left w:val="single" w:color="C9D3E3" w:sz="4"/>
-              <w:bottom w:val="single" w:color="C9D3E3" w:sz="4"/>
-              <w:right w:val="single" w:color="C9D3E3" w:sz="4"/>
+              <w:top w:val="single" w:color="C9C9D6" w:sz="4"/>
+              <w:left w:val="single" w:color="C9C9D6" w:sz="4"/>
+              <w:bottom w:val="single" w:color="C9C9D6" w:sz="4"/>
+              <w:right w:val="single" w:color="C9C9D6" w:sz="4"/>
             </w:tcBorders>
             <w:tcMar>
               <w:top w:type="dxa" w:w="60"/>
@@ -7040,10 +7102,10 @@
           <w:tcPr>
             <w:tcW w:type="dxa" w:w="6747"/>
             <w:tcBorders>
-              <w:top w:val="single" w:color="C9D3E3" w:sz="4"/>
-              <w:left w:val="single" w:color="C9D3E3" w:sz="4"/>
-              <w:bottom w:val="single" w:color="C9D3E3" w:sz="4"/>
-              <w:right w:val="single" w:color="C9D3E3" w:sz="4"/>
+              <w:top w:val="single" w:color="C9C9D6" w:sz="4"/>
+              <w:left w:val="single" w:color="C9C9D6" w:sz="4"/>
+              <w:bottom w:val="single" w:color="C9C9D6" w:sz="4"/>
+              <w:right w:val="single" w:color="C9C9D6" w:sz="4"/>
             </w:tcBorders>
             <w:tcMar>
               <w:top w:type="dxa" w:w="60"/>
@@ -7081,10 +7143,10 @@
           <w:tcPr>
             <w:tcW w:type="dxa" w:w="2891"/>
             <w:tcBorders>
-              <w:top w:val="single" w:color="C9D3E3" w:sz="4"/>
-              <w:left w:val="single" w:color="C9D3E3" w:sz="4"/>
-              <w:bottom w:val="single" w:color="C9D3E3" w:sz="4"/>
-              <w:right w:val="single" w:color="C9D3E3" w:sz="4"/>
+              <w:top w:val="single" w:color="C9C9D6" w:sz="4"/>
+              <w:left w:val="single" w:color="C9C9D6" w:sz="4"/>
+              <w:bottom w:val="single" w:color="C9C9D6" w:sz="4"/>
+              <w:right w:val="single" w:color="C9C9D6" w:sz="4"/>
             </w:tcBorders>
             <w:tcMar>
               <w:top w:type="dxa" w:w="60"/>
@@ -7116,10 +7178,10 @@
           <w:tcPr>
             <w:tcW w:type="dxa" w:w="6747"/>
             <w:tcBorders>
-              <w:top w:val="single" w:color="C9D3E3" w:sz="4"/>
-              <w:left w:val="single" w:color="C9D3E3" w:sz="4"/>
-              <w:bottom w:val="single" w:color="C9D3E3" w:sz="4"/>
-              <w:right w:val="single" w:color="C9D3E3" w:sz="4"/>
+              <w:top w:val="single" w:color="C9C9D6" w:sz="4"/>
+              <w:left w:val="single" w:color="C9C9D6" w:sz="4"/>
+              <w:bottom w:val="single" w:color="C9C9D6" w:sz="4"/>
+              <w:right w:val="single" w:color="C9C9D6" w:sz="4"/>
             </w:tcBorders>
             <w:tcMar>
               <w:top w:type="dxa" w:w="60"/>
@@ -7157,10 +7219,10 @@
           <w:tcPr>
             <w:tcW w:type="dxa" w:w="2891"/>
             <w:tcBorders>
-              <w:top w:val="single" w:color="C9D3E3" w:sz="4"/>
-              <w:left w:val="single" w:color="C9D3E3" w:sz="4"/>
-              <w:bottom w:val="single" w:color="C9D3E3" w:sz="4"/>
-              <w:right w:val="single" w:color="C9D3E3" w:sz="4"/>
+              <w:top w:val="single" w:color="C9C9D6" w:sz="4"/>
+              <w:left w:val="single" w:color="C9C9D6" w:sz="4"/>
+              <w:bottom w:val="single" w:color="C9C9D6" w:sz="4"/>
+              <w:right w:val="single" w:color="C9C9D6" w:sz="4"/>
             </w:tcBorders>
             <w:tcMar>
               <w:top w:type="dxa" w:w="60"/>
@@ -7192,10 +7254,10 @@
           <w:tcPr>
             <w:tcW w:type="dxa" w:w="6747"/>
             <w:tcBorders>
-              <w:top w:val="single" w:color="C9D3E3" w:sz="4"/>
-              <w:left w:val="single" w:color="C9D3E3" w:sz="4"/>
-              <w:bottom w:val="single" w:color="C9D3E3" w:sz="4"/>
-              <w:right w:val="single" w:color="C9D3E3" w:sz="4"/>
+              <w:top w:val="single" w:color="C9C9D6" w:sz="4"/>
+              <w:left w:val="single" w:color="C9C9D6" w:sz="4"/>
+              <w:bottom w:val="single" w:color="C9C9D6" w:sz="4"/>
+              <w:right w:val="single" w:color="C9C9D6" w:sz="4"/>
             </w:tcBorders>
             <w:tcMar>
               <w:top w:type="dxa" w:w="60"/>
@@ -7233,10 +7295,10 @@
           <w:tcPr>
             <w:tcW w:type="dxa" w:w="2891"/>
             <w:tcBorders>
-              <w:top w:val="single" w:color="C9D3E3" w:sz="4"/>
-              <w:left w:val="single" w:color="C9D3E3" w:sz="4"/>
-              <w:bottom w:val="single" w:color="C9D3E3" w:sz="4"/>
-              <w:right w:val="single" w:color="C9D3E3" w:sz="4"/>
+              <w:top w:val="single" w:color="C9C9D6" w:sz="4"/>
+              <w:left w:val="single" w:color="C9C9D6" w:sz="4"/>
+              <w:bottom w:val="single" w:color="C9C9D6" w:sz="4"/>
+              <w:right w:val="single" w:color="C9C9D6" w:sz="4"/>
             </w:tcBorders>
             <w:tcMar>
               <w:top w:type="dxa" w:w="60"/>
@@ -7268,10 +7330,10 @@
           <w:tcPr>
             <w:tcW w:type="dxa" w:w="6747"/>
             <w:tcBorders>
-              <w:top w:val="single" w:color="C9D3E3" w:sz="4"/>
-              <w:left w:val="single" w:color="C9D3E3" w:sz="4"/>
-              <w:bottom w:val="single" w:color="C9D3E3" w:sz="4"/>
-              <w:right w:val="single" w:color="C9D3E3" w:sz="4"/>
+              <w:top w:val="single" w:color="C9C9D6" w:sz="4"/>
+              <w:left w:val="single" w:color="C9C9D6" w:sz="4"/>
+              <w:bottom w:val="single" w:color="C9C9D6" w:sz="4"/>
+              <w:right w:val="single" w:color="C9C9D6" w:sz="4"/>
             </w:tcBorders>
             <w:tcMar>
               <w:top w:type="dxa" w:w="60"/>
@@ -7349,12 +7411,12 @@
           <w:tcPr>
             <w:tcW w:type="dxa" w:w="3276"/>
             <w:tcBorders>
-              <w:top w:val="single" w:color="C9D3E3" w:sz="4"/>
-              <w:left w:val="single" w:color="C9D3E3" w:sz="4"/>
-              <w:bottom w:val="single" w:color="C9D3E3" w:sz="4"/>
-              <w:right w:val="single" w:color="C9D3E3" w:sz="4"/>
-            </w:tcBorders>
-            <w:shd w:fill="1F3B73" w:color="auto" w:val="clear"/>
+              <w:top w:val="single" w:color="C9C9D6" w:sz="4"/>
+              <w:left w:val="single" w:color="C9C9D6" w:sz="4"/>
+              <w:bottom w:val="single" w:color="C9C9D6" w:sz="4"/>
+              <w:right w:val="single" w:color="C9C9D6" w:sz="4"/>
+            </w:tcBorders>
+            <w:shd w:fill="010222" w:color="auto" w:val="clear"/>
             <w:tcMar>
               <w:top w:type="dxa" w:w="60"/>
               <w:left w:type="dxa" w:w="90"/>
@@ -7385,12 +7447,12 @@
           <w:tcPr>
             <w:tcW w:type="dxa" w:w="1252"/>
             <w:tcBorders>
-              <w:top w:val="single" w:color="C9D3E3" w:sz="4"/>
-              <w:left w:val="single" w:color="C9D3E3" w:sz="4"/>
-              <w:bottom w:val="single" w:color="C9D3E3" w:sz="4"/>
-              <w:right w:val="single" w:color="C9D3E3" w:sz="4"/>
-            </w:tcBorders>
-            <w:shd w:fill="1F3B73" w:color="auto" w:val="clear"/>
+              <w:top w:val="single" w:color="C9C9D6" w:sz="4"/>
+              <w:left w:val="single" w:color="C9C9D6" w:sz="4"/>
+              <w:bottom w:val="single" w:color="C9C9D6" w:sz="4"/>
+              <w:right w:val="single" w:color="C9C9D6" w:sz="4"/>
+            </w:tcBorders>
+            <w:shd w:fill="010222" w:color="auto" w:val="clear"/>
             <w:tcMar>
               <w:top w:type="dxa" w:w="60"/>
               <w:left w:type="dxa" w:w="90"/>
@@ -7421,12 +7483,12 @@
           <w:tcPr>
             <w:tcW w:type="dxa" w:w="1252"/>
             <w:tcBorders>
-              <w:top w:val="single" w:color="C9D3E3" w:sz="4"/>
-              <w:left w:val="single" w:color="C9D3E3" w:sz="4"/>
-              <w:bottom w:val="single" w:color="C9D3E3" w:sz="4"/>
-              <w:right w:val="single" w:color="C9D3E3" w:sz="4"/>
-            </w:tcBorders>
-            <w:shd w:fill="1F3B73" w:color="auto" w:val="clear"/>
+              <w:top w:val="single" w:color="C9C9D6" w:sz="4"/>
+              <w:left w:val="single" w:color="C9C9D6" w:sz="4"/>
+              <w:bottom w:val="single" w:color="C9C9D6" w:sz="4"/>
+              <w:right w:val="single" w:color="C9C9D6" w:sz="4"/>
+            </w:tcBorders>
+            <w:shd w:fill="010222" w:color="auto" w:val="clear"/>
             <w:tcMar>
               <w:top w:type="dxa" w:w="60"/>
               <w:left w:type="dxa" w:w="90"/>
@@ -7457,12 +7519,12 @@
           <w:tcPr>
             <w:tcW w:type="dxa" w:w="1252"/>
             <w:tcBorders>
-              <w:top w:val="single" w:color="C9D3E3" w:sz="4"/>
-              <w:left w:val="single" w:color="C9D3E3" w:sz="4"/>
-              <w:bottom w:val="single" w:color="C9D3E3" w:sz="4"/>
-              <w:right w:val="single" w:color="C9D3E3" w:sz="4"/>
-            </w:tcBorders>
-            <w:shd w:fill="1F3B73" w:color="auto" w:val="clear"/>
+              <w:top w:val="single" w:color="C9C9D6" w:sz="4"/>
+              <w:left w:val="single" w:color="C9C9D6" w:sz="4"/>
+              <w:bottom w:val="single" w:color="C9C9D6" w:sz="4"/>
+              <w:right w:val="single" w:color="C9C9D6" w:sz="4"/>
+            </w:tcBorders>
+            <w:shd w:fill="010222" w:color="auto" w:val="clear"/>
             <w:tcMar>
               <w:top w:type="dxa" w:w="60"/>
               <w:left w:type="dxa" w:w="90"/>
@@ -7493,12 +7555,12 @@
           <w:tcPr>
             <w:tcW w:type="dxa" w:w="1349"/>
             <w:tcBorders>
-              <w:top w:val="single" w:color="C9D3E3" w:sz="4"/>
-              <w:left w:val="single" w:color="C9D3E3" w:sz="4"/>
-              <w:bottom w:val="single" w:color="C9D3E3" w:sz="4"/>
-              <w:right w:val="single" w:color="C9D3E3" w:sz="4"/>
-            </w:tcBorders>
-            <w:shd w:fill="1F3B73" w:color="auto" w:val="clear"/>
+              <w:top w:val="single" w:color="C9C9D6" w:sz="4"/>
+              <w:left w:val="single" w:color="C9C9D6" w:sz="4"/>
+              <w:bottom w:val="single" w:color="C9C9D6" w:sz="4"/>
+              <w:right w:val="single" w:color="C9C9D6" w:sz="4"/>
+            </w:tcBorders>
+            <w:shd w:fill="010222" w:color="auto" w:val="clear"/>
             <w:tcMar>
               <w:top w:type="dxa" w:w="60"/>
               <w:left w:type="dxa" w:w="90"/>
@@ -7529,12 +7591,12 @@
           <w:tcPr>
             <w:tcW w:type="dxa" w:w="1257"/>
             <w:tcBorders>
-              <w:top w:val="single" w:color="C9D3E3" w:sz="4"/>
-              <w:left w:val="single" w:color="C9D3E3" w:sz="4"/>
-              <w:bottom w:val="single" w:color="C9D3E3" w:sz="4"/>
-              <w:right w:val="single" w:color="C9D3E3" w:sz="4"/>
-            </w:tcBorders>
-            <w:shd w:fill="1F3B73" w:color="auto" w:val="clear"/>
+              <w:top w:val="single" w:color="C9C9D6" w:sz="4"/>
+              <w:left w:val="single" w:color="C9C9D6" w:sz="4"/>
+              <w:bottom w:val="single" w:color="C9C9D6" w:sz="4"/>
+              <w:right w:val="single" w:color="C9C9D6" w:sz="4"/>
+            </w:tcBorders>
+            <w:shd w:fill="010222" w:color="auto" w:val="clear"/>
             <w:tcMar>
               <w:top w:type="dxa" w:w="60"/>
               <w:left w:type="dxa" w:w="90"/>
@@ -7571,10 +7633,10 @@
           <w:tcPr>
             <w:tcW w:type="dxa" w:w="3276"/>
             <w:tcBorders>
-              <w:top w:val="single" w:color="C9D3E3" w:sz="4"/>
-              <w:left w:val="single" w:color="C9D3E3" w:sz="4"/>
-              <w:bottom w:val="single" w:color="C9D3E3" w:sz="4"/>
-              <w:right w:val="single" w:color="C9D3E3" w:sz="4"/>
+              <w:top w:val="single" w:color="C9C9D6" w:sz="4"/>
+              <w:left w:val="single" w:color="C9C9D6" w:sz="4"/>
+              <w:bottom w:val="single" w:color="C9C9D6" w:sz="4"/>
+              <w:right w:val="single" w:color="C9C9D6" w:sz="4"/>
             </w:tcBorders>
             <w:tcMar>
               <w:top w:type="dxa" w:w="60"/>
@@ -7606,10 +7668,10 @@
           <w:tcPr>
             <w:tcW w:type="dxa" w:w="1252"/>
             <w:tcBorders>
-              <w:top w:val="single" w:color="C9D3E3" w:sz="4"/>
-              <w:left w:val="single" w:color="C9D3E3" w:sz="4"/>
-              <w:bottom w:val="single" w:color="C9D3E3" w:sz="4"/>
-              <w:right w:val="single" w:color="C9D3E3" w:sz="4"/>
+              <w:top w:val="single" w:color="C9C9D6" w:sz="4"/>
+              <w:left w:val="single" w:color="C9C9D6" w:sz="4"/>
+              <w:bottom w:val="single" w:color="C9C9D6" w:sz="4"/>
+              <w:right w:val="single" w:color="C9C9D6" w:sz="4"/>
             </w:tcBorders>
             <w:tcMar>
               <w:top w:type="dxa" w:w="60"/>
@@ -7641,10 +7703,10 @@
           <w:tcPr>
             <w:tcW w:type="dxa" w:w="1252"/>
             <w:tcBorders>
-              <w:top w:val="single" w:color="C9D3E3" w:sz="4"/>
-              <w:left w:val="single" w:color="C9D3E3" w:sz="4"/>
-              <w:bottom w:val="single" w:color="C9D3E3" w:sz="4"/>
-              <w:right w:val="single" w:color="C9D3E3" w:sz="4"/>
+              <w:top w:val="single" w:color="C9C9D6" w:sz="4"/>
+              <w:left w:val="single" w:color="C9C9D6" w:sz="4"/>
+              <w:bottom w:val="single" w:color="C9C9D6" w:sz="4"/>
+              <w:right w:val="single" w:color="C9C9D6" w:sz="4"/>
             </w:tcBorders>
             <w:tcMar>
               <w:top w:type="dxa" w:w="60"/>
@@ -7676,10 +7738,10 @@
           <w:tcPr>
             <w:tcW w:type="dxa" w:w="1252"/>
             <w:tcBorders>
-              <w:top w:val="single" w:color="C9D3E3" w:sz="4"/>
-              <w:left w:val="single" w:color="C9D3E3" w:sz="4"/>
-              <w:bottom w:val="single" w:color="C9D3E3" w:sz="4"/>
-              <w:right w:val="single" w:color="C9D3E3" w:sz="4"/>
+              <w:top w:val="single" w:color="C9C9D6" w:sz="4"/>
+              <w:left w:val="single" w:color="C9C9D6" w:sz="4"/>
+              <w:bottom w:val="single" w:color="C9C9D6" w:sz="4"/>
+              <w:right w:val="single" w:color="C9C9D6" w:sz="4"/>
             </w:tcBorders>
             <w:tcMar>
               <w:top w:type="dxa" w:w="60"/>
@@ -7711,10 +7773,10 @@
           <w:tcPr>
             <w:tcW w:type="dxa" w:w="1349"/>
             <w:tcBorders>
-              <w:top w:val="single" w:color="C9D3E3" w:sz="4"/>
-              <w:left w:val="single" w:color="C9D3E3" w:sz="4"/>
-              <w:bottom w:val="single" w:color="C9D3E3" w:sz="4"/>
-              <w:right w:val="single" w:color="C9D3E3" w:sz="4"/>
+              <w:top w:val="single" w:color="C9C9D6" w:sz="4"/>
+              <w:left w:val="single" w:color="C9C9D6" w:sz="4"/>
+              <w:bottom w:val="single" w:color="C9C9D6" w:sz="4"/>
+              <w:right w:val="single" w:color="C9C9D6" w:sz="4"/>
             </w:tcBorders>
             <w:tcMar>
               <w:top w:type="dxa" w:w="60"/>
@@ -7746,10 +7808,10 @@
           <w:tcPr>
             <w:tcW w:type="dxa" w:w="1257"/>
             <w:tcBorders>
-              <w:top w:val="single" w:color="C9D3E3" w:sz="4"/>
-              <w:left w:val="single" w:color="C9D3E3" w:sz="4"/>
-              <w:bottom w:val="single" w:color="C9D3E3" w:sz="4"/>
-              <w:right w:val="single" w:color="C9D3E3" w:sz="4"/>
+              <w:top w:val="single" w:color="C9C9D6" w:sz="4"/>
+              <w:left w:val="single" w:color="C9C9D6" w:sz="4"/>
+              <w:bottom w:val="single" w:color="C9C9D6" w:sz="4"/>
+              <w:right w:val="single" w:color="C9C9D6" w:sz="4"/>
             </w:tcBorders>
             <w:tcMar>
               <w:top w:type="dxa" w:w="60"/>
@@ -7787,10 +7849,10 @@
           <w:tcPr>
             <w:tcW w:type="dxa" w:w="3276"/>
             <w:tcBorders>
-              <w:top w:val="single" w:color="C9D3E3" w:sz="4"/>
-              <w:left w:val="single" w:color="C9D3E3" w:sz="4"/>
-              <w:bottom w:val="single" w:color="C9D3E3" w:sz="4"/>
-              <w:right w:val="single" w:color="C9D3E3" w:sz="4"/>
+              <w:top w:val="single" w:color="C9C9D6" w:sz="4"/>
+              <w:left w:val="single" w:color="C9C9D6" w:sz="4"/>
+              <w:bottom w:val="single" w:color="C9C9D6" w:sz="4"/>
+              <w:right w:val="single" w:color="C9C9D6" w:sz="4"/>
             </w:tcBorders>
             <w:tcMar>
               <w:top w:type="dxa" w:w="60"/>
@@ -7822,10 +7884,10 @@
           <w:tcPr>
             <w:tcW w:type="dxa" w:w="1252"/>
             <w:tcBorders>
-              <w:top w:val="single" w:color="C9D3E3" w:sz="4"/>
-              <w:left w:val="single" w:color="C9D3E3" w:sz="4"/>
-              <w:bottom w:val="single" w:color="C9D3E3" w:sz="4"/>
-              <w:right w:val="single" w:color="C9D3E3" w:sz="4"/>
+              <w:top w:val="single" w:color="C9C9D6" w:sz="4"/>
+              <w:left w:val="single" w:color="C9C9D6" w:sz="4"/>
+              <w:bottom w:val="single" w:color="C9C9D6" w:sz="4"/>
+              <w:right w:val="single" w:color="C9C9D6" w:sz="4"/>
             </w:tcBorders>
             <w:tcMar>
               <w:top w:type="dxa" w:w="60"/>
@@ -7857,10 +7919,10 @@
           <w:tcPr>
             <w:tcW w:type="dxa" w:w="1252"/>
             <w:tcBorders>
-              <w:top w:val="single" w:color="C9D3E3" w:sz="4"/>
-              <w:left w:val="single" w:color="C9D3E3" w:sz="4"/>
-              <w:bottom w:val="single" w:color="C9D3E3" w:sz="4"/>
-              <w:right w:val="single" w:color="C9D3E3" w:sz="4"/>
+              <w:top w:val="single" w:color="C9C9D6" w:sz="4"/>
+              <w:left w:val="single" w:color="C9C9D6" w:sz="4"/>
+              <w:bottom w:val="single" w:color="C9C9D6" w:sz="4"/>
+              <w:right w:val="single" w:color="C9C9D6" w:sz="4"/>
             </w:tcBorders>
             <w:tcMar>
               <w:top w:type="dxa" w:w="60"/>
@@ -7892,10 +7954,10 @@
           <w:tcPr>
             <w:tcW w:type="dxa" w:w="1252"/>
             <w:tcBorders>
-              <w:top w:val="single" w:color="C9D3E3" w:sz="4"/>
-              <w:left w:val="single" w:color="C9D3E3" w:sz="4"/>
-              <w:bottom w:val="single" w:color="C9D3E3" w:sz="4"/>
-              <w:right w:val="single" w:color="C9D3E3" w:sz="4"/>
+              <w:top w:val="single" w:color="C9C9D6" w:sz="4"/>
+              <w:left w:val="single" w:color="C9C9D6" w:sz="4"/>
+              <w:bottom w:val="single" w:color="C9C9D6" w:sz="4"/>
+              <w:right w:val="single" w:color="C9C9D6" w:sz="4"/>
             </w:tcBorders>
             <w:tcMar>
               <w:top w:type="dxa" w:w="60"/>
@@ -7927,10 +7989,10 @@
           <w:tcPr>
             <w:tcW w:type="dxa" w:w="1349"/>
             <w:tcBorders>
-              <w:top w:val="single" w:color="C9D3E3" w:sz="4"/>
-              <w:left w:val="single" w:color="C9D3E3" w:sz="4"/>
-              <w:bottom w:val="single" w:color="C9D3E3" w:sz="4"/>
-              <w:right w:val="single" w:color="C9D3E3" w:sz="4"/>
+              <w:top w:val="single" w:color="C9C9D6" w:sz="4"/>
+              <w:left w:val="single" w:color="C9C9D6" w:sz="4"/>
+              <w:bottom w:val="single" w:color="C9C9D6" w:sz="4"/>
+              <w:right w:val="single" w:color="C9C9D6" w:sz="4"/>
             </w:tcBorders>
             <w:tcMar>
               <w:top w:type="dxa" w:w="60"/>
@@ -7962,10 +8024,10 @@
           <w:tcPr>
             <w:tcW w:type="dxa" w:w="1257"/>
             <w:tcBorders>
-              <w:top w:val="single" w:color="C9D3E3" w:sz="4"/>
-              <w:left w:val="single" w:color="C9D3E3" w:sz="4"/>
-              <w:bottom w:val="single" w:color="C9D3E3" w:sz="4"/>
-              <w:right w:val="single" w:color="C9D3E3" w:sz="4"/>
+              <w:top w:val="single" w:color="C9C9D6" w:sz="4"/>
+              <w:left w:val="single" w:color="C9C9D6" w:sz="4"/>
+              <w:bottom w:val="single" w:color="C9C9D6" w:sz="4"/>
+              <w:right w:val="single" w:color="C9C9D6" w:sz="4"/>
             </w:tcBorders>
             <w:tcMar>
               <w:top w:type="dxa" w:w="60"/>
@@ -8003,12 +8065,12 @@
           <w:tcPr>
             <w:tcW w:type="dxa" w:w="3276"/>
             <w:tcBorders>
-              <w:top w:val="single" w:color="C9D3E3" w:sz="4"/>
-              <w:left w:val="single" w:color="C9D3E3" w:sz="4"/>
-              <w:bottom w:val="single" w:color="C9D3E3" w:sz="4"/>
-              <w:right w:val="single" w:color="C9D3E3" w:sz="4"/>
-            </w:tcBorders>
-            <w:shd w:fill="EEF3FA" w:color="auto" w:val="clear"/>
+              <w:top w:val="single" w:color="C9C9D6" w:sz="4"/>
+              <w:left w:val="single" w:color="C9C9D6" w:sz="4"/>
+              <w:bottom w:val="single" w:color="C9C9D6" w:sz="4"/>
+              <w:right w:val="single" w:color="C9C9D6" w:sz="4"/>
+            </w:tcBorders>
+            <w:shd w:fill="F3F3F7" w:color="auto" w:val="clear"/>
             <w:tcMar>
               <w:top w:type="dxa" w:w="60"/>
               <w:left w:type="dxa" w:w="90"/>
@@ -8039,12 +8101,12 @@
           <w:tcPr>
             <w:tcW w:type="dxa" w:w="1252"/>
             <w:tcBorders>
-              <w:top w:val="single" w:color="C9D3E3" w:sz="4"/>
-              <w:left w:val="single" w:color="C9D3E3" w:sz="4"/>
-              <w:bottom w:val="single" w:color="C9D3E3" w:sz="4"/>
-              <w:right w:val="single" w:color="C9D3E3" w:sz="4"/>
-            </w:tcBorders>
-            <w:shd w:fill="EEF3FA" w:color="auto" w:val="clear"/>
+              <w:top w:val="single" w:color="C9C9D6" w:sz="4"/>
+              <w:left w:val="single" w:color="C9C9D6" w:sz="4"/>
+              <w:bottom w:val="single" w:color="C9C9D6" w:sz="4"/>
+              <w:right w:val="single" w:color="C9C9D6" w:sz="4"/>
+            </w:tcBorders>
+            <w:shd w:fill="F3F3F7" w:color="auto" w:val="clear"/>
             <w:tcMar>
               <w:top w:type="dxa" w:w="60"/>
               <w:left w:type="dxa" w:w="90"/>
@@ -8075,12 +8137,12 @@
           <w:tcPr>
             <w:tcW w:type="dxa" w:w="1252"/>
             <w:tcBorders>
-              <w:top w:val="single" w:color="C9D3E3" w:sz="4"/>
-              <w:left w:val="single" w:color="C9D3E3" w:sz="4"/>
-              <w:bottom w:val="single" w:color="C9D3E3" w:sz="4"/>
-              <w:right w:val="single" w:color="C9D3E3" w:sz="4"/>
-            </w:tcBorders>
-            <w:shd w:fill="EEF3FA" w:color="auto" w:val="clear"/>
+              <w:top w:val="single" w:color="C9C9D6" w:sz="4"/>
+              <w:left w:val="single" w:color="C9C9D6" w:sz="4"/>
+              <w:bottom w:val="single" w:color="C9C9D6" w:sz="4"/>
+              <w:right w:val="single" w:color="C9C9D6" w:sz="4"/>
+            </w:tcBorders>
+            <w:shd w:fill="F3F3F7" w:color="auto" w:val="clear"/>
             <w:tcMar>
               <w:top w:type="dxa" w:w="60"/>
               <w:left w:type="dxa" w:w="90"/>
@@ -8111,12 +8173,12 @@
           <w:tcPr>
             <w:tcW w:type="dxa" w:w="1252"/>
             <w:tcBorders>
-              <w:top w:val="single" w:color="C9D3E3" w:sz="4"/>
-              <w:left w:val="single" w:color="C9D3E3" w:sz="4"/>
-              <w:bottom w:val="single" w:color="C9D3E3" w:sz="4"/>
-              <w:right w:val="single" w:color="C9D3E3" w:sz="4"/>
-            </w:tcBorders>
-            <w:shd w:fill="EEF3FA" w:color="auto" w:val="clear"/>
+              <w:top w:val="single" w:color="C9C9D6" w:sz="4"/>
+              <w:left w:val="single" w:color="C9C9D6" w:sz="4"/>
+              <w:bottom w:val="single" w:color="C9C9D6" w:sz="4"/>
+              <w:right w:val="single" w:color="C9C9D6" w:sz="4"/>
+            </w:tcBorders>
+            <w:shd w:fill="F3F3F7" w:color="auto" w:val="clear"/>
             <w:tcMar>
               <w:top w:type="dxa" w:w="60"/>
               <w:left w:type="dxa" w:w="90"/>
@@ -8147,12 +8209,12 @@
           <w:tcPr>
             <w:tcW w:type="dxa" w:w="1349"/>
             <w:tcBorders>
-              <w:top w:val="single" w:color="C9D3E3" w:sz="4"/>
-              <w:left w:val="single" w:color="C9D3E3" w:sz="4"/>
-              <w:bottom w:val="single" w:color="C9D3E3" w:sz="4"/>
-              <w:right w:val="single" w:color="C9D3E3" w:sz="4"/>
-            </w:tcBorders>
-            <w:shd w:fill="EEF3FA" w:color="auto" w:val="clear"/>
+              <w:top w:val="single" w:color="C9C9D6" w:sz="4"/>
+              <w:left w:val="single" w:color="C9C9D6" w:sz="4"/>
+              <w:bottom w:val="single" w:color="C9C9D6" w:sz="4"/>
+              <w:right w:val="single" w:color="C9C9D6" w:sz="4"/>
+            </w:tcBorders>
+            <w:shd w:fill="F3F3F7" w:color="auto" w:val="clear"/>
             <w:tcMar>
               <w:top w:type="dxa" w:w="60"/>
               <w:left w:type="dxa" w:w="90"/>
@@ -8183,12 +8245,12 @@
           <w:tcPr>
             <w:tcW w:type="dxa" w:w="1257"/>
             <w:tcBorders>
-              <w:top w:val="single" w:color="C9D3E3" w:sz="4"/>
-              <w:left w:val="single" w:color="C9D3E3" w:sz="4"/>
-              <w:bottom w:val="single" w:color="C9D3E3" w:sz="4"/>
-              <w:right w:val="single" w:color="C9D3E3" w:sz="4"/>
-            </w:tcBorders>
-            <w:shd w:fill="EEF3FA" w:color="auto" w:val="clear"/>
+              <w:top w:val="single" w:color="C9C9D6" w:sz="4"/>
+              <w:left w:val="single" w:color="C9C9D6" w:sz="4"/>
+              <w:bottom w:val="single" w:color="C9C9D6" w:sz="4"/>
+              <w:right w:val="single" w:color="C9C9D6" w:sz="4"/>
+            </w:tcBorders>
+            <w:shd w:fill="F3F3F7" w:color="auto" w:val="clear"/>
             <w:tcMar>
               <w:top w:type="dxa" w:w="60"/>
               <w:left w:type="dxa" w:w="90"/>
@@ -8225,10 +8287,10 @@
           <w:tcPr>
             <w:tcW w:type="dxa" w:w="3276"/>
             <w:tcBorders>
-              <w:top w:val="single" w:color="C9D3E3" w:sz="4"/>
-              <w:left w:val="single" w:color="C9D3E3" w:sz="4"/>
-              <w:bottom w:val="single" w:color="C9D3E3" w:sz="4"/>
-              <w:right w:val="single" w:color="C9D3E3" w:sz="4"/>
+              <w:top w:val="single" w:color="C9C9D6" w:sz="4"/>
+              <w:left w:val="single" w:color="C9C9D6" w:sz="4"/>
+              <w:bottom w:val="single" w:color="C9C9D6" w:sz="4"/>
+              <w:right w:val="single" w:color="C9C9D6" w:sz="4"/>
             </w:tcBorders>
             <w:tcMar>
               <w:top w:type="dxa" w:w="60"/>
@@ -8260,10 +8322,10 @@
           <w:tcPr>
             <w:tcW w:type="dxa" w:w="1252"/>
             <w:tcBorders>
-              <w:top w:val="single" w:color="C9D3E3" w:sz="4"/>
-              <w:left w:val="single" w:color="C9D3E3" w:sz="4"/>
-              <w:bottom w:val="single" w:color="C9D3E3" w:sz="4"/>
-              <w:right w:val="single" w:color="C9D3E3" w:sz="4"/>
+              <w:top w:val="single" w:color="C9C9D6" w:sz="4"/>
+              <w:left w:val="single" w:color="C9C9D6" w:sz="4"/>
+              <w:bottom w:val="single" w:color="C9C9D6" w:sz="4"/>
+              <w:right w:val="single" w:color="C9C9D6" w:sz="4"/>
             </w:tcBorders>
             <w:tcMar>
               <w:top w:type="dxa" w:w="60"/>
@@ -8295,10 +8357,10 @@
           <w:tcPr>
             <w:tcW w:type="dxa" w:w="1252"/>
             <w:tcBorders>
-              <w:top w:val="single" w:color="C9D3E3" w:sz="4"/>
-              <w:left w:val="single" w:color="C9D3E3" w:sz="4"/>
-              <w:bottom w:val="single" w:color="C9D3E3" w:sz="4"/>
-              <w:right w:val="single" w:color="C9D3E3" w:sz="4"/>
+              <w:top w:val="single" w:color="C9C9D6" w:sz="4"/>
+              <w:left w:val="single" w:color="C9C9D6" w:sz="4"/>
+              <w:bottom w:val="single" w:color="C9C9D6" w:sz="4"/>
+              <w:right w:val="single" w:color="C9C9D6" w:sz="4"/>
             </w:tcBorders>
             <w:tcMar>
               <w:top w:type="dxa" w:w="60"/>
@@ -8330,10 +8392,10 @@
           <w:tcPr>
             <w:tcW w:type="dxa" w:w="1252"/>
             <w:tcBorders>
-              <w:top w:val="single" w:color="C9D3E3" w:sz="4"/>
-              <w:left w:val="single" w:color="C9D3E3" w:sz="4"/>
-              <w:bottom w:val="single" w:color="C9D3E3" w:sz="4"/>
-              <w:right w:val="single" w:color="C9D3E3" w:sz="4"/>
+              <w:top w:val="single" w:color="C9C9D6" w:sz="4"/>
+              <w:left w:val="single" w:color="C9C9D6" w:sz="4"/>
+              <w:bottom w:val="single" w:color="C9C9D6" w:sz="4"/>
+              <w:right w:val="single" w:color="C9C9D6" w:sz="4"/>
             </w:tcBorders>
             <w:tcMar>
               <w:top w:type="dxa" w:w="60"/>
@@ -8365,10 +8427,10 @@
           <w:tcPr>
             <w:tcW w:type="dxa" w:w="1349"/>
             <w:tcBorders>
-              <w:top w:val="single" w:color="C9D3E3" w:sz="4"/>
-              <w:left w:val="single" w:color="C9D3E3" w:sz="4"/>
-              <w:bottom w:val="single" w:color="C9D3E3" w:sz="4"/>
-              <w:right w:val="single" w:color="C9D3E3" w:sz="4"/>
+              <w:top w:val="single" w:color="C9C9D6" w:sz="4"/>
+              <w:left w:val="single" w:color="C9C9D6" w:sz="4"/>
+              <w:bottom w:val="single" w:color="C9C9D6" w:sz="4"/>
+              <w:right w:val="single" w:color="C9C9D6" w:sz="4"/>
             </w:tcBorders>
             <w:tcMar>
               <w:top w:type="dxa" w:w="60"/>
@@ -8400,10 +8462,10 @@
           <w:tcPr>
             <w:tcW w:type="dxa" w:w="1257"/>
             <w:tcBorders>
-              <w:top w:val="single" w:color="C9D3E3" w:sz="4"/>
-              <w:left w:val="single" w:color="C9D3E3" w:sz="4"/>
-              <w:bottom w:val="single" w:color="C9D3E3" w:sz="4"/>
-              <w:right w:val="single" w:color="C9D3E3" w:sz="4"/>
+              <w:top w:val="single" w:color="C9C9D6" w:sz="4"/>
+              <w:left w:val="single" w:color="C9C9D6" w:sz="4"/>
+              <w:bottom w:val="single" w:color="C9C9D6" w:sz="4"/>
+              <w:right w:val="single" w:color="C9C9D6" w:sz="4"/>
             </w:tcBorders>
             <w:tcMar>
               <w:top w:type="dxa" w:w="60"/>
@@ -8441,10 +8503,10 @@
           <w:tcPr>
             <w:tcW w:type="dxa" w:w="3276"/>
             <w:tcBorders>
-              <w:top w:val="single" w:color="C9D3E3" w:sz="4"/>
-              <w:left w:val="single" w:color="C9D3E3" w:sz="4"/>
-              <w:bottom w:val="single" w:color="C9D3E3" w:sz="4"/>
-              <w:right w:val="single" w:color="C9D3E3" w:sz="4"/>
+              <w:top w:val="single" w:color="C9C9D6" w:sz="4"/>
+              <w:left w:val="single" w:color="C9C9D6" w:sz="4"/>
+              <w:bottom w:val="single" w:color="C9C9D6" w:sz="4"/>
+              <w:right w:val="single" w:color="C9C9D6" w:sz="4"/>
             </w:tcBorders>
             <w:tcMar>
               <w:top w:type="dxa" w:w="60"/>
@@ -8476,10 +8538,10 @@
           <w:tcPr>
             <w:tcW w:type="dxa" w:w="1252"/>
             <w:tcBorders>
-              <w:top w:val="single" w:color="C9D3E3" w:sz="4"/>
-              <w:left w:val="single" w:color="C9D3E3" w:sz="4"/>
-              <w:bottom w:val="single" w:color="C9D3E3" w:sz="4"/>
-              <w:right w:val="single" w:color="C9D3E3" w:sz="4"/>
+              <w:top w:val="single" w:color="C9C9D6" w:sz="4"/>
+              <w:left w:val="single" w:color="C9C9D6" w:sz="4"/>
+              <w:bottom w:val="single" w:color="C9C9D6" w:sz="4"/>
+              <w:right w:val="single" w:color="C9C9D6" w:sz="4"/>
             </w:tcBorders>
             <w:tcMar>
               <w:top w:type="dxa" w:w="60"/>
@@ -8511,10 +8573,10 @@
           <w:tcPr>
             <w:tcW w:type="dxa" w:w="1252"/>
             <w:tcBorders>
-              <w:top w:val="single" w:color="C9D3E3" w:sz="4"/>
-              <w:left w:val="single" w:color="C9D3E3" w:sz="4"/>
-              <w:bottom w:val="single" w:color="C9D3E3" w:sz="4"/>
-              <w:right w:val="single" w:color="C9D3E3" w:sz="4"/>
+              <w:top w:val="single" w:color="C9C9D6" w:sz="4"/>
+              <w:left w:val="single" w:color="C9C9D6" w:sz="4"/>
+              <w:bottom w:val="single" w:color="C9C9D6" w:sz="4"/>
+              <w:right w:val="single" w:color="C9C9D6" w:sz="4"/>
             </w:tcBorders>
             <w:tcMar>
               <w:top w:type="dxa" w:w="60"/>
@@ -8546,10 +8608,10 @@
           <w:tcPr>
             <w:tcW w:type="dxa" w:w="1252"/>
             <w:tcBorders>
-              <w:top w:val="single" w:color="C9D3E3" w:sz="4"/>
-              <w:left w:val="single" w:color="C9D3E3" w:sz="4"/>
-              <w:bottom w:val="single" w:color="C9D3E3" w:sz="4"/>
-              <w:right w:val="single" w:color="C9D3E3" w:sz="4"/>
+              <w:top w:val="single" w:color="C9C9D6" w:sz="4"/>
+              <w:left w:val="single" w:color="C9C9D6" w:sz="4"/>
+              <w:bottom w:val="single" w:color="C9C9D6" w:sz="4"/>
+              <w:right w:val="single" w:color="C9C9D6" w:sz="4"/>
             </w:tcBorders>
             <w:tcMar>
               <w:top w:type="dxa" w:w="60"/>
@@ -8581,10 +8643,10 @@
           <w:tcPr>
             <w:tcW w:type="dxa" w:w="1349"/>
             <w:tcBorders>
-              <w:top w:val="single" w:color="C9D3E3" w:sz="4"/>
-              <w:left w:val="single" w:color="C9D3E3" w:sz="4"/>
-              <w:bottom w:val="single" w:color="C9D3E3" w:sz="4"/>
-              <w:right w:val="single" w:color="C9D3E3" w:sz="4"/>
+              <w:top w:val="single" w:color="C9C9D6" w:sz="4"/>
+              <w:left w:val="single" w:color="C9C9D6" w:sz="4"/>
+              <w:bottom w:val="single" w:color="C9C9D6" w:sz="4"/>
+              <w:right w:val="single" w:color="C9C9D6" w:sz="4"/>
             </w:tcBorders>
             <w:tcMar>
               <w:top w:type="dxa" w:w="60"/>
@@ -8616,10 +8678,10 @@
           <w:tcPr>
             <w:tcW w:type="dxa" w:w="1257"/>
             <w:tcBorders>
-              <w:top w:val="single" w:color="C9D3E3" w:sz="4"/>
-              <w:left w:val="single" w:color="C9D3E3" w:sz="4"/>
-              <w:bottom w:val="single" w:color="C9D3E3" w:sz="4"/>
-              <w:right w:val="single" w:color="C9D3E3" w:sz="4"/>
+              <w:top w:val="single" w:color="C9C9D6" w:sz="4"/>
+              <w:left w:val="single" w:color="C9C9D6" w:sz="4"/>
+              <w:bottom w:val="single" w:color="C9C9D6" w:sz="4"/>
+              <w:right w:val="single" w:color="C9C9D6" w:sz="4"/>
             </w:tcBorders>
             <w:tcMar>
               <w:top w:type="dxa" w:w="60"/>
@@ -8657,10 +8719,10 @@
           <w:tcPr>
             <w:tcW w:type="dxa" w:w="3276"/>
             <w:tcBorders>
-              <w:top w:val="single" w:color="C9D3E3" w:sz="4"/>
-              <w:left w:val="single" w:color="C9D3E3" w:sz="4"/>
-              <w:bottom w:val="single" w:color="C9D3E3" w:sz="4"/>
-              <w:right w:val="single" w:color="C9D3E3" w:sz="4"/>
+              <w:top w:val="single" w:color="C9C9D6" w:sz="4"/>
+              <w:left w:val="single" w:color="C9C9D6" w:sz="4"/>
+              <w:bottom w:val="single" w:color="C9C9D6" w:sz="4"/>
+              <w:right w:val="single" w:color="C9C9D6" w:sz="4"/>
             </w:tcBorders>
             <w:tcMar>
               <w:top w:type="dxa" w:w="60"/>
@@ -8692,10 +8754,10 @@
           <w:tcPr>
             <w:tcW w:type="dxa" w:w="1252"/>
             <w:tcBorders>
-              <w:top w:val="single" w:color="C9D3E3" w:sz="4"/>
-              <w:left w:val="single" w:color="C9D3E3" w:sz="4"/>
-              <w:bottom w:val="single" w:color="C9D3E3" w:sz="4"/>
-              <w:right w:val="single" w:color="C9D3E3" w:sz="4"/>
+              <w:top w:val="single" w:color="C9C9D6" w:sz="4"/>
+              <w:left w:val="single" w:color="C9C9D6" w:sz="4"/>
+              <w:bottom w:val="single" w:color="C9C9D6" w:sz="4"/>
+              <w:right w:val="single" w:color="C9C9D6" w:sz="4"/>
             </w:tcBorders>
             <w:tcMar>
               <w:top w:type="dxa" w:w="60"/>
@@ -8727,10 +8789,10 @@
           <w:tcPr>
             <w:tcW w:type="dxa" w:w="1252"/>
             <w:tcBorders>
-              <w:top w:val="single" w:color="C9D3E3" w:sz="4"/>
-              <w:left w:val="single" w:color="C9D3E3" w:sz="4"/>
-              <w:bottom w:val="single" w:color="C9D3E3" w:sz="4"/>
-              <w:right w:val="single" w:color="C9D3E3" w:sz="4"/>
+              <w:top w:val="single" w:color="C9C9D6" w:sz="4"/>
+              <w:left w:val="single" w:color="C9C9D6" w:sz="4"/>
+              <w:bottom w:val="single" w:color="C9C9D6" w:sz="4"/>
+              <w:right w:val="single" w:color="C9C9D6" w:sz="4"/>
             </w:tcBorders>
             <w:tcMar>
               <w:top w:type="dxa" w:w="60"/>
@@ -8762,10 +8824,10 @@
           <w:tcPr>
             <w:tcW w:type="dxa" w:w="1252"/>
             <w:tcBorders>
-              <w:top w:val="single" w:color="C9D3E3" w:sz="4"/>
-              <w:left w:val="single" w:color="C9D3E3" w:sz="4"/>
-              <w:bottom w:val="single" w:color="C9D3E3" w:sz="4"/>
-              <w:right w:val="single" w:color="C9D3E3" w:sz="4"/>
+              <w:top w:val="single" w:color="C9C9D6" w:sz="4"/>
+              <w:left w:val="single" w:color="C9C9D6" w:sz="4"/>
+              <w:bottom w:val="single" w:color="C9C9D6" w:sz="4"/>
+              <w:right w:val="single" w:color="C9C9D6" w:sz="4"/>
             </w:tcBorders>
             <w:tcMar>
               <w:top w:type="dxa" w:w="60"/>
@@ -8797,10 +8859,10 @@
           <w:tcPr>
             <w:tcW w:type="dxa" w:w="1349"/>
             <w:tcBorders>
-              <w:top w:val="single" w:color="C9D3E3" w:sz="4"/>
-              <w:left w:val="single" w:color="C9D3E3" w:sz="4"/>
-              <w:bottom w:val="single" w:color="C9D3E3" w:sz="4"/>
-              <w:right w:val="single" w:color="C9D3E3" w:sz="4"/>
+              <w:top w:val="single" w:color="C9C9D6" w:sz="4"/>
+              <w:left w:val="single" w:color="C9C9D6" w:sz="4"/>
+              <w:bottom w:val="single" w:color="C9C9D6" w:sz="4"/>
+              <w:right w:val="single" w:color="C9C9D6" w:sz="4"/>
             </w:tcBorders>
             <w:tcMar>
               <w:top w:type="dxa" w:w="60"/>
@@ -8832,10 +8894,10 @@
           <w:tcPr>
             <w:tcW w:type="dxa" w:w="1257"/>
             <w:tcBorders>
-              <w:top w:val="single" w:color="C9D3E3" w:sz="4"/>
-              <w:left w:val="single" w:color="C9D3E3" w:sz="4"/>
-              <w:bottom w:val="single" w:color="C9D3E3" w:sz="4"/>
-              <w:right w:val="single" w:color="C9D3E3" w:sz="4"/>
+              <w:top w:val="single" w:color="C9C9D6" w:sz="4"/>
+              <w:left w:val="single" w:color="C9C9D6" w:sz="4"/>
+              <w:bottom w:val="single" w:color="C9C9D6" w:sz="4"/>
+              <w:right w:val="single" w:color="C9C9D6" w:sz="4"/>
             </w:tcBorders>
             <w:tcMar>
               <w:top w:type="dxa" w:w="60"/>
@@ -8873,12 +8935,12 @@
           <w:tcPr>
             <w:tcW w:type="dxa" w:w="3276"/>
             <w:tcBorders>
-              <w:top w:val="single" w:color="C9D3E3" w:sz="4"/>
-              <w:left w:val="single" w:color="C9D3E3" w:sz="4"/>
-              <w:bottom w:val="single" w:color="C9D3E3" w:sz="4"/>
-              <w:right w:val="single" w:color="C9D3E3" w:sz="4"/>
-            </w:tcBorders>
-            <w:shd w:fill="EEF3FA" w:color="auto" w:val="clear"/>
+              <w:top w:val="single" w:color="C9C9D6" w:sz="4"/>
+              <w:left w:val="single" w:color="C9C9D6" w:sz="4"/>
+              <w:bottom w:val="single" w:color="C9C9D6" w:sz="4"/>
+              <w:right w:val="single" w:color="C9C9D6" w:sz="4"/>
+            </w:tcBorders>
+            <w:shd w:fill="F3F3F7" w:color="auto" w:val="clear"/>
             <w:tcMar>
               <w:top w:type="dxa" w:w="60"/>
               <w:left w:type="dxa" w:w="90"/>
@@ -8909,12 +8971,12 @@
           <w:tcPr>
             <w:tcW w:type="dxa" w:w="1252"/>
             <w:tcBorders>
-              <w:top w:val="single" w:color="C9D3E3" w:sz="4"/>
-              <w:left w:val="single" w:color="C9D3E3" w:sz="4"/>
-              <w:bottom w:val="single" w:color="C9D3E3" w:sz="4"/>
-              <w:right w:val="single" w:color="C9D3E3" w:sz="4"/>
-            </w:tcBorders>
-            <w:shd w:fill="EEF3FA" w:color="auto" w:val="clear"/>
+              <w:top w:val="single" w:color="C9C9D6" w:sz="4"/>
+              <w:left w:val="single" w:color="C9C9D6" w:sz="4"/>
+              <w:bottom w:val="single" w:color="C9C9D6" w:sz="4"/>
+              <w:right w:val="single" w:color="C9C9D6" w:sz="4"/>
+            </w:tcBorders>
+            <w:shd w:fill="F3F3F7" w:color="auto" w:val="clear"/>
             <w:tcMar>
               <w:top w:type="dxa" w:w="60"/>
               <w:left w:type="dxa" w:w="90"/>
@@ -8945,12 +9007,12 @@
           <w:tcPr>
             <w:tcW w:type="dxa" w:w="1252"/>
             <w:tcBorders>
-              <w:top w:val="single" w:color="C9D3E3" w:sz="4"/>
-              <w:left w:val="single" w:color="C9D3E3" w:sz="4"/>
-              <w:bottom w:val="single" w:color="C9D3E3" w:sz="4"/>
-              <w:right w:val="single" w:color="C9D3E3" w:sz="4"/>
-            </w:tcBorders>
-            <w:shd w:fill="EEF3FA" w:color="auto" w:val="clear"/>
+              <w:top w:val="single" w:color="C9C9D6" w:sz="4"/>
+              <w:left w:val="single" w:color="C9C9D6" w:sz="4"/>
+              <w:bottom w:val="single" w:color="C9C9D6" w:sz="4"/>
+              <w:right w:val="single" w:color="C9C9D6" w:sz="4"/>
+            </w:tcBorders>
+            <w:shd w:fill="F3F3F7" w:color="auto" w:val="clear"/>
             <w:tcMar>
               <w:top w:type="dxa" w:w="60"/>
               <w:left w:type="dxa" w:w="90"/>
@@ -8981,12 +9043,12 @@
           <w:tcPr>
             <w:tcW w:type="dxa" w:w="1252"/>
             <w:tcBorders>
-              <w:top w:val="single" w:color="C9D3E3" w:sz="4"/>
-              <w:left w:val="single" w:color="C9D3E3" w:sz="4"/>
-              <w:bottom w:val="single" w:color="C9D3E3" w:sz="4"/>
-              <w:right w:val="single" w:color="C9D3E3" w:sz="4"/>
-            </w:tcBorders>
-            <w:shd w:fill="EEF3FA" w:color="auto" w:val="clear"/>
+              <w:top w:val="single" w:color="C9C9D6" w:sz="4"/>
+              <w:left w:val="single" w:color="C9C9D6" w:sz="4"/>
+              <w:bottom w:val="single" w:color="C9C9D6" w:sz="4"/>
+              <w:right w:val="single" w:color="C9C9D6" w:sz="4"/>
+            </w:tcBorders>
+            <w:shd w:fill="F3F3F7" w:color="auto" w:val="clear"/>
             <w:tcMar>
               <w:top w:type="dxa" w:w="60"/>
               <w:left w:type="dxa" w:w="90"/>
@@ -9017,12 +9079,12 @@
           <w:tcPr>
             <w:tcW w:type="dxa" w:w="1349"/>
             <w:tcBorders>
-              <w:top w:val="single" w:color="C9D3E3" w:sz="4"/>
-              <w:left w:val="single" w:color="C9D3E3" w:sz="4"/>
-              <w:bottom w:val="single" w:color="C9D3E3" w:sz="4"/>
-              <w:right w:val="single" w:color="C9D3E3" w:sz="4"/>
-            </w:tcBorders>
-            <w:shd w:fill="EEF3FA" w:color="auto" w:val="clear"/>
+              <w:top w:val="single" w:color="C9C9D6" w:sz="4"/>
+              <w:left w:val="single" w:color="C9C9D6" w:sz="4"/>
+              <w:bottom w:val="single" w:color="C9C9D6" w:sz="4"/>
+              <w:right w:val="single" w:color="C9C9D6" w:sz="4"/>
+            </w:tcBorders>
+            <w:shd w:fill="F3F3F7" w:color="auto" w:val="clear"/>
             <w:tcMar>
               <w:top w:type="dxa" w:w="60"/>
               <w:left w:type="dxa" w:w="90"/>
@@ -9053,12 +9115,12 @@
           <w:tcPr>
             <w:tcW w:type="dxa" w:w="1257"/>
             <w:tcBorders>
-              <w:top w:val="single" w:color="C9D3E3" w:sz="4"/>
-              <w:left w:val="single" w:color="C9D3E3" w:sz="4"/>
-              <w:bottom w:val="single" w:color="C9D3E3" w:sz="4"/>
-              <w:right w:val="single" w:color="C9D3E3" w:sz="4"/>
-            </w:tcBorders>
-            <w:shd w:fill="EEF3FA" w:color="auto" w:val="clear"/>
+              <w:top w:val="single" w:color="C9C9D6" w:sz="4"/>
+              <w:left w:val="single" w:color="C9C9D6" w:sz="4"/>
+              <w:bottom w:val="single" w:color="C9C9D6" w:sz="4"/>
+              <w:right w:val="single" w:color="C9C9D6" w:sz="4"/>
+            </w:tcBorders>
+            <w:shd w:fill="F3F3F7" w:color="auto" w:val="clear"/>
             <w:tcMar>
               <w:top w:type="dxa" w:w="60"/>
               <w:left w:type="dxa" w:w="90"/>
@@ -9095,10 +9157,10 @@
           <w:tcPr>
             <w:tcW w:type="dxa" w:w="3276"/>
             <w:tcBorders>
-              <w:top w:val="single" w:color="C9D3E3" w:sz="4"/>
-              <w:left w:val="single" w:color="C9D3E3" w:sz="4"/>
-              <w:bottom w:val="single" w:color="C9D3E3" w:sz="4"/>
-              <w:right w:val="single" w:color="C9D3E3" w:sz="4"/>
+              <w:top w:val="single" w:color="C9C9D6" w:sz="4"/>
+              <w:left w:val="single" w:color="C9C9D6" w:sz="4"/>
+              <w:bottom w:val="single" w:color="C9C9D6" w:sz="4"/>
+              <w:right w:val="single" w:color="C9C9D6" w:sz="4"/>
             </w:tcBorders>
             <w:tcMar>
               <w:top w:type="dxa" w:w="60"/>
@@ -9130,10 +9192,10 @@
           <w:tcPr>
             <w:tcW w:type="dxa" w:w="1252"/>
             <w:tcBorders>
-              <w:top w:val="single" w:color="C9D3E3" w:sz="4"/>
-              <w:left w:val="single" w:color="C9D3E3" w:sz="4"/>
-              <w:bottom w:val="single" w:color="C9D3E3" w:sz="4"/>
-              <w:right w:val="single" w:color="C9D3E3" w:sz="4"/>
+              <w:top w:val="single" w:color="C9C9D6" w:sz="4"/>
+              <w:left w:val="single" w:color="C9C9D6" w:sz="4"/>
+              <w:bottom w:val="single" w:color="C9C9D6" w:sz="4"/>
+              <w:right w:val="single" w:color="C9C9D6" w:sz="4"/>
             </w:tcBorders>
             <w:tcMar>
               <w:top w:type="dxa" w:w="60"/>
@@ -9165,10 +9227,10 @@
           <w:tcPr>
             <w:tcW w:type="dxa" w:w="1252"/>
             <w:tcBorders>
-              <w:top w:val="single" w:color="C9D3E3" w:sz="4"/>
-              <w:left w:val="single" w:color="C9D3E3" w:sz="4"/>
-              <w:bottom w:val="single" w:color="C9D3E3" w:sz="4"/>
-              <w:right w:val="single" w:color="C9D3E3" w:sz="4"/>
+              <w:top w:val="single" w:color="C9C9D6" w:sz="4"/>
+              <w:left w:val="single" w:color="C9C9D6" w:sz="4"/>
+              <w:bottom w:val="single" w:color="C9C9D6" w:sz="4"/>
+              <w:right w:val="single" w:color="C9C9D6" w:sz="4"/>
             </w:tcBorders>
             <w:tcMar>
               <w:top w:type="dxa" w:w="60"/>
@@ -9200,10 +9262,10 @@
           <w:tcPr>
             <w:tcW w:type="dxa" w:w="1252"/>
             <w:tcBorders>
-              <w:top w:val="single" w:color="C9D3E3" w:sz="4"/>
-              <w:left w:val="single" w:color="C9D3E3" w:sz="4"/>
-              <w:bottom w:val="single" w:color="C9D3E3" w:sz="4"/>
-              <w:right w:val="single" w:color="C9D3E3" w:sz="4"/>
+              <w:top w:val="single" w:color="C9C9D6" w:sz="4"/>
+              <w:left w:val="single" w:color="C9C9D6" w:sz="4"/>
+              <w:bottom w:val="single" w:color="C9C9D6" w:sz="4"/>
+              <w:right w:val="single" w:color="C9C9D6" w:sz="4"/>
             </w:tcBorders>
             <w:tcMar>
               <w:top w:type="dxa" w:w="60"/>
@@ -9235,10 +9297,10 @@
           <w:tcPr>
             <w:tcW w:type="dxa" w:w="1349"/>
             <w:tcBorders>
-              <w:top w:val="single" w:color="C9D3E3" w:sz="4"/>
-              <w:left w:val="single" w:color="C9D3E3" w:sz="4"/>
-              <w:bottom w:val="single" w:color="C9D3E3" w:sz="4"/>
-              <w:right w:val="single" w:color="C9D3E3" w:sz="4"/>
+              <w:top w:val="single" w:color="C9C9D6" w:sz="4"/>
+              <w:left w:val="single" w:color="C9C9D6" w:sz="4"/>
+              <w:bottom w:val="single" w:color="C9C9D6" w:sz="4"/>
+              <w:right w:val="single" w:color="C9C9D6" w:sz="4"/>
             </w:tcBorders>
             <w:tcMar>
               <w:top w:type="dxa" w:w="60"/>
@@ -9270,10 +9332,10 @@
           <w:tcPr>
             <w:tcW w:type="dxa" w:w="1257"/>
             <w:tcBorders>
-              <w:top w:val="single" w:color="C9D3E3" w:sz="4"/>
-              <w:left w:val="single" w:color="C9D3E3" w:sz="4"/>
-              <w:bottom w:val="single" w:color="C9D3E3" w:sz="4"/>
-              <w:right w:val="single" w:color="C9D3E3" w:sz="4"/>
+              <w:top w:val="single" w:color="C9C9D6" w:sz="4"/>
+              <w:left w:val="single" w:color="C9C9D6" w:sz="4"/>
+              <w:bottom w:val="single" w:color="C9C9D6" w:sz="4"/>
+              <w:right w:val="single" w:color="C9C9D6" w:sz="4"/>
             </w:tcBorders>
             <w:tcMar>
               <w:top w:type="dxa" w:w="60"/>
@@ -9344,7 +9406,7 @@
                     </pic:cNvPicPr>
                   </pic:nvPicPr>
                   <pic:blipFill>
-                    <a:blip r:embed="rId15" cstate="none"/>
+                    <a:blip r:embed="rId18" cstate="none"/>
                     <a:srcRect/>
                     <a:stretch>
                       <a:fillRect/>
@@ -9386,14 +9448,17 @@
     <w:p>
       <w:pPr>
         <w:pStyle w:val="Heading1"/>
-        <w:spacing w:after="160" w:before="360"/>
+        <w:pBdr>
+          <w:bottom w:val="single" w:color="FF4000" w:sz="12" w:space="4"/>
+        </w:pBdr>
+        <w:spacing w:after="200" w:before="360"/>
       </w:pPr>
       <w:r>
         <w:rPr>
           <w:rFonts w:ascii="Arial" w:cs="Arial" w:eastAsia="Arial" w:hAnsi="Arial"/>
           <w:b/>
           <w:bCs/>
-          <w:color w:val="1F3B73"/>
+          <w:color w:val="010222"/>
           <w:sz w:val="30"/>
           <w:szCs w:val="30"/>
         </w:rPr>
@@ -9439,12 +9504,12 @@
           <w:tcPr>
             <w:tcW w:type="dxa" w:w="2891"/>
             <w:tcBorders>
-              <w:top w:val="single" w:color="C9D3E3" w:sz="4"/>
-              <w:left w:val="single" w:color="C9D3E3" w:sz="4"/>
-              <w:bottom w:val="single" w:color="C9D3E3" w:sz="4"/>
-              <w:right w:val="single" w:color="C9D3E3" w:sz="4"/>
-            </w:tcBorders>
-            <w:shd w:fill="1F3B73" w:color="auto" w:val="clear"/>
+              <w:top w:val="single" w:color="C9C9D6" w:sz="4"/>
+              <w:left w:val="single" w:color="C9C9D6" w:sz="4"/>
+              <w:bottom w:val="single" w:color="C9C9D6" w:sz="4"/>
+              <w:right w:val="single" w:color="C9C9D6" w:sz="4"/>
+            </w:tcBorders>
+            <w:shd w:fill="010222" w:color="auto" w:val="clear"/>
             <w:tcMar>
               <w:top w:type="dxa" w:w="60"/>
               <w:left w:type="dxa" w:w="90"/>
@@ -9475,12 +9540,12 @@
           <w:tcPr>
             <w:tcW w:type="dxa" w:w="6747"/>
             <w:tcBorders>
-              <w:top w:val="single" w:color="C9D3E3" w:sz="4"/>
-              <w:left w:val="single" w:color="C9D3E3" w:sz="4"/>
-              <w:bottom w:val="single" w:color="C9D3E3" w:sz="4"/>
-              <w:right w:val="single" w:color="C9D3E3" w:sz="4"/>
-            </w:tcBorders>
-            <w:shd w:fill="1F3B73" w:color="auto" w:val="clear"/>
+              <w:top w:val="single" w:color="C9C9D6" w:sz="4"/>
+              <w:left w:val="single" w:color="C9C9D6" w:sz="4"/>
+              <w:bottom w:val="single" w:color="C9C9D6" w:sz="4"/>
+              <w:right w:val="single" w:color="C9C9D6" w:sz="4"/>
+            </w:tcBorders>
+            <w:shd w:fill="010222" w:color="auto" w:val="clear"/>
             <w:tcMar>
               <w:top w:type="dxa" w:w="60"/>
               <w:left w:type="dxa" w:w="90"/>
@@ -9517,10 +9582,10 @@
           <w:tcPr>
             <w:tcW w:type="dxa" w:w="2891"/>
             <w:tcBorders>
-              <w:top w:val="single" w:color="C9D3E3" w:sz="4"/>
-              <w:left w:val="single" w:color="C9D3E3" w:sz="4"/>
-              <w:bottom w:val="single" w:color="C9D3E3" w:sz="4"/>
-              <w:right w:val="single" w:color="C9D3E3" w:sz="4"/>
+              <w:top w:val="single" w:color="C9C9D6" w:sz="4"/>
+              <w:left w:val="single" w:color="C9C9D6" w:sz="4"/>
+              <w:bottom w:val="single" w:color="C9C9D6" w:sz="4"/>
+              <w:right w:val="single" w:color="C9C9D6" w:sz="4"/>
             </w:tcBorders>
             <w:tcMar>
               <w:top w:type="dxa" w:w="60"/>
@@ -9552,10 +9617,10 @@
           <w:tcPr>
             <w:tcW w:type="dxa" w:w="6747"/>
             <w:tcBorders>
-              <w:top w:val="single" w:color="C9D3E3" w:sz="4"/>
-              <w:left w:val="single" w:color="C9D3E3" w:sz="4"/>
-              <w:bottom w:val="single" w:color="C9D3E3" w:sz="4"/>
-              <w:right w:val="single" w:color="C9D3E3" w:sz="4"/>
+              <w:top w:val="single" w:color="C9C9D6" w:sz="4"/>
+              <w:left w:val="single" w:color="C9C9D6" w:sz="4"/>
+              <w:bottom w:val="single" w:color="C9C9D6" w:sz="4"/>
+              <w:right w:val="single" w:color="C9C9D6" w:sz="4"/>
             </w:tcBorders>
             <w:tcMar>
               <w:top w:type="dxa" w:w="60"/>
@@ -9593,10 +9658,10 @@
           <w:tcPr>
             <w:tcW w:type="dxa" w:w="2891"/>
             <w:tcBorders>
-              <w:top w:val="single" w:color="C9D3E3" w:sz="4"/>
-              <w:left w:val="single" w:color="C9D3E3" w:sz="4"/>
-              <w:bottom w:val="single" w:color="C9D3E3" w:sz="4"/>
-              <w:right w:val="single" w:color="C9D3E3" w:sz="4"/>
+              <w:top w:val="single" w:color="C9C9D6" w:sz="4"/>
+              <w:left w:val="single" w:color="C9C9D6" w:sz="4"/>
+              <w:bottom w:val="single" w:color="C9C9D6" w:sz="4"/>
+              <w:right w:val="single" w:color="C9C9D6" w:sz="4"/>
             </w:tcBorders>
             <w:tcMar>
               <w:top w:type="dxa" w:w="60"/>
@@ -9628,10 +9693,10 @@
           <w:tcPr>
             <w:tcW w:type="dxa" w:w="6747"/>
             <w:tcBorders>
-              <w:top w:val="single" w:color="C9D3E3" w:sz="4"/>
-              <w:left w:val="single" w:color="C9D3E3" w:sz="4"/>
-              <w:bottom w:val="single" w:color="C9D3E3" w:sz="4"/>
-              <w:right w:val="single" w:color="C9D3E3" w:sz="4"/>
+              <w:top w:val="single" w:color="C9C9D6" w:sz="4"/>
+              <w:left w:val="single" w:color="C9C9D6" w:sz="4"/>
+              <w:bottom w:val="single" w:color="C9C9D6" w:sz="4"/>
+              <w:right w:val="single" w:color="C9C9D6" w:sz="4"/>
             </w:tcBorders>
             <w:tcMar>
               <w:top w:type="dxa" w:w="60"/>
@@ -9669,10 +9734,10 @@
           <w:tcPr>
             <w:tcW w:type="dxa" w:w="2891"/>
             <w:tcBorders>
-              <w:top w:val="single" w:color="C9D3E3" w:sz="4"/>
-              <w:left w:val="single" w:color="C9D3E3" w:sz="4"/>
-              <w:bottom w:val="single" w:color="C9D3E3" w:sz="4"/>
-              <w:right w:val="single" w:color="C9D3E3" w:sz="4"/>
+              <w:top w:val="single" w:color="C9C9D6" w:sz="4"/>
+              <w:left w:val="single" w:color="C9C9D6" w:sz="4"/>
+              <w:bottom w:val="single" w:color="C9C9D6" w:sz="4"/>
+              <w:right w:val="single" w:color="C9C9D6" w:sz="4"/>
             </w:tcBorders>
             <w:tcMar>
               <w:top w:type="dxa" w:w="60"/>
@@ -9704,10 +9769,10 @@
           <w:tcPr>
             <w:tcW w:type="dxa" w:w="6747"/>
             <w:tcBorders>
-              <w:top w:val="single" w:color="C9D3E3" w:sz="4"/>
-              <w:left w:val="single" w:color="C9D3E3" w:sz="4"/>
-              <w:bottom w:val="single" w:color="C9D3E3" w:sz="4"/>
-              <w:right w:val="single" w:color="C9D3E3" w:sz="4"/>
+              <w:top w:val="single" w:color="C9C9D6" w:sz="4"/>
+              <w:left w:val="single" w:color="C9C9D6" w:sz="4"/>
+              <w:bottom w:val="single" w:color="C9C9D6" w:sz="4"/>
+              <w:right w:val="single" w:color="C9C9D6" w:sz="4"/>
             </w:tcBorders>
             <w:tcMar>
               <w:top w:type="dxa" w:w="60"/>
@@ -9745,10 +9810,10 @@
           <w:tcPr>
             <w:tcW w:type="dxa" w:w="2891"/>
             <w:tcBorders>
-              <w:top w:val="single" w:color="C9D3E3" w:sz="4"/>
-              <w:left w:val="single" w:color="C9D3E3" w:sz="4"/>
-              <w:bottom w:val="single" w:color="C9D3E3" w:sz="4"/>
-              <w:right w:val="single" w:color="C9D3E3" w:sz="4"/>
+              <w:top w:val="single" w:color="C9C9D6" w:sz="4"/>
+              <w:left w:val="single" w:color="C9C9D6" w:sz="4"/>
+              <w:bottom w:val="single" w:color="C9C9D6" w:sz="4"/>
+              <w:right w:val="single" w:color="C9C9D6" w:sz="4"/>
             </w:tcBorders>
             <w:tcMar>
               <w:top w:type="dxa" w:w="60"/>
@@ -9780,10 +9845,10 @@
           <w:tcPr>
             <w:tcW w:type="dxa" w:w="6747"/>
             <w:tcBorders>
-              <w:top w:val="single" w:color="C9D3E3" w:sz="4"/>
-              <w:left w:val="single" w:color="C9D3E3" w:sz="4"/>
-              <w:bottom w:val="single" w:color="C9D3E3" w:sz="4"/>
-              <w:right w:val="single" w:color="C9D3E3" w:sz="4"/>
+              <w:top w:val="single" w:color="C9C9D6" w:sz="4"/>
+              <w:left w:val="single" w:color="C9C9D6" w:sz="4"/>
+              <w:bottom w:val="single" w:color="C9C9D6" w:sz="4"/>
+              <w:right w:val="single" w:color="C9C9D6" w:sz="4"/>
             </w:tcBorders>
             <w:tcMar>
               <w:top w:type="dxa" w:w="60"/>
@@ -9821,10 +9886,10 @@
           <w:tcPr>
             <w:tcW w:type="dxa" w:w="2891"/>
             <w:tcBorders>
-              <w:top w:val="single" w:color="C9D3E3" w:sz="4"/>
-              <w:left w:val="single" w:color="C9D3E3" w:sz="4"/>
-              <w:bottom w:val="single" w:color="C9D3E3" w:sz="4"/>
-              <w:right w:val="single" w:color="C9D3E3" w:sz="4"/>
+              <w:top w:val="single" w:color="C9C9D6" w:sz="4"/>
+              <w:left w:val="single" w:color="C9C9D6" w:sz="4"/>
+              <w:bottom w:val="single" w:color="C9C9D6" w:sz="4"/>
+              <w:right w:val="single" w:color="C9C9D6" w:sz="4"/>
             </w:tcBorders>
             <w:tcMar>
               <w:top w:type="dxa" w:w="60"/>
@@ -9856,10 +9921,10 @@
           <w:tcPr>
             <w:tcW w:type="dxa" w:w="6747"/>
             <w:tcBorders>
-              <w:top w:val="single" w:color="C9D3E3" w:sz="4"/>
-              <w:left w:val="single" w:color="C9D3E3" w:sz="4"/>
-              <w:bottom w:val="single" w:color="C9D3E3" w:sz="4"/>
-              <w:right w:val="single" w:color="C9D3E3" w:sz="4"/>
+              <w:top w:val="single" w:color="C9C9D6" w:sz="4"/>
+              <w:left w:val="single" w:color="C9C9D6" w:sz="4"/>
+              <w:bottom w:val="single" w:color="C9C9D6" w:sz="4"/>
+              <w:right w:val="single" w:color="C9C9D6" w:sz="4"/>
             </w:tcBorders>
             <w:tcMar>
               <w:top w:type="dxa" w:w="60"/>
@@ -9897,10 +9962,10 @@
           <w:tcPr>
             <w:tcW w:type="dxa" w:w="2891"/>
             <w:tcBorders>
-              <w:top w:val="single" w:color="C9D3E3" w:sz="4"/>
-              <w:left w:val="single" w:color="C9D3E3" w:sz="4"/>
-              <w:bottom w:val="single" w:color="C9D3E3" w:sz="4"/>
-              <w:right w:val="single" w:color="C9D3E3" w:sz="4"/>
+              <w:top w:val="single" w:color="C9C9D6" w:sz="4"/>
+              <w:left w:val="single" w:color="C9C9D6" w:sz="4"/>
+              <w:bottom w:val="single" w:color="C9C9D6" w:sz="4"/>
+              <w:right w:val="single" w:color="C9C9D6" w:sz="4"/>
             </w:tcBorders>
             <w:tcMar>
               <w:top w:type="dxa" w:w="60"/>
@@ -9932,10 +9997,10 @@
           <w:tcPr>
             <w:tcW w:type="dxa" w:w="6747"/>
             <w:tcBorders>
-              <w:top w:val="single" w:color="C9D3E3" w:sz="4"/>
-              <w:left w:val="single" w:color="C9D3E3" w:sz="4"/>
-              <w:bottom w:val="single" w:color="C9D3E3" w:sz="4"/>
-              <w:right w:val="single" w:color="C9D3E3" w:sz="4"/>
+              <w:top w:val="single" w:color="C9C9D6" w:sz="4"/>
+              <w:left w:val="single" w:color="C9C9D6" w:sz="4"/>
+              <w:bottom w:val="single" w:color="C9C9D6" w:sz="4"/>
+              <w:right w:val="single" w:color="C9C9D6" w:sz="4"/>
             </w:tcBorders>
             <w:tcMar>
               <w:top w:type="dxa" w:w="60"/>
@@ -10040,7 +10105,7 @@
                           </pic:cNvPicPr>
                         </pic:nvPicPr>
                         <pic:blipFill>
-                          <a:blip r:embed="rId16" cstate="none"/>
+                          <a:blip r:embed="rId19" cstate="none"/>
                           <a:srcRect/>
                           <a:stretch>
                             <a:fillRect/>
@@ -10104,7 +10169,7 @@
                           </pic:cNvPicPr>
                         </pic:nvPicPr>
                         <pic:blipFill>
-                          <a:blip r:embed="rId17" cstate="none"/>
+                          <a:blip r:embed="rId20" cstate="none"/>
                           <a:srcRect/>
                           <a:stretch>
                             <a:fillRect/>
@@ -10174,10 +10239,13 @@
     </w:p>
     <w:sectPr>
       <w:headerReference w:type="default" r:id="rId7"/>
-      <w:footerReference w:type="default" r:id="rId8"/>
+      <w:headerReference w:type="first" r:id="rId8"/>
+      <w:footerReference w:type="default" r:id="rId9"/>
+      <w:footerReference w:type="first" r:id="rId10"/>
       <w:pgSz w:w="11906" w:h="16838" w:orient="portrait"/>
       <w:pgMar w:top="1134" w:right="1134" w:bottom="1134" w:left="1134" w:header="708" w:footer="708" w:gutter="0"/>
       <w:pgNumType/>
+      <w:titlePg/>
       <w:docGrid w:linePitch="360"/>
     </w:sectPr>
   </w:body>
@@ -10238,12 +10306,14 @@
         <w:sz w:val="16"/>
         <w:szCs w:val="16"/>
       </w:rPr>
-      <w:t xml:space="preserve">Strona </w:t>
+      <w:t xml:space="preserve">BauHausEurope s. r. o.  |  www.bauhauseurope.sk  |  Strona </w:t>
     </w:r>
     <w:r>
       <w:rPr>
         <w:rFonts w:ascii="Arial" w:cs="Arial" w:eastAsia="Arial" w:hAnsi="Arial"/>
-        <w:color w:val="52514E"/>
+        <w:b/>
+        <w:bCs/>
+        <w:color w:val="FF4000"/>
         <w:sz w:val="16"/>
         <w:szCs w:val="16"/>
       </w:rPr>
@@ -10253,6 +10323,12 @@
       <w:fldChar w:fldCharType="end"/>
     </w:r>
   </w:p>
+</w:ftr>
+</file>
+
+<file path=word/footer2.xml><?xml version="1.0" encoding="utf-8"?>
+<w:ftr xmlns:wpc="http://schemas.microsoft.com/office/word/2010/wordprocessingCanvas" xmlns:mc="http://schemas.openxmlformats.org/markup-compatibility/2006" xmlns:o="urn:schemas-microsoft-com:office:office" xmlns:r="http://schemas.openxmlformats.org/officeDocument/2006/relationships" xmlns:m="http://schemas.openxmlformats.org/officeDocument/2006/math" xmlns:v="urn:schemas-microsoft-com:vml" xmlns:wp14="http://schemas.microsoft.com/office/word/2010/wordprocessingDrawing" xmlns:wp="http://schemas.openxmlformats.org/drawingml/2006/wordprocessingDrawing" xmlns:w10="urn:schemas-microsoft-com:office:word" xmlns:w="http://schemas.openxmlformats.org/wordprocessingml/2006/main" xmlns:w14="http://schemas.microsoft.com/office/word/2010/wordml" xmlns:w15="http://schemas.microsoft.com/office/word/2012/wordml" xmlns:wpg="http://schemas.microsoft.com/office/word/2010/wordprocessingGroup" xmlns:wpi="http://schemas.microsoft.com/office/word/2010/wordprocessingInk" xmlns:wne="http://schemas.microsoft.com/office/word/2006/wordml" xmlns:wps="http://schemas.microsoft.com/office/word/2010/wordprocessingShape">
+  <w:p/>
 </w:ftr>
 </file>
 
@@ -10295,23 +10371,127 @@
 
 <file path=word/header1.xml><?xml version="1.0" encoding="utf-8"?>
 <w:hdr xmlns:wpc="http://schemas.microsoft.com/office/word/2010/wordprocessingCanvas" xmlns:mc="http://schemas.openxmlformats.org/markup-compatibility/2006" xmlns:o="urn:schemas-microsoft-com:office:office" xmlns:r="http://schemas.openxmlformats.org/officeDocument/2006/relationships" xmlns:m="http://schemas.openxmlformats.org/officeDocument/2006/math" xmlns:v="urn:schemas-microsoft-com:vml" xmlns:wp14="http://schemas.microsoft.com/office/word/2010/wordprocessingDrawing" xmlns:wp="http://schemas.openxmlformats.org/drawingml/2006/wordprocessingDrawing" xmlns:w10="urn:schemas-microsoft-com:office:word" xmlns:w="http://schemas.openxmlformats.org/wordprocessingml/2006/main" xmlns:w14="http://schemas.microsoft.com/office/word/2010/wordml" xmlns:w15="http://schemas.microsoft.com/office/word/2012/wordml" xmlns:wpg="http://schemas.microsoft.com/office/word/2010/wordprocessingGroup" xmlns:wpi="http://schemas.microsoft.com/office/word/2010/wordprocessingInk" xmlns:wne="http://schemas.microsoft.com/office/word/2006/wordml" xmlns:wps="http://schemas.microsoft.com/office/word/2010/wordprocessingShape" xmlns:cx="http://schemas.microsoft.com/office/drawing/2014/chartex" xmlns:cx1="http://schemas.microsoft.com/office/drawing/2015/9/8/chartex" xmlns:cx2="http://schemas.microsoft.com/office/drawing/2015/10/21/chartex" xmlns:cx3="http://schemas.microsoft.com/office/drawing/2016/5/9/chartex" xmlns:cx4="http://schemas.microsoft.com/office/drawing/2016/5/10/chartex" xmlns:cx5="http://schemas.microsoft.com/office/drawing/2016/5/11/chartex" xmlns:cx6="http://schemas.microsoft.com/office/drawing/2016/5/12/chartex" xmlns:cx7="http://schemas.microsoft.com/office/drawing/2016/5/13/chartex" xmlns:cx8="http://schemas.microsoft.com/office/drawing/2016/5/14/chartex" xmlns:w16cid="http://schemas.microsoft.com/office/word/2016/wordml/cid" xmlns:w16se="http://schemas.microsoft.com/office/word/2015/wordml/symex">
-  <w:p>
-    <w:pPr>
-      <w:pBdr>
-        <w:bottom w:val="single" w:color="C9D3E3" w:sz="4" w:space="4"/>
-      </w:pBdr>
-      <w:jc w:val="right"/>
-    </w:pPr>
-    <w:r>
-      <w:rPr>
-        <w:rFonts w:ascii="Arial" w:cs="Arial" w:eastAsia="Arial" w:hAnsi="Arial"/>
-        <w:color w:val="52514E"/>
-        <w:sz w:val="15"/>
-        <w:szCs w:val="15"/>
-      </w:rPr>
-      <w:t xml:space="preserve">Oferta inwestycyjna  |  Teren „Stará Pekáreň”, Stará Ľubovňa  |  BauHausEurope s. r. o.  |  Poufne</w:t>
-    </w:r>
-  </w:p>
+  <w:tbl>
+    <w:tblPr>
+      <w:tblW w:type="dxa" w:w="9638"/>
+      <w:tblBorders>
+        <w:top w:val="none" w:color="FFFFFF" w:sz="0"/>
+        <w:left w:val="none" w:color="FFFFFF" w:sz="0"/>
+        <w:bottom w:val="none" w:color="FFFFFF" w:sz="0"/>
+        <w:right w:val="none" w:color="FFFFFF" w:sz="0"/>
+        <w:insideH w:val="none" w:color="FFFFFF" w:sz="0"/>
+        <w:insideV w:val="none" w:color="FFFFFF" w:sz="0"/>
+      </w:tblBorders>
+    </w:tblPr>
+    <w:tblGrid>
+      <w:gridCol w:w="2400"/>
+      <w:gridCol w:w="7238"/>
+    </w:tblGrid>
+    <w:tr>
+      <w:tc>
+        <w:tcPr>
+          <w:tcW w:type="dxa" w:w="2400"/>
+          <w:tcBorders>
+            <w:top w:val="none" w:color="FFFFFF" w:sz="0"/>
+            <w:left w:val="none" w:color="FFFFFF" w:sz="0"/>
+            <w:bottom w:val="single" w:color="FF4000" w:sz="6"/>
+            <w:right w:val="none" w:color="FFFFFF" w:sz="0"/>
+          </w:tcBorders>
+          <w:tcMar>
+            <w:top w:type="dxa" w:w="0"/>
+            <w:left w:type="dxa" w:w="0"/>
+            <w:bottom w:type="dxa" w:w="60"/>
+            <w:right w:type="dxa" w:w="0"/>
+          </w:tcMar>
+          <w:vAlign w:val="bottom"/>
+        </w:tcPr>
+        <w:p>
+          <w:pPr>
+            <w:spacing w:after="0"/>
+          </w:pPr>
+          <w:r>
+            <w:drawing>
+              <wp:inline distT="0" distB="0" distL="0" distR="0">
+                <wp:extent cx="857250" cy="257175"/>
+                <wp:effectExtent t="0" r="0" b="0" l="0"/>
+                <wp:docPr id="1" name="" descr="" title=""/>
+                <wp:cNvGraphicFramePr>
+                  <a:graphicFrameLocks xmlns:a="http://schemas.openxmlformats.org/drawingml/2006/main" noChangeAspect="1"/>
+                </wp:cNvGraphicFramePr>
+                <a:graphic xmlns:a="http://schemas.openxmlformats.org/drawingml/2006/main">
+                  <a:graphicData uri="http://schemas.openxmlformats.org/drawingml/2006/picture">
+                    <pic:pic xmlns:pic="http://schemas.openxmlformats.org/drawingml/2006/picture">
+                      <pic:nvPicPr>
+                        <pic:cNvPr id="0" name="" descr=""/>
+                        <pic:cNvPicPr>
+                          <a:picLocks noChangeAspect="1" noChangeArrowheads="1"/>
+                        </pic:cNvPicPr>
+                      </pic:nvPicPr>
+                      <pic:blipFill>
+                        <a:blip r:embed="rId0" cstate="none"/>
+                        <a:srcRect/>
+                        <a:stretch>
+                          <a:fillRect/>
+                        </a:stretch>
+                      </pic:blipFill>
+                      <pic:spPr bwMode="auto">
+                        <a:xfrm>
+                          <a:off x="0" y="0"/>
+                          <a:ext cx="857250" cy="257175"/>
+                        </a:xfrm>
+                        <a:prstGeom prst="rect">
+                          <a:avLst/>
+                        </a:prstGeom>
+                      </pic:spPr>
+                    </pic:pic>
+                  </a:graphicData>
+                </a:graphic>
+              </wp:inline>
+            </w:drawing>
+          </w:r>
+        </w:p>
+      </w:tc>
+      <w:tc>
+        <w:tcPr>
+          <w:tcW w:type="dxa" w:w="7238"/>
+          <w:tcBorders>
+            <w:top w:val="none" w:color="FFFFFF" w:sz="0"/>
+            <w:left w:val="none" w:color="FFFFFF" w:sz="0"/>
+            <w:bottom w:val="single" w:color="FF4000" w:sz="6"/>
+            <w:right w:val="none" w:color="FFFFFF" w:sz="0"/>
+          </w:tcBorders>
+          <w:tcMar>
+            <w:top w:type="dxa" w:w="0"/>
+            <w:left w:type="dxa" w:w="0"/>
+            <w:bottom w:type="dxa" w:w="60"/>
+            <w:right w:type="dxa" w:w="0"/>
+          </w:tcMar>
+          <w:vAlign w:val="bottom"/>
+        </w:tcPr>
+        <w:p>
+          <w:pPr>
+            <w:spacing w:after="0"/>
+            <w:jc w:val="right"/>
+          </w:pPr>
+          <w:r>
+            <w:rPr>
+              <w:rFonts w:ascii="Arial" w:cs="Arial" w:eastAsia="Arial" w:hAnsi="Arial"/>
+              <w:color w:val="52514E"/>
+              <w:sz w:val="15"/>
+              <w:szCs w:val="15"/>
+            </w:rPr>
+            <w:t xml:space="preserve">Oferta inwestycyjna  |  Teren „Stará Pekáreň”, Stará Ľubovňa  |  BauHausEurope s. r. o.  |  Poufne</w:t>
+          </w:r>
+        </w:p>
+      </w:tc>
+    </w:tr>
+  </w:tbl>
+</w:hdr>
+</file>
+
+<file path=word/header2.xml><?xml version="1.0" encoding="utf-8"?>
+<w:hdr xmlns:wpc="http://schemas.microsoft.com/office/word/2010/wordprocessingCanvas" xmlns:mc="http://schemas.openxmlformats.org/markup-compatibility/2006" xmlns:o="urn:schemas-microsoft-com:office:office" xmlns:r="http://schemas.openxmlformats.org/officeDocument/2006/relationships" xmlns:m="http://schemas.openxmlformats.org/officeDocument/2006/math" xmlns:v="urn:schemas-microsoft-com:vml" xmlns:wp14="http://schemas.microsoft.com/office/word/2010/wordprocessingDrawing" xmlns:wp="http://schemas.openxmlformats.org/drawingml/2006/wordprocessingDrawing" xmlns:w10="urn:schemas-microsoft-com:office:word" xmlns:w="http://schemas.openxmlformats.org/wordprocessingml/2006/main" xmlns:w14="http://schemas.microsoft.com/office/word/2010/wordml" xmlns:w15="http://schemas.microsoft.com/office/word/2012/wordml" xmlns:wpg="http://schemas.microsoft.com/office/word/2010/wordprocessingGroup" xmlns:wpi="http://schemas.microsoft.com/office/word/2010/wordprocessingInk" xmlns:wne="http://schemas.microsoft.com/office/word/2006/wordml" xmlns:wps="http://schemas.microsoft.com/office/word/2010/wordprocessingShape" xmlns:cx="http://schemas.microsoft.com/office/drawing/2014/chartex" xmlns:cx1="http://schemas.microsoft.com/office/drawing/2015/9/8/chartex" xmlns:cx2="http://schemas.microsoft.com/office/drawing/2015/10/21/chartex" xmlns:cx3="http://schemas.microsoft.com/office/drawing/2016/5/9/chartex" xmlns:cx4="http://schemas.microsoft.com/office/drawing/2016/5/10/chartex" xmlns:cx5="http://schemas.microsoft.com/office/drawing/2016/5/11/chartex" xmlns:cx6="http://schemas.microsoft.com/office/drawing/2016/5/12/chartex" xmlns:cx7="http://schemas.microsoft.com/office/drawing/2016/5/13/chartex" xmlns:cx8="http://schemas.microsoft.com/office/drawing/2016/5/14/chartex" xmlns:w16cid="http://schemas.microsoft.com/office/word/2016/wordml/cid" xmlns:w16se="http://schemas.microsoft.com/office/word/2015/wordml/symex">
+  <w:p/>
 </w:hdr>
 </file>
 
@@ -10406,11 +10586,16 @@
     <w:lvl w:ilvl="0" w15:tentative="1">
       <w:start w:val="1"/>
       <w:numFmt w:val="bullet"/>
-      <w:lvlText w:val="•"/>
+      <w:lvlText w:val="■"/>
       <w:lvlJc w:val="left"/>
       <w:pPr>
         <w:ind w:left="540" w:hanging="300"/>
       </w:pPr>
+      <w:rPr>
+        <w:color w:val="FF4000"/>
+        <w:sz w:val="14"/>
+        <w:szCs w:val="14"/>
+      </w:rPr>
     </w:lvl>
   </w:abstractNum>
   <w:num w:numId="1">
@@ -10624,7 +10809,7 @@
       <w:rFonts w:ascii="Arial" w:cs="Arial" w:eastAsia="Arial" w:hAnsi="Arial"/>
       <w:b/>
       <w:bCs/>
-      <w:color w:val="1F3B73"/>
+      <w:color w:val="010222"/>
       <w:sz w:val="30"/>
       <w:szCs w:val="30"/>
     </w:rPr>
@@ -10642,7 +10827,7 @@
       <w:rFonts w:ascii="Arial" w:cs="Arial" w:eastAsia="Arial" w:hAnsi="Arial"/>
       <w:b/>
       <w:bCs/>
-      <w:color w:val="1F3B73"/>
+      <w:color w:val="010222"/>
       <w:sz w:val="24"/>
       <w:szCs w:val="24"/>
     </w:rPr>

</xml_diff>

<commit_message>
Offer: remove blank page after the title page
Co-Authored-By: Claude Fable 5.1 <noreply@anthropic.com>
Claude-Session: https://claude.ai/code/session_01Y2BwyWrz2zGDUPQB2oEzRk
</commit_message>
<xml_diff>
--- a/business-plan/ponuka-merkury-market/Oferta_inwestycyjna_Stara_Lubovna_Merkury_Market_PL.docx
+++ b/business-plan/ponuka-merkury-market/Oferta_inwestycyjna_Stara_Lubovna_Merkury_Market_PL.docx
@@ -104,7 +104,7 @@
       <w:r>
         <w:drawing>
           <wp:inline distT="0" distB="0" distL="0" distR="0">
-            <wp:extent cx="5715000" cy="3876675"/>
+            <wp:extent cx="5334000" cy="3619500"/>
             <wp:effectExtent t="0" r="0" b="0" l="0"/>
             <wp:docPr id="1" name="" descr="" title=""/>
             <wp:cNvGraphicFramePr>
@@ -129,7 +129,7 @@
                   <pic:spPr bwMode="auto">
                     <a:xfrm>
                       <a:off x="0" y="0"/>
-                      <a:ext cx="5715000" cy="3876675"/>
+                      <a:ext cx="5334000" cy="3619500"/>
                     </a:xfrm>
                     <a:prstGeom prst="rect">
                       <a:avLst/>
@@ -256,17 +256,13 @@
       </w:r>
     </w:p>
     <w:p>
-      <w:r>
-        <w:br w:type="page"/>
-      </w:r>
-    </w:p>
-    <w:p>
       <w:pPr>
         <w:pStyle w:val="Heading1"/>
+        <w:pageBreakBefore/>
         <w:pBdr>
           <w:bottom w:val="single" w:color="FF4000" w:sz="12" w:space="4"/>
         </w:pBdr>
-        <w:spacing w:after="200" w:before="360"/>
+        <w:spacing w:after="200" w:before="0"/>
       </w:pPr>
       <w:r>
         <w:rPr>

</xml_diff>